<commit_message>
Add Heavenly Ascension System Chapter 59
</commit_message>
<xml_diff>
--- a/Heavenly Ascension System.docx
+++ b/Heavenly Ascension System.docx
@@ -41558,6 +41558,19 @@
       </w:r>
     </w:p>
     <w:p/>
+    <w:p>
+      <w:pPr>
+        <w:pStyle w:val="Heading1"/>
+      </w:pPr>
+      <w:r>
+        <w:t xml:space="preserve">Chapter 59</w:t>
+      </w:r>
+    </w:p>
+    <w:p>
+      <w:r>
+        <w:t xml:space="preserve">Chapter 59: The Winter Beneath the Reeds Lena found the first useful lie in the photograph eleven minutes after Kai put his phone away. The image claimed it had no location data. That part was true in the narrow way machines understood truth. No coordinates waited inside the file. No device name, no timestamp, no neat trail leading from the unknown number to the stone among the reeds. But the photograph had been cropped. Lena stood beside Han's van with Kai's phone connected to her laptop by a cable she carried for reasons Rian had once called suspicious and now called comforting. The sidewalk around the Ruins had begun returning to its ordinary rhythm. Buses sighed at the curb. Shoes whispered over wet pavement. Across the road, the last frost was gone, leaving the grass darker where the ring had held. "Here," Lena said. She enlarged the lower right corner until the yellow scrap became a staircase of pixels. Mina leaned over one shoulder. Dr. Venn leaned over the other. Rian stayed behind all three of them and complained that expertise had terrible crowd control. The yellow paint belonged to a metal plate fixed to the rusted fence post. Most of the plate had been cut out of the picture, but its upper edge remained. A black curve crossed the yellow. "A letter? " Mina asked. "Part of one," Lena said. "Or part of a symbol. The crop was meant to remove it. " Kai listened to the picture as if it were a place. Nothing answered. A photograph was light already taken, a moment flattened until its breath could no longer move. Yet the ember in his chest warmed when he looked at the frost around the dark stone. Not recognition. Relation. The difference mattered. The System remained quiet. Dr. Venn adjusted his glasses. "Municipal hazard plates use yellow. So do utility corridors, flood-control sites, rail maintenance zones, and half the private contractors in the province. " "Excellent," Rian said. "We have narrowed it down to everywhere unpleasant. " Seo Jun had not moved from the curb. His attention stayed fixed on the black curve. "It is not a letter," he said. They looked at him. He stepped closer only after Kai nodded. Then he pointed without touching the screen. "North River marks active survey boundaries with blue stakes and white plates. Their older subcontractors used orange. Yellow with a black arc belonged to watershed maintenance before the work was privatized. I saw plates like that in archived access maps. " Lena's fingers stopped over the keyboard. "Archived where? " Seo Jun gave a humorless smile. "In a folder Vale told me never to open again. " Han looked across the road at the Ruins, then toward Dr. Park. "Do you still have it? " "No. Vale checked my work laptop himself after the storage yard incident. " Seo Jun swallowed. "But I remember the naming convention. WM sectors. A district number. A site letter. Most of the files were scans of paper maps from before North River existed. " Mina wrote watershed maintenance beneath unknown marker owner. "How many sites? " "I do not know. More than one. Fewer than a hundred. " Seo Jun looked at the photograph again. "The maps were not important to us then. They showed abandoned channels, culverts, retention basins. Places where water used to move. Vale cared about overlays, not the maps themselves. " Kai felt the low memory of the Ruins beneath traffic and voices. Water used to move. The first mouth sat under a place where old channels converged. The second waited among dry reeds. Not identical. Related. Mina saw the thought cross his face. "A dry watershed site could still belong to the same network. " "Could," Dr. Venn said. "We do not promote could into is because the photograph wants us to hurry. " Kai nodded. "We do not chase it today. " The words cost him something. That was how he knew they were real. Part of him had already imagined the road beyond the city, reeds scraping the doors of Han's van, frost shining under a blank sky. The old hunger for the next answer had not disappeared when he learned patience. It had only lost the right to call itself destiny. Lena closed the enlarged image and opened a clean document. "Then today we verify the invitation, identify likely sites, and tell Dr. Park before the person who sent this decides silence means consent. " "That sounded almost responsible," Rian said. "Do not spread it around. " Dr. Park listened without interrupting. He stood just inside the city barrier, one hand resting on a rolled survey map. When Lena finished, he looked at Seo Jun. "Can you put what you remember in a signed statement? " Seo Jun's face tightened. The question was ordinary. The fear behind it was not. North River had trained him to understand documents as weapons held by whoever owned the cabinet. A signed statement could protect him. It could also become a bright line drawn around his name. Kai waited. So did Dr. Park. No one filled the silence for him. "Yes," Seo Jun said at last. "If I can read the final copy before it is filed. " "You can. " "And I want the distinction included. I saw the archived maps. I did not see this stone. " "Included. " Seo Jun exhaled. The breath shook once and steadied. Mina wrote witness terms in the margin of her page. Kai understood why. Return conditions were changing shape already. They were not only rules for touching old stone. They were rules for approaching people whose memories had been used without their permission. Dr. Park called the municipal records office. Lena searched public planning archives. Han drove Dr. Venn back to the community center so they could use the larger tables and the printer that only jammed when someone was in a hurry. Rian went to the market to tell Mrs. Yoon that the Ruins remained quiet and that no, quiet did not mean solved. Kai and Mina walked there instead of riding. The city had warmed by then. Water dripped from awnings. The frost photographs were already spreading online, but the most popular posts focused on the strange beauty of the ring rather than the second image no one else had seen. People passed them carrying groceries, backpacks, coffee, flowers. A child dragged a stick along a fence and made the metal sing in uneven notes. Kai heard the city as layers. Traffic above pipes. Footsteps above buried channels. Voices above old instructions worn smooth by time. The network did not feel like one thing beneath them anymore. It felt like a question asked in many places, each place keeping a different part of the answer. "You want to go," Mina said. "Yes. " "So do I. " He glanced at her. She kept walking, notebook held against her coat. "Waiting is easier when we pretend the desire went away. That makes it less honest, not less dangerous. " "I imagined the road. " "I imagined the site map. " "That sounds more like you. " "It had labels. " Kai smiled. At the next crossing, the signal took too long. Mina watched the red figure on the pole and spoke without looking at him. "The message was sent to you. Not Dr. Venn. Not the city. Not even Seo Jun, who knows the old maps. Whoever sent it expects you to behave like the person you were. " "Cross the fence before dawn. " "Touch the stone. Call the consequences destiny. " His own thought, returned in her voice, stung more than accusation would have. "I am not that person now. " The crossing signal changed. Mina stepped forward. "Then they are working from an old map too. " At the community center, Han had covered two folding tables with printouts. The old building smelled of floor polish, instant coffee, and the onion broth someone was preparing in the kitchen. Dr. Venn stood at the far end with a magnifying glass he did not need but enjoyed using. Lena occupied the center like a commander of paper. "Public records gave us forty-three former watershed maintenance sites in the greater district," she said. "Twelve have reeds. Seven are dry or seasonally dry. Four still have pre-privatization fencing. " Rian arrived carrying a bag of buns from Mrs. Yoon. "Please tell me none of the four is called Mouth Two. " "Municipal engineers lacked your gift for making everything worse. " "A neglected art. " Seo Jun sat at the smaller table with Dr. Park, reviewing his statement line by line. His shoulders were rigid, but he was reading instead of merely signing. Kai counted that as a victory no System would reward. Mina placed the photograph beside the four site images Lena had found. One showed a concrete spillway under an expressway. One was a fenced retention basin behind new apartment towers. One lay beside a railway service road. The last was a former floodplain monitoring station at the edge of a reservoir that had been drained twenty years ago. Dry reeds surrounded the last site. A rusted post leaned near the remains of a fence. The public archive photograph was six years old and taken in summer. No dark stone was visible. The ground where it should have stood disappeared beneath waist-high grass. Lena tapped the label. "West Haneul Retention Sector C. Closed after subsidence damaged the eastern service path. No active utilities. Ownership disputed between the city water office and the regional land trust. " "Meaning no one checks it," Han said. "Meaning everyone can explain why checking it belongs to someone else. " Dr. Venn placed the magnifying glass over the fence post in the archive image. A yellow plate clung to it. The resolution was poor, but a black arc crossed the top. No one spoke for several seconds. The ember in Kai's chest brightened. The System appeared. [Related convergence site identified with moderate confidence.] [Remote resonance detected.] [Caution: detection may be reciprocal.] Kai read the final line twice. "It knows we found it," he said. Rian set down the buns. "The stone? " "Or whoever is listening through it," Mina said. Dr. Venn lowered himself into a chair. "Do not decide those are different things yet. " The lights flickered. Every phone on the table lost its signal at the same time. Lena looked at hers, then at Dr. Park's. The community center's old radio snapped into static in the kitchen. A woman preparing lunch called out that the breaker had gone strange. Kai stood very still. The signal loss lasted one breath. Two. Three. Then the lights steadied. Phones reconnected in a chorus of small tones. The kitchen radio returned halfway through a weather report. Nothing dramatic followed. That made the interruption worse. Lena unplugged her laptop from the center's network and closed every window except the files already saved offline. "Reciprocal," she said. Mina drew a box around the word. Dr. Park called the city operations desk from a wired phone. There had been no district outage. No reported power fluctuation. No cell-service incident. Only the community center had blinked, and only after they named West Haneul. Kai moved toward the window. Outside, winter had not returned. Sunlight lay across the steps. An old man practiced slow stretches near the garden wall. Two teenagers argued over a bicycle. Nothing waited among the parked cars. He let Lantern Breath settle through his ribs. Warmth inward. Warmth outward. Listen without reaching. For a moment, he heard the Ruins far beneath the city, one low held note. Beyond it, at the edge of perception, another note answered from a greater distance. Colder. Thinner. Interrupted by something that pulsed in precise intervals. Three short. One long. Three short. Not a song. A signal. Kai opened his eyes. "The second site is not silent. " Mina had already turned to a clean page. "What did you hear? " He tapped the rhythm on the table. Three short. One long. Three short. Seo Jun's chair scraped back. His signed statement lay forgotten under one hand. "That was the old field check," he said. "North River crews used it when radios failed underground. Three taps, pause, one tap, pause, three taps. It meant a person was present and needed acknowledgment. " "A rescue signal? " Han asked. "Not exactly. It meant do not energize the line. Someone is inside. " The room changed around the words. The stone in the photograph stopped being only an object. The frost ring stopped being only proof of another convergence site. Someone is inside could mean a person trapped in a buried channel. It could mean an old instruction occupying the network. It could mean the sender wanted them to believe either one. Kai felt the hunger to move sharpen into urgency. Urgency was more dangerous than curiosity because it could wear another person's face. "We still do not go today," he said. Rian studied him. "You sure? " "No. " The honest answer loosened something in the room. Kai looked at Dr. Park. "But we can ask the nearest local authority to secure the road without entering the site. We can check missing-person reports. We can find out whether anyone has legally accessed West Haneul. We can prepare. " Mina added each item to the page. Dr. Park nodded. "I can request a perimeter inspection under the subsidence order. No approach to the central ground. No excavation. " "And no mention of Kai," Lena said. "The sender already knows his number. We do not give them his travel plan too. " Han distributed the buns because fear became less persuasive when people had to chew. Mrs. Yoon had packed six, then apparently reconsidered the nature of their group and packed twelve. They ate around the maps. Preparation took the rest of the afternoon. The regional office confirmed the road to West Haneul was technically closed but often used by fishermen. No maintenance crew had signed in for nine months. No missing-person report directly named the reservoir. Two hikers had reported hearing metal strikes near the old floodplain the previous week, but the note had been filed as probable construction noise. There was no active construction within four kilometers. Dr. Venn built a sensor list. Mina turned the Ruins return conditions into a second-site approach protocol. Han checked the van, then rejected the van because its North River incident damage made it too recognizable. Rian borrowed his aunt's old minibus after promising not to explain why until the promise became impossible to keep. Lena prepared three copies of every map, one digital, one printed, one left with Dr. Park. Seo Jun marked the routes he remembered from the archive overlays. He refused to join the first approach. No one tried to shame him into changing his mind. "I can help from here," he said. "If Vale built this invitation from old North River files, he may expect me to lead you. I do not want to make his prediction true. " Kai understood. Choosing where not to stand could be a form of witness too. By sunset, the plan occupied an entire wall. They would leave after sunrise, not before. Dr. Park would coordinate with the regional office. Two civil engineers would inspect the closed road and subsidence boundary. Kai, Mina, Rian, Han, Dr. Venn, and Lena would stop at the outer fence. No one would cross until the site was photographed, measured, and listened to from outside. If the frost appeared beyond the stone, they withdrew. If any communication failed, they withdrew. If Kai's System issued a forced-contact warning, they withdrew. "If the stone asks politely? " Rian said. Mina did not look up. "We still withdraw. " "Good. I wanted to clarify how much manners matter to geology. " Kai added one condition himself. No one enters because the signal sounds human. He wrote it slowly. The sentence felt cruel until he understood its purpose. If someone was truly trapped, charging blind into unstable ground would not save them. They would locate, confirm, call trained rescue crews, and keep the network from turning compassion into a lever. Mina read the condition twice. Then she drew a line beneath it and added another. No one is left alone with the decision to enter. Kai looked at her. "That includes you," she said. He almost answered that the System belonged to him, that its warnings arrived behind his eyes, that some choices could not be shared. The old argument rose easily because he had practiced it for years. Then he looked around the room. At Rian checking the withdrawal routes. At Han counting emergency lamps. At Lena sealing maps in clear sleeves. At Dr. Venn labeling sensors with hands that had finally stopped trembling. None of them could see the System, but all of them had learned how to answer what it asked of him. "It includes me," Kai said. Mina nodded and handed him the pen. He initialed both conditions. One by one, the others did the same. The page became more than a list. It became a promise with six different handwritings, uneven and ordinary and strong because no single person owned it. The old Kai would have hated the condition. The person he was becoming needed it. They left the community center after dark. The temperature had fallen, but no frost marked the steps. Kai walked home with Mina and Rian. For once, Rian did not fill the silence. The city lights shone on damp streets. Somewhere behind them, the Ruins waited under official seals and quiet sensors. Kai's phone buzzed as they reached his building. Unknown number. Mina saw the screen and stopped. Rian moved close enough to read without asking. This message contained no photograph. It contained an audio file, seven seconds long. Lena had told them not to open anything from the sender without isolating the device. Kai obeyed. They went upstairs, placed the phone inside the small offline enclosure she had given him, and called her from Mina's phone. Twenty minutes later, Lena arrived with Han and a laptop that had never touched the internet. She transferred the file through a one-way adapter and examined it. "No obvious executable payload," she said. "No metadata worth trusting. The waveform is simple. " "Simple has been having a difficult week," Rian said. Lena played the recording through a cheap speaker. Wind moved through dry reeds. Then came the taps. Three short. One long. Three short. A pause followed. Under the wind, so faint they almost missed it, someone breathed. Kai leaned closer. The ember flared hard enough to hurt. The System filled his vision. [Witness pattern confirmed.] [Second convergence mouth is occupied.] [Occupant state: unresolved.] [Warning: first mouth has begun answering.] Every light in the apartment went out. In the darkness beneath the city, too low for the speaker and too near to be West Haneul, the Ruins struck back. Three short. One long. Three short.</w:t>
+      </w:r>
+    </w:p>
     <w:sectPr>
       <w:pgSz w:w="12240" w:h="15840"/>
       <w:pgMar w:top="1440" w:right="1440" w:bottom="1440" w:left="1440" w:header="720" w:footer="720" w:gutter="0"/>

</xml_diff>

<commit_message>
Fix Heavenly Ascension System Chapter 59 title and paragraph formatting
</commit_message>
<xml_diff>
--- a/Heavenly Ascension System.docx
+++ b/Heavenly Ascension System.docx
@@ -41557,18 +41557,1082 @@
         <w:t>Kai kept his hand away from the latch. That was the promise he could make today. Not to stop being afraid. Not to stop wanting answers. Only to return when returning meant listening first.</w:t>
       </w:r>
     </w:p>
-    <w:p/>
     <w:p>
       <w:pPr>
         <w:pStyle w:val="Heading1"/>
       </w:pPr>
       <w:r>
-        <w:t xml:space="preserve">Chapter 59</w:t>
-      </w:r>
-    </w:p>
-    <w:p>
-      <w:r>
-        <w:t xml:space="preserve">Chapter 59: The Winter Beneath the Reeds Lena found the first useful lie in the photograph eleven minutes after Kai put his phone away. The image claimed it had no location data. That part was true in the narrow way machines understood truth. No coordinates waited inside the file. No device name, no timestamp, no neat trail leading from the unknown number to the stone among the reeds. But the photograph had been cropped. Lena stood beside Han's van with Kai's phone connected to her laptop by a cable she carried for reasons Rian had once called suspicious and now called comforting. The sidewalk around the Ruins had begun returning to its ordinary rhythm. Buses sighed at the curb. Shoes whispered over wet pavement. Across the road, the last frost was gone, leaving the grass darker where the ring had held. "Here," Lena said. She enlarged the lower right corner until the yellow scrap became a staircase of pixels. Mina leaned over one shoulder. Dr. Venn leaned over the other. Rian stayed behind all three of them and complained that expertise had terrible crowd control. The yellow paint belonged to a metal plate fixed to the rusted fence post. Most of the plate had been cut out of the picture, but its upper edge remained. A black curve crossed the yellow. "A letter? " Mina asked. "Part of one," Lena said. "Or part of a symbol. The crop was meant to remove it. " Kai listened to the picture as if it were a place. Nothing answered. A photograph was light already taken, a moment flattened until its breath could no longer move. Yet the ember in his chest warmed when he looked at the frost around the dark stone. Not recognition. Relation. The difference mattered. The System remained quiet. Dr. Venn adjusted his glasses. "Municipal hazard plates use yellow. So do utility corridors, flood-control sites, rail maintenance zones, and half the private contractors in the province. " "Excellent," Rian said. "We have narrowed it down to everywhere unpleasant. " Seo Jun had not moved from the curb. His attention stayed fixed on the black curve. "It is not a letter," he said. They looked at him. He stepped closer only after Kai nodded. Then he pointed without touching the screen. "North River marks active survey boundaries with blue stakes and white plates. Their older subcontractors used orange. Yellow with a black arc belonged to watershed maintenance before the work was privatized. I saw plates like that in archived access maps. " Lena's fingers stopped over the keyboard. "Archived where? " Seo Jun gave a humorless smile. "In a folder Vale told me never to open again. " Han looked across the road at the Ruins, then toward Dr. Park. "Do you still have it? " "No. Vale checked my work laptop himself after the storage yard incident. " Seo Jun swallowed. "But I remember the naming convention. WM sectors. A district number. A site letter. Most of the files were scans of paper maps from before North River existed. " Mina wrote watershed maintenance beneath unknown marker owner. "How many sites? " "I do not know. More than one. Fewer than a hundred. " Seo Jun looked at the photograph again. "The maps were not important to us then. They showed abandoned channels, culverts, retention basins. Places where water used to move. Vale cared about overlays, not the maps themselves. " Kai felt the low memory of the Ruins beneath traffic and voices. Water used to move. The first mouth sat under a place where old channels converged. The second waited among dry reeds. Not identical. Related. Mina saw the thought cross his face. "A dry watershed site could still belong to the same network. " "Could," Dr. Venn said. "We do not promote could into is because the photograph wants us to hurry. " Kai nodded. "We do not chase it today. " The words cost him something. That was how he knew they were real. Part of him had already imagined the road beyond the city, reeds scraping the doors of Han's van, frost shining under a blank sky. The old hunger for the next answer had not disappeared when he learned patience. It had only lost the right to call itself destiny. Lena closed the enlarged image and opened a clean document. "Then today we verify the invitation, identify likely sites, and tell Dr. Park before the person who sent this decides silence means consent. " "That sounded almost responsible," Rian said. "Do not spread it around. " Dr. Park listened without interrupting. He stood just inside the city barrier, one hand resting on a rolled survey map. When Lena finished, he looked at Seo Jun. "Can you put what you remember in a signed statement? " Seo Jun's face tightened. The question was ordinary. The fear behind it was not. North River had trained him to understand documents as weapons held by whoever owned the cabinet. A signed statement could protect him. It could also become a bright line drawn around his name. Kai waited. So did Dr. Park. No one filled the silence for him. "Yes," Seo Jun said at last. "If I can read the final copy before it is filed. " "You can. " "And I want the distinction included. I saw the archived maps. I did not see this stone. " "Included. " Seo Jun exhaled. The breath shook once and steadied. Mina wrote witness terms in the margin of her page. Kai understood why. Return conditions were changing shape already. They were not only rules for touching old stone. They were rules for approaching people whose memories had been used without their permission. Dr. Park called the municipal records office. Lena searched public planning archives. Han drove Dr. Venn back to the community center so they could use the larger tables and the printer that only jammed when someone was in a hurry. Rian went to the market to tell Mrs. Yoon that the Ruins remained quiet and that no, quiet did not mean solved. Kai and Mina walked there instead of riding. The city had warmed by then. Water dripped from awnings. The frost photographs were already spreading online, but the most popular posts focused on the strange beauty of the ring rather than the second image no one else had seen. People passed them carrying groceries, backpacks, coffee, flowers. A child dragged a stick along a fence and made the metal sing in uneven notes. Kai heard the city as layers. Traffic above pipes. Footsteps above buried channels. Voices above old instructions worn smooth by time. The network did not feel like one thing beneath them anymore. It felt like a question asked in many places, each place keeping a different part of the answer. "You want to go," Mina said. "Yes. " "So do I. " He glanced at her. She kept walking, notebook held against her coat. "Waiting is easier when we pretend the desire went away. That makes it less honest, not less dangerous. " "I imagined the road. " "I imagined the site map. " "That sounds more like you. " "It had labels. " Kai smiled. At the next crossing, the signal took too long. Mina watched the red figure on the pole and spoke without looking at him. "The message was sent to you. Not Dr. Venn. Not the city. Not even Seo Jun, who knows the old maps. Whoever sent it expects you to behave like the person you were. " "Cross the fence before dawn. " "Touch the stone. Call the consequences destiny. " His own thought, returned in her voice, stung more than accusation would have. "I am not that person now. " The crossing signal changed. Mina stepped forward. "Then they are working from an old map too. " At the community center, Han had covered two folding tables with printouts. The old building smelled of floor polish, instant coffee, and the onion broth someone was preparing in the kitchen. Dr. Venn stood at the far end with a magnifying glass he did not need but enjoyed using. Lena occupied the center like a commander of paper. "Public records gave us forty-three former watershed maintenance sites in the greater district," she said. "Twelve have reeds. Seven are dry or seasonally dry. Four still have pre-privatization fencing. " Rian arrived carrying a bag of buns from Mrs. Yoon. "Please tell me none of the four is called Mouth Two. " "Municipal engineers lacked your gift for making everything worse. " "A neglected art. " Seo Jun sat at the smaller table with Dr. Park, reviewing his statement line by line. His shoulders were rigid, but he was reading instead of merely signing. Kai counted that as a victory no System would reward. Mina placed the photograph beside the four site images Lena had found. One showed a concrete spillway under an expressway. One was a fenced retention basin behind new apartment towers. One lay beside a railway service road. The last was a former floodplain monitoring station at the edge of a reservoir that had been drained twenty years ago. Dry reeds surrounded the last site. A rusted post leaned near the remains of a fence. The public archive photograph was six years old and taken in summer. No dark stone was visible. The ground where it should have stood disappeared beneath waist-high grass. Lena tapped the label. "West Haneul Retention Sector C. Closed after subsidence damaged the eastern service path. No active utilities. Ownership disputed between the city water office and the regional land trust. " "Meaning no one checks it," Han said. "Meaning everyone can explain why checking it belongs to someone else. " Dr. Venn placed the magnifying glass over the fence post in the archive image. A yellow plate clung to it. The resolution was poor, but a black arc crossed the top. No one spoke for several seconds. The ember in Kai's chest brightened. The System appeared. [Related convergence site identified with moderate confidence.] [Remote resonance detected.] [Caution: detection may be reciprocal.] Kai read the final line twice. "It knows we found it," he said. Rian set down the buns. "The stone? " "Or whoever is listening through it," Mina said. Dr. Venn lowered himself into a chair. "Do not decide those are different things yet. " The lights flickered. Every phone on the table lost its signal at the same time. Lena looked at hers, then at Dr. Park's. The community center's old radio snapped into static in the kitchen. A woman preparing lunch called out that the breaker had gone strange. Kai stood very still. The signal loss lasted one breath. Two. Three. Then the lights steadied. Phones reconnected in a chorus of small tones. The kitchen radio returned halfway through a weather report. Nothing dramatic followed. That made the interruption worse. Lena unplugged her laptop from the center's network and closed every window except the files already saved offline. "Reciprocal," she said. Mina drew a box around the word. Dr. Park called the city operations desk from a wired phone. There had been no district outage. No reported power fluctuation. No cell-service incident. Only the community center had blinked, and only after they named West Haneul. Kai moved toward the window. Outside, winter had not returned. Sunlight lay across the steps. An old man practiced slow stretches near the garden wall. Two teenagers argued over a bicycle. Nothing waited among the parked cars. He let Lantern Breath settle through his ribs. Warmth inward. Warmth outward. Listen without reaching. For a moment, he heard the Ruins far beneath the city, one low held note. Beyond it, at the edge of perception, another note answered from a greater distance. Colder. Thinner. Interrupted by something that pulsed in precise intervals. Three short. One long. Three short. Not a song. A signal. Kai opened his eyes. "The second site is not silent. " Mina had already turned to a clean page. "What did you hear? " He tapped the rhythm on the table. Three short. One long. Three short. Seo Jun's chair scraped back. His signed statement lay forgotten under one hand. "That was the old field check," he said. "North River crews used it when radios failed underground. Three taps, pause, one tap, pause, three taps. It meant a person was present and needed acknowledgment. " "A rescue signal? " Han asked. "Not exactly. It meant do not energize the line. Someone is inside. " The room changed around the words. The stone in the photograph stopped being only an object. The frost ring stopped being only proof of another convergence site. Someone is inside could mean a person trapped in a buried channel. It could mean an old instruction occupying the network. It could mean the sender wanted them to believe either one. Kai felt the hunger to move sharpen into urgency. Urgency was more dangerous than curiosity because it could wear another person's face. "We still do not go today," he said. Rian studied him. "You sure? " "No. " The honest answer loosened something in the room. Kai looked at Dr. Park. "But we can ask the nearest local authority to secure the road without entering the site. We can check missing-person reports. We can find out whether anyone has legally accessed West Haneul. We can prepare. " Mina added each item to the page. Dr. Park nodded. "I can request a perimeter inspection under the subsidence order. No approach to the central ground. No excavation. " "And no mention of Kai," Lena said. "The sender already knows his number. We do not give them his travel plan too. " Han distributed the buns because fear became less persuasive when people had to chew. Mrs. Yoon had packed six, then apparently reconsidered the nature of their group and packed twelve. They ate around the maps. Preparation took the rest of the afternoon. The regional office confirmed the road to West Haneul was technically closed but often used by fishermen. No maintenance crew had signed in for nine months. No missing-person report directly named the reservoir. Two hikers had reported hearing metal strikes near the old floodplain the previous week, but the note had been filed as probable construction noise. There was no active construction within four kilometers. Dr. Venn built a sensor list. Mina turned the Ruins return conditions into a second-site approach protocol. Han checked the van, then rejected the van because its North River incident damage made it too recognizable. Rian borrowed his aunt's old minibus after promising not to explain why until the promise became impossible to keep. Lena prepared three copies of every map, one digital, one printed, one left with Dr. Park. Seo Jun marked the routes he remembered from the archive overlays. He refused to join the first approach. No one tried to shame him into changing his mind. "I can help from here," he said. "If Vale built this invitation from old North River files, he may expect me to lead you. I do not want to make his prediction true. " Kai understood. Choosing where not to stand could be a form of witness too. By sunset, the plan occupied an entire wall. They would leave after sunrise, not before. Dr. Park would coordinate with the regional office. Two civil engineers would inspect the closed road and subsidence boundary. Kai, Mina, Rian, Han, Dr. Venn, and Lena would stop at the outer fence. No one would cross until the site was photographed, measured, and listened to from outside. If the frost appeared beyond the stone, they withdrew. If any communication failed, they withdrew. If Kai's System issued a forced-contact warning, they withdrew. "If the stone asks politely? " Rian said. Mina did not look up. "We still withdraw. " "Good. I wanted to clarify how much manners matter to geology. " Kai added one condition himself. No one enters because the signal sounds human. He wrote it slowly. The sentence felt cruel until he understood its purpose. If someone was truly trapped, charging blind into unstable ground would not save them. They would locate, confirm, call trained rescue crews, and keep the network from turning compassion into a lever. Mina read the condition twice. Then she drew a line beneath it and added another. No one is left alone with the decision to enter. Kai looked at her. "That includes you," she said. He almost answered that the System belonged to him, that its warnings arrived behind his eyes, that some choices could not be shared. The old argument rose easily because he had practiced it for years. Then he looked around the room. At Rian checking the withdrawal routes. At Han counting emergency lamps. At Lena sealing maps in clear sleeves. At Dr. Venn labeling sensors with hands that had finally stopped trembling. None of them could see the System, but all of them had learned how to answer what it asked of him. "It includes me," Kai said. Mina nodded and handed him the pen. He initialed both conditions. One by one, the others did the same. The page became more than a list. It became a promise with six different handwritings, uneven and ordinary and strong because no single person owned it. The old Kai would have hated the condition. The person he was becoming needed it. They left the community center after dark. The temperature had fallen, but no frost marked the steps. Kai walked home with Mina and Rian. For once, Rian did not fill the silence. The city lights shone on damp streets. Somewhere behind them, the Ruins waited under official seals and quiet sensors. Kai's phone buzzed as they reached his building. Unknown number. Mina saw the screen and stopped. Rian moved close enough to read without asking. This message contained no photograph. It contained an audio file, seven seconds long. Lena had told them not to open anything from the sender without isolating the device. Kai obeyed. They went upstairs, placed the phone inside the small offline enclosure she had given him, and called her from Mina's phone. Twenty minutes later, Lena arrived with Han and a laptop that had never touched the internet. She transferred the file through a one-way adapter and examined it. "No obvious executable payload," she said. "No metadata worth trusting. The waveform is simple. " "Simple has been having a difficult week," Rian said. Lena played the recording through a cheap speaker. Wind moved through dry reeds. Then came the taps. Three short. One long. Three short. A pause followed. Under the wind, so faint they almost missed it, someone breathed. Kai leaned closer. The ember flared hard enough to hurt. The System filled his vision. [Witness pattern confirmed.] [Second convergence mouth is occupied.] [Occupant state: unresolved.] [Warning: first mouth has begun answering.] Every light in the apartment went out. In the darkness beneath the city, too low for the speaker and too near to be West Haneul, the Ruins struck back. Three short. One long. Three short.</w:t>
+        <w:t xml:space="preserve">Chapter 59: The Winter Beneath the Reeds</w:t>
+      </w:r>
+    </w:p>
+    <w:p>
+      <w:r>
+        <w:t xml:space="preserve">Lena found the first useful lie in the photograph eleven minutes after Kai put his phone away.</w:t>
+      </w:r>
+    </w:p>
+    <w:p>
+      <w:r>
+        <w:t xml:space="preserve">The image claimed it had no location data. That part was true in the narrow way machines understood truth. No coordinates waited inside the file. No device name, no timestamp, no neat trail leading from the unknown number to the stone among the reeds.</w:t>
+      </w:r>
+    </w:p>
+    <w:p>
+      <w:r>
+        <w:t xml:space="preserve">But the photograph had been cropped.</w:t>
+      </w:r>
+    </w:p>
+    <w:p>
+      <w:r>
+        <w:t xml:space="preserve">Lena stood beside Han's van with Kai's phone connected to her laptop by a cable she carried for reasons Rian had once called suspicious and now called comforting. The sidewalk around the Ruins had begun returning to its ordinary rhythm. Buses sighed at the curb. Shoes whispered over wet pavement. Across the road, the last frost was gone, leaving the grass darker where the ring had held.</w:t>
+      </w:r>
+    </w:p>
+    <w:p>
+      <w:r>
+        <w:t xml:space="preserve">"Here," Lena said.</w:t>
+      </w:r>
+    </w:p>
+    <w:p>
+      <w:r>
+        <w:t xml:space="preserve">She enlarged the lower right corner until the yellow scrap became a staircase of pixels. Mina leaned over one shoulder. Dr. Venn leaned over the other. Rian stayed behind all three of them and complained that expertise had terrible crowd control.</w:t>
+      </w:r>
+    </w:p>
+    <w:p>
+      <w:r>
+        <w:t xml:space="preserve">The yellow paint belonged to a metal plate fixed to the rusted fence post. Most of the plate had been cut out of the picture, but its upper edge remained. A black curve crossed the yellow.</w:t>
+      </w:r>
+    </w:p>
+    <w:p>
+      <w:r>
+        <w:t xml:space="preserve">"A letter? " Mina asked.</w:t>
+      </w:r>
+    </w:p>
+    <w:p>
+      <w:r>
+        <w:t xml:space="preserve">"Part of one," Lena said. "Or part of a symbol. The crop was meant to remove it. "</w:t>
+      </w:r>
+    </w:p>
+    <w:p>
+      <w:r>
+        <w:t xml:space="preserve">Kai listened to the picture as if it were a place.</w:t>
+      </w:r>
+    </w:p>
+    <w:p>
+      <w:r>
+        <w:t xml:space="preserve">Nothing answered. A photograph was light already taken, a moment flattened until its breath could no longer move. Yet the ember in his chest warmed when he looked at the frost around the dark stone. Not recognition. Relation.</w:t>
+      </w:r>
+    </w:p>
+    <w:p>
+      <w:r>
+        <w:t xml:space="preserve">The difference mattered.</w:t>
+      </w:r>
+    </w:p>
+    <w:p>
+      <w:r>
+        <w:t xml:space="preserve">The System remained quiet.</w:t>
+      </w:r>
+    </w:p>
+    <w:p>
+      <w:r>
+        <w:t xml:space="preserve">Dr. Venn adjusted his glasses. "Municipal hazard plates use yellow. So do utility corridors, flood-control sites, rail maintenance zones, and half the private contractors in the province. "</w:t>
+      </w:r>
+    </w:p>
+    <w:p>
+      <w:r>
+        <w:t xml:space="preserve">"Excellent," Rian said. "We have narrowed it down to everywhere unpleasant. "</w:t>
+      </w:r>
+    </w:p>
+    <w:p>
+      <w:r>
+        <w:t xml:space="preserve">Seo Jun had not moved from the curb. His attention stayed fixed on the black curve.</w:t>
+      </w:r>
+    </w:p>
+    <w:p>
+      <w:r>
+        <w:t xml:space="preserve">"It is not a letter," he said.</w:t>
+      </w:r>
+    </w:p>
+    <w:p>
+      <w:r>
+        <w:t xml:space="preserve">They looked at him.</w:t>
+      </w:r>
+    </w:p>
+    <w:p>
+      <w:r>
+        <w:t xml:space="preserve">He stepped closer only after Kai nodded. Then he pointed without touching the screen.</w:t>
+      </w:r>
+    </w:p>
+    <w:p>
+      <w:r>
+        <w:t xml:space="preserve">"North River marks active survey boundaries with blue stakes and white plates. Their older subcontractors used orange. Yellow with a black arc belonged to watershed maintenance before the work was privatized. I saw plates like that in archived access maps. "</w:t>
+      </w:r>
+    </w:p>
+    <w:p>
+      <w:r>
+        <w:t xml:space="preserve">Lena's fingers stopped over the keyboard.</w:t>
+      </w:r>
+    </w:p>
+    <w:p>
+      <w:r>
+        <w:t xml:space="preserve">"Archived where? "</w:t>
+      </w:r>
+    </w:p>
+    <w:p>
+      <w:r>
+        <w:t xml:space="preserve">Seo Jun gave a humorless smile. "In a folder Vale told me never to open again. "</w:t>
+      </w:r>
+    </w:p>
+    <w:p>
+      <w:r>
+        <w:t xml:space="preserve">Han looked across the road at the Ruins, then toward Dr. Park. "Do you still have it? "</w:t>
+      </w:r>
+    </w:p>
+    <w:p>
+      <w:r>
+        <w:t xml:space="preserve">"No. Vale checked my work laptop himself after the storage yard incident. " Seo Jun swallowed. "But I remember the naming convention. WM sectors. A district number. A site letter. Most of the files were scans of paper maps from before North River existed. "</w:t>
+      </w:r>
+    </w:p>
+    <w:p>
+      <w:r>
+        <w:t xml:space="preserve">Mina wrote watershed maintenance beneath unknown marker owner.</w:t>
+      </w:r>
+    </w:p>
+    <w:p>
+      <w:r>
+        <w:t xml:space="preserve">"How many sites? "</w:t>
+      </w:r>
+    </w:p>
+    <w:p>
+      <w:r>
+        <w:t xml:space="preserve">"I do not know. More than one. Fewer than a hundred. " Seo Jun looked at the photograph again. "The maps were not important to us then. They showed abandoned channels, culverts, retention basins. Places where water used to move. Vale cared about overlays, not the maps themselves. "</w:t>
+      </w:r>
+    </w:p>
+    <w:p>
+      <w:r>
+        <w:t xml:space="preserve">Kai felt the low memory of the Ruins beneath traffic and voices.</w:t>
+      </w:r>
+    </w:p>
+    <w:p>
+      <w:r>
+        <w:t xml:space="preserve">Water used to move.</w:t>
+      </w:r>
+    </w:p>
+    <w:p>
+      <w:r>
+        <w:t xml:space="preserve">The first mouth sat under a place where old channels converged. The second waited among dry reeds. Not identical. Related.</w:t>
+      </w:r>
+    </w:p>
+    <w:p>
+      <w:r>
+        <w:t xml:space="preserve">Mina saw the thought cross his face. "A dry watershed site could still belong to the same network. "</w:t>
+      </w:r>
+    </w:p>
+    <w:p>
+      <w:r>
+        <w:t xml:space="preserve">"Could," Dr. Venn said. "We do not promote could into is because the photograph wants us to hurry. "</w:t>
+      </w:r>
+    </w:p>
+    <w:p>
+      <w:r>
+        <w:t xml:space="preserve">Kai nodded. "We do not chase it today. "</w:t>
+      </w:r>
+    </w:p>
+    <w:p>
+      <w:r>
+        <w:t xml:space="preserve">The words cost him something.</w:t>
+      </w:r>
+    </w:p>
+    <w:p>
+      <w:r>
+        <w:t xml:space="preserve">That was how he knew they were real.</w:t>
+      </w:r>
+    </w:p>
+    <w:p>
+      <w:r>
+        <w:t xml:space="preserve">Part of him had already imagined the road beyond the city, reeds scraping the doors of Han's van, frost shining under a blank sky. The old hunger for the next answer had not disappeared when he learned patience. It had only lost the right to call itself destiny.</w:t>
+      </w:r>
+    </w:p>
+    <w:p>
+      <w:r>
+        <w:t xml:space="preserve">Lena closed the enlarged image and opened a clean document.</w:t>
+      </w:r>
+    </w:p>
+    <w:p>
+      <w:r>
+        <w:t xml:space="preserve">"Then today we verify the invitation, identify likely sites, and tell Dr. Park before the person who sent this decides silence means consent. "</w:t>
+      </w:r>
+    </w:p>
+    <w:p>
+      <w:r>
+        <w:t xml:space="preserve">"That sounded almost responsible," Rian said.</w:t>
+      </w:r>
+    </w:p>
+    <w:p>
+      <w:r>
+        <w:t xml:space="preserve">"Do not spread it around. "</w:t>
+      </w:r>
+    </w:p>
+    <w:p>
+      <w:r>
+        <w:t xml:space="preserve">Dr. Park listened without interrupting. He stood just inside the city barrier, one hand resting on a rolled survey map. When Lena finished, he looked at Seo Jun.</w:t>
+      </w:r>
+    </w:p>
+    <w:p>
+      <w:r>
+        <w:t xml:space="preserve">"Can you put what you remember in a signed statement? "</w:t>
+      </w:r>
+    </w:p>
+    <w:p>
+      <w:r>
+        <w:t xml:space="preserve">Seo Jun's face tightened.</w:t>
+      </w:r>
+    </w:p>
+    <w:p>
+      <w:r>
+        <w:t xml:space="preserve">The question was ordinary. The fear behind it was not.</w:t>
+      </w:r>
+    </w:p>
+    <w:p>
+      <w:r>
+        <w:t xml:space="preserve">North River had trained him to understand documents as weapons held by whoever owned the cabinet. A signed statement could protect him. It could also become a bright line drawn around his name.</w:t>
+      </w:r>
+    </w:p>
+    <w:p>
+      <w:r>
+        <w:t xml:space="preserve">Kai waited.</w:t>
+      </w:r>
+    </w:p>
+    <w:p>
+      <w:r>
+        <w:t xml:space="preserve">So did Dr. Park.</w:t>
+      </w:r>
+    </w:p>
+    <w:p>
+      <w:r>
+        <w:t xml:space="preserve">No one filled the silence for him.</w:t>
+      </w:r>
+    </w:p>
+    <w:p>
+      <w:r>
+        <w:t xml:space="preserve">"Yes," Seo Jun said at last. "If I can read the final copy before it is filed. "</w:t>
+      </w:r>
+    </w:p>
+    <w:p>
+      <w:r>
+        <w:t xml:space="preserve">"You can. "</w:t>
+      </w:r>
+    </w:p>
+    <w:p>
+      <w:r>
+        <w:t xml:space="preserve">"And I want the distinction included. I saw the archived maps. I did not see this stone. "</w:t>
+      </w:r>
+    </w:p>
+    <w:p>
+      <w:r>
+        <w:t xml:space="preserve">"Included. "</w:t>
+      </w:r>
+    </w:p>
+    <w:p>
+      <w:r>
+        <w:t xml:space="preserve">Seo Jun exhaled. The breath shook once and steadied.</w:t>
+      </w:r>
+    </w:p>
+    <w:p>
+      <w:r>
+        <w:t xml:space="preserve">Mina wrote witness terms in the margin of her page.</w:t>
+      </w:r>
+    </w:p>
+    <w:p>
+      <w:r>
+        <w:t xml:space="preserve">Kai understood why. Return conditions were changing shape already. They were not only rules for touching old stone. They were rules for approaching people whose memories had been used without their permission.</w:t>
+      </w:r>
+    </w:p>
+    <w:p>
+      <w:r>
+        <w:t xml:space="preserve">Dr. Park called the municipal records office. Lena searched public planning archives. Han drove Dr. Venn back to the community center so they could use the larger tables and the printer that only jammed when someone was in a hurry. Rian went to the market to tell Mrs. Yoon that the Ruins remained quiet and that no, quiet did not mean solved.</w:t>
+      </w:r>
+    </w:p>
+    <w:p>
+      <w:r>
+        <w:t xml:space="preserve">Kai and Mina walked there instead of riding.</w:t>
+      </w:r>
+    </w:p>
+    <w:p>
+      <w:r>
+        <w:t xml:space="preserve">The city had warmed by then. Water dripped from awnings. The frost photographs were already spreading online, but the most popular posts focused on the strange beauty of the ring rather than the second image no one else had seen. People passed them carrying groceries, backpacks, coffee, flowers. A child dragged a stick along a fence and made the metal sing in uneven notes.</w:t>
+      </w:r>
+    </w:p>
+    <w:p>
+      <w:r>
+        <w:t xml:space="preserve">Kai heard the city as layers.</w:t>
+      </w:r>
+    </w:p>
+    <w:p>
+      <w:r>
+        <w:t xml:space="preserve">Traffic above pipes. Footsteps above buried channels. Voices above old instructions worn smooth by time. The network did not feel like one thing beneath them anymore. It felt like a question asked in many places, each place keeping a different part of the answer.</w:t>
+      </w:r>
+    </w:p>
+    <w:p>
+      <w:r>
+        <w:t xml:space="preserve">"You want to go," Mina said.</w:t>
+      </w:r>
+    </w:p>
+    <w:p>
+      <w:r>
+        <w:t xml:space="preserve">"Yes. "</w:t>
+      </w:r>
+    </w:p>
+    <w:p>
+      <w:r>
+        <w:t xml:space="preserve">"So do I. "</w:t>
+      </w:r>
+    </w:p>
+    <w:p>
+      <w:r>
+        <w:t xml:space="preserve">He glanced at her.</w:t>
+      </w:r>
+    </w:p>
+    <w:p>
+      <w:r>
+        <w:t xml:space="preserve">She kept walking, notebook held against her coat. "Waiting is easier when we pretend the desire went away. That makes it less honest, not less dangerous. "</w:t>
+      </w:r>
+    </w:p>
+    <w:p>
+      <w:r>
+        <w:t xml:space="preserve">"I imagined the road. "</w:t>
+      </w:r>
+    </w:p>
+    <w:p>
+      <w:r>
+        <w:t xml:space="preserve">"I imagined the site map. "</w:t>
+      </w:r>
+    </w:p>
+    <w:p>
+      <w:r>
+        <w:t xml:space="preserve">"That sounds more like you. "</w:t>
+      </w:r>
+    </w:p>
+    <w:p>
+      <w:r>
+        <w:t xml:space="preserve">"It had labels. "</w:t>
+      </w:r>
+    </w:p>
+    <w:p>
+      <w:r>
+        <w:t xml:space="preserve">Kai smiled.</w:t>
+      </w:r>
+    </w:p>
+    <w:p>
+      <w:r>
+        <w:t xml:space="preserve">At the next crossing, the signal took too long. Mina watched the red figure on the pole and spoke without looking at him.</w:t>
+      </w:r>
+    </w:p>
+    <w:p>
+      <w:r>
+        <w:t xml:space="preserve">"The message was sent to you. Not Dr. Venn. Not the city. Not even Seo Jun, who knows the old maps. Whoever sent it expects you to behave like the person you were. "</w:t>
+      </w:r>
+    </w:p>
+    <w:p>
+      <w:r>
+        <w:t xml:space="preserve">"Cross the fence before dawn. "</w:t>
+      </w:r>
+    </w:p>
+    <w:p>
+      <w:r>
+        <w:t xml:space="preserve">"Touch the stone. Call the consequences destiny. "</w:t>
+      </w:r>
+    </w:p>
+    <w:p>
+      <w:r>
+        <w:t xml:space="preserve">His own thought, returned in her voice, stung more than accusation would have.</w:t>
+      </w:r>
+    </w:p>
+    <w:p>
+      <w:r>
+        <w:t xml:space="preserve">"I am not that person now. "</w:t>
+      </w:r>
+    </w:p>
+    <w:p>
+      <w:r>
+        <w:t xml:space="preserve">The crossing signal changed.</w:t>
+      </w:r>
+    </w:p>
+    <w:p>
+      <w:r>
+        <w:t xml:space="preserve">Mina stepped forward. "Then they are working from an old map too. "</w:t>
+      </w:r>
+    </w:p>
+    <w:p>
+      <w:r>
+        <w:t xml:space="preserve">At the community center, Han had covered two folding tables with printouts. The old building smelled of floor polish, instant coffee, and the onion broth someone was preparing in the kitchen. Dr. Venn stood at the far end with a magnifying glass he did not need but enjoyed using. Lena occupied the center like a commander of paper.</w:t>
+      </w:r>
+    </w:p>
+    <w:p>
+      <w:r>
+        <w:t xml:space="preserve">"Public records gave us forty-three former watershed maintenance sites in the greater district," she said. "Twelve have reeds. Seven are dry or seasonally dry. Four still have pre-privatization fencing. "</w:t>
+      </w:r>
+    </w:p>
+    <w:p>
+      <w:r>
+        <w:t xml:space="preserve">Rian arrived carrying a bag of buns from Mrs. Yoon.</w:t>
+      </w:r>
+    </w:p>
+    <w:p>
+      <w:r>
+        <w:t xml:space="preserve">"Please tell me none of the four is called Mouth Two. "</w:t>
+      </w:r>
+    </w:p>
+    <w:p>
+      <w:r>
+        <w:t xml:space="preserve">"Municipal engineers lacked your gift for making everything worse. "</w:t>
+      </w:r>
+    </w:p>
+    <w:p>
+      <w:r>
+        <w:t xml:space="preserve">"A neglected art. "</w:t>
+      </w:r>
+    </w:p>
+    <w:p>
+      <w:r>
+        <w:t xml:space="preserve">Seo Jun sat at the smaller table with Dr. Park, reviewing his statement line by line. His shoulders were rigid, but he was reading instead of merely signing. Kai counted that as a victory no System would reward.</w:t>
+      </w:r>
+    </w:p>
+    <w:p>
+      <w:r>
+        <w:t xml:space="preserve">Mina placed the photograph beside the four site images Lena had found.</w:t>
+      </w:r>
+    </w:p>
+    <w:p>
+      <w:r>
+        <w:t xml:space="preserve">One showed a concrete spillway under an expressway. One was a fenced retention basin behind new apartment towers. One lay beside a railway service road. The last was a former floodplain monitoring station at the edge of a reservoir that had been drained twenty years ago.</w:t>
+      </w:r>
+    </w:p>
+    <w:p>
+      <w:r>
+        <w:t xml:space="preserve">Dry reeds surrounded the last site.</w:t>
+      </w:r>
+    </w:p>
+    <w:p>
+      <w:r>
+        <w:t xml:space="preserve">A rusted post leaned near the remains of a fence.</w:t>
+      </w:r>
+    </w:p>
+    <w:p>
+      <w:r>
+        <w:t xml:space="preserve">The public archive photograph was six years old and taken in summer. No dark stone was visible. The ground where it should have stood disappeared beneath waist-high grass.</w:t>
+      </w:r>
+    </w:p>
+    <w:p>
+      <w:r>
+        <w:t xml:space="preserve">Lena tapped the label.</w:t>
+      </w:r>
+    </w:p>
+    <w:p>
+      <w:r>
+        <w:t xml:space="preserve">"West Haneul Retention Sector C. Closed after subsidence damaged the eastern service path. No active utilities. Ownership disputed between the city water office and the regional land trust. "</w:t>
+      </w:r>
+    </w:p>
+    <w:p>
+      <w:r>
+        <w:t xml:space="preserve">"Meaning no one checks it," Han said.</w:t>
+      </w:r>
+    </w:p>
+    <w:p>
+      <w:r>
+        <w:t xml:space="preserve">"Meaning everyone can explain why checking it belongs to someone else. "</w:t>
+      </w:r>
+    </w:p>
+    <w:p>
+      <w:r>
+        <w:t xml:space="preserve">Dr. Venn placed the magnifying glass over the fence post in the archive image. A yellow plate clung to it. The resolution was poor, but a black arc crossed the top.</w:t>
+      </w:r>
+    </w:p>
+    <w:p>
+      <w:r>
+        <w:t xml:space="preserve">No one spoke for several seconds.</w:t>
+      </w:r>
+    </w:p>
+    <w:p>
+      <w:r>
+        <w:t xml:space="preserve">The ember in Kai's chest brightened.</w:t>
+      </w:r>
+    </w:p>
+    <w:p>
+      <w:r>
+        <w:t xml:space="preserve">The System appeared.</w:t>
+      </w:r>
+    </w:p>
+    <w:p>
+      <w:r>
+        <w:t xml:space="preserve">[Related convergence site identified with moderate confidence.]</w:t>
+      </w:r>
+    </w:p>
+    <w:p>
+      <w:r>
+        <w:t xml:space="preserve">[Remote resonance detected.]</w:t>
+      </w:r>
+    </w:p>
+    <w:p>
+      <w:r>
+        <w:t xml:space="preserve">[Caution: detection may be reciprocal.]</w:t>
+      </w:r>
+    </w:p>
+    <w:p>
+      <w:r>
+        <w:t xml:space="preserve">Kai read the final line twice.</w:t>
+      </w:r>
+    </w:p>
+    <w:p>
+      <w:r>
+        <w:t xml:space="preserve">"It knows we found it," he said.</w:t>
+      </w:r>
+    </w:p>
+    <w:p>
+      <w:r>
+        <w:t xml:space="preserve">Rian set down the buns. "The stone? "</w:t>
+      </w:r>
+    </w:p>
+    <w:p>
+      <w:r>
+        <w:t xml:space="preserve">"Or whoever is listening through it," Mina said.</w:t>
+      </w:r>
+    </w:p>
+    <w:p>
+      <w:r>
+        <w:t xml:space="preserve">Dr. Venn lowered himself into a chair. "Do not decide those are different things yet. "</w:t>
+      </w:r>
+    </w:p>
+    <w:p>
+      <w:r>
+        <w:t xml:space="preserve">The lights flickered.</w:t>
+      </w:r>
+    </w:p>
+    <w:p>
+      <w:r>
+        <w:t xml:space="preserve">Every phone on the table lost its signal at the same time.</w:t>
+      </w:r>
+    </w:p>
+    <w:p>
+      <w:r>
+        <w:t xml:space="preserve">Lena looked at hers, then at Dr. Park's. The community center's old radio snapped into static in the kitchen. A woman preparing lunch called out that the breaker had gone strange.</w:t>
+      </w:r>
+    </w:p>
+    <w:p>
+      <w:r>
+        <w:t xml:space="preserve">Kai stood very still.</w:t>
+      </w:r>
+    </w:p>
+    <w:p>
+      <w:r>
+        <w:t xml:space="preserve">The signal loss lasted one breath.</w:t>
+      </w:r>
+    </w:p>
+    <w:p>
+      <w:r>
+        <w:t xml:space="preserve">Two.</w:t>
+      </w:r>
+    </w:p>
+    <w:p>
+      <w:r>
+        <w:t xml:space="preserve">Three.</w:t>
+      </w:r>
+    </w:p>
+    <w:p>
+      <w:r>
+        <w:t xml:space="preserve">Then the lights steadied. Phones reconnected in a chorus of small tones. The kitchen radio returned halfway through a weather report.</w:t>
+      </w:r>
+    </w:p>
+    <w:p>
+      <w:r>
+        <w:t xml:space="preserve">Nothing dramatic followed.</w:t>
+      </w:r>
+    </w:p>
+    <w:p>
+      <w:r>
+        <w:t xml:space="preserve">That made the interruption worse.</w:t>
+      </w:r>
+    </w:p>
+    <w:p>
+      <w:r>
+        <w:t xml:space="preserve">Lena unplugged her laptop from the center's network and closed every window except the files already saved offline.</w:t>
+      </w:r>
+    </w:p>
+    <w:p>
+      <w:r>
+        <w:t xml:space="preserve">"Reciprocal," she said.</w:t>
+      </w:r>
+    </w:p>
+    <w:p>
+      <w:r>
+        <w:t xml:space="preserve">Mina drew a box around the word.</w:t>
+      </w:r>
+    </w:p>
+    <w:p>
+      <w:r>
+        <w:t xml:space="preserve">Dr. Park called the city operations desk from a wired phone. There had been no district outage. No reported power fluctuation. No cell-service incident. Only the community center had blinked, and only after they named West Haneul.</w:t>
+      </w:r>
+    </w:p>
+    <w:p>
+      <w:r>
+        <w:t xml:space="preserve">Kai moved toward the window.</w:t>
+      </w:r>
+    </w:p>
+    <w:p>
+      <w:r>
+        <w:t xml:space="preserve">Outside, winter had not returned. Sunlight lay across the steps. An old man practiced slow stretches near the garden wall. Two teenagers argued over a bicycle. Nothing waited among the parked cars.</w:t>
+      </w:r>
+    </w:p>
+    <w:p>
+      <w:r>
+        <w:t xml:space="preserve">He let Lantern Breath settle through his ribs.</w:t>
+      </w:r>
+    </w:p>
+    <w:p>
+      <w:r>
+        <w:t xml:space="preserve">Warmth inward.</w:t>
+      </w:r>
+    </w:p>
+    <w:p>
+      <w:r>
+        <w:t xml:space="preserve">Warmth outward.</w:t>
+      </w:r>
+    </w:p>
+    <w:p>
+      <w:r>
+        <w:t xml:space="preserve">Listen without reaching.</w:t>
+      </w:r>
+    </w:p>
+    <w:p>
+      <w:r>
+        <w:t xml:space="preserve">For a moment, he heard the Ruins far beneath the city, one low held note. Beyond it, at the edge of perception, another note answered from a greater distance. Colder. Thinner. Interrupted by something that pulsed in precise intervals.</w:t>
+      </w:r>
+    </w:p>
+    <w:p>
+      <w:r>
+        <w:t xml:space="preserve">Three short.</w:t>
+      </w:r>
+    </w:p>
+    <w:p>
+      <w:r>
+        <w:t xml:space="preserve">One long.</w:t>
+      </w:r>
+    </w:p>
+    <w:p>
+      <w:r>
+        <w:t xml:space="preserve">Three short.</w:t>
+      </w:r>
+    </w:p>
+    <w:p>
+      <w:r>
+        <w:t xml:space="preserve">Not a song.</w:t>
+      </w:r>
+    </w:p>
+    <w:p>
+      <w:r>
+        <w:t xml:space="preserve">A signal.</w:t>
+      </w:r>
+    </w:p>
+    <w:p>
+      <w:r>
+        <w:t xml:space="preserve">Kai opened his eyes.</w:t>
+      </w:r>
+    </w:p>
+    <w:p>
+      <w:r>
+        <w:t xml:space="preserve">"The second site is not silent. "</w:t>
+      </w:r>
+    </w:p>
+    <w:p>
+      <w:r>
+        <w:t xml:space="preserve">Mina had already turned to a clean page. "What did you hear? "</w:t>
+      </w:r>
+    </w:p>
+    <w:p>
+      <w:r>
+        <w:t xml:space="preserve">He tapped the rhythm on the table.</w:t>
+      </w:r>
+    </w:p>
+    <w:p>
+      <w:r>
+        <w:t xml:space="preserve">Three short. One long. Three short.</w:t>
+      </w:r>
+    </w:p>
+    <w:p>
+      <w:r>
+        <w:t xml:space="preserve">Seo Jun's chair scraped back.</w:t>
+      </w:r>
+    </w:p>
+    <w:p>
+      <w:r>
+        <w:t xml:space="preserve">His signed statement lay forgotten under one hand.</w:t>
+      </w:r>
+    </w:p>
+    <w:p>
+      <w:r>
+        <w:t xml:space="preserve">"That was the old field check," he said. "North River crews used it when radios failed underground. Three taps, pause, one tap, pause, three taps. It meant a person was present and needed acknowledgment. "</w:t>
+      </w:r>
+    </w:p>
+    <w:p>
+      <w:r>
+        <w:t xml:space="preserve">"A rescue signal? " Han asked.</w:t>
+      </w:r>
+    </w:p>
+    <w:p>
+      <w:r>
+        <w:t xml:space="preserve">"Not exactly. It meant do not energize the line. Someone is inside. "</w:t>
+      </w:r>
+    </w:p>
+    <w:p>
+      <w:r>
+        <w:t xml:space="preserve">The room changed around the words.</w:t>
+      </w:r>
+    </w:p>
+    <w:p>
+      <w:r>
+        <w:t xml:space="preserve">The stone in the photograph stopped being only an object. The frost ring stopped being only proof of another convergence site. Someone is inside could mean a person trapped in a buried channel. It could mean an old instruction occupying the network. It could mean the sender wanted them to believe either one.</w:t>
+      </w:r>
+    </w:p>
+    <w:p>
+      <w:r>
+        <w:t xml:space="preserve">Kai felt the hunger to move sharpen into urgency.</w:t>
+      </w:r>
+    </w:p>
+    <w:p>
+      <w:r>
+        <w:t xml:space="preserve">Urgency was more dangerous than curiosity because it could wear another person's face.</w:t>
+      </w:r>
+    </w:p>
+    <w:p>
+      <w:r>
+        <w:t xml:space="preserve">"We still do not go today," he said.</w:t>
+      </w:r>
+    </w:p>
+    <w:p>
+      <w:r>
+        <w:t xml:space="preserve">Rian studied him. "You sure? "</w:t>
+      </w:r>
+    </w:p>
+    <w:p>
+      <w:r>
+        <w:t xml:space="preserve">"No. "</w:t>
+      </w:r>
+    </w:p>
+    <w:p>
+      <w:r>
+        <w:t xml:space="preserve">The honest answer loosened something in the room.</w:t>
+      </w:r>
+    </w:p>
+    <w:p>
+      <w:r>
+        <w:t xml:space="preserve">Kai looked at Dr. Park. "But we can ask the nearest local authority to secure the road without entering the site. We can check missing-person reports. We can find out whether anyone has legally accessed West Haneul. We can prepare. "</w:t>
+      </w:r>
+    </w:p>
+    <w:p>
+      <w:r>
+        <w:t xml:space="preserve">Mina added each item to the page.</w:t>
+      </w:r>
+    </w:p>
+    <w:p>
+      <w:r>
+        <w:t xml:space="preserve">Dr. Park nodded. "I can request a perimeter inspection under the subsidence order. No approach to the central ground. No excavation. "</w:t>
+      </w:r>
+    </w:p>
+    <w:p>
+      <w:r>
+        <w:t xml:space="preserve">"And no mention of Kai," Lena said. "The sender already knows his number. We do not give them his travel plan too. "</w:t>
+      </w:r>
+    </w:p>
+    <w:p>
+      <w:r>
+        <w:t xml:space="preserve">Han distributed the buns because fear became less persuasive when people had to chew. Mrs. Yoon had packed six, then apparently reconsidered the nature of their group and packed twelve. They ate around the maps.</w:t>
+      </w:r>
+    </w:p>
+    <w:p>
+      <w:r>
+        <w:t xml:space="preserve">Preparation took the rest of the afternoon.</w:t>
+      </w:r>
+    </w:p>
+    <w:p>
+      <w:r>
+        <w:t xml:space="preserve">The regional office confirmed the road to West Haneul was technically closed but often used by fishermen. No maintenance crew had signed in for nine months. No missing-person report directly named the reservoir. Two hikers had reported hearing metal strikes near the old floodplain the previous week, but the note had been filed as probable construction noise.</w:t>
+      </w:r>
+    </w:p>
+    <w:p>
+      <w:r>
+        <w:t xml:space="preserve">There was no active construction within four kilometers.</w:t>
+      </w:r>
+    </w:p>
+    <w:p>
+      <w:r>
+        <w:t xml:space="preserve">Dr. Venn built a sensor list. Mina turned the Ruins return conditions into a second-site approach protocol. Han checked the van, then rejected the van because its North River incident damage made it too recognizable. Rian borrowed his aunt's old minibus after promising not to explain why until the promise became impossible to keep.</w:t>
+      </w:r>
+    </w:p>
+    <w:p>
+      <w:r>
+        <w:t xml:space="preserve">Lena prepared three copies of every map, one digital, one printed, one left with Dr. Park. Seo Jun marked the routes he remembered from the archive overlays. He refused to join the first approach.</w:t>
+      </w:r>
+    </w:p>
+    <w:p>
+      <w:r>
+        <w:t xml:space="preserve">No one tried to shame him into changing his mind.</w:t>
+      </w:r>
+    </w:p>
+    <w:p>
+      <w:r>
+        <w:t xml:space="preserve">"I can help from here," he said. "If Vale built this invitation from old North River files, he may expect me to lead you. I do not want to make his prediction true. "</w:t>
+      </w:r>
+    </w:p>
+    <w:p>
+      <w:r>
+        <w:t xml:space="preserve">Kai understood.</w:t>
+      </w:r>
+    </w:p>
+    <w:p>
+      <w:r>
+        <w:t xml:space="preserve">Choosing where not to stand could be a form of witness too.</w:t>
+      </w:r>
+    </w:p>
+    <w:p>
+      <w:r>
+        <w:t xml:space="preserve">By sunset, the plan occupied an entire wall.</w:t>
+      </w:r>
+    </w:p>
+    <w:p>
+      <w:r>
+        <w:t xml:space="preserve">They would leave after sunrise, not before. Dr. Park would coordinate with the regional office. Two civil engineers would inspect the closed road and subsidence boundary. Kai, Mina, Rian, Han, Dr. Venn, and Lena would stop at the outer fence. No one would cross until the site was photographed, measured, and listened to from outside. If the frost appeared beyond the stone, they withdrew. If any communication failed, they withdrew. If Kai's System issued a forced-contact warning, they withdrew.</w:t>
+      </w:r>
+    </w:p>
+    <w:p>
+      <w:r>
+        <w:t xml:space="preserve">"If the stone asks politely? " Rian said.</w:t>
+      </w:r>
+    </w:p>
+    <w:p>
+      <w:r>
+        <w:t xml:space="preserve">Mina did not look up. "We still withdraw. "</w:t>
+      </w:r>
+    </w:p>
+    <w:p>
+      <w:r>
+        <w:t xml:space="preserve">"Good. I wanted to clarify how much manners matter to geology. "</w:t>
+      </w:r>
+    </w:p>
+    <w:p>
+      <w:r>
+        <w:t xml:space="preserve">Kai added one condition himself.</w:t>
+      </w:r>
+    </w:p>
+    <w:p>
+      <w:r>
+        <w:t xml:space="preserve">No one enters because the signal sounds human.</w:t>
+      </w:r>
+    </w:p>
+    <w:p>
+      <w:r>
+        <w:t xml:space="preserve">He wrote it slowly.</w:t>
+      </w:r>
+    </w:p>
+    <w:p>
+      <w:r>
+        <w:t xml:space="preserve">The sentence felt cruel until he understood its purpose. If someone was truly trapped, charging blind into unstable ground would not save them. They would locate, confirm, call trained rescue crews, and keep the network from turning compassion into a lever.</w:t>
+      </w:r>
+    </w:p>
+    <w:p>
+      <w:r>
+        <w:t xml:space="preserve">Mina read the condition twice. Then she drew a line beneath it and added another.</w:t>
+      </w:r>
+    </w:p>
+    <w:p>
+      <w:r>
+        <w:t xml:space="preserve">No one is left alone with the decision to enter.</w:t>
+      </w:r>
+    </w:p>
+    <w:p>
+      <w:r>
+        <w:t xml:space="preserve">Kai looked at her.</w:t>
+      </w:r>
+    </w:p>
+    <w:p>
+      <w:r>
+        <w:t xml:space="preserve">"That includes you," she said.</w:t>
+      </w:r>
+    </w:p>
+    <w:p>
+      <w:r>
+        <w:t xml:space="preserve">He almost answered that the System belonged to him, that its warnings arrived behind his eyes, that some choices could not be shared. The old argument rose easily because he had practiced it for years. Then he looked around the room. At Rian checking the withdrawal routes. At Han counting emergency lamps. At Lena sealing maps in clear sleeves. At Dr. Venn labeling sensors with hands that had finally stopped trembling. None of them could see the System, but all of them had learned how to answer what it asked of him.</w:t>
+      </w:r>
+    </w:p>
+    <w:p>
+      <w:r>
+        <w:t xml:space="preserve">"It includes me," Kai said.</w:t>
+      </w:r>
+    </w:p>
+    <w:p>
+      <w:r>
+        <w:t xml:space="preserve">Mina nodded and handed him the pen.</w:t>
+      </w:r>
+    </w:p>
+    <w:p>
+      <w:r>
+        <w:t xml:space="preserve">He initialed both conditions. One by one, the others did the same. The page became more than a list. It became a promise with six different handwritings, uneven and ordinary and strong because no single person owned it.</w:t>
+      </w:r>
+    </w:p>
+    <w:p>
+      <w:r>
+        <w:t xml:space="preserve">The old Kai would have hated the condition.</w:t>
+      </w:r>
+    </w:p>
+    <w:p>
+      <w:r>
+        <w:t xml:space="preserve">The person he was becoming needed it.</w:t>
+      </w:r>
+    </w:p>
+    <w:p>
+      <w:r>
+        <w:t xml:space="preserve">They left the community center after dark. The temperature had fallen, but no frost marked the steps. Kai walked home with Mina and Rian. For once, Rian did not fill the silence. The city lights shone on damp streets. Somewhere behind them, the Ruins waited under official seals and quiet sensors.</w:t>
+      </w:r>
+    </w:p>
+    <w:p>
+      <w:r>
+        <w:t xml:space="preserve">Kai's phone buzzed as they reached his building.</w:t>
+      </w:r>
+    </w:p>
+    <w:p>
+      <w:r>
+        <w:t xml:space="preserve">Unknown number.</w:t>
+      </w:r>
+    </w:p>
+    <w:p>
+      <w:r>
+        <w:t xml:space="preserve">Mina saw the screen and stopped. Rian moved close enough to read without asking.</w:t>
+      </w:r>
+    </w:p>
+    <w:p>
+      <w:r>
+        <w:t xml:space="preserve">This message contained no photograph.</w:t>
+      </w:r>
+    </w:p>
+    <w:p>
+      <w:r>
+        <w:t xml:space="preserve">It contained an audio file, seven seconds long.</w:t>
+      </w:r>
+    </w:p>
+    <w:p>
+      <w:r>
+        <w:t xml:space="preserve">Lena had told them not to open anything from the sender without isolating the device. Kai obeyed. They went upstairs, placed the phone inside the small offline enclosure she had given him, and called her from Mina's phone. Twenty minutes later, Lena arrived with Han and a laptop that had never touched the internet.</w:t>
+      </w:r>
+    </w:p>
+    <w:p>
+      <w:r>
+        <w:t xml:space="preserve">She transferred the file through a one-way adapter and examined it.</w:t>
+      </w:r>
+    </w:p>
+    <w:p>
+      <w:r>
+        <w:t xml:space="preserve">"No obvious executable payload," she said. "No metadata worth trusting. The waveform is simple. "</w:t>
+      </w:r>
+    </w:p>
+    <w:p>
+      <w:r>
+        <w:t xml:space="preserve">"Simple has been having a difficult week," Rian said.</w:t>
+      </w:r>
+    </w:p>
+    <w:p>
+      <w:r>
+        <w:t xml:space="preserve">Lena played the recording through a cheap speaker.</w:t>
+      </w:r>
+    </w:p>
+    <w:p>
+      <w:r>
+        <w:t xml:space="preserve">Wind moved through dry reeds.</w:t>
+      </w:r>
+    </w:p>
+    <w:p>
+      <w:r>
+        <w:t xml:space="preserve">Then came the taps.</w:t>
+      </w:r>
+    </w:p>
+    <w:p>
+      <w:r>
+        <w:t xml:space="preserve">Three short.</w:t>
+      </w:r>
+    </w:p>
+    <w:p>
+      <w:r>
+        <w:t xml:space="preserve">One long.</w:t>
+      </w:r>
+    </w:p>
+    <w:p>
+      <w:r>
+        <w:t xml:space="preserve">Three short.</w:t>
+      </w:r>
+    </w:p>
+    <w:p>
+      <w:r>
+        <w:t xml:space="preserve">A pause followed.</w:t>
+      </w:r>
+    </w:p>
+    <w:p>
+      <w:r>
+        <w:t xml:space="preserve">Under the wind, so faint they almost missed it, someone breathed.</w:t>
+      </w:r>
+    </w:p>
+    <w:p>
+      <w:r>
+        <w:t xml:space="preserve">Kai leaned closer.</w:t>
+      </w:r>
+    </w:p>
+    <w:p>
+      <w:r>
+        <w:t xml:space="preserve">The ember flared hard enough to hurt.</w:t>
+      </w:r>
+    </w:p>
+    <w:p>
+      <w:r>
+        <w:t xml:space="preserve">The System filled his vision.</w:t>
+      </w:r>
+    </w:p>
+    <w:p>
+      <w:r>
+        <w:t xml:space="preserve">[Witness pattern confirmed.]</w:t>
+      </w:r>
+    </w:p>
+    <w:p>
+      <w:r>
+        <w:t xml:space="preserve">[Second convergence mouth is occupied.]</w:t>
+      </w:r>
+    </w:p>
+    <w:p>
+      <w:r>
+        <w:t xml:space="preserve">[Occupant state: unresolved.]</w:t>
+      </w:r>
+    </w:p>
+    <w:p>
+      <w:r>
+        <w:t xml:space="preserve">[Warning: first mouth has begun answering.]</w:t>
+      </w:r>
+    </w:p>
+    <w:p>
+      <w:r>
+        <w:t xml:space="preserve">Every light in the apartment went out.</w:t>
+      </w:r>
+    </w:p>
+    <w:p>
+      <w:r>
+        <w:t xml:space="preserve">In the darkness beneath the city, too low for the speaker and too near to be West Haneul, the Ruins struck back.</w:t>
+      </w:r>
+    </w:p>
+    <w:p>
+      <w:r>
+        <w:t xml:space="preserve">Three short.</w:t>
+      </w:r>
+    </w:p>
+    <w:p>
+      <w:r>
+        <w:t xml:space="preserve">One long.</w:t>
+      </w:r>
+    </w:p>
+    <w:p>
+      <w:r>
+        <w:t xml:space="preserve">Three short.</w:t>
       </w:r>
     </w:p>
     <w:sectPr>

</xml_diff>

<commit_message>
Add Heavenly Ascension System Chapter 60: The Name Beneath West Haneul
</commit_message>
<xml_diff>
--- a/Heavenly Ascension System.docx
+++ b/Heavenly Ascension System.docx
@@ -42633,6 +42633,1439 @@
     <w:p>
       <w:r>
         <w:t xml:space="preserve">Three short.</w:t>
+      </w:r>
+    </w:p>
+    <w:p>
+      <w:pPr>
+        <w:pStyle w:val="Heading1"/>
+      </w:pPr>
+      <w:r>
+        <w:t xml:space="preserve">Chapter 60: The Name Beneath West Haneul</w:t>
+      </w:r>
+    </w:p>
+    <w:p>
+      <w:r>
+        <w:t xml:space="preserve">The minibus smelled like old vinyl, peppermint gum, and every family trip Rian had ever been forced to survive.</w:t>
+      </w:r>
+    </w:p>
+    <w:p>
+      <w:r>
+        <w:t xml:space="preserve">"My aunt says the left window sticks," he told them as Han guided the vehicle out of the city. "She also says the heater only works when insulted. I have not tested whether the insults need to be sincere. "</w:t>
+      </w:r>
+    </w:p>
+    <w:p>
+      <w:r>
+        <w:t xml:space="preserve">"Please do not antagonize the only climate control we have," Dr. Venn said.</w:t>
+      </w:r>
+    </w:p>
+    <w:p>
+      <w:r>
+        <w:t xml:space="preserve">Morning had barely cleared the rooftops. They had left after sunrise, exactly as the plan required. No dramatic departure. No secret road taken before anyone could object. Dr. Park had watched them load the equipment and checked every name against the approach authorization. Two civil engineers were already waiting near the closed service road. Seo Jun remained at the community center with copies of the old overlays and a phone line that did not depend on the minibus having signal.</w:t>
+      </w:r>
+    </w:p>
+    <w:p>
+      <w:r>
+        <w:t xml:space="preserve">Kai sat beside Mina in the second row.</w:t>
+      </w:r>
+    </w:p>
+    <w:p>
+      <w:r>
+        <w:t xml:space="preserve">Between them rested the signed protocol in a clear sleeve. Six sets of initials marked the final page. No one enters because the signal sounds human. No one is left alone with the decision to enter.</w:t>
+      </w:r>
+    </w:p>
+    <w:p>
+      <w:r>
+        <w:t xml:space="preserve">The words looked smaller in daylight.</w:t>
+      </w:r>
+    </w:p>
+    <w:p>
+      <w:r>
+        <w:t xml:space="preserve">They did not feel smaller.</w:t>
+      </w:r>
+    </w:p>
+    <w:p>
+      <w:r>
+        <w:t xml:space="preserve">Lena occupied the back row with three sealed cases and a laptop that had never connected to the community center network. Dr. Venn held the sensor crate on his knees despite Han's repeated assurance that it would not slide. Rian sat in front and read road signs aloud with the grave authority of a navigator who had contributed nothing to the route.</w:t>
+      </w:r>
+    </w:p>
+    <w:p>
+      <w:r>
+        <w:t xml:space="preserve">The city thinned around them.</w:t>
+      </w:r>
+    </w:p>
+    <w:p>
+      <w:r>
+        <w:t xml:space="preserve">Apartment towers gave way to repair yards, then low warehouses, then fields winter had pressed flat. The farther east they drove, the more often old drainage channels appeared beside the road. Some carried water. Others held weeds, discarded bottles, and the pale scars of currents diverted decades ago.</w:t>
+      </w:r>
+    </w:p>
+    <w:p>
+      <w:r>
+        <w:t xml:space="preserve">Kai listened without reaching.</w:t>
+      </w:r>
+    </w:p>
+    <w:p>
+      <w:r>
+        <w:t xml:space="preserve">Lantern Breath moved through him in its smallest cycle.</w:t>
+      </w:r>
+    </w:p>
+    <w:p>
+      <w:r>
+        <w:t xml:space="preserve">Warmth inward.</w:t>
+      </w:r>
+    </w:p>
+    <w:p>
+      <w:r>
+        <w:t xml:space="preserve">Warmth outward.</w:t>
+      </w:r>
+    </w:p>
+    <w:p>
+      <w:r>
+        <w:t xml:space="preserve">The Ruins remained behind them, but its answer traveled beneath the city and into the old watershed lines. Three short. One long. Three short. The pattern did not repeat continuously. It waited, sometimes for minutes, before striking again through stone and buried pipe.</w:t>
+      </w:r>
+    </w:p>
+    <w:p>
+      <w:r>
+        <w:t xml:space="preserve">West Haneul answered from ahead.</w:t>
+      </w:r>
+    </w:p>
+    <w:p>
+      <w:r>
+        <w:t xml:space="preserve">Its rhythm was weaker.</w:t>
+      </w:r>
+    </w:p>
+    <w:p>
+      <w:r>
+        <w:t xml:space="preserve">Not quieter. Tired.</w:t>
+      </w:r>
+    </w:p>
+    <w:p>
+      <w:r>
+        <w:t xml:space="preserve">The System appeared near the edge of his vision.</w:t>
+      </w:r>
+    </w:p>
+    <w:p>
+      <w:r>
+        <w:t xml:space="preserve">[Dual convergence communication persists.]</w:t>
+      </w:r>
+    </w:p>
+    <w:p>
+      <w:r>
+        <w:t xml:space="preserve">[Second mouth occupant signal degraded by 4.2 percent since prior observation.]</w:t>
+      </w:r>
+    </w:p>
+    <w:p>
+      <w:r>
+        <w:t xml:space="preserve">[Recommendation: maintain witness distance.]</w:t>
+      </w:r>
+    </w:p>
+    <w:p>
+      <w:r>
+        <w:t xml:space="preserve">Kai read the last line twice.</w:t>
+      </w:r>
+    </w:p>
+    <w:p>
+      <w:r>
+        <w:t xml:space="preserve">"The signal is weakening," he said.</w:t>
+      </w:r>
+    </w:p>
+    <w:p>
+      <w:r>
+        <w:t xml:space="preserve">Mina's hand moved toward the protocol, then stopped on top of the sleeve. "Weakening does not change the approach conditions. "</w:t>
+      </w:r>
+    </w:p>
+    <w:p>
+      <w:r>
+        <w:t xml:space="preserve">"I know. "</w:t>
+      </w:r>
+    </w:p>
+    <w:p>
+      <w:r>
+        <w:t xml:space="preserve">"I know you know. "</w:t>
+      </w:r>
+    </w:p>
+    <w:p>
+      <w:r>
+        <w:t xml:space="preserve">Rian turned in his seat. "For the record, I also know that he knows, and I dislike how much knowing is happening before breakfast. "</w:t>
+      </w:r>
+    </w:p>
+    <w:p>
+      <w:r>
+        <w:t xml:space="preserve">Han passed him a wrapped rice roll without taking his eyes from the road.</w:t>
+      </w:r>
+    </w:p>
+    <w:p>
+      <w:r>
+        <w:t xml:space="preserve">"Eat. "</w:t>
+      </w:r>
+    </w:p>
+    <w:p>
+      <w:r>
+        <w:t xml:space="preserve">Rian obeyed, which was how Kai knew he was worried.</w:t>
+      </w:r>
+    </w:p>
+    <w:p>
+      <w:r>
+        <w:t xml:space="preserve">The road to West Haneul ended at a red steel barrier whose paint had faded to pink. Beyond it, cracked pavement curved through low hills covered in dry grass. A regional utility truck stood on the shoulder. Two engineers in orange vests waited beside it with Dr. Park's authorization open on a tablet.</w:t>
+      </w:r>
+    </w:p>
+    <w:p>
+      <w:r>
+        <w:t xml:space="preserve">No one crossed immediately.</w:t>
+      </w:r>
+    </w:p>
+    <w:p>
+      <w:r>
+        <w:t xml:space="preserve">Lena photographed the barrier, the road, both vehicles, the engineers, and the time displayed on three separate devices. Han checked the return route. Dr. Venn calibrated the passive sensors on the public side of the barrier. Mina read the first-stage conditions aloud.</w:t>
+      </w:r>
+    </w:p>
+    <w:p>
+      <w:r>
+        <w:t xml:space="preserve">"Outer road stable. Regional authority present. Weather dry. Public attention low. Communications active. No unplanned personnel. "</w:t>
+      </w:r>
+    </w:p>
+    <w:p>
+      <w:r>
+        <w:t xml:space="preserve">She looked at each of them in turn.</w:t>
+      </w:r>
+    </w:p>
+    <w:p>
+      <w:r>
+        <w:t xml:space="preserve">"Any objection to proceeding to the subsidence boundary? "</w:t>
+      </w:r>
+    </w:p>
+    <w:p>
+      <w:r>
+        <w:t xml:space="preserve">No one objected.</w:t>
+      </w:r>
+    </w:p>
+    <w:p>
+      <w:r>
+        <w:t xml:space="preserve">The engineers unlocked the barrier.</w:t>
+      </w:r>
+    </w:p>
+    <w:p>
+      <w:r>
+        <w:t xml:space="preserve">They took the minibus because the road remained drivable and because no one wanted to leave Rian's aunt's vehicle beside an empty highway with the keys inside. The utility truck led. Han kept two car lengths behind it. Dust rose in pale sheets and settled over the weeds.</w:t>
+      </w:r>
+    </w:p>
+    <w:p>
+      <w:r>
+        <w:t xml:space="preserve">The old reservoir appeared gradually.</w:t>
+      </w:r>
+    </w:p>
+    <w:p>
+      <w:r>
+        <w:t xml:space="preserve">First came the concrete height markers standing uselessly above dry ground. Then the remains of a boat ramp descending into reeds. Finally the basin opened before them, wide and shallow, its center filled with gray grass that moved under no visible wind.</w:t>
+      </w:r>
+    </w:p>
+    <w:p>
+      <w:r>
+        <w:t xml:space="preserve">West Haneul had not held water in twenty years.</w:t>
+      </w:r>
+    </w:p>
+    <w:p>
+      <w:r>
+        <w:t xml:space="preserve">It still looked drowned.</w:t>
+      </w:r>
+    </w:p>
+    <w:p>
+      <w:r>
+        <w:t xml:space="preserve">Kai felt pressure build behind his ribs.</w:t>
+      </w:r>
+    </w:p>
+    <w:p>
+      <w:r>
+        <w:t xml:space="preserve">The ember warmed, then cooled so sharply his breath caught.</w:t>
+      </w:r>
+    </w:p>
+    <w:p>
+      <w:r>
+        <w:t xml:space="preserve">[Related convergence site confirmed.]</w:t>
+      </w:r>
+    </w:p>
+    <w:p>
+      <w:r>
+        <w:t xml:space="preserve">[Local thermal inversion active.]</w:t>
+      </w:r>
+    </w:p>
+    <w:p>
+      <w:r>
+        <w:t xml:space="preserve">[Occupant signal below surface.]</w:t>
+      </w:r>
+    </w:p>
+    <w:p>
+      <w:r>
+        <w:t xml:space="preserve">Han stopped at the marked subsidence boundary.</w:t>
+      </w:r>
+    </w:p>
+    <w:p>
+      <w:r>
+        <w:t xml:space="preserve">Everyone got out.</w:t>
+      </w:r>
+    </w:p>
+    <w:p>
+      <w:r>
+        <w:t xml:space="preserve">No one approached the reeds.</w:t>
+      </w:r>
+    </w:p>
+    <w:p>
+      <w:r>
+        <w:t xml:space="preserve">The regional engineers set orange cones along the stable pavement. One of them, Engineer Bae, pointed toward a depression near the eastern service path. "The ground dropped forty centimeters after the last heavy rain. We measured no further movement this morning. The old monitoring station is beyond that fence line. "</w:t>
+      </w:r>
+    </w:p>
+    <w:p>
+      <w:r>
+        <w:t xml:space="preserve">The rusted post from the photograph leaned exactly where Lena had predicted.</w:t>
+      </w:r>
+    </w:p>
+    <w:p>
+      <w:r>
+        <w:t xml:space="preserve">Its yellow plate remained attached.</w:t>
+      </w:r>
+    </w:p>
+    <w:p>
+      <w:r>
+        <w:t xml:space="preserve">A black arc crossed the top. Beneath it, hidden in the cropped message, were three faded characters.</w:t>
+      </w:r>
+    </w:p>
+    <w:p>
+      <w:r>
+        <w:t xml:space="preserve">WM-C.</w:t>
+      </w:r>
+    </w:p>
+    <w:p>
+      <w:r>
+        <w:t xml:space="preserve">Mina photographed it from behind the subsidence line.</w:t>
+      </w:r>
+    </w:p>
+    <w:p>
+      <w:r>
+        <w:t xml:space="preserve">"No frost," Rian said.</w:t>
+      </w:r>
+    </w:p>
+    <w:p>
+      <w:r>
+        <w:t xml:space="preserve">Dr. Venn looked at the thermometer in his hand. "Surface temperature is six degrees below the road. "</w:t>
+      </w:r>
+    </w:p>
+    <w:p>
+      <w:r>
+        <w:t xml:space="preserve">"So invisible frost. Worse for branding. "</w:t>
+      </w:r>
+    </w:p>
+    <w:p>
+      <w:r>
+        <w:t xml:space="preserve">"Rian. "</w:t>
+      </w:r>
+    </w:p>
+    <w:p>
+      <w:r>
+        <w:t xml:space="preserve">"Eating did not fix it. "</w:t>
+      </w:r>
+    </w:p>
+    <w:p>
+      <w:r>
+        <w:t xml:space="preserve">Lena raised one hand.</w:t>
+      </w:r>
+    </w:p>
+    <w:p>
+      <w:r>
+        <w:t xml:space="preserve">Everyone fell quiet.</w:t>
+      </w:r>
+    </w:p>
+    <w:p>
+      <w:r>
+        <w:t xml:space="preserve">From somewhere among the reeds came three metallic taps.</w:t>
+      </w:r>
+    </w:p>
+    <w:p>
+      <w:r>
+        <w:t xml:space="preserve">Short.</w:t>
+      </w:r>
+    </w:p>
+    <w:p>
+      <w:r>
+        <w:t xml:space="preserve">Short.</w:t>
+      </w:r>
+    </w:p>
+    <w:p>
+      <w:r>
+        <w:t xml:space="preserve">Short.</w:t>
+      </w:r>
+    </w:p>
+    <w:p>
+      <w:r>
+        <w:t xml:space="preserve">A pause.</w:t>
+      </w:r>
+    </w:p>
+    <w:p>
+      <w:r>
+        <w:t xml:space="preserve">One long strike.</w:t>
+      </w:r>
+    </w:p>
+    <w:p>
+      <w:r>
+        <w:t xml:space="preserve">A pause.</w:t>
+      </w:r>
+    </w:p>
+    <w:p>
+      <w:r>
+        <w:t xml:space="preserve">Three short.</w:t>
+      </w:r>
+    </w:p>
+    <w:p>
+      <w:r>
+        <w:t xml:space="preserve">The sound was not loud. The basin made it difficult to locate. Echoes moved through abandoned culverts and returned from the old spillway.</w:t>
+      </w:r>
+    </w:p>
+    <w:p>
+      <w:r>
+        <w:t xml:space="preserve">Kai's body moved before his feet did. Every muscle leaned toward the sound.</w:t>
+      </w:r>
+    </w:p>
+    <w:p>
+      <w:r>
+        <w:t xml:space="preserve">Mina touched the clear sleeve between them.</w:t>
+      </w:r>
+    </w:p>
+    <w:p>
+      <w:r>
+        <w:t xml:space="preserve">Not him.</w:t>
+      </w:r>
+    </w:p>
+    <w:p>
+      <w:r>
+        <w:t xml:space="preserve">The protocol.</w:t>
+      </w:r>
+    </w:p>
+    <w:p>
+      <w:r>
+        <w:t xml:space="preserve">Kai let his weight settle backward.</w:t>
+      </w:r>
+    </w:p>
+    <w:p>
+      <w:r>
+        <w:t xml:space="preserve">"Signal confirmed from beyond the stable boundary," Lena said for the audio record. "No visual contact. No approach initiated. "</w:t>
+      </w:r>
+    </w:p>
+    <w:p>
+      <w:r>
+        <w:t xml:space="preserve">Engineer Bae stared at the reeds. "There should not be any metal structure left in that section. The monitoring shed was removed. "</w:t>
+      </w:r>
+    </w:p>
+    <w:p>
+      <w:r>
+        <w:t xml:space="preserve">"Was the underground access removed? " Han asked.</w:t>
+      </w:r>
+    </w:p>
+    <w:p>
+      <w:r>
+        <w:t xml:space="preserve">The engineer looked at the old plan. "The report says sealed. "</w:t>
+      </w:r>
+    </w:p>
+    <w:p>
+      <w:r>
+        <w:t xml:space="preserve">"Reports say many things," Lena said.</w:t>
+      </w:r>
+    </w:p>
+    <w:p>
+      <w:r>
+        <w:t xml:space="preserve">Dr. Venn placed three passive receivers along the pavement. The first recorded the air. The second pressed against the concrete curb. The third connected to an abandoned inspection pipe that Engineer Bae confirmed was safe to touch.</w:t>
+      </w:r>
+    </w:p>
+    <w:p>
+      <w:r>
+        <w:t xml:space="preserve">The next signal traveled strongest through the pipe.</w:t>
+      </w:r>
+    </w:p>
+    <w:p>
+      <w:r>
+        <w:t xml:space="preserve">Three short.</w:t>
+      </w:r>
+    </w:p>
+    <w:p>
+      <w:r>
+        <w:t xml:space="preserve">One long.</w:t>
+      </w:r>
+    </w:p>
+    <w:p>
+      <w:r>
+        <w:t xml:space="preserve">Three short.</w:t>
+      </w:r>
+    </w:p>
+    <w:p>
+      <w:r>
+        <w:t xml:space="preserve">Then two weak taps.</w:t>
+      </w:r>
+    </w:p>
+    <w:p>
+      <w:r>
+        <w:t xml:space="preserve">Seo Jun heard the recording from the community center.</w:t>
+      </w:r>
+    </w:p>
+    <w:p>
+      <w:r>
+        <w:t xml:space="preserve">His voice came through the speaker. "The last two are not part of the field check. Play them again. "</w:t>
+      </w:r>
+    </w:p>
+    <w:p>
+      <w:r>
+        <w:t xml:space="preserve">Lena did.</w:t>
+      </w:r>
+    </w:p>
+    <w:p>
+      <w:r>
+        <w:t xml:space="preserve">Silence followed.</w:t>
+      </w:r>
+    </w:p>
+    <w:p>
+      <w:r>
+        <w:t xml:space="preserve">"Those are response positions," Seo Jun said. "Old crews identified tunnel branches by adding a number after the presence signal. Two taps means eastern auxiliary line. "</w:t>
+      </w:r>
+    </w:p>
+    <w:p>
+      <w:r>
+        <w:t xml:space="preserve">Engineer Bae enlarged the archive plan. "There is no eastern auxiliary line. "</w:t>
+      </w:r>
+    </w:p>
+    <w:p>
+      <w:r>
+        <w:t xml:space="preserve">"There was when the watershed maps were drawn," Seo Jun replied.</w:t>
+      </w:r>
+    </w:p>
+    <w:p>
+      <w:r>
+        <w:t xml:space="preserve">Mina leaned over the paper without crossing the cones. "Could it connect to the monitoring station? "</w:t>
+      </w:r>
+    </w:p>
+    <w:p>
+      <w:r>
+        <w:t xml:space="preserve">"It ran beneath it. Then the line disappears from later plans. "</w:t>
+      </w:r>
+    </w:p>
+    <w:p>
+      <w:r>
+        <w:t xml:space="preserve">Kai listened deeper.</w:t>
+      </w:r>
+    </w:p>
+    <w:p>
+      <w:r>
+        <w:t xml:space="preserve">The signal had a human rhythm because someone had taught it one. But beneath the strikes he felt something broader, a resonance moving through the old channel walls. The second mouth was not simply carrying the signal. It was repeating it, preserving the shape of a person's attempt to be found.</w:t>
+      </w:r>
+    </w:p>
+    <w:p>
+      <w:r>
+        <w:t xml:space="preserve">"There may not be someone tapping now," he said.</w:t>
+      </w:r>
+    </w:p>
+    <w:p>
+      <w:r>
+        <w:t xml:space="preserve">Rian looked at him. "A recording? "</w:t>
+      </w:r>
+    </w:p>
+    <w:p>
+      <w:r>
+        <w:t xml:space="preserve">"A witness pattern. Like stress held in the frost. The site may remember someone who was inside. "</w:t>
+      </w:r>
+    </w:p>
+    <w:p>
+      <w:r>
+        <w:t xml:space="preserve">The System answered.</w:t>
+      </w:r>
+    </w:p>
+    <w:p>
+      <w:r>
+        <w:t xml:space="preserve">[Interpretation partially aligned.]</w:t>
+      </w:r>
+    </w:p>
+    <w:p>
+      <w:r>
+        <w:t xml:space="preserve">[Occupant classification includes biological, mnemonic, and resonant components.]</w:t>
+      </w:r>
+    </w:p>
+    <w:p>
+      <w:r>
+        <w:t xml:space="preserve">[Temporal state: unresolved.]</w:t>
+      </w:r>
+    </w:p>
+    <w:p>
+      <w:r>
+        <w:t xml:space="preserve">Dr. Venn read the lines over Kai's shoulder. "It cannot tell whether the person is alive, remembered, or both. "</w:t>
+      </w:r>
+    </w:p>
+    <w:p>
+      <w:r>
+        <w:t xml:space="preserve">"That is a sentence I would have preferred never to hear," Rian said.</w:t>
+      </w:r>
+    </w:p>
+    <w:p>
+      <w:r>
+        <w:t xml:space="preserve">Mina opened to the emergency section of the protocol. "We confirm the auxiliary access without entering the basin. "</w:t>
+      </w:r>
+    </w:p>
+    <w:p>
+      <w:r>
+        <w:t xml:space="preserve">Engineer Bae pointed to the utility truck. "Ground radar can scan from the pavement if we keep the array inside the stable zone. "</w:t>
+      </w:r>
+    </w:p>
+    <w:p>
+      <w:r>
+        <w:t xml:space="preserve">They set it up together.</w:t>
+      </w:r>
+    </w:p>
+    <w:p>
+      <w:r>
+        <w:t xml:space="preserve">The radar cart moved slowly along the cracked road. Lines appeared on the engineer's screen, layers of compacted soil, broken drainage, and buried concrete. Twenty meters east of the monitoring station, a rectangular void emerged beneath the reeds.</w:t>
+      </w:r>
+    </w:p>
+    <w:p>
+      <w:r>
+        <w:t xml:space="preserve">An access chamber.</w:t>
+      </w:r>
+    </w:p>
+    <w:p>
+      <w:r>
+        <w:t xml:space="preserve">A narrow line extended from it toward the dark stone.</w:t>
+      </w:r>
+    </w:p>
+    <w:p>
+      <w:r>
+        <w:t xml:space="preserve">The line did not appear on any current plan.</w:t>
+      </w:r>
+    </w:p>
+    <w:p>
+      <w:r>
+        <w:t xml:space="preserve">"There," Seo Jun said through the speaker. "That is the auxiliary branch. "</w:t>
+      </w:r>
+    </w:p>
+    <w:p>
+      <w:r>
+        <w:t xml:space="preserve">"Depth? " Han asked.</w:t>
+      </w:r>
+    </w:p>
+    <w:p>
+      <w:r>
+        <w:t xml:space="preserve">"Four point eight meters at the chamber. Deeper near the stone. "</w:t>
+      </w:r>
+    </w:p>
+    <w:p>
+      <w:r>
+        <w:t xml:space="preserve">Engineer Bae ran the scan again.</w:t>
+      </w:r>
+    </w:p>
+    <w:p>
+      <w:r>
+        <w:t xml:space="preserve">This time a second shape appeared inside the chamber.</w:t>
+      </w:r>
+    </w:p>
+    <w:p>
+      <w:r>
+        <w:t xml:space="preserve">Small.</w:t>
+      </w:r>
+    </w:p>
+    <w:p>
+      <w:r>
+        <w:t xml:space="preserve">Vertical.</w:t>
+      </w:r>
+    </w:p>
+    <w:p>
+      <w:r>
+        <w:t xml:space="preserve">Human-sized.</w:t>
+      </w:r>
+    </w:p>
+    <w:p>
+      <w:r>
+        <w:t xml:space="preserve">No one spoke.</w:t>
+      </w:r>
+    </w:p>
+    <w:p>
+      <w:r>
+        <w:t xml:space="preserve">The tapping began again.</w:t>
+      </w:r>
+    </w:p>
+    <w:p>
+      <w:r>
+        <w:t xml:space="preserve">Kai felt the ember surge.</w:t>
+      </w:r>
+    </w:p>
+    <w:p>
+      <w:r>
+        <w:t xml:space="preserve">He stepped back before Mina needed to stop him.</w:t>
+      </w:r>
+    </w:p>
+    <w:p>
+      <w:r>
+        <w:t xml:space="preserve">That choice hurt more than moving forward would have.</w:t>
+      </w:r>
+    </w:p>
+    <w:p>
+      <w:r>
+        <w:t xml:space="preserve">"We call rescue," he said.</w:t>
+      </w:r>
+    </w:p>
+    <w:p>
+      <w:r>
+        <w:t xml:space="preserve">Engineer Bae was already reaching for his radio. "Regional confined-space team. We report a possible occupied underground chamber under an active subsidence restriction. "</w:t>
+      </w:r>
+    </w:p>
+    <w:p>
+      <w:r>
+        <w:t xml:space="preserve">"No one tells them to enter until they see the resonance data," Dr. Venn said.</w:t>
+      </w:r>
+    </w:p>
+    <w:p>
+      <w:r>
+        <w:t xml:space="preserve">"They will think resonance data is not a thing. "</w:t>
+      </w:r>
+    </w:p>
+    <w:p>
+      <w:r>
+        <w:t xml:space="preserve">"Then show them the thermal readings, structural scan, and signal recording. Use words they are trained to respect. "</w:t>
+      </w:r>
+    </w:p>
+    <w:p>
+      <w:r>
+        <w:t xml:space="preserve">The rescue team arrived forty minutes later.</w:t>
+      </w:r>
+    </w:p>
+    <w:p>
+      <w:r>
+        <w:t xml:space="preserve">Waiting became physical.</w:t>
+      </w:r>
+    </w:p>
+    <w:p>
+      <w:r>
+        <w:t xml:space="preserve">Kai paced only between two cones. Mina reviewed the conditions three times. Rian distributed water no one wanted. Han watched the road. Lena copied every file to two drives. Dr. Venn built a simplified diagram for the rescue supervisor, replacing mouth with thermal convergence and witness pattern with repeating mechanical signal.</w:t>
+      </w:r>
+    </w:p>
+    <w:p>
+      <w:r>
+        <w:t xml:space="preserve">The supervisor, Captain Im, listened without mocking any of it.</w:t>
+      </w:r>
+    </w:p>
+    <w:p>
+      <w:r>
+        <w:t xml:space="preserve">That alone made Kai trust her more than confidence would have.</w:t>
+      </w:r>
+    </w:p>
+    <w:p>
+      <w:r>
+        <w:t xml:space="preserve">"No entry through unstable ground," she said. "We locate the old maintenance hatch from the western pavement. If it is intact, we camera first, air sample second, human entry last. "</w:t>
+      </w:r>
+    </w:p>
+    <w:p>
+      <w:r>
+        <w:t xml:space="preserve">Mina pointed to their protocol. "If communications fail, everyone withdraws. If temperature drops more than three degrees, everyone withdraws. If the tapping changes to a continuous tone, everyone withdraws. "</w:t>
+      </w:r>
+    </w:p>
+    <w:p>
+      <w:r>
+        <w:t xml:space="preserve">Captain Im looked at her. "Your team has done this before? "</w:t>
+      </w:r>
+    </w:p>
+    <w:p>
+      <w:r>
+        <w:t xml:space="preserve">"Not this. "</w:t>
+      </w:r>
+    </w:p>
+    <w:p>
+      <w:r>
+        <w:t xml:space="preserve">"Good answer. "</w:t>
+      </w:r>
+    </w:p>
+    <w:p>
+      <w:r>
+        <w:t xml:space="preserve">The old maintenance hatch lay beneath asphalt poured over after the reservoir closed. The crew found its outline with radar and cut a square around it. Under the road, rusted metal waited beneath two decades of tar and dust.</w:t>
+      </w:r>
+    </w:p>
+    <w:p>
+      <w:r>
+        <w:t xml:space="preserve">When they lifted the hatch, cold air breathed out.</w:t>
+      </w:r>
+    </w:p>
+    <w:p>
+      <w:r>
+        <w:t xml:space="preserve">Every sensor dropped two degrees.</w:t>
+      </w:r>
+    </w:p>
+    <w:p>
+      <w:r>
+        <w:t xml:space="preserve">No one entered.</w:t>
+      </w:r>
+    </w:p>
+    <w:p>
+      <w:r>
+        <w:t xml:space="preserve">The crew lowered a camera on a reinforced cable.</w:t>
+      </w:r>
+    </w:p>
+    <w:p>
+      <w:r>
+        <w:t xml:space="preserve">The screen showed a vertical shaft lined with old concrete. Water glimmered far below, though the reservoir was dry. At four meters, a side tunnel opened east.</w:t>
+      </w:r>
+    </w:p>
+    <w:p>
+      <w:r>
+        <w:t xml:space="preserve">Someone had scratched three lines into the concrete beside it.</w:t>
+      </w:r>
+    </w:p>
+    <w:p>
+      <w:r>
+        <w:t xml:space="preserve">Short.</w:t>
+      </w:r>
+    </w:p>
+    <w:p>
+      <w:r>
+        <w:t xml:space="preserve">Short.</w:t>
+      </w:r>
+    </w:p>
+    <w:p>
+      <w:r>
+        <w:t xml:space="preserve">Short.</w:t>
+      </w:r>
+    </w:p>
+    <w:p>
+      <w:r>
+        <w:t xml:space="preserve">One long.</w:t>
+      </w:r>
+    </w:p>
+    <w:p>
+      <w:r>
+        <w:t xml:space="preserve">Three short.</w:t>
+      </w:r>
+    </w:p>
+    <w:p>
+      <w:r>
+        <w:t xml:space="preserve">Two short beneath them.</w:t>
+      </w:r>
+    </w:p>
+    <w:p>
+      <w:r>
+        <w:t xml:space="preserve">"The pattern," Mina whispered.</w:t>
+      </w:r>
+    </w:p>
+    <w:p>
+      <w:r>
+        <w:t xml:space="preserve">The camera turned into the auxiliary tunnel.</w:t>
+      </w:r>
+    </w:p>
+    <w:p>
+      <w:r>
+        <w:t xml:space="preserve">Its light found footprints in mineral dust.</w:t>
+      </w:r>
+    </w:p>
+    <w:p>
+      <w:r>
+        <w:t xml:space="preserve">Not fresh. Not ancient.</w:t>
+      </w:r>
+    </w:p>
+    <w:p>
+      <w:r>
+        <w:t xml:space="preserve">The prints led toward the chamber.</w:t>
+      </w:r>
+    </w:p>
+    <w:p>
+      <w:r>
+        <w:t xml:space="preserve">Halfway there, the video flickered.</w:t>
+      </w:r>
+    </w:p>
+    <w:p>
+      <w:r>
+        <w:t xml:space="preserve">"Hold," Captain Im ordered.</w:t>
+      </w:r>
+    </w:p>
+    <w:p>
+      <w:r>
+        <w:t xml:space="preserve">The operator stopped the cable.</w:t>
+      </w:r>
+    </w:p>
+    <w:p>
+      <w:r>
+        <w:t xml:space="preserve">The tapping sounded through the camera microphone.</w:t>
+      </w:r>
+    </w:p>
+    <w:p>
+      <w:r>
+        <w:t xml:space="preserve">Three short.</w:t>
+      </w:r>
+    </w:p>
+    <w:p>
+      <w:r>
+        <w:t xml:space="preserve">One long.</w:t>
+      </w:r>
+    </w:p>
+    <w:p>
+      <w:r>
+        <w:t xml:space="preserve">Three short.</w:t>
+      </w:r>
+    </w:p>
+    <w:p>
+      <w:r>
+        <w:t xml:space="preserve">Two short.</w:t>
+      </w:r>
+    </w:p>
+    <w:p>
+      <w:r>
+        <w:t xml:space="preserve">Then a voice.</w:t>
+      </w:r>
+    </w:p>
+    <w:p>
+      <w:r>
+        <w:t xml:space="preserve">Faint.</w:t>
+      </w:r>
+    </w:p>
+    <w:p>
+      <w:r>
+        <w:t xml:space="preserve">Dry.</w:t>
+      </w:r>
+    </w:p>
+    <w:p>
+      <w:r>
+        <w:t xml:space="preserve">Human.</w:t>
+      </w:r>
+    </w:p>
+    <w:p>
+      <w:r>
+        <w:t xml:space="preserve">"Do not energize the line. "</w:t>
+      </w:r>
+    </w:p>
+    <w:p>
+      <w:r>
+        <w:t xml:space="preserve">Rian's water bottle slipped from his hand.</w:t>
+      </w:r>
+    </w:p>
+    <w:p>
+      <w:r>
+        <w:t xml:space="preserve">The camera image steadied.</w:t>
+      </w:r>
+    </w:p>
+    <w:p>
+      <w:r>
+        <w:t xml:space="preserve">At the end of the tunnel stood a sealed steel door. Frost traced a black arc across it. In the center, someone had written a name with a finger dipped in rust.</w:t>
+      </w:r>
+    </w:p>
+    <w:p>
+      <w:r>
+        <w:t xml:space="preserve">MIN JAE-HO.</w:t>
+      </w:r>
+    </w:p>
+    <w:p>
+      <w:r>
+        <w:t xml:space="preserve">Seo Jun made a sound through the speaker.</w:t>
+      </w:r>
+    </w:p>
+    <w:p>
+      <w:r>
+        <w:t xml:space="preserve">Kai turned toward it. "You know that name. "</w:t>
+      </w:r>
+    </w:p>
+    <w:p>
+      <w:r>
+        <w:t xml:space="preserve">For several seconds, Seo Jun did not answer.</w:t>
+      </w:r>
+    </w:p>
+    <w:p>
+      <w:r>
+        <w:t xml:space="preserve">"He was a North River survey technician," he said at last. "Officially, he resigned eight years ago. "</w:t>
+      </w:r>
+    </w:p>
+    <w:p>
+      <w:r>
+        <w:t xml:space="preserve">"Unofficially? " Lena asked.</w:t>
+      </w:r>
+    </w:p>
+    <w:p>
+      <w:r>
+        <w:t xml:space="preserve">"Vale used his login after he disappeared. "</w:t>
+      </w:r>
+    </w:p>
+    <w:p>
+      <w:r>
+        <w:t xml:space="preserve">The cold deepened.</w:t>
+      </w:r>
+    </w:p>
+    <w:p>
+      <w:r>
+        <w:t xml:space="preserve">Every receiver displayed the same warning at once.</w:t>
+      </w:r>
+    </w:p>
+    <w:p>
+      <w:r>
+        <w:t xml:space="preserve">Another voice came through the tunnel.</w:t>
+      </w:r>
+    </w:p>
+    <w:p>
+      <w:r>
+        <w:t xml:space="preserve">Not Min Jae-ho's.</w:t>
+      </w:r>
+    </w:p>
+    <w:p>
+      <w:r>
+        <w:t xml:space="preserve">Smooth. Close to the microphone though the corridor remained empty.</w:t>
+      </w:r>
+    </w:p>
+    <w:p>
+      <w:r>
+        <w:t xml:space="preserve">"You brought the witness," it said.</w:t>
+      </w:r>
+    </w:p>
+    <w:p>
+      <w:r>
+        <w:t xml:space="preserve">Seo Jun's connection went silent.</w:t>
+      </w:r>
+    </w:p>
+    <w:p>
+      <w:r>
+        <w:t xml:space="preserve">Kai heard three people inhale at once.</w:t>
+      </w:r>
+    </w:p>
+    <w:p>
+      <w:r>
+        <w:t xml:space="preserve">Captain Im raised one closed fist.</w:t>
+      </w:r>
+    </w:p>
+    <w:p>
+      <w:r>
+        <w:t xml:space="preserve">"Camera back. Everyone away from the hatch. "</w:t>
+      </w:r>
+    </w:p>
+    <w:p>
+      <w:r>
+        <w:t xml:space="preserve">The operator reeled in the cable. The view retreated from the steel door, past the footprints, past the scratched signal beside the shaft. Cold air followed it upward. Frost formed along the cable guide despite the dry sky.</w:t>
+      </w:r>
+    </w:p>
+    <w:p>
+      <w:r>
+        <w:t xml:space="preserve">Mina was already reading the protocol.</w:t>
+      </w:r>
+    </w:p>
+    <w:p>
+      <w:r>
+        <w:t xml:space="preserve">"Communication failure. Temperature decline. Unidentified voice addressing team knowledge. We withdraw to the outer barrier. "</w:t>
+      </w:r>
+    </w:p>
+    <w:p>
+      <w:r>
+        <w:t xml:space="preserve">No one argued.</w:t>
+      </w:r>
+    </w:p>
+    <w:p>
+      <w:r>
+        <w:t xml:space="preserve">Kai wanted to.</w:t>
+      </w:r>
+    </w:p>
+    <w:p>
+      <w:r>
+        <w:t xml:space="preserve">The desire rose hot and immediate. Min Jae-ho might be behind the door. Seo Jun might be in danger at the community center. The second voice had named their purpose without explaining how. Every unanswered question pulled in a different direction, and all of them pretended movement would become rescue if he moved fast enough.</w:t>
+      </w:r>
+    </w:p>
+    <w:p>
+      <w:r>
+        <w:t xml:space="preserve">He picked up Rian's fallen water bottle instead.</w:t>
+      </w:r>
+    </w:p>
+    <w:p>
+      <w:r>
+        <w:t xml:space="preserve">"Outer barrier," he said.</w:t>
+      </w:r>
+    </w:p>
+    <w:p>
+      <w:r>
+        <w:t xml:space="preserve">They moved as a group.</w:t>
+      </w:r>
+    </w:p>
+    <w:p>
+      <w:r>
+        <w:t xml:space="preserve">The rescue crew sealed the hatch without locking it. Engineer Bae left two remote sensors beside the opening. Han counted everyone twice. Lena kept the local recordings in a shielded case. Dr. Venn watched the temperature climb only after they crossed the red steel barrier.</w:t>
+      </w:r>
+    </w:p>
+    <w:p>
+      <w:r>
+        <w:t xml:space="preserve">"Six degrees below normal," he said. "Then four. Now two. "</w:t>
+      </w:r>
+    </w:p>
+    <w:p>
+      <w:r>
+        <w:t xml:space="preserve">"Is that good? " Rian asked.</w:t>
+      </w:r>
+    </w:p>
+    <w:p>
+      <w:r>
+        <w:t xml:space="preserve">"It is less immediately bad. "</w:t>
+      </w:r>
+    </w:p>
+    <w:p>
+      <w:r>
+        <w:t xml:space="preserve">"Science remains inspirational. "</w:t>
+      </w:r>
+    </w:p>
+    <w:p>
+      <w:r>
+        <w:t xml:space="preserve">Mina called Dr. Park from the regional engineer's satellite phone.</w:t>
+      </w:r>
+    </w:p>
+    <w:p>
+      <w:r>
+        <w:t xml:space="preserve">He answered on the second ring.</w:t>
+      </w:r>
+    </w:p>
+    <w:p>
+      <w:r>
+        <w:t xml:space="preserve">Seo Jun was alive.</w:t>
+      </w:r>
+    </w:p>
+    <w:p>
+      <w:r>
+        <w:t xml:space="preserve">The community center had lost power and wired service at the same instant his voice disappeared from their speaker. The outage affected only the building. Dr. Park had moved everyone outside and called from his own vehicle. No one had entered. No unknown person had appeared.</w:t>
+      </w:r>
+    </w:p>
+    <w:p>
+      <w:r>
+        <w:t xml:space="preserve">"He heard the voice too," Dr. Park said. "He wants to speak to you. "</w:t>
+      </w:r>
+    </w:p>
+    <w:p>
+      <w:r>
+        <w:t xml:space="preserve">Seo Jun came on the line breathing too quickly.</w:t>
+      </w:r>
+    </w:p>
+    <w:p>
+      <w:r>
+        <w:t xml:space="preserve">"The voice used Vale's cadence," he said.</w:t>
+      </w:r>
+    </w:p>
+    <w:p>
+      <w:r>
+        <w:t xml:space="preserve">Kai closed his eyes. "Vale? "</w:t>
+      </w:r>
+    </w:p>
+    <w:p>
+      <w:r>
+        <w:t xml:space="preserve">"Not exactly. Vale paused before names when he wanted someone to feel chosen. The voice did the same thing. You brought the witness. He used phrases like that in closed meetings. "</w:t>
+      </w:r>
+    </w:p>
+    <w:p>
+      <w:r>
+        <w:t xml:space="preserve">Lena looked toward the abandoned road. "Could Vale have installed a recording? "</w:t>
+      </w:r>
+    </w:p>
+    <w:p>
+      <w:r>
+        <w:t xml:space="preserve">"Eight years ago? Maybe. But he did not know all of you then. "</w:t>
+      </w:r>
+    </w:p>
+    <w:p>
+      <w:r>
+        <w:t xml:space="preserve">"The site knows us through the Ruins," Kai said.</w:t>
+      </w:r>
+    </w:p>
+    <w:p>
+      <w:r>
+        <w:t xml:space="preserve">The System offered no correction.</w:t>
+      </w:r>
+    </w:p>
+    <w:p>
+      <w:r>
+        <w:t xml:space="preserve">Seo Jun's breath steadied. "Min Jae-ho found the West Haneul overlay before I joined North River. His name remained in old access logs, but his employee file said voluntary departure. Vale used Min's credentials for legacy systems because no one was supposed to ask where he went. "</w:t>
+      </w:r>
+    </w:p>
+    <w:p>
+      <w:r>
+        <w:t xml:space="preserve">"What did Min find? " Mina asked.</w:t>
+      </w:r>
+    </w:p>
+    <w:p>
+      <w:r>
+        <w:t xml:space="preserve">"A line that could carry more than power. Vale called it a dormant distribution network. Min called it a witness channel. "</w:t>
+      </w:r>
+    </w:p>
+    <w:p>
+      <w:r>
+        <w:t xml:space="preserve">Kai looked at the signed protocol in Mina's hands.</w:t>
+      </w:r>
+    </w:p>
+    <w:p>
+      <w:r>
+        <w:t xml:space="preserve">Witness.</w:t>
+      </w:r>
+    </w:p>
+    <w:p>
+      <w:r>
+        <w:t xml:space="preserve">The word had followed them from the Ruins to the frost, from frost to signal, from signal to a name written in rust.</w:t>
+      </w:r>
+    </w:p>
+    <w:p>
+      <w:r>
+        <w:t xml:space="preserve">"Did Min seal the chamber? " Han asked.</w:t>
+      </w:r>
+    </w:p>
+    <w:p>
+      <w:r>
+        <w:t xml:space="preserve">"I do not know. "</w:t>
+      </w:r>
+    </w:p>
+    <w:p>
+      <w:r>
+        <w:t xml:space="preserve">"Did Vale? "</w:t>
+      </w:r>
+    </w:p>
+    <w:p>
+      <w:r>
+        <w:t xml:space="preserve">Seo Jun was silent long enough to become honest.</w:t>
+      </w:r>
+    </w:p>
+    <w:p>
+      <w:r>
+        <w:t xml:space="preserve">"I think North River energized the line while Min was inside. "</w:t>
+      </w:r>
+    </w:p>
+    <w:p>
+      <w:r>
+        <w:t xml:space="preserve">Captain Im took the phone. "We have a possible living occupant behind a sealed door. What does energizing mean in physical terms? Electrical current? Pressure? Heat? "</w:t>
+      </w:r>
+    </w:p>
+    <w:p>
+      <w:r>
+        <w:t xml:space="preserve">"All of them on the official diagram," Seo Jun said. "Something else on Min's notes. He wrote that the channel stored observation. That every activation added the people near it to the system's memory. "</w:t>
+      </w:r>
+    </w:p>
+    <w:p>
+      <w:r>
+        <w:t xml:space="preserve">Lena looked at Kai. "That is how it knows the team. "</w:t>
+      </w:r>
+    </w:p>
+    <w:p>
+      <w:r>
+        <w:t xml:space="preserve">"And why it called Seo Jun the witness," Mina said. "He is carrying knowledge from North River into the open. "</w:t>
+      </w:r>
+    </w:p>
+    <w:p>
+      <w:r>
+        <w:t xml:space="preserve">Rian stared down the closed road. "So the occupied thing may be Min, a memory of Min, and a network that has been collecting everyone who listened near it. "</w:t>
+      </w:r>
+    </w:p>
+    <w:p>
+      <w:r>
+        <w:t xml:space="preserve">"Occupant classification includes biological, mnemonic, and resonant components," Dr. Venn repeated.</w:t>
+      </w:r>
+    </w:p>
+    <w:p>
+      <w:r>
+        <w:t xml:space="preserve">For once, the System's language made the situation less strange instead of more.</w:t>
+      </w:r>
+    </w:p>
+    <w:p>
+      <w:r>
+        <w:t xml:space="preserve">Captain Im ended the call only after arranging a permanent satellite link. Then she faced the group.</w:t>
+      </w:r>
+    </w:p>
+    <w:p>
+      <w:r>
+        <w:t xml:space="preserve">"We do not enter today. The chamber has waited eight years. One more hour spent understanding the door will not be the thing that kills a viable survivor, but an unplanned entry might. "</w:t>
+      </w:r>
+    </w:p>
+    <w:p>
+      <w:r>
+        <w:t xml:space="preserve">Kai felt the statement settle into the same part of him that had once believed speed proved care.</w:t>
+      </w:r>
+    </w:p>
+    <w:p>
+      <w:r>
+        <w:t xml:space="preserve">"What can we do from outside? "</w:t>
+      </w:r>
+    </w:p>
+    <w:p>
+      <w:r>
+        <w:t xml:space="preserve">"Air sample through the camera conduit. Thermal imaging. Structural model. We bring a medical team and remote cutting equipment. No one crosses the unstable basin. "</w:t>
+      </w:r>
+    </w:p>
+    <w:p>
+      <w:r>
+        <w:t xml:space="preserve">"And the voice? " Mina asked.</w:t>
+      </w:r>
+    </w:p>
+    <w:p>
+      <w:r>
+        <w:t xml:space="preserve">Captain Im looked at the frost still clinging to the retrieved cable.</w:t>
+      </w:r>
+    </w:p>
+    <w:p>
+      <w:r>
+        <w:t xml:space="preserve">"We treat it as an unknown hazard that can communicate. Communication does not grant it command. "</w:t>
+      </w:r>
+    </w:p>
+    <w:p>
+      <w:r>
+        <w:t xml:space="preserve">Kai smiled despite himself.</w:t>
+      </w:r>
+    </w:p>
+    <w:p>
+      <w:r>
+        <w:t xml:space="preserve">"You should meet Dr. Park more often. "</w:t>
+      </w:r>
+    </w:p>
+    <w:p>
+      <w:r>
+        <w:t xml:space="preserve">They returned only to the subsidence boundary, not the hatch. The rescue crew sent a sampling tube down the sealed shaft while everyone else remained behind the cones. Air readings came back low in oxygen but not impossible. A thermal probe found a narrow pocket of warmth behind the steel door.</w:t>
+      </w:r>
+    </w:p>
+    <w:p>
+      <w:r>
+        <w:t xml:space="preserve">Human warmth.</w:t>
+      </w:r>
+    </w:p>
+    <w:p>
+      <w:r>
+        <w:t xml:space="preserve">Slow.</w:t>
+      </w:r>
+    </w:p>
+    <w:p>
+      <w:r>
+        <w:t xml:space="preserve">Steady.</w:t>
+      </w:r>
+    </w:p>
+    <w:p>
+      <w:r>
+        <w:t xml:space="preserve">The System appeared.</w:t>
+      </w:r>
+    </w:p>
+    <w:p>
+      <w:r>
+        <w:t xml:space="preserve">[Biological component viable.]</w:t>
+      </w:r>
+    </w:p>
+    <w:p>
+      <w:r>
+        <w:t xml:space="preserve">[Temporal suspension maintained by convergence field.]</w:t>
+      </w:r>
+    </w:p>
+    <w:p>
+      <w:r>
+        <w:t xml:space="preserve">[Warning: opening the chamber will end suspension.]</w:t>
+      </w:r>
+    </w:p>
+    <w:p>
+      <w:r>
+        <w:t xml:space="preserve">Captain Im read the lines and did not ask whether Kai believed them.</w:t>
+      </w:r>
+    </w:p>
+    <w:p>
+      <w:r>
+        <w:t xml:space="preserve">"Then opening becomes a medical event," she said. "We prepare before we touch the seal. "</w:t>
+      </w:r>
+    </w:p>
+    <w:p>
+      <w:r>
+        <w:t xml:space="preserve">The tapping resumed beneath the reeds.</w:t>
+      </w:r>
+    </w:p>
+    <w:p>
+      <w:r>
+        <w:t xml:space="preserve">Three short.</w:t>
+      </w:r>
+    </w:p>
+    <w:p>
+      <w:r>
+        <w:t xml:space="preserve">One long.</w:t>
+      </w:r>
+    </w:p>
+    <w:p>
+      <w:r>
+        <w:t xml:space="preserve">Three short.</w:t>
+      </w:r>
+    </w:p>
+    <w:p>
+      <w:r>
+        <w:t xml:space="preserve">Two short.</w:t>
+      </w:r>
+    </w:p>
+    <w:p>
+      <w:r>
+        <w:t xml:space="preserve">Then a new pattern followed.</w:t>
+      </w:r>
+    </w:p>
+    <w:p>
+      <w:r>
+        <w:t xml:space="preserve">Lena recorded it. Seo Jun listened over the restored satellite line.</w:t>
+      </w:r>
+    </w:p>
+    <w:p>
+      <w:r>
+        <w:t xml:space="preserve">One short.</w:t>
+      </w:r>
+    </w:p>
+    <w:p>
+      <w:r>
+        <w:t xml:space="preserve">Five short.</w:t>
+      </w:r>
+    </w:p>
+    <w:p>
+      <w:r>
+        <w:t xml:space="preserve">"Not a branch number," he said.</w:t>
+      </w:r>
+    </w:p>
+    <w:p>
+      <w:r>
+        <w:t xml:space="preserve">The sequence repeated.</w:t>
+      </w:r>
+    </w:p>
+    <w:p>
+      <w:r>
+        <w:t xml:space="preserve">One.</w:t>
+      </w:r>
+    </w:p>
+    <w:p>
+      <w:r>
+        <w:t xml:space="preserve">Five.</w:t>
+      </w:r>
+    </w:p>
+    <w:p>
+      <w:r>
+        <w:t xml:space="preserve">Engineer Bae turned the old plan sideways. "Could it be a date? A station code? "</w:t>
+      </w:r>
+    </w:p>
+    <w:p>
+      <w:r>
+        <w:t xml:space="preserve">Seo Jun made no sound.</w:t>
+      </w:r>
+    </w:p>
+    <w:p>
+      <w:r>
+        <w:t xml:space="preserve">"What is it? " Kai asked.</w:t>
+      </w:r>
+    </w:p>
+    <w:p>
+      <w:r>
+        <w:t xml:space="preserve">"My employee number ended in one-five. "</w:t>
+      </w:r>
+    </w:p>
+    <w:p>
+      <w:r>
+        <w:t xml:space="preserve">The basin went quiet.</w:t>
+      </w:r>
+    </w:p>
+    <w:p>
+      <w:r>
+        <w:t xml:space="preserve">On the remote camera feed, still paused before the sealed door, the rust letters began to change.</w:t>
+      </w:r>
+    </w:p>
+    <w:p>
+      <w:r>
+        <w:t xml:space="preserve">No hand appeared.</w:t>
+      </w:r>
+    </w:p>
+    <w:p>
+      <w:r>
+        <w:t xml:space="preserve">No figure crossed the tunnel.</w:t>
+      </w:r>
+    </w:p>
+    <w:p>
+      <w:r>
+        <w:t xml:space="preserve">Beneath MIN JAE-HO, a second name wrote itself slowly across the steel.</w:t>
+      </w:r>
+    </w:p>
+    <w:p>
+      <w:r>
+        <w:t xml:space="preserve">SEO JUN.</w:t>
       </w:r>
     </w:p>
     <w:sectPr>

</xml_diff>

<commit_message>
Add Heavenly Ascension System Chapter 61: The Man Who Answered Twice
</commit_message>
<xml_diff>
--- a/Heavenly Ascension System.docx
+++ b/Heavenly Ascension System.docx
@@ -44066,6 +44066,2004 @@
     <w:p>
       <w:r>
         <w:t xml:space="preserve">SEO JUN.</w:t>
+      </w:r>
+    </w:p>
+    <w:p>
+      <w:pPr>
+        <w:pStyle w:val="Heading1"/>
+      </w:pPr>
+      <w:r>
+        <w:t xml:space="preserve">Chapter 61: The Man Who Answered Twice</w:t>
+      </w:r>
+    </w:p>
+    <w:p>
+      <w:r>
+        <w:t xml:space="preserve">The heater began working after Han called it a traitor.</w:t>
+      </w:r>
+    </w:p>
+    <w:p>
+      <w:r>
+        <w:t xml:space="preserve">Rian considered that proof of several things, none of them flattering to the vehicle.</w:t>
+      </w:r>
+    </w:p>
+    <w:p>
+      <w:r>
+        <w:t xml:space="preserve">Warm air coughed through the vents in uneven bursts, carrying the smell of dust and something faintly scorched. Dr. Venn held both hands before the nearest vent as though accepting an offering from a minor household spirit. Across from her, Kai Li watched the city thin beyond the rain-streaked glass.</w:t>
+      </w:r>
+    </w:p>
+    <w:p>
+      <w:r>
+        <w:t xml:space="preserve">Apartment towers became warehouses. Warehouses gave way to narrow fields pressed between low hills. The morning sky had settled into a dull sheet of cloud, pale enough to promise light but too heavy to deliver much of it. Telephone poles followed the road in patient intervals. Between them, prayer ribbons snapped from bare branches, each one faded almost white.</w:t>
+      </w:r>
+    </w:p>
+    <w:p>
+      <w:r>
+        <w:t xml:space="preserve">Han drove with both hands on the wheel.</w:t>
+      </w:r>
+    </w:p>
+    <w:p>
+      <w:r>
+        <w:t xml:space="preserve">He had not spoken since they crossed the northern boundary marker.</w:t>
+      </w:r>
+    </w:p>
+    <w:p>
+      <w:r>
+        <w:t xml:space="preserve">That silence bothered Kai more than Rian's constant commentary would have.</w:t>
+      </w:r>
+    </w:p>
+    <w:p>
+      <w:r>
+        <w:t xml:space="preserve">Rian sat beside the equipment cases, one knee braced against a dented metal box that contained Dr. Venn's portable resonance array. Every few minutes, the minibus hit a seam in the road and the case slid toward him. Every few minutes, he shoved it back.</w:t>
+      </w:r>
+    </w:p>
+    <w:p>
+      <w:r>
+        <w:t xml:space="preserve">"My aunt also said the brakes prefer advance notice," he said.</w:t>
+      </w:r>
+    </w:p>
+    <w:p>
+      <w:r>
+        <w:t xml:space="preserve">Han's eyes remained on the road. "Your aunt should be arrested. "</w:t>
+      </w:r>
+    </w:p>
+    <w:p>
+      <w:r>
+        <w:t xml:space="preserve">"She lent us the vehicle for free. "</w:t>
+      </w:r>
+    </w:p>
+    <w:p>
+      <w:r>
+        <w:t xml:space="preserve">"She should be thanked, then arrested. "</w:t>
+      </w:r>
+    </w:p>
+    <w:p>
+      <w:r>
+        <w:t xml:space="preserve">Dr. Venn looked over her shoulder. "The brakes are functional. "</w:t>
+      </w:r>
+    </w:p>
+    <w:p>
+      <w:r>
+        <w:t xml:space="preserve">"That is not the same as reassuring," Rian said.</w:t>
+      </w:r>
+    </w:p>
+    <w:p>
+      <w:r>
+        <w:t xml:space="preserve">Kai let their voices pass around him.</w:t>
+      </w:r>
+    </w:p>
+    <w:p>
+      <w:r>
+        <w:t xml:space="preserve">The authorization card inside his coat felt heavier than paper should. Dr. Park had issued four temporary field credentials, each marked with the seal of the Civic Fracture Bureau and a restriction printed in red.</w:t>
+      </w:r>
+    </w:p>
+    <w:p>
+      <w:r>
+        <w:t xml:space="preserve">OBSERVATION AND CIVILIAN CONTACT ONLY.</w:t>
+      </w:r>
+    </w:p>
+    <w:p>
+      <w:r>
+        <w:t xml:space="preserve">No suppression.</w:t>
+      </w:r>
+    </w:p>
+    <w:p>
+      <w:r>
+        <w:t xml:space="preserve">No seizure.</w:t>
+      </w:r>
+    </w:p>
+    <w:p>
+      <w:r>
+        <w:t xml:space="preserve">No forced entry.</w:t>
+      </w:r>
+    </w:p>
+    <w:p>
+      <w:r>
+        <w:t xml:space="preserve">No engagement with an active fracture unless civilian life was in immediate danger.</w:t>
+      </w:r>
+    </w:p>
+    <w:p>
+      <w:r>
+        <w:t xml:space="preserve">Dr. Park had read each restriction aloud before handing them over, looking directly at Han during the final one.</w:t>
+      </w:r>
+    </w:p>
+    <w:p>
+      <w:r>
+        <w:t xml:space="preserve">Han had smiled.</w:t>
+      </w:r>
+    </w:p>
+    <w:p>
+      <w:r>
+        <w:t xml:space="preserve">Dr. Park had made him repeat it.</w:t>
+      </w:r>
+    </w:p>
+    <w:p>
+      <w:r>
+        <w:t xml:space="preserve">Kai had not smiled at all.</w:t>
+      </w:r>
+    </w:p>
+    <w:p>
+      <w:r>
+        <w:t xml:space="preserve">West Haneul lay another thirty kilometers ahead, tucked into a basin where three old mountain roads met. On current maps, it was marked as a district absorbed by the larger Haneul administrative region. On older maps, it had been a separate township. On maps older than that, it had possessed another name entirely.</w:t>
+      </w:r>
+    </w:p>
+    <w:p>
+      <w:r>
+        <w:t xml:space="preserve">The name had appeared beneath a layer of overwritten ink in the archive record.</w:t>
+      </w:r>
+    </w:p>
+    <w:p>
+      <w:r>
+        <w:t xml:space="preserve">Seo Jun.</w:t>
+      </w:r>
+    </w:p>
+    <w:p>
+      <w:r>
+        <w:t xml:space="preserve">Not Seo Jun Village.</w:t>
+      </w:r>
+    </w:p>
+    <w:p>
+      <w:r>
+        <w:t xml:space="preserve">Not Seo Jun Shrine.</w:t>
+      </w:r>
+    </w:p>
+    <w:p>
+      <w:r>
+        <w:t xml:space="preserve">Only Seo Jun, written in the position where a location should have been.</w:t>
+      </w:r>
+    </w:p>
+    <w:p>
+      <w:r>
+        <w:t xml:space="preserve">The same name had appeared in the registration ledger of the missing geomancer who had surveyed West Haneul twenty-seven years earlier.</w:t>
+      </w:r>
+    </w:p>
+    <w:p>
+      <w:r>
+        <w:t xml:space="preserve">The same name had been listed as a witness to three fracture incidents across six decades.</w:t>
+      </w:r>
+    </w:p>
+    <w:p>
+      <w:r>
+        <w:t xml:space="preserve">The same name belonged to a boy recorded as dying in West Haneul during a landslide eighty-one years ago.</w:t>
+      </w:r>
+    </w:p>
+    <w:p>
+      <w:r>
+        <w:t xml:space="preserve">Dr. Venn had found the fourth appearance just before midnight.</w:t>
+      </w:r>
+    </w:p>
+    <w:p>
+      <w:r>
+        <w:t xml:space="preserve">Seo Jun, temporary custodian of the western boundary stone.</w:t>
+      </w:r>
+    </w:p>
+    <w:p>
+      <w:r>
+        <w:t xml:space="preserve">Date of appointment: one hundred and nineteen years ago.</w:t>
+      </w:r>
+    </w:p>
+    <w:p>
+      <w:r>
+        <w:t xml:space="preserve">No date of death.</w:t>
+      </w:r>
+    </w:p>
+    <w:p>
+      <w:r>
+        <w:t xml:space="preserve">No successor.</w:t>
+      </w:r>
+    </w:p>
+    <w:p>
+      <w:r>
+        <w:t xml:space="preserve">Kai turned from the window.</w:t>
+      </w:r>
+    </w:p>
+    <w:p>
+      <w:r>
+        <w:t xml:space="preserve">"Have you found any connection between the records other than the name? "</w:t>
+      </w:r>
+    </w:p>
+    <w:p>
+      <w:r>
+        <w:t xml:space="preserve">Dr. Venn lowered her tablet. "No shared family registry. No consistent birth date. No matching identification number where identification numbers exist. The handwriting changes, so we can rule out one person falsifying all the documents by hand. "</w:t>
+      </w:r>
+    </w:p>
+    <w:p>
+      <w:r>
+        <w:t xml:space="preserve">"Can we? "</w:t>
+      </w:r>
+    </w:p>
+    <w:p>
+      <w:r>
+        <w:t xml:space="preserve">Rian's question sounded lighter than his expression.</w:t>
+      </w:r>
+    </w:p>
+    <w:p>
+      <w:r>
+        <w:t xml:space="preserve">Dr. Venn adjusted her glasses. "No. We can rule out one ordinary person falsifying them by hand. "</w:t>
+      </w:r>
+    </w:p>
+    <w:p>
+      <w:r>
+        <w:t xml:space="preserve">Han glanced at the rearview mirror. "Better. "</w:t>
+      </w:r>
+    </w:p>
+    <w:p>
+      <w:r>
+        <w:t xml:space="preserve">"It is not better," Rian said.</w:t>
+      </w:r>
+    </w:p>
+    <w:p>
+      <w:r>
+        <w:t xml:space="preserve">"It is clearer. "</w:t>
+      </w:r>
+    </w:p>
+    <w:p>
+      <w:r>
+        <w:t xml:space="preserve">"That is often worse. "</w:t>
+      </w:r>
+    </w:p>
+    <w:p>
+      <w:r>
+        <w:t xml:space="preserve">Kai looked back toward the road.</w:t>
+      </w:r>
+    </w:p>
+    <w:p>
+      <w:r>
+        <w:t xml:space="preserve">The old map rested inside a protective sleeve on the seat beside Dr. Venn. Even folded, its paper carried a dry medicinal scent. West Haneul's streets had been drawn in black ink, but beneath them, visible only under angled light, ran an earlier pattern in reddish brown.</w:t>
+      </w:r>
+    </w:p>
+    <w:p>
+      <w:r>
+        <w:t xml:space="preserve">The newer roads followed the old ones almost perfectly.</w:t>
+      </w:r>
+    </w:p>
+    <w:p>
+      <w:r>
+        <w:t xml:space="preserve">The houses did not.</w:t>
+      </w:r>
+    </w:p>
+    <w:p>
+      <w:r>
+        <w:t xml:space="preserve">The surveyor who redrew the township had shifted every residence several meters east or west, enough to make the map technically inaccurate while preserving the overall street plan. At the center stood a public well that no longer existed. At the western edge, where the basin narrowed between two ridges, a small square had been left blank.</w:t>
+      </w:r>
+    </w:p>
+    <w:p>
+      <w:r>
+        <w:t xml:space="preserve">Someone had later written a name there.</w:t>
+      </w:r>
+    </w:p>
+    <w:p>
+      <w:r>
+        <w:t xml:space="preserve">SEO JUN.</w:t>
+      </w:r>
+    </w:p>
+    <w:p>
+      <w:r>
+        <w:t xml:space="preserve">Kai closed his eyes and let his awareness sink inward.</w:t>
+      </w:r>
+    </w:p>
+    <w:p>
+      <w:r>
+        <w:t xml:space="preserve">The system waited without warmth or impatience.</w:t>
+      </w:r>
+    </w:p>
+    <w:p>
+      <w:r>
+        <w:t xml:space="preserve">Regional Query Available.</w:t>
+      </w:r>
+    </w:p>
+    <w:p>
+      <w:r>
+        <w:t xml:space="preserve">The notification had appeared when they crossed the city boundary. It had remained at the edge of his perception ever since.</w:t>
+      </w:r>
+    </w:p>
+    <w:p>
+      <w:r>
+        <w:t xml:space="preserve">He had not opened it.</w:t>
+      </w:r>
+    </w:p>
+    <w:p>
+      <w:r>
+        <w:t xml:space="preserve">The system answered questions according to rules it never fully explained. Sometimes it offered a direction. Sometimes it offered a measurement. Sometimes it translated danger into numbers precise enough to be useless.</w:t>
+      </w:r>
+    </w:p>
+    <w:p>
+      <w:r>
+        <w:t xml:space="preserve">It never offered comfort.</w:t>
+      </w:r>
+    </w:p>
+    <w:p>
+      <w:r>
+        <w:t xml:space="preserve">It never told him whether an answer would cost more than ignorance.</w:t>
+      </w:r>
+    </w:p>
+    <w:p>
+      <w:r>
+        <w:t xml:space="preserve">Kai opened his eyes.</w:t>
+      </w:r>
+    </w:p>
+    <w:p>
+      <w:r>
+        <w:t xml:space="preserve">The road curved between two hills.</w:t>
+      </w:r>
+    </w:p>
+    <w:p>
+      <w:r>
+        <w:t xml:space="preserve">Ahead, an old stone marker stood beside the guardrail. Moss covered most of its face, but the carved characters near the top remained visible.</w:t>
+      </w:r>
+    </w:p>
+    <w:p>
+      <w:r>
+        <w:t xml:space="preserve">WEST HANEUL.</w:t>
+      </w:r>
+    </w:p>
+    <w:p>
+      <w:r>
+        <w:t xml:space="preserve">The moment the minibus passed it, the system changed.</w:t>
+      </w:r>
+    </w:p>
+    <w:p>
+      <w:r>
+        <w:t xml:space="preserve">Threshold Crossed.</w:t>
+      </w:r>
+    </w:p>
+    <w:p>
+      <w:r>
+        <w:t xml:space="preserve">Unregistered Cultivation Field Detected.</w:t>
+      </w:r>
+    </w:p>
+    <w:p>
+      <w:r>
+        <w:t xml:space="preserve">Field Classification: Incomplete.</w:t>
+      </w:r>
+    </w:p>
+    <w:p>
+      <w:r>
+        <w:t xml:space="preserve">Stability: 63 percent.</w:t>
+      </w:r>
+    </w:p>
+    <w:p>
+      <w:r>
+        <w:t xml:space="preserve">Occupancy: 1.</w:t>
+      </w:r>
+    </w:p>
+    <w:p>
+      <w:r>
+        <w:t xml:space="preserve">Kai sat forward.</w:t>
+      </w:r>
+    </w:p>
+    <w:p>
+      <w:r>
+        <w:t xml:space="preserve">"Stop. "</w:t>
+      </w:r>
+    </w:p>
+    <w:p>
+      <w:r>
+        <w:t xml:space="preserve">Han braked hard enough to make the equipment cases slam against their restraints.</w:t>
+      </w:r>
+    </w:p>
+    <w:p>
+      <w:r>
+        <w:t xml:space="preserve">Rian caught the resonance array with both arms. "Advance notice! "</w:t>
+      </w:r>
+    </w:p>
+    <w:p>
+      <w:r>
+        <w:t xml:space="preserve">"What is it? " Dr. Venn asked.</w:t>
+      </w:r>
+    </w:p>
+    <w:p>
+      <w:r>
+        <w:t xml:space="preserve">Kai looked through the rear window.</w:t>
+      </w:r>
+    </w:p>
+    <w:p>
+      <w:r>
+        <w:t xml:space="preserve">The stone marker stood thirty meters behind them. Beyond it, the road appeared unchanged. Gray asphalt. Winter grass. A drainage ditch filled with dead leaves.</w:t>
+      </w:r>
+    </w:p>
+    <w:p>
+      <w:r>
+        <w:t xml:space="preserve">Yet the qi in the air had shifted.</w:t>
+      </w:r>
+    </w:p>
+    <w:p>
+      <w:r>
+        <w:t xml:space="preserve">It was thin, almost too thin to feel, but ordered. Not the restless pressure of a natural fracture. Not the stale residue that clung to sealed sites. The field stretched through the basin in layered currents, each one aligned with the roads, the slopes, and the buried water channels beneath the ground.</w:t>
+      </w:r>
+    </w:p>
+    <w:p>
+      <w:r>
+        <w:t xml:space="preserve">It felt maintained.</w:t>
+      </w:r>
+    </w:p>
+    <w:p>
+      <w:r>
+        <w:t xml:space="preserve">Not recently.</w:t>
+      </w:r>
+    </w:p>
+    <w:p>
+      <w:r>
+        <w:t xml:space="preserve">Continuously.</w:t>
+      </w:r>
+    </w:p>
+    <w:p>
+      <w:r>
+        <w:t xml:space="preserve">"The basin is inside a formation," Kai said.</w:t>
+      </w:r>
+    </w:p>
+    <w:p>
+      <w:r>
+        <w:t xml:space="preserve">Han pulled the minibus onto the shoulder. "Defensive? "</w:t>
+      </w:r>
+    </w:p>
+    <w:p>
+      <w:r>
+        <w:t xml:space="preserve">"I cannot tell. "</w:t>
+      </w:r>
+    </w:p>
+    <w:p>
+      <w:r>
+        <w:t xml:space="preserve">Dr. Venn was already opening the nearest equipment case. "How large? "</w:t>
+      </w:r>
+    </w:p>
+    <w:p>
+      <w:r>
+        <w:t xml:space="preserve">"All of West Haneul. "</w:t>
+      </w:r>
+    </w:p>
+    <w:p>
+      <w:r>
+        <w:t xml:space="preserve">Rian looked toward the clustered roofs visible beyond the next rise. "The records list three thousand residents. "</w:t>
+      </w:r>
+    </w:p>
+    <w:p>
+      <w:r>
+        <w:t xml:space="preserve">"Three thousand four hundred and twelve," Dr. Venn said.</w:t>
+      </w:r>
+    </w:p>
+    <w:p>
+      <w:r>
+        <w:t xml:space="preserve">"Thank you for making the number worse. "</w:t>
+      </w:r>
+    </w:p>
+    <w:p>
+      <w:r>
+        <w:t xml:space="preserve">Han turned off the engine.</w:t>
+      </w:r>
+    </w:p>
+    <w:p>
+      <w:r>
+        <w:t xml:space="preserve">The heater died with a final offended rattle.</w:t>
+      </w:r>
+    </w:p>
+    <w:p>
+      <w:r>
+        <w:t xml:space="preserve">For several seconds, the only sound inside the minibus was rain tapping the roof.</w:t>
+      </w:r>
+    </w:p>
+    <w:p>
+      <w:r>
+        <w:t xml:space="preserve">Then Dr. Venn assembled the portable array.</w:t>
+      </w:r>
+    </w:p>
+    <w:p>
+      <w:r>
+        <w:t xml:space="preserve">The device unfolded into three brass rings mounted around a glass cylinder. Fine wires ran from the cylinder to a tablet in her hand. When she switched it on, a low tone filled the vehicle.</w:t>
+      </w:r>
+    </w:p>
+    <w:p>
+      <w:r>
+        <w:t xml:space="preserve">The rings rotated.</w:t>
+      </w:r>
+    </w:p>
+    <w:p>
+      <w:r>
+        <w:t xml:space="preserve">The tone sharpened.</w:t>
+      </w:r>
+    </w:p>
+    <w:p>
+      <w:r>
+        <w:t xml:space="preserve">The glass cylinder clouded from within.</w:t>
+      </w:r>
+    </w:p>
+    <w:p>
+      <w:r>
+        <w:t xml:space="preserve">Dr. Venn frowned. "It is reading environmental coherence. "</w:t>
+      </w:r>
+    </w:p>
+    <w:p>
+      <w:r>
+        <w:t xml:space="preserve">Han unfastened his seat belt. "Meaning? "</w:t>
+      </w:r>
+    </w:p>
+    <w:p>
+      <w:r>
+        <w:t xml:space="preserve">"The field is not merely covering the town. It is using the town. "</w:t>
+      </w:r>
+    </w:p>
+    <w:p>
+      <w:r>
+        <w:t xml:space="preserve">Rian stared at her.</w:t>
+      </w:r>
+    </w:p>
+    <w:p>
+      <w:r>
+        <w:t xml:space="preserve">She continued before he could ask.</w:t>
+      </w:r>
+    </w:p>
+    <w:p>
+      <w:r>
+        <w:t xml:space="preserve">"Roads, walls, drainage lines, power cables, property boundaries. They have all been incorporated into a single geometric structure. Not perfectly, but deliberately. Every renovation and expansion has been guided into the same pattern. "</w:t>
+      </w:r>
+    </w:p>
+    <w:p>
+      <w:r>
+        <w:t xml:space="preserve">"For how long? " Kai asked.</w:t>
+      </w:r>
+    </w:p>
+    <w:p>
+      <w:r>
+        <w:t xml:space="preserve">Dr. Venn studied the waveform. "Decades. Possibly longer. "</w:t>
+      </w:r>
+    </w:p>
+    <w:p>
+      <w:r>
+        <w:t xml:space="preserve">"Would the residents know? "</w:t>
+      </w:r>
+    </w:p>
+    <w:p>
+      <w:r>
+        <w:t xml:space="preserve">"Most would not feel anything. Sensitive individuals might experience recurring dreams, directional unease, memory distortion, or the persistent belief that certain streets should not be entered. "</w:t>
+      </w:r>
+    </w:p>
+    <w:p>
+      <w:r>
+        <w:t xml:space="preserve">Rian slowly turned toward the window. "I dislike how specific that became. "</w:t>
+      </w:r>
+    </w:p>
+    <w:p>
+      <w:r>
+        <w:t xml:space="preserve">Kai opened the regional query.</w:t>
+      </w:r>
+    </w:p>
+    <w:p>
+      <w:r>
+        <w:t xml:space="preserve">Regional Query: Identify primary function of detected field.</w:t>
+      </w:r>
+    </w:p>
+    <w:p>
+      <w:r>
+        <w:t xml:space="preserve">Cost: 6 Meridian Units.</w:t>
+      </w:r>
+    </w:p>
+    <w:p>
+      <w:r>
+        <w:t xml:space="preserve">He accepted.</w:t>
+      </w:r>
+    </w:p>
+    <w:p>
+      <w:r>
+        <w:t xml:space="preserve">Cold pressure moved through the channels beneath his ribs. It was not pain, exactly. It felt like a hand passing along the inside of his bones, counting what belonged there.</w:t>
+      </w:r>
+    </w:p>
+    <w:p>
+      <w:r>
+        <w:t xml:space="preserve">The answer formed.</w:t>
+      </w:r>
+    </w:p>
+    <w:p>
+      <w:r>
+        <w:t xml:space="preserve">Primary Function: Recognition.</w:t>
+      </w:r>
+    </w:p>
+    <w:p>
+      <w:r>
+        <w:t xml:space="preserve">Kai waited.</w:t>
+      </w:r>
+    </w:p>
+    <w:p>
+      <w:r>
+        <w:t xml:space="preserve">Nothing else appeared.</w:t>
+      </w:r>
+    </w:p>
+    <w:p>
+      <w:r>
+        <w:t xml:space="preserve">"Recognition," he said.</w:t>
+      </w:r>
+    </w:p>
+    <w:p>
+      <w:r>
+        <w:t xml:space="preserve">Han looked back. "It identifies people entering the town? "</w:t>
+      </w:r>
+    </w:p>
+    <w:p>
+      <w:r>
+        <w:t xml:space="preserve">"Or forces the town to identify them," Dr. Venn said.</w:t>
+      </w:r>
+    </w:p>
+    <w:p>
+      <w:r>
+        <w:t xml:space="preserve">Rian released the equipment case and leaned away from the window. "Can we return to the city and investigate something less interested in knowing us? "</w:t>
+      </w:r>
+    </w:p>
+    <w:p>
+      <w:r>
+        <w:t xml:space="preserve">"No," Han said.</w:t>
+      </w:r>
+    </w:p>
+    <w:p>
+      <w:r>
+        <w:t xml:space="preserve">"I knew that. I wanted to hear how unreasonable it sounded aloud. "</w:t>
+      </w:r>
+    </w:p>
+    <w:p>
+      <w:r>
+        <w:t xml:space="preserve">Kai studied the stone marker.</w:t>
+      </w:r>
+    </w:p>
+    <w:p>
+      <w:r>
+        <w:t xml:space="preserve">The formation had already registered them. The system's occupancy count had shown one, not three thousand four hundred and twelve.</w:t>
+      </w:r>
+    </w:p>
+    <w:p>
+      <w:r>
+        <w:t xml:space="preserve">One occupant.</w:t>
+      </w:r>
+    </w:p>
+    <w:p>
+      <w:r>
+        <w:t xml:space="preserve">Not one cultivator.</w:t>
+      </w:r>
+    </w:p>
+    <w:p>
+      <w:r>
+        <w:t xml:space="preserve">Not one active core.</w:t>
+      </w:r>
+    </w:p>
+    <w:p>
+      <w:r>
+        <w:t xml:space="preserve">One.</w:t>
+      </w:r>
+    </w:p>
+    <w:p>
+      <w:r>
+        <w:t xml:space="preserve">He focused again.</w:t>
+      </w:r>
+    </w:p>
+    <w:p>
+      <w:r>
+        <w:t xml:space="preserve">Clarification Query Available.</w:t>
+      </w:r>
+    </w:p>
+    <w:p>
+      <w:r>
+        <w:t xml:space="preserve">Cost: 9 Meridian Units.</w:t>
+      </w:r>
+    </w:p>
+    <w:p>
+      <w:r>
+        <w:t xml:space="preserve">He did not accept.</w:t>
+      </w:r>
+    </w:p>
+    <w:p>
+      <w:r>
+        <w:t xml:space="preserve">The system had recognized the danger. That did not mean it understood it.</w:t>
+      </w:r>
+    </w:p>
+    <w:p>
+      <w:r>
+        <w:t xml:space="preserve">"We continue," Kai said. "Slowly. No unnecessary stops until we reach the municipal office. "</w:t>
+      </w:r>
+    </w:p>
+    <w:p>
+      <w:r>
+        <w:t xml:space="preserve">Han started the engine.</w:t>
+      </w:r>
+    </w:p>
+    <w:p>
+      <w:r>
+        <w:t xml:space="preserve">The heater remained dead despite renewed insults.</w:t>
+      </w:r>
+    </w:p>
+    <w:p>
+      <w:r>
+        <w:t xml:space="preserve">West Haneul appeared ordinary from a distance.</w:t>
+      </w:r>
+    </w:p>
+    <w:p>
+      <w:r>
+        <w:t xml:space="preserve">That made it worse.</w:t>
+      </w:r>
+    </w:p>
+    <w:p>
+      <w:r>
+        <w:t xml:space="preserve">The town filled the basin in low layers of concrete, brick, and aging tile. Small apartment blocks stood beside older homes with curved roofs. A grocery store displayed crates of cabbage beneath a striped awning. A mechanic worked under the raised hood of a delivery truck. Two children in yellow raincoats splashed through a gutter while an elderly woman watched from a doorway.</w:t>
+      </w:r>
+    </w:p>
+    <w:p>
+      <w:r>
+        <w:t xml:space="preserve">No one looked frightened.</w:t>
+      </w:r>
+    </w:p>
+    <w:p>
+      <w:r>
+        <w:t xml:space="preserve">No one looked entranced.</w:t>
+      </w:r>
+    </w:p>
+    <w:p>
+      <w:r>
+        <w:t xml:space="preserve">No one looked toward the minibus as it entered.</w:t>
+      </w:r>
+    </w:p>
+    <w:p>
+      <w:r>
+        <w:t xml:space="preserve">Kai watched every face.</w:t>
+      </w:r>
+    </w:p>
+    <w:p>
+      <w:r>
+        <w:t xml:space="preserve">The formation's qi moved beneath the road in narrow channels. At each intersection, the current divided and rejoined. Utility poles served as vertical anchors. Metal signs carried faint traces of engraved script hidden beneath paint. Even the traffic mirrors had been angled to reflect energy between streets.</w:t>
+      </w:r>
+    </w:p>
+    <w:p>
+      <w:r>
+        <w:t xml:space="preserve">Whoever maintained the structure had adapted an old formation to modern infrastructure.</w:t>
+      </w:r>
+    </w:p>
+    <w:p>
+      <w:r>
+        <w:t xml:space="preserve">That required more than knowledge.</w:t>
+      </w:r>
+    </w:p>
+    <w:p>
+      <w:r>
+        <w:t xml:space="preserve">It required patience.</w:t>
+      </w:r>
+    </w:p>
+    <w:p>
+      <w:r>
+        <w:t xml:space="preserve">Han slowed near a crosswalk.</w:t>
+      </w:r>
+    </w:p>
+    <w:p>
+      <w:r>
+        <w:t xml:space="preserve">A man stood beneath a black umbrella, waiting to cross.</w:t>
+      </w:r>
+    </w:p>
+    <w:p>
+      <w:r>
+        <w:t xml:space="preserve">He appeared to be in his late twenties. Dark coat. Gray trousers. No bag. No phone. Rainwater gathered along the edge of his umbrella but did not fall.</w:t>
+      </w:r>
+    </w:p>
+    <w:p>
+      <w:r>
+        <w:t xml:space="preserve">As the minibus approached, he lifted his head.</w:t>
+      </w:r>
+    </w:p>
+    <w:p>
+      <w:r>
+        <w:t xml:space="preserve">His gaze met Kai's through the glass.</w:t>
+      </w:r>
+    </w:p>
+    <w:p>
+      <w:r>
+        <w:t xml:space="preserve">The system reacted.</w:t>
+      </w:r>
+    </w:p>
+    <w:p>
+      <w:r>
+        <w:t xml:space="preserve">Identity Conflict Detected.</w:t>
+      </w:r>
+    </w:p>
+    <w:p>
+      <w:r>
+        <w:t xml:space="preserve">The man smiled.</w:t>
+      </w:r>
+    </w:p>
+    <w:p>
+      <w:r>
+        <w:t xml:space="preserve">Then Han drove past him.</w:t>
+      </w:r>
+    </w:p>
+    <w:p>
+      <w:r>
+        <w:t xml:space="preserve">Kai twisted in his seat.</w:t>
+      </w:r>
+    </w:p>
+    <w:p>
+      <w:r>
+        <w:t xml:space="preserve">The crosswalk was empty.</w:t>
+      </w:r>
+    </w:p>
+    <w:p>
+      <w:r>
+        <w:t xml:space="preserve">"Stop. "</w:t>
+      </w:r>
+    </w:p>
+    <w:p>
+      <w:r>
+        <w:t xml:space="preserve">Again the brakes protested.</w:t>
+      </w:r>
+    </w:p>
+    <w:p>
+      <w:r>
+        <w:t xml:space="preserve">This time Rian had one hand on the equipment case before it moved.</w:t>
+      </w:r>
+    </w:p>
+    <w:p>
+      <w:r>
+        <w:t xml:space="preserve">Han looked into the mirror. "You saw something. "</w:t>
+      </w:r>
+    </w:p>
+    <w:p>
+      <w:r>
+        <w:t xml:space="preserve">"A man at the crosswalk. "</w:t>
+      </w:r>
+    </w:p>
+    <w:p>
+      <w:r>
+        <w:t xml:space="preserve">Dr. Venn looked through the rear window. "There is no one there. "</w:t>
+      </w:r>
+    </w:p>
+    <w:p>
+      <w:r>
+        <w:t xml:space="preserve">"There was. "</w:t>
+      </w:r>
+    </w:p>
+    <w:p>
+      <w:r>
+        <w:t xml:space="preserve">"What did he look like? " Rian asked.</w:t>
+      </w:r>
+    </w:p>
+    <w:p>
+      <w:r>
+        <w:t xml:space="preserve">Kai described him.</w:t>
+      </w:r>
+    </w:p>
+    <w:p>
+      <w:r>
+        <w:t xml:space="preserve">Rian's expression tightened.</w:t>
+      </w:r>
+    </w:p>
+    <w:p>
+      <w:r>
+        <w:t xml:space="preserve">Han noticed. "What? "</w:t>
+      </w:r>
+    </w:p>
+    <w:p>
+      <w:r>
+        <w:t xml:space="preserve">"When we passed the grocery store," Rian said, "I saw someone matching that description standing beneath the awning. "</w:t>
+      </w:r>
+    </w:p>
+    <w:p>
+      <w:r>
+        <w:t xml:space="preserve">Dr. Venn checked the tablet. "You did not mention it. "</w:t>
+      </w:r>
+    </w:p>
+    <w:p>
+      <w:r>
+        <w:t xml:space="preserve">"I thought he was waiting for the rain to ease. "</w:t>
+      </w:r>
+    </w:p>
+    <w:p>
+      <w:r>
+        <w:t xml:space="preserve">"The grocery store was three streets back," Han said.</w:t>
+      </w:r>
+    </w:p>
+    <w:p>
+      <w:r>
+        <w:t xml:space="preserve">"I know. "</w:t>
+      </w:r>
+    </w:p>
+    <w:p>
+      <w:r>
+        <w:t xml:space="preserve">Kai looked at the system message.</w:t>
+      </w:r>
+    </w:p>
+    <w:p>
+      <w:r>
+        <w:t xml:space="preserve">Identity Conflict Detected.</w:t>
+      </w:r>
+    </w:p>
+    <w:p>
+      <w:r>
+        <w:t xml:space="preserve">No further explanation.</w:t>
+      </w:r>
+    </w:p>
+    <w:p>
+      <w:r>
+        <w:t xml:space="preserve">Han eased the minibus forward again.</w:t>
+      </w:r>
+    </w:p>
+    <w:p>
+      <w:r>
+        <w:t xml:space="preserve">They reached the municipal office at nine seventeen.</w:t>
+      </w:r>
+    </w:p>
+    <w:p>
+      <w:r>
+        <w:t xml:space="preserve">The building had once been a school. Its broad concrete steps were worn in the center, and the faded outline of removed lettering remained above the entrance. A newer sign identified it as the West Haneul Community Administration Center.</w:t>
+      </w:r>
+    </w:p>
+    <w:p>
+      <w:r>
+        <w:t xml:space="preserve">Three flagpoles stood in the courtyard.</w:t>
+      </w:r>
+    </w:p>
+    <w:p>
+      <w:r>
+        <w:t xml:space="preserve">Only two carried flags.</w:t>
+      </w:r>
+    </w:p>
+    <w:p>
+      <w:r>
+        <w:t xml:space="preserve">The third was wrapped in white cord from base to tip.</w:t>
+      </w:r>
+    </w:p>
+    <w:p>
+      <w:r>
+        <w:t xml:space="preserve">Han parked beside a row of compact cars.</w:t>
+      </w:r>
+    </w:p>
+    <w:p>
+      <w:r>
+        <w:t xml:space="preserve">"Observation and civilian contact only," Dr. Venn said.</w:t>
+      </w:r>
+    </w:p>
+    <w:p>
+      <w:r>
+        <w:t xml:space="preserve">Rian opened the door. "You sounded exactly like Dr. Park. "</w:t>
+      </w:r>
+    </w:p>
+    <w:p>
+      <w:r>
+        <w:t xml:space="preserve">"That was intentional. "</w:t>
+      </w:r>
+    </w:p>
+    <w:p>
+      <w:r>
+        <w:t xml:space="preserve">The air outside was colder than Kai expected.</w:t>
+      </w:r>
+    </w:p>
+    <w:p>
+      <w:r>
+        <w:t xml:space="preserve">Rain had weakened to mist. It clung to his hair and coat without seeming to fall. The town's qi pressed lightly against his skin, not hostile, but attentive.</w:t>
+      </w:r>
+    </w:p>
+    <w:p>
+      <w:r>
+        <w:t xml:space="preserve">Recognition.</w:t>
+      </w:r>
+    </w:p>
+    <w:p>
+      <w:r>
+        <w:t xml:space="preserve">The formation was still deciding what they were.</w:t>
+      </w:r>
+    </w:p>
+    <w:p>
+      <w:r>
+        <w:t xml:space="preserve">Han unloaded the equipment while Dr. Venn reviewed their cover. They were conducting a civil infrastructure assessment following irregular magnetic readings and archival inconsistencies. It was true enough to survive casual scrutiny and dull enough to discourage questions.</w:t>
+      </w:r>
+    </w:p>
+    <w:p>
+      <w:r>
+        <w:t xml:space="preserve">Rian looked up at the empty flagpole.</w:t>
+      </w:r>
+    </w:p>
+    <w:p>
+      <w:r>
+        <w:t xml:space="preserve">"Is that normal? "</w:t>
+      </w:r>
+    </w:p>
+    <w:p>
+      <w:r>
+        <w:t xml:space="preserve">"No," Kai said.</w:t>
+      </w:r>
+    </w:p>
+    <w:p>
+      <w:r>
+        <w:t xml:space="preserve">"You answered quickly. "</w:t>
+      </w:r>
+    </w:p>
+    <w:p>
+      <w:r>
+        <w:t xml:space="preserve">"The cord is part of the formation. "</w:t>
+      </w:r>
+    </w:p>
+    <w:p>
+      <w:r>
+        <w:t xml:space="preserve">Dr. Venn lifted the resonance array toward it. The brass rings rotated half a turn, then stopped.</w:t>
+      </w:r>
+    </w:p>
+    <w:p>
+      <w:r>
+        <w:t xml:space="preserve">"The cord is hemp," she said. "Salt treated. There are iron filings woven into the fibers. "</w:t>
+      </w:r>
+    </w:p>
+    <w:p>
+      <w:r>
+        <w:t xml:space="preserve">Han followed the line upward. "Boundary marker? "</w:t>
+      </w:r>
+    </w:p>
+    <w:p>
+      <w:r>
+        <w:t xml:space="preserve">"More likely a counting post. "</w:t>
+      </w:r>
+    </w:p>
+    <w:p>
+      <w:r>
+        <w:t xml:space="preserve">Rian looked at the municipal building. "Counting what? "</w:t>
+      </w:r>
+    </w:p>
+    <w:p>
+      <w:r>
+        <w:t xml:space="preserve">The front doors opened.</w:t>
+      </w:r>
+    </w:p>
+    <w:p>
+      <w:r>
+        <w:t xml:space="preserve">A woman in a navy administrative jacket stepped outside. She was perhaps fifty, with cropped hair and the expression of someone who had already been told about a problem she did not intend to adopt.</w:t>
+      </w:r>
+    </w:p>
+    <w:p>
+      <w:r>
+        <w:t xml:space="preserve">"You are from the city bureau? "</w:t>
+      </w:r>
+    </w:p>
+    <w:p>
+      <w:r>
+        <w:t xml:space="preserve">Dr. Venn stepped forward and presented her credentials. "Dr. Mira Venn. Thank you for receiving us on short notice. "</w:t>
+      </w:r>
+    </w:p>
+    <w:p>
+      <w:r>
+        <w:t xml:space="preserve">The woman examined the card, then the minibus, then Han.</w:t>
+      </w:r>
+    </w:p>
+    <w:p>
+      <w:r>
+        <w:t xml:space="preserve">Her gaze paused on Kai.</w:t>
+      </w:r>
+    </w:p>
+    <w:p>
+      <w:r>
+        <w:t xml:space="preserve">Something changed in her face.</w:t>
+      </w:r>
+    </w:p>
+    <w:p>
+      <w:r>
+        <w:t xml:space="preserve">Not fear.</w:t>
+      </w:r>
+    </w:p>
+    <w:p>
+      <w:r>
+        <w:t xml:space="preserve">Recognition.</w:t>
+      </w:r>
+    </w:p>
+    <w:p>
+      <w:r>
+        <w:t xml:space="preserve">"You brought him," she said.</w:t>
+      </w:r>
+    </w:p>
+    <w:p>
+      <w:r>
+        <w:t xml:space="preserve">No one moved.</w:t>
+      </w:r>
+    </w:p>
+    <w:p>
+      <w:r>
+        <w:t xml:space="preserve">Dr. Venn kept her voice level. "I am sorry? "</w:t>
+      </w:r>
+    </w:p>
+    <w:p>
+      <w:r>
+        <w:t xml:space="preserve">The woman blinked.</w:t>
+      </w:r>
+    </w:p>
+    <w:p>
+      <w:r>
+        <w:t xml:space="preserve">Her expression cleared so completely that Kai wondered whether he had imagined the first one.</w:t>
+      </w:r>
+    </w:p>
+    <w:p>
+      <w:r>
+        <w:t xml:space="preserve">"You brought additional personnel," she said. "The request listed two inspectors. "</w:t>
+      </w:r>
+    </w:p>
+    <w:p>
+      <w:r>
+        <w:t xml:space="preserve">"Our team expanded after the archive review. "</w:t>
+      </w:r>
+    </w:p>
+    <w:p>
+      <w:r>
+        <w:t xml:space="preserve">"Of course. "</w:t>
+      </w:r>
+    </w:p>
+    <w:p>
+      <w:r>
+        <w:t xml:space="preserve">She handed the credentials back. "I am Deputy Administrator Choi. Administrator Bae is unavailable this morning. I can provide access to the property records and maintenance logs, but I was informed your review would not disrupt public services. "</w:t>
+      </w:r>
+    </w:p>
+    <w:p>
+      <w:r>
+        <w:t xml:space="preserve">"It will not," Dr. Venn said.</w:t>
+      </w:r>
+    </w:p>
+    <w:p>
+      <w:r>
+        <w:t xml:space="preserve">Deputy Administrator Choi looked at Kai once more.</w:t>
+      </w:r>
+    </w:p>
+    <w:p>
+      <w:r>
+        <w:t xml:space="preserve">This time there was no recognition.</w:t>
+      </w:r>
+    </w:p>
+    <w:p>
+      <w:r>
+        <w:t xml:space="preserve">"Come inside. "</w:t>
+      </w:r>
+    </w:p>
+    <w:p>
+      <w:r>
+        <w:t xml:space="preserve">The municipal office smelled of wet coats, copier toner, and boiled barley tea.</w:t>
+      </w:r>
+    </w:p>
+    <w:p>
+      <w:r>
+        <w:t xml:space="preserve">People moved through the lobby carrying forms and umbrellas. A television mounted in one corner showed a weather report with the sound muted. A row of plastic chairs faced a service counter. Behind it, two clerks worked beneath fluorescent lights.</w:t>
+      </w:r>
+    </w:p>
+    <w:p>
+      <w:r>
+        <w:t xml:space="preserve">Everyone looked ordinary.</w:t>
+      </w:r>
+    </w:p>
+    <w:p>
+      <w:r>
+        <w:t xml:space="preserve">Kai's system did not.</w:t>
+      </w:r>
+    </w:p>
+    <w:p>
+      <w:r>
+        <w:t xml:space="preserve">Identity Conflict Detected.</w:t>
+      </w:r>
+    </w:p>
+    <w:p>
+      <w:r>
+        <w:t xml:space="preserve">The message flashed again as an elderly man passed them.</w:t>
+      </w:r>
+    </w:p>
+    <w:p>
+      <w:r>
+        <w:t xml:space="preserve">Then again when a young clerk looked up from her monitor.</w:t>
+      </w:r>
+    </w:p>
+    <w:p>
+      <w:r>
+        <w:t xml:space="preserve">Then again when a maintenance worker emerged from a side corridor.</w:t>
+      </w:r>
+    </w:p>
+    <w:p>
+      <w:r>
+        <w:t xml:space="preserve">Three different faces.</w:t>
+      </w:r>
+    </w:p>
+    <w:p>
+      <w:r>
+        <w:t xml:space="preserve">One conflict.</w:t>
+      </w:r>
+    </w:p>
+    <w:p>
+      <w:r>
+        <w:t xml:space="preserve">Kai watched the maintenance worker disappear through a door marked STAFF ONLY.</w:t>
+      </w:r>
+    </w:p>
+    <w:p>
+      <w:r>
+        <w:t xml:space="preserve">"Is something wrong? " Deputy Administrator Choi asked.</w:t>
+      </w:r>
+    </w:p>
+    <w:p>
+      <w:r>
+        <w:t xml:space="preserve">"Your building layout," Kai said. "Has it changed recently? "</w:t>
+      </w:r>
+    </w:p>
+    <w:p>
+      <w:r>
+        <w:t xml:space="preserve">She glanced toward the corridor. "The western offices were renovated last year. "</w:t>
+      </w:r>
+    </w:p>
+    <w:p>
+      <w:r>
+        <w:t xml:space="preserve">"Walls moved? "</w:t>
+      </w:r>
+    </w:p>
+    <w:p>
+      <w:r>
+        <w:t xml:space="preserve">"One partition. Why? "</w:t>
+      </w:r>
+    </w:p>
+    <w:p>
+      <w:r>
+        <w:t xml:space="preserve">"He notices structural irregularities," Dr. Venn said smoothly. "It is why he is here. "</w:t>
+      </w:r>
+    </w:p>
+    <w:p>
+      <w:r>
+        <w:t xml:space="preserve">Deputy Administrator Choi accepted that with visible reluctance.</w:t>
+      </w:r>
+    </w:p>
+    <w:p>
+      <w:r>
+        <w:t xml:space="preserve">She led them upstairs to a records room overlooking the courtyard.</w:t>
+      </w:r>
+    </w:p>
+    <w:p>
+      <w:r>
+        <w:t xml:space="preserve">Metal shelves filled most of the space. Newer property files occupied labeled binders. Older documents rested in archival boxes stacked along the rear wall. A large map of West Haneul hung behind the central table.</w:t>
+      </w:r>
+    </w:p>
+    <w:p>
+      <w:r>
+        <w:t xml:space="preserve">Kai stopped inside the doorway.</w:t>
+      </w:r>
+    </w:p>
+    <w:p>
+      <w:r>
+        <w:t xml:space="preserve">The map was wrong.</w:t>
+      </w:r>
+    </w:p>
+    <w:p>
+      <w:r>
+        <w:t xml:space="preserve">Not geographically.</w:t>
+      </w:r>
+    </w:p>
+    <w:p>
+      <w:r>
+        <w:t xml:space="preserve">Energetically.</w:t>
+      </w:r>
+    </w:p>
+    <w:p>
+      <w:r>
+        <w:t xml:space="preserve">Thin red lines had been drawn across the printed streets, connecting schools, wells, transformer boxes, bridges, and public buildings. Most were faint enough to resemble faded marker. Together they formed a web centered on the western ridge.</w:t>
+      </w:r>
+    </w:p>
+    <w:p>
+      <w:r>
+        <w:t xml:space="preserve">At the center of the web, someone had placed a black pin.</w:t>
+      </w:r>
+    </w:p>
+    <w:p>
+      <w:r>
+        <w:t xml:space="preserve">The label beneath it read JUN HOUSEHOLD MEMORIAL SITE.</w:t>
+      </w:r>
+    </w:p>
+    <w:p>
+      <w:r>
+        <w:t xml:space="preserve">Dr. Venn saw it too.</w:t>
+      </w:r>
+    </w:p>
+    <w:p>
+      <w:r>
+        <w:t xml:space="preserve">"Deputy Administrator," she said, "what is the memorial site? "</w:t>
+      </w:r>
+    </w:p>
+    <w:p>
+      <w:r>
+        <w:t xml:space="preserve">Choi followed her gaze. "An old grave plot. "</w:t>
+      </w:r>
+    </w:p>
+    <w:p>
+      <w:r>
+        <w:t xml:space="preserve">"The archive maps do not show a cemetery there. "</w:t>
+      </w:r>
+    </w:p>
+    <w:p>
+      <w:r>
+        <w:t xml:space="preserve">"It is not a cemetery. One family was buried near the ridge before the district registry was established. "</w:t>
+      </w:r>
+    </w:p>
+    <w:p>
+      <w:r>
+        <w:t xml:space="preserve">"The Jun family? "</w:t>
+      </w:r>
+    </w:p>
+    <w:p>
+      <w:r>
+        <w:t xml:space="preserve">"Yes. "</w:t>
+      </w:r>
+    </w:p>
+    <w:p>
+      <w:r>
+        <w:t xml:space="preserve">"Seo Jun? "</w:t>
+      </w:r>
+    </w:p>
+    <w:p>
+      <w:r>
+        <w:t xml:space="preserve">Deputy Administrator Choi went still.</w:t>
+      </w:r>
+    </w:p>
+    <w:p>
+      <w:r>
+        <w:t xml:space="preserve">Only for a moment.</w:t>
+      </w:r>
+    </w:p>
+    <w:p>
+      <w:r>
+        <w:t xml:space="preserve">Then she turned toward the door.</w:t>
+      </w:r>
+    </w:p>
+    <w:p>
+      <w:r>
+        <w:t xml:space="preserve">"I will bring the maintenance logs. "</w:t>
+      </w:r>
+    </w:p>
+    <w:p>
+      <w:r>
+        <w:t xml:space="preserve">"Deputy Administrator," Han said.</w:t>
+      </w:r>
+    </w:p>
+    <w:p>
+      <w:r>
+        <w:t xml:space="preserve">She stopped without looking back.</w:t>
+      </w:r>
+    </w:p>
+    <w:p>
+      <w:r>
+        <w:t xml:space="preserve">"Who is Seo Jun? "</w:t>
+      </w:r>
+    </w:p>
+    <w:p>
+      <w:r>
+        <w:t xml:space="preserve">The lights flickered.</w:t>
+      </w:r>
+    </w:p>
+    <w:p>
+      <w:r>
+        <w:t xml:space="preserve">Every sound in the building ceased.</w:t>
+      </w:r>
+    </w:p>
+    <w:p>
+      <w:r>
+        <w:t xml:space="preserve">No footsteps in the hall.</w:t>
+      </w:r>
+    </w:p>
+    <w:p>
+      <w:r>
+        <w:t xml:space="preserve">No printers below.</w:t>
+      </w:r>
+    </w:p>
+    <w:p>
+      <w:r>
+        <w:t xml:space="preserve">No muted television.</w:t>
+      </w:r>
+    </w:p>
+    <w:p>
+      <w:r>
+        <w:t xml:space="preserve">Even the rain against the window disappeared.</w:t>
+      </w:r>
+    </w:p>
+    <w:p>
+      <w:r>
+        <w:t xml:space="preserve">Deputy Administrator Choi turned.</w:t>
+      </w:r>
+    </w:p>
+    <w:p>
+      <w:r>
+        <w:t xml:space="preserve">Her face was calm, but her eyes had become unfocused.</w:t>
+      </w:r>
+    </w:p>
+    <w:p>
+      <w:r>
+        <w:t xml:space="preserve">"Seo Jun is the one who stayed," she said.</w:t>
+      </w:r>
+    </w:p>
+    <w:p>
+      <w:r>
+        <w:t xml:space="preserve">The system flooded Kai's vision.</w:t>
+      </w:r>
+    </w:p>
+    <w:p>
+      <w:r>
+        <w:t xml:space="preserve">Field Response Escalating.</w:t>
+      </w:r>
+    </w:p>
+    <w:p>
+      <w:r>
+        <w:t xml:space="preserve">Recognition Sequence Initiated.</w:t>
+      </w:r>
+    </w:p>
+    <w:p>
+      <w:r>
+        <w:t xml:space="preserve">Do not answer identity prompts.</w:t>
+      </w:r>
+    </w:p>
+    <w:p>
+      <w:r>
+        <w:t xml:space="preserve">The last line struck harder than the others.</w:t>
+      </w:r>
+    </w:p>
+    <w:p>
+      <w:r>
+        <w:t xml:space="preserve">The system rarely issued direct warnings.</w:t>
+      </w:r>
+    </w:p>
+    <w:p>
+      <w:r>
+        <w:t xml:space="preserve">Deputy Administrator Choi looked at Rian.</w:t>
+      </w:r>
+    </w:p>
+    <w:p>
+      <w:r>
+        <w:t xml:space="preserve">"What is your name? "</w:t>
+      </w:r>
+    </w:p>
+    <w:p>
+      <w:r>
+        <w:t xml:space="preserve">Rian's mouth opened.</w:t>
+      </w:r>
+    </w:p>
+    <w:p>
+      <w:r>
+        <w:t xml:space="preserve">Kai caught his wrist.</w:t>
+      </w:r>
+    </w:p>
+    <w:p>
+      <w:r>
+        <w:t xml:space="preserve">"Do not answer. "</w:t>
+      </w:r>
+    </w:p>
+    <w:p>
+      <w:r>
+        <w:t xml:space="preserve">Choi's head tilted.</w:t>
+      </w:r>
+    </w:p>
+    <w:p>
+      <w:r>
+        <w:t xml:space="preserve">The motion was too precise.</w:t>
+      </w:r>
+    </w:p>
+    <w:p>
+      <w:r>
+        <w:t xml:space="preserve">"What is your name? " she asked again.</w:t>
+      </w:r>
+    </w:p>
+    <w:p>
+      <w:r>
+        <w:t xml:space="preserve">This time the voice did not belong entirely to her.</w:t>
+      </w:r>
+    </w:p>
+    <w:p>
+      <w:r>
+        <w:t xml:space="preserve">A second voice spoke beneath it, quieter and male.</w:t>
+      </w:r>
+    </w:p>
+    <w:p>
+      <w:r>
+        <w:t xml:space="preserve">Han moved between her and the others. "Deputy Administrator Choi, step back. "</w:t>
+      </w:r>
+    </w:p>
+    <w:p>
+      <w:r>
+        <w:t xml:space="preserve">Her gaze shifted to him.</w:t>
+      </w:r>
+    </w:p>
+    <w:p>
+      <w:r>
+        <w:t xml:space="preserve">"What is your name? "</w:t>
+      </w:r>
+    </w:p>
+    <w:p>
+      <w:r>
+        <w:t xml:space="preserve">Han's hand moved toward the collapsible suppression baton beneath his coat.</w:t>
+      </w:r>
+    </w:p>
+    <w:p>
+      <w:r>
+        <w:t xml:space="preserve">Dr. Venn grabbed his sleeve.</w:t>
+      </w:r>
+    </w:p>
+    <w:p>
+      <w:r>
+        <w:t xml:space="preserve">"Civilian," she whispered.</w:t>
+      </w:r>
+    </w:p>
+    <w:p>
+      <w:r>
+        <w:t xml:space="preserve">Choi looked at Dr. Venn.</w:t>
+      </w:r>
+    </w:p>
+    <w:p>
+      <w:r>
+        <w:t xml:space="preserve">"What is your name? "</w:t>
+      </w:r>
+    </w:p>
+    <w:p>
+      <w:r>
+        <w:t xml:space="preserve">Dr. Venn pressed her lips together.</w:t>
+      </w:r>
+    </w:p>
+    <w:p>
+      <w:r>
+        <w:t xml:space="preserve">The qi in the building tightened.</w:t>
+      </w:r>
+    </w:p>
+    <w:p>
+      <w:r>
+        <w:t xml:space="preserve">Lines beneath the floor brightened in Kai's spiritual perception. They ran through walls, wiring, pipes, and window frames. Every path led toward the black pin on the map.</w:t>
+      </w:r>
+    </w:p>
+    <w:p>
+      <w:r>
+        <w:t xml:space="preserve">Recognition was not the field's final purpose.</w:t>
+      </w:r>
+    </w:p>
+    <w:p>
+      <w:r>
+        <w:t xml:space="preserve">It was the first step.</w:t>
+      </w:r>
+    </w:p>
+    <w:p>
+      <w:r>
+        <w:t xml:space="preserve">The formation identified those who entered, then placed them into its pattern.</w:t>
+      </w:r>
+    </w:p>
+    <w:p>
+      <w:r>
+        <w:t xml:space="preserve">Names were coordinates.</w:t>
+      </w:r>
+    </w:p>
+    <w:p>
+      <w:r>
+        <w:t xml:space="preserve">To answer was to consent to being located.</w:t>
+      </w:r>
+    </w:p>
+    <w:p>
+      <w:r>
+        <w:t xml:space="preserve">Deputy Administrator Choi turned to Kai.</w:t>
+      </w:r>
+    </w:p>
+    <w:p>
+      <w:r>
+        <w:t xml:space="preserve">The second voice beneath hers grew clearer.</w:t>
+      </w:r>
+    </w:p>
+    <w:p>
+      <w:r>
+        <w:t xml:space="preserve">"What is your name? "</w:t>
+      </w:r>
+    </w:p>
+    <w:p>
+      <w:r>
+        <w:t xml:space="preserve">Kai felt the system waiting.</w:t>
+      </w:r>
+    </w:p>
+    <w:p>
+      <w:r>
+        <w:t xml:space="preserve">A new prompt appeared.</w:t>
+      </w:r>
+    </w:p>
+    <w:p>
+      <w:r>
+        <w:t xml:space="preserve">Identity Claim Incoming.</w:t>
+      </w:r>
+    </w:p>
+    <w:p>
+      <w:r>
+        <w:t xml:space="preserve">Resistance possible.</w:t>
+      </w:r>
+    </w:p>
+    <w:p>
+      <w:r>
+        <w:t xml:space="preserve">Cost: Unknown.</w:t>
+      </w:r>
+    </w:p>
+    <w:p>
+      <w:r>
+        <w:t xml:space="preserve">The woman's eyes focused.</w:t>
+      </w:r>
+    </w:p>
+    <w:p>
+      <w:r>
+        <w:t xml:space="preserve">For the first time, Kai saw fear inside them.</w:t>
+      </w:r>
+    </w:p>
+    <w:p>
+      <w:r>
+        <w:t xml:space="preserve">Her lips moved.</w:t>
+      </w:r>
+    </w:p>
+    <w:p>
+      <w:r>
+        <w:t xml:space="preserve">The male voice spoke.</w:t>
+      </w:r>
+    </w:p>
+    <w:p>
+      <w:r>
+        <w:t xml:space="preserve">"Seo Jun. "</w:t>
+      </w:r>
+    </w:p>
+    <w:p>
+      <w:r>
+        <w:t xml:space="preserve">The name traveled through the room like a struck bell.</w:t>
+      </w:r>
+    </w:p>
+    <w:p>
+      <w:r>
+        <w:t xml:space="preserve">Every red line on the wall map darkened.</w:t>
+      </w:r>
+    </w:p>
+    <w:p>
+      <w:r>
+        <w:t xml:space="preserve">Downstairs, the television switched on at full volume.</w:t>
+      </w:r>
+    </w:p>
+    <w:p>
+      <w:r>
+        <w:t xml:space="preserve">A weather forecaster stood before a map of the region, but her mouth did not match the words coming from the speakers.</w:t>
+      </w:r>
+    </w:p>
+    <w:p>
+      <w:r>
+        <w:t xml:space="preserve">"What is your name? "</w:t>
+      </w:r>
+    </w:p>
+    <w:p>
+      <w:r>
+        <w:t xml:space="preserve">From the hallway, several voices answered.</w:t>
+      </w:r>
+    </w:p>
+    <w:p>
+      <w:r>
+        <w:t xml:space="preserve">"Seo Jun. "</w:t>
+      </w:r>
+    </w:p>
+    <w:p>
+      <w:r>
+        <w:t xml:space="preserve">From the lobby below, more voices followed.</w:t>
+      </w:r>
+    </w:p>
+    <w:p>
+      <w:r>
+        <w:t xml:space="preserve">"Seo Jun. "</w:t>
+      </w:r>
+    </w:p>
+    <w:p>
+      <w:r>
+        <w:t xml:space="preserve">Outside, across the courtyard, people stopped beneath umbrellas and turned toward the building.</w:t>
+      </w:r>
+    </w:p>
+    <w:p>
+      <w:r>
+        <w:t xml:space="preserve">"Seo Jun. "</w:t>
+      </w:r>
+    </w:p>
+    <w:p>
+      <w:r>
+        <w:t xml:space="preserve">The formation pulsed.</w:t>
+      </w:r>
+    </w:p>
+    <w:p>
+      <w:r>
+        <w:t xml:space="preserve">The system's occupancy count changed.</w:t>
+      </w:r>
+    </w:p>
+    <w:p>
+      <w:r>
+        <w:t xml:space="preserve">Occupancy: 3,413.</w:t>
+      </w:r>
+    </w:p>
+    <w:p>
+      <w:r>
+        <w:t xml:space="preserve">Then changed again.</w:t>
+      </w:r>
+    </w:p>
+    <w:p>
+      <w:r>
+        <w:t xml:space="preserve">Occupancy: 1.</w:t>
+      </w:r>
+    </w:p>
+    <w:p>
+      <w:r>
+        <w:t xml:space="preserve">Deputy Administrator Choi took one step toward Kai.</w:t>
+      </w:r>
+    </w:p>
+    <w:p>
+      <w:r>
+        <w:t xml:space="preserve">Her shadow did not move with her.</w:t>
+      </w:r>
+    </w:p>
+    <w:p>
+      <w:r>
+        <w:t xml:space="preserve">It remained beside the door, stretched long across the floor despite the flat fluorescent light.</w:t>
+      </w:r>
+    </w:p>
+    <w:p>
+      <w:r>
+        <w:t xml:space="preserve">The shadow lifted its head.</w:t>
+      </w:r>
+    </w:p>
+    <w:p>
+      <w:r>
+        <w:t xml:space="preserve">Kai saw the outline of a man holding an umbrella.</w:t>
+      </w:r>
+    </w:p>
+    <w:p>
+      <w:r>
+        <w:t xml:space="preserve">Dark coat.</w:t>
+      </w:r>
+    </w:p>
+    <w:p>
+      <w:r>
+        <w:t xml:space="preserve">Gray trousers.</w:t>
+      </w:r>
+    </w:p>
+    <w:p>
+      <w:r>
+        <w:t xml:space="preserve">Still water gathered along the umbrella's edge.</w:t>
+      </w:r>
+    </w:p>
+    <w:p>
+      <w:r>
+        <w:t xml:space="preserve">The shadow smiled.</w:t>
+      </w:r>
+    </w:p>
+    <w:p>
+      <w:r>
+        <w:t xml:space="preserve">"You came back," it said.</w:t>
+      </w:r>
+    </w:p>
+    <w:p>
+      <w:r>
+        <w:t xml:space="preserve">Kai's meridians tightened.</w:t>
+      </w:r>
+    </w:p>
+    <w:p>
+      <w:r>
+        <w:t xml:space="preserve">He had never been here.</w:t>
+      </w:r>
+    </w:p>
+    <w:p>
+      <w:r>
+        <w:t xml:space="preserve">He was certain of that.</w:t>
+      </w:r>
+    </w:p>
+    <w:p>
+      <w:r>
+        <w:t xml:space="preserve">The certainty lasted until the room changed.</w:t>
+      </w:r>
+    </w:p>
+    <w:p>
+      <w:r>
+        <w:t xml:space="preserve">For one heartbeat, the metal shelves vanished.</w:t>
+      </w:r>
+    </w:p>
+    <w:p>
+      <w:r>
+        <w:t xml:space="preserve">He stood beneath a night sky filled with ash. The municipal building was gone. In its place rose a wooden hall burning from the inside. Bodies lay across the courtyard, each face covered by a strip of white cloth.</w:t>
+      </w:r>
+    </w:p>
+    <w:p>
+      <w:r>
+        <w:t xml:space="preserve">At the western ridge, someone rang a bronze bell.</w:t>
+      </w:r>
+    </w:p>
+    <w:p>
+      <w:r>
+        <w:t xml:space="preserve">A young man stood before Kai in a blood-soaked robe.</w:t>
+      </w:r>
+    </w:p>
+    <w:p>
+      <w:r>
+        <w:t xml:space="preserve">His face was Seo Jun's face.</w:t>
+      </w:r>
+    </w:p>
+    <w:p>
+      <w:r>
+        <w:t xml:space="preserve">Not the man beneath the umbrella.</w:t>
+      </w:r>
+    </w:p>
+    <w:p>
+      <w:r>
+        <w:t xml:space="preserve">Not exactly.</w:t>
+      </w:r>
+    </w:p>
+    <w:p>
+      <w:r>
+        <w:t xml:space="preserve">Younger.</w:t>
+      </w:r>
+    </w:p>
+    <w:p>
+      <w:r>
+        <w:t xml:space="preserve">Terrified.</w:t>
+      </w:r>
+    </w:p>
+    <w:p>
+      <w:r>
+        <w:t xml:space="preserve">Alive.</w:t>
+      </w:r>
+    </w:p>
+    <w:p>
+      <w:r>
+        <w:t xml:space="preserve">"You promised," the young man said.</w:t>
+      </w:r>
+    </w:p>
+    <w:p>
+      <w:r>
+        <w:t xml:space="preserve">Then the records room returned.</w:t>
+      </w:r>
+    </w:p>
+    <w:p>
+      <w:r>
+        <w:t xml:space="preserve">Kai staggered.</w:t>
+      </w:r>
+    </w:p>
+    <w:p>
+      <w:r>
+        <w:t xml:space="preserve">Han caught his shoulder.</w:t>
+      </w:r>
+    </w:p>
+    <w:p>
+      <w:r>
+        <w:t xml:space="preserve">"What did you see? "</w:t>
+      </w:r>
+    </w:p>
+    <w:p>
+      <w:r>
+        <w:t xml:space="preserve">Before Kai could answer, every person outside the building looked up at the same time.</w:t>
+      </w:r>
+    </w:p>
+    <w:p>
+      <w:r>
+        <w:t xml:space="preserve">Their faces turned toward the western ridge.</w:t>
+      </w:r>
+    </w:p>
+    <w:p>
+      <w:r>
+        <w:t xml:space="preserve">Deputy Administrator Choi whispered through clenched teeth.</w:t>
+      </w:r>
+    </w:p>
+    <w:p>
+      <w:r>
+        <w:t xml:space="preserve">"Do not let him ring the bell again. "</w:t>
+      </w:r>
+    </w:p>
+    <w:p>
+      <w:r>
+        <w:t xml:space="preserve">The shadow beside the door released the umbrella.</w:t>
+      </w:r>
+    </w:p>
+    <w:p>
+      <w:r>
+        <w:t xml:space="preserve">It struck the floor without sound.</w:t>
+      </w:r>
+    </w:p>
+    <w:p>
+      <w:r>
+        <w:t xml:space="preserve">At the western edge of town, beyond the roofs and power lines, a bell began to toll.</w:t>
+      </w:r>
+    </w:p>
+    <w:p>
+      <w:r>
+        <w:t xml:space="preserve">Once.</w:t>
+      </w:r>
+    </w:p>
+    <w:p>
+      <w:r>
+        <w:t xml:space="preserve">The windows trembled.</w:t>
+      </w:r>
+    </w:p>
+    <w:p>
+      <w:r>
+        <w:t xml:space="preserve">Twice.</w:t>
+      </w:r>
+    </w:p>
+    <w:p>
+      <w:r>
+        <w:t xml:space="preserve">The red lines on the map peeled away from the paper like veins lifting beneath skin.</w:t>
+      </w:r>
+    </w:p>
+    <w:p>
+      <w:r>
+        <w:t xml:space="preserve">Three times.</w:t>
+      </w:r>
+    </w:p>
+    <w:p>
+      <w:r>
+        <w:t xml:space="preserve">The black pin at the Jun Household Memorial Site split down the center.</w:t>
+      </w:r>
+    </w:p>
+    <w:p>
+      <w:r>
+        <w:t xml:space="preserve">Something beneath the western ridge opened its eyes.</w:t>
+      </w:r>
+    </w:p>
+    <w:p>
+      <w:r>
+        <w:t xml:space="preserve">The system delivered one final message.</w:t>
+      </w:r>
+    </w:p>
+    <w:p>
+      <w:r>
+        <w:t xml:space="preserve">Emergency Quest Generated: The Name That Refused Burial</w:t>
+      </w:r>
+    </w:p>
+    <w:p>
+      <w:r>
+        <w:t xml:space="preserve">Objective: Reach the western boundary before the seventh bell.</w:t>
+      </w:r>
+    </w:p>
+    <w:p>
+      <w:r>
+        <w:t xml:space="preserve">Failure Condition: Seo Jun completes recognition.</w:t>
+      </w:r>
+    </w:p>
+    <w:p>
+      <w:r>
+        <w:t xml:space="preserve">Current Bell Count: 3.</w:t>
+      </w:r>
+    </w:p>
+    <w:p>
+      <w:r>
+        <w:t xml:space="preserve">The fourth toll rolled across West Haneul.</w:t>
+      </w:r>
+    </w:p>
+    <w:p>
+      <w:r>
+        <w:t xml:space="preserve">Kai looked at Han.</w:t>
+      </w:r>
+    </w:p>
+    <w:p>
+      <w:r>
+        <w:t xml:space="preserve">"Get everyone out of the building. "</w:t>
+      </w:r>
+    </w:p>
+    <w:p>
+      <w:r>
+        <w:t xml:space="preserve">Han did not ask why.</w:t>
+      </w:r>
+    </w:p>
+    <w:p>
+      <w:r>
+        <w:t xml:space="preserve">Kai turned toward the window as the town below began walking west.</w:t>
+      </w:r>
+    </w:p>
+    <w:p>
+      <w:r>
+        <w:t xml:space="preserve">Every resident moved in the same direction.</w:t>
+      </w:r>
+    </w:p>
+    <w:p>
+      <w:r>
+        <w:t xml:space="preserve">Every mouth formed the same name.</w:t>
+      </w:r>
+    </w:p>
+    <w:p>
+      <w:r>
+        <w:t xml:space="preserve">And somewhere among them, the man beneath the black umbrella walked against the crowd, smiling as he came toward Kai.</w:t>
       </w:r>
     </w:p>
     <w:sectPr>

</xml_diff>

<commit_message>
Add Heavenly Ascension System Chapter 62: Before the Seventh Bell
</commit_message>
<xml_diff>
--- a/Heavenly Ascension System.docx
+++ b/Heavenly Ascension System.docx
@@ -46064,6 +46064,3864 @@
     <w:p>
       <w:r>
         <w:t xml:space="preserve">And somewhere among them, the man beneath the black umbrella walked against the crowd, smiling as he came toward Kai.</w:t>
+      </w:r>
+    </w:p>
+    <w:p>
+      <w:pPr>
+        <w:pStyle w:val="Heading1"/>
+      </w:pPr>
+      <w:r>
+        <w:t xml:space="preserve">Chapter 62: Before the Seventh Bell</w:t>
+      </w:r>
+    </w:p>
+    <w:p>
+      <w:r>
+        <w:t xml:space="preserve">And somewhere among them, the man beneath the black umbrella walked against the crowd, smiling as he came toward Kai.</w:t>
+      </w:r>
+    </w:p>
+    <w:p>
+      <w:r>
+        <w:t xml:space="preserve">The fourth bell rolled over West Haneul.</w:t>
+      </w:r>
+    </w:p>
+    <w:p>
+      <w:r>
+        <w:t xml:space="preserve">The sound passed through glass, concrete, bone, and breath. It did not strike the municipal building so much as persuade every part of it to remember that it could tremble. Metal shelves rattled against the records room walls. Dust rose from the map table. Downstairs, hundreds of feet stopped at once.</w:t>
+      </w:r>
+    </w:p>
+    <w:p>
+      <w:r>
+        <w:t xml:space="preserve">Then continued west.</w:t>
+      </w:r>
+    </w:p>
+    <w:p>
+      <w:r>
+        <w:t xml:space="preserve">Kai watched through the window.</w:t>
+      </w:r>
+    </w:p>
+    <w:p>
+      <w:r>
+        <w:t xml:space="preserve">Residents filled every street visible from the municipal office. Some wore coats over sleep clothes. Some carried umbrellas despite the rain having thinned to mist. An elderly man walked with an intravenous stand beside him. Two students moved in matching uniforms, school bags still hanging from their shoulders. A delivery driver had left his truck running in the intersection.</w:t>
+      </w:r>
+    </w:p>
+    <w:p>
+      <w:r>
+        <w:t xml:space="preserve">None hurried.</w:t>
+      </w:r>
+    </w:p>
+    <w:p>
+      <w:r>
+        <w:t xml:space="preserve">None looked around.</w:t>
+      </w:r>
+    </w:p>
+    <w:p>
+      <w:r>
+        <w:t xml:space="preserve">Their mouths moved together.</w:t>
+      </w:r>
+    </w:p>
+    <w:p>
+      <w:r>
+        <w:t xml:space="preserve">Seo Jun.</w:t>
+      </w:r>
+    </w:p>
+    <w:p>
+      <w:r>
+        <w:t xml:space="preserve">The man beneath the black umbrella alone walked east.</w:t>
+      </w:r>
+    </w:p>
+    <w:p>
+      <w:r>
+        <w:t xml:space="preserve">He slipped through the crowd without touching anyone. Bodies shifted before he reached them, opening a clean path. His umbrella remained dry. Rain gathered along its rim, suspended in a perfect silver edge.</w:t>
+      </w:r>
+    </w:p>
+    <w:p>
+      <w:r>
+        <w:t xml:space="preserve">He looked up at Kai.</w:t>
+      </w:r>
+    </w:p>
+    <w:p>
+      <w:r>
+        <w:t xml:space="preserve">The distance between street and window should have hidden the details of his face.</w:t>
+      </w:r>
+    </w:p>
+    <w:p>
+      <w:r>
+        <w:t xml:space="preserve">It did not.</w:t>
+      </w:r>
+    </w:p>
+    <w:p>
+      <w:r>
+        <w:t xml:space="preserve">Young.</w:t>
+      </w:r>
+    </w:p>
+    <w:p>
+      <w:r>
+        <w:t xml:space="preserve">Pale.</w:t>
+      </w:r>
+    </w:p>
+    <w:p>
+      <w:r>
+        <w:t xml:space="preserve">Dark hair neatly parted.</w:t>
+      </w:r>
+    </w:p>
+    <w:p>
+      <w:r>
+        <w:t xml:space="preserve">An expression almost kind.</w:t>
+      </w:r>
+    </w:p>
+    <w:p>
+      <w:r>
+        <w:t xml:space="preserve">The system reacted.</w:t>
+      </w:r>
+    </w:p>
+    <w:p>
+      <w:r>
+        <w:t xml:space="preserve">Recognition Target Approaching.</w:t>
+      </w:r>
+    </w:p>
+    <w:p>
+      <w:r>
+        <w:t xml:space="preserve">Identity conflict remains unresolved.</w:t>
+      </w:r>
+    </w:p>
+    <w:p>
+      <w:r>
+        <w:t xml:space="preserve">Current Bell Count: 4.</w:t>
+      </w:r>
+    </w:p>
+    <w:p>
+      <w:r>
+        <w:t xml:space="preserve">Estimated completion at Bell 7.</w:t>
+      </w:r>
+    </w:p>
+    <w:p>
+      <w:r>
+        <w:t xml:space="preserve">Han seized Deputy Administrator Choi by the shoulders as her knees buckled.</w:t>
+      </w:r>
+    </w:p>
+    <w:p>
+      <w:r>
+        <w:t xml:space="preserve">"Rian, door. "</w:t>
+      </w:r>
+    </w:p>
+    <w:p>
+      <w:r>
+        <w:t xml:space="preserve">Rian shoved a filing cabinet across the records room entrance. The wheels squealed, hit the frame, and jammed at an angle.</w:t>
+      </w:r>
+    </w:p>
+    <w:p>
+      <w:r>
+        <w:t xml:space="preserve">"That will not stop three thousand people," Dr. Venn said.</w:t>
+      </w:r>
+    </w:p>
+    <w:p>
+      <w:r>
+        <w:t xml:space="preserve">"It may stop one administrator with a difficult morning. "</w:t>
+      </w:r>
+    </w:p>
+    <w:p>
+      <w:r>
+        <w:t xml:space="preserve">Choi's head lifted.</w:t>
+      </w:r>
+    </w:p>
+    <w:p>
+      <w:r>
+        <w:t xml:space="preserve">"What is your name? "</w:t>
+      </w:r>
+    </w:p>
+    <w:p>
+      <w:r>
+        <w:t xml:space="preserve">The male voice remained beneath hers, but weaker now. Her own breath broke around it.</w:t>
+      </w:r>
+    </w:p>
+    <w:p>
+      <w:r>
+        <w:t xml:space="preserve">Han turned her away from Kai.</w:t>
+      </w:r>
+    </w:p>
+    <w:p>
+      <w:r>
+        <w:t xml:space="preserve">"Do not answer anyone. Not even us. "</w:t>
+      </w:r>
+    </w:p>
+    <w:p>
+      <w:r>
+        <w:t xml:space="preserve">"I know my name," she whispered.</w:t>
+      </w:r>
+    </w:p>
+    <w:p>
+      <w:r>
+        <w:t xml:space="preserve">"Keep it to yourself. "</w:t>
+      </w:r>
+    </w:p>
+    <w:p>
+      <w:r>
+        <w:t xml:space="preserve">Her shadow continued lying across the floor beside the door. It no longer matched her position. One arm stretched toward the map. Its finger touched the black pin marking the Jun Household Memorial Site.</w:t>
+      </w:r>
+    </w:p>
+    <w:p>
+      <w:r>
+        <w:t xml:space="preserve">Kai moved to the table.</w:t>
+      </w:r>
+    </w:p>
+    <w:p>
+      <w:r>
+        <w:t xml:space="preserve">The red lines drawn across West Haneul had thickened. They no longer resembled faded marker. They looked wet. At each intersection, the lines pulsed in time with the residents' steps.</w:t>
+      </w:r>
+    </w:p>
+    <w:p>
+      <w:r>
+        <w:t xml:space="preserve">The town had become a body.</w:t>
+      </w:r>
+    </w:p>
+    <w:p>
+      <w:r>
+        <w:t xml:space="preserve">The western ridge was its heart.</w:t>
+      </w:r>
+    </w:p>
+    <w:p>
+      <w:r>
+        <w:t xml:space="preserve">The municipal office was something else.</w:t>
+      </w:r>
+    </w:p>
+    <w:p>
+      <w:r>
+        <w:t xml:space="preserve">A tongue, perhaps.</w:t>
+      </w:r>
+    </w:p>
+    <w:p>
+      <w:r>
+        <w:t xml:space="preserve">A place where names became records.</w:t>
+      </w:r>
+    </w:p>
+    <w:p>
+      <w:r>
+        <w:t xml:space="preserve">Dr. Venn set the portable resonance array beside the map. The brass rings spun fast enough to blur.</w:t>
+      </w:r>
+    </w:p>
+    <w:p>
+      <w:r>
+        <w:t xml:space="preserve">"The formation is drawing identity impressions from every resident," she said. "Names, household registrations, employment records, property claims. Everything that establishes a person's place inside the town. "</w:t>
+      </w:r>
+    </w:p>
+    <w:p>
+      <w:r>
+        <w:t xml:space="preserve">Rian looked at the crowded streets. "And sending them west? "</w:t>
+      </w:r>
+    </w:p>
+    <w:p>
+      <w:r>
+        <w:t xml:space="preserve">"Compressing them first. "</w:t>
+      </w:r>
+    </w:p>
+    <w:p>
+      <w:r>
+        <w:t xml:space="preserve">"Into Seo Jun. "</w:t>
+      </w:r>
+    </w:p>
+    <w:p>
+      <w:r>
+        <w:t xml:space="preserve">Dr. Venn did not answer immediately.</w:t>
+      </w:r>
+    </w:p>
+    <w:p>
+      <w:r>
+        <w:t xml:space="preserve">The glass cylinder inside the array darkened.</w:t>
+      </w:r>
+    </w:p>
+    <w:p>
+      <w:r>
+        <w:t xml:space="preserve">"Not into him. Into the position he occupies. "</w:t>
+      </w:r>
+    </w:p>
+    <w:p>
+      <w:r>
+        <w:t xml:space="preserve">Kai looked at the black pin.</w:t>
+      </w:r>
+    </w:p>
+    <w:p>
+      <w:r>
+        <w:t xml:space="preserve">Recognition.</w:t>
+      </w:r>
+    </w:p>
+    <w:p>
+      <w:r>
+        <w:t xml:space="preserve">Names as coordinates.</w:t>
+      </w:r>
+    </w:p>
+    <w:p>
+      <w:r>
+        <w:t xml:space="preserve">The field had not registered three thousand people because it no longer treated the residents as separate occupants. It was aligning them into one recognized identity.</w:t>
+      </w:r>
+    </w:p>
+    <w:p>
+      <w:r>
+        <w:t xml:space="preserve">"What happens at the seventh bell? " Han asked.</w:t>
+      </w:r>
+    </w:p>
+    <w:p>
+      <w:r>
+        <w:t xml:space="preserve">Dr. Venn adjusted the array. "If the pattern completes, I believe every registered resident becomes an extension of the custodian. "</w:t>
+      </w:r>
+    </w:p>
+    <w:p>
+      <w:r>
+        <w:t xml:space="preserve">Rian stared at her. "Meaning they all believe they are Seo Jun? "</w:t>
+      </w:r>
+    </w:p>
+    <w:p>
+      <w:r>
+        <w:t xml:space="preserve">"No. Belief would require separate minds holding the same idea. "</w:t>
+      </w:r>
+    </w:p>
+    <w:p>
+      <w:r>
+        <w:t xml:space="preserve">Her voice lowered.</w:t>
+      </w:r>
+    </w:p>
+    <w:p>
+      <w:r>
+        <w:t xml:space="preserve">"There may no longer be separate minds. "</w:t>
+      </w:r>
+    </w:p>
+    <w:p>
+      <w:r>
+        <w:t xml:space="preserve">The fifth bell had not yet begun, but Kai could feel pressure collecting beneath the western ridge.</w:t>
+      </w:r>
+    </w:p>
+    <w:p>
+      <w:r>
+        <w:t xml:space="preserve">Three bells to wake.</w:t>
+      </w:r>
+    </w:p>
+    <w:p>
+      <w:r>
+        <w:t xml:space="preserve">Three to claim.</w:t>
+      </w:r>
+    </w:p>
+    <w:p>
+      <w:r>
+        <w:t xml:space="preserve">One to ignite.</w:t>
+      </w:r>
+    </w:p>
+    <w:p>
+      <w:r>
+        <w:t xml:space="preserve">The warning from Mael's old case did not belong to this world, yet the structure felt disturbingly similar. A formation did not need fire to consume people. It required a category broad enough to hold them and a mechanism strong enough to erase what did not fit.</w:t>
+      </w:r>
+    </w:p>
+    <w:p>
+      <w:r>
+        <w:t xml:space="preserve">"What is being ignited? " Kai asked.</w:t>
+      </w:r>
+    </w:p>
+    <w:p>
+      <w:r>
+        <w:t xml:space="preserve">Dr. Venn looked toward the map.</w:t>
+      </w:r>
+    </w:p>
+    <w:p>
+      <w:r>
+        <w:t xml:space="preserve">"The custodian. "</w:t>
+      </w:r>
+    </w:p>
+    <w:p>
+      <w:r>
+        <w:t xml:space="preserve">Deputy Administrator Choi laughed.</w:t>
+      </w:r>
+    </w:p>
+    <w:p>
+      <w:r>
+        <w:t xml:space="preserve">It was a man's laugh.</w:t>
+      </w:r>
+    </w:p>
+    <w:p>
+      <w:r>
+        <w:t xml:space="preserve">Han tightened his grip.</w:t>
+      </w:r>
+    </w:p>
+    <w:p>
+      <w:r>
+        <w:t xml:space="preserve">The shadow beside the door stood.</w:t>
+      </w:r>
+    </w:p>
+    <w:p>
+      <w:r>
+        <w:t xml:space="preserve">Choi remained half collapsed in his arms, but her shadow rose independently, smoothing its coat and opening an umbrella that cast no shape upon the floor.</w:t>
+      </w:r>
+    </w:p>
+    <w:p>
+      <w:r>
+        <w:t xml:space="preserve">"You came back," it said to Kai.</w:t>
+      </w:r>
+    </w:p>
+    <w:p>
+      <w:r>
+        <w:t xml:space="preserve">The filing cabinet moved.</w:t>
+      </w:r>
+    </w:p>
+    <w:p>
+      <w:r>
+        <w:t xml:space="preserve">Not pushed.</w:t>
+      </w:r>
+    </w:p>
+    <w:p>
+      <w:r>
+        <w:t xml:space="preserve">Repositioned.</w:t>
+      </w:r>
+    </w:p>
+    <w:p>
+      <w:r>
+        <w:t xml:space="preserve">One moment it blocked the door. The next it stood against the far wall as though it had always belonged there.</w:t>
+      </w:r>
+    </w:p>
+    <w:p>
+      <w:r>
+        <w:t xml:space="preserve">The door opened.</w:t>
+      </w:r>
+    </w:p>
+    <w:p>
+      <w:r>
+        <w:t xml:space="preserve">The hallway beyond was empty.</w:t>
+      </w:r>
+    </w:p>
+    <w:p>
+      <w:r>
+        <w:t xml:space="preserve">At the stairwell, footsteps climbed in perfect rhythm.</w:t>
+      </w:r>
+    </w:p>
+    <w:p>
+      <w:r>
+        <w:t xml:space="preserve">Han dragged Choi toward the rear shelves. "We need another exit. "</w:t>
+      </w:r>
+    </w:p>
+    <w:p>
+      <w:r>
+        <w:t xml:space="preserve">"Window," Rian said.</w:t>
+      </w:r>
+    </w:p>
+    <w:p>
+      <w:r>
+        <w:t xml:space="preserve">"We are on the second floor. "</w:t>
+      </w:r>
+    </w:p>
+    <w:p>
+      <w:r>
+        <w:t xml:space="preserve">"I did not call it a good exit. "</w:t>
+      </w:r>
+    </w:p>
+    <w:p>
+      <w:r>
+        <w:t xml:space="preserve">Kai did not move.</w:t>
+      </w:r>
+    </w:p>
+    <w:p>
+      <w:r>
+        <w:t xml:space="preserve">The man outside had vanished from the street.</w:t>
+      </w:r>
+    </w:p>
+    <w:p>
+      <w:r>
+        <w:t xml:space="preserve">The shadow in the room turned toward him.</w:t>
+      </w:r>
+    </w:p>
+    <w:p>
+      <w:r>
+        <w:t xml:space="preserve">"Four bells," it said. "You took longer last time. "</w:t>
+      </w:r>
+    </w:p>
+    <w:p>
+      <w:r>
+        <w:t xml:space="preserve">"I have never been here. "</w:t>
+      </w:r>
+    </w:p>
+    <w:p>
+      <w:r>
+        <w:t xml:space="preserve">The shadow tilted its head.</w:t>
+      </w:r>
+    </w:p>
+    <w:p>
+      <w:r>
+        <w:t xml:space="preserve">The system flashed.</w:t>
+      </w:r>
+    </w:p>
+    <w:p>
+      <w:r>
+        <w:t xml:space="preserve">Identity prompt detected.</w:t>
+      </w:r>
+    </w:p>
+    <w:p>
+      <w:r>
+        <w:t xml:space="preserve">Do not provide corrective declaration.</w:t>
+      </w:r>
+    </w:p>
+    <w:p>
+      <w:r>
+        <w:t xml:space="preserve">Kai closed his mouth.</w:t>
+      </w:r>
+    </w:p>
+    <w:p>
+      <w:r>
+        <w:t xml:space="preserve">Saying I am not who you think I am would still be an identity statement. A correction defined the same boundary as an answer.</w:t>
+      </w:r>
+    </w:p>
+    <w:p>
+      <w:r>
+        <w:t xml:space="preserve">The shadow smiled.</w:t>
+      </w:r>
+    </w:p>
+    <w:p>
+      <w:r>
+        <w:t xml:space="preserve">"You learned that sooner. "</w:t>
+      </w:r>
+    </w:p>
+    <w:p>
+      <w:r>
+        <w:t xml:space="preserve">The footsteps reached the hallway.</w:t>
+      </w:r>
+    </w:p>
+    <w:p>
+      <w:r>
+        <w:t xml:space="preserve">Residents appeared beyond the door.</w:t>
+      </w:r>
+    </w:p>
+    <w:p>
+      <w:r>
+        <w:t xml:space="preserve">A clerk from downstairs stood at the front. Beside her waited the maintenance worker Kai had seen earlier, an old man, two teenagers, and a woman holding a toddler. Their eyes remained open. Their expressions were calm.</w:t>
+      </w:r>
+    </w:p>
+    <w:p>
+      <w:r>
+        <w:t xml:space="preserve">"What is your name? " they asked.</w:t>
+      </w:r>
+    </w:p>
+    <w:p>
+      <w:r>
+        <w:t xml:space="preserve">Rian backed toward the window.</w:t>
+      </w:r>
+    </w:p>
+    <w:p>
+      <w:r>
+        <w:t xml:space="preserve">"Not Seo Jun. "</w:t>
+      </w:r>
+    </w:p>
+    <w:p>
+      <w:r>
+        <w:t xml:space="preserve">Dr. Venn caught his sleeve.</w:t>
+      </w:r>
+    </w:p>
+    <w:p>
+      <w:r>
+        <w:t xml:space="preserve">"That is still an answer. "</w:t>
+      </w:r>
+    </w:p>
+    <w:p>
+      <w:r>
+        <w:t xml:space="preserve">"Right. New rule. I have never possessed language. "</w:t>
+      </w:r>
+    </w:p>
+    <w:p>
+      <w:r>
+        <w:t xml:space="preserve">The residents stepped into the room.</w:t>
+      </w:r>
+    </w:p>
+    <w:p>
+      <w:r>
+        <w:t xml:space="preserve">Han shifted Choi behind him and drew the collapsible suppression baton. It extended with a metallic snap.</w:t>
+      </w:r>
+    </w:p>
+    <w:p>
+      <w:r>
+        <w:t xml:space="preserve">"Nonlethal," Dr. Venn said.</w:t>
+      </w:r>
+    </w:p>
+    <w:p>
+      <w:r>
+        <w:t xml:space="preserve">"I heard the authorization. "</w:t>
+      </w:r>
+    </w:p>
+    <w:p>
+      <w:r>
+        <w:t xml:space="preserve">"You smiled when you heard it. "</w:t>
+      </w:r>
+    </w:p>
+    <w:p>
+      <w:r>
+        <w:t xml:space="preserve">"I smile when annoyed. "</w:t>
+      </w:r>
+    </w:p>
+    <w:p>
+      <w:r>
+        <w:t xml:space="preserve">"You smiled during the entire briefing. "</w:t>
+      </w:r>
+    </w:p>
+    <w:p>
+      <w:r>
+        <w:t xml:space="preserve">"I was extremely annoyed. "</w:t>
+      </w:r>
+    </w:p>
+    <w:p>
+      <w:r>
+        <w:t xml:space="preserve">The first clerk reached for him.</w:t>
+      </w:r>
+    </w:p>
+    <w:p>
+      <w:r>
+        <w:t xml:space="preserve">Han struck her forearm just hard enough to turn the grasp aside. He moved into the gap, using his shoulder to guide her past him without driving her to the floor. The maintenance worker came next. Han caught his wrist, rotated, and released before the joint could lock.</w:t>
+      </w:r>
+    </w:p>
+    <w:p>
+      <w:r>
+        <w:t xml:space="preserve">Neither reacted to pain.</w:t>
+      </w:r>
+    </w:p>
+    <w:p>
+      <w:r>
+        <w:t xml:space="preserve">Neither defended themselves.</w:t>
+      </w:r>
+    </w:p>
+    <w:p>
+      <w:r>
+        <w:t xml:space="preserve">They only tried to touch Kai.</w:t>
+      </w:r>
+    </w:p>
+    <w:p>
+      <w:r>
+        <w:t xml:space="preserve">Rian grabbed a binder from the shelf and held it like a shield.</w:t>
+      </w:r>
+    </w:p>
+    <w:p>
+      <w:r>
+        <w:t xml:space="preserve">"Observation and civilian contact only is becoming difficult to interpret. "</w:t>
+      </w:r>
+    </w:p>
+    <w:p>
+      <w:r>
+        <w:t xml:space="preserve">"Do not injure them," Kai said.</w:t>
+      </w:r>
+    </w:p>
+    <w:p>
+      <w:r>
+        <w:t xml:space="preserve">"I was planning to reason with the binder. "</w:t>
+      </w:r>
+    </w:p>
+    <w:p>
+      <w:r>
+        <w:t xml:space="preserve">The toddler looked at him from the woman's arms.</w:t>
+      </w:r>
+    </w:p>
+    <w:p>
+      <w:r>
+        <w:t xml:space="preserve">"What is your name? "</w:t>
+      </w:r>
+    </w:p>
+    <w:p>
+      <w:r>
+        <w:t xml:space="preserve">The child's voice carried the same adult male beneath it.</w:t>
+      </w:r>
+    </w:p>
+    <w:p>
+      <w:r>
+        <w:t xml:space="preserve">Rian lowered the binder.</w:t>
+      </w:r>
+    </w:p>
+    <w:p>
+      <w:r>
+        <w:t xml:space="preserve">"Oh, that is unacceptable. "</w:t>
+      </w:r>
+    </w:p>
+    <w:p>
+      <w:r>
+        <w:t xml:space="preserve">More residents entered the hallway.</w:t>
+      </w:r>
+    </w:p>
+    <w:p>
+      <w:r>
+        <w:t xml:space="preserve">The formation tightened.</w:t>
+      </w:r>
+    </w:p>
+    <w:p>
+      <w:r>
+        <w:t xml:space="preserve">Kai felt every name recorded inside the municipal building. Birth certificates. Property deeds. Marriage registrations. School enrollment forms. Death records. Decades of paper and digital entries layered into a single administrative memory.</w:t>
+      </w:r>
+    </w:p>
+    <w:p>
+      <w:r>
+        <w:t xml:space="preserve">The building was not merely part of the formation.</w:t>
+      </w:r>
+    </w:p>
+    <w:p>
+      <w:r>
+        <w:t xml:space="preserve">It was feeding it proof.</w:t>
+      </w:r>
+    </w:p>
+    <w:p>
+      <w:r>
+        <w:t xml:space="preserve">"Burn the records? " Han asked.</w:t>
+      </w:r>
+    </w:p>
+    <w:p>
+      <w:r>
+        <w:t xml:space="preserve">Dr. Venn shook her head immediately. "That could erase the distinctions we are trying to preserve. The field may interpret destruction of the records as confirmation that only the consolidated identity remains. "</w:t>
+      </w:r>
+    </w:p>
+    <w:p>
+      <w:r>
+        <w:t xml:space="preserve">"Remove the black pin," Rian said.</w:t>
+      </w:r>
+    </w:p>
+    <w:p>
+      <w:r>
+        <w:t xml:space="preserve">Kai reached for it.</w:t>
+      </w:r>
+    </w:p>
+    <w:p>
+      <w:r>
+        <w:t xml:space="preserve">The system opened another warning.</w:t>
+      </w:r>
+    </w:p>
+    <w:p>
+      <w:r>
+        <w:t xml:space="preserve">Direct alteration may accelerate recognition.</w:t>
+      </w:r>
+    </w:p>
+    <w:p>
+      <w:r>
+        <w:t xml:space="preserve">He stopped.</w:t>
+      </w:r>
+    </w:p>
+    <w:p>
+      <w:r>
+        <w:t xml:space="preserve">The shadow watched him.</w:t>
+      </w:r>
+    </w:p>
+    <w:p>
+      <w:r>
+        <w:t xml:space="preserve">"You removed it before," it said.</w:t>
+      </w:r>
+    </w:p>
+    <w:p>
+      <w:r>
+        <w:t xml:space="preserve">"Did that stop you? "</w:t>
+      </w:r>
+    </w:p>
+    <w:p>
+      <w:r>
+        <w:t xml:space="preserve">The shadow's mouth widened.</w:t>
+      </w:r>
+    </w:p>
+    <w:p>
+      <w:r>
+        <w:t xml:space="preserve">"For eighty-one years. "</w:t>
+      </w:r>
+    </w:p>
+    <w:p>
+      <w:r>
+        <w:t xml:space="preserve">Kai looked at the black pin.</w:t>
+      </w:r>
+    </w:p>
+    <w:p>
+      <w:r>
+        <w:t xml:space="preserve">Seo Jun had been recorded as a boy who died in the landslide eighty-one years ago.</w:t>
+      </w:r>
+    </w:p>
+    <w:p>
+      <w:r>
+        <w:t xml:space="preserve">Perhaps that had not been his first death.</w:t>
+      </w:r>
+    </w:p>
+    <w:p>
+      <w:r>
+        <w:t xml:space="preserve">Perhaps it had been the previous interruption.</w:t>
+      </w:r>
+    </w:p>
+    <w:p>
+      <w:r>
+        <w:t xml:space="preserve">The fifth bell began.</w:t>
+      </w:r>
+    </w:p>
+    <w:p>
+      <w:r>
+        <w:t xml:space="preserve">The first vibration rose through the floor.</w:t>
+      </w:r>
+    </w:p>
+    <w:p>
+      <w:r>
+        <w:t xml:space="preserve">Kai reacted before sound formed.</w:t>
+      </w:r>
+    </w:p>
+    <w:p>
+      <w:r>
+        <w:t xml:space="preserve">He drove his palm against the map table and sent qi through the wood.</w:t>
+      </w:r>
+    </w:p>
+    <w:p>
+      <w:r>
+        <w:t xml:space="preserve">Not toward the western ridge.</w:t>
+      </w:r>
+    </w:p>
+    <w:p>
+      <w:r>
+        <w:t xml:space="preserve">Into the municipal records.</w:t>
+      </w:r>
+    </w:p>
+    <w:p>
+      <w:r>
+        <w:t xml:space="preserve">The bell struck.</w:t>
+      </w:r>
+    </w:p>
+    <w:p>
+      <w:r>
+        <w:t xml:space="preserve">Every document in the room lifted.</w:t>
+      </w:r>
+    </w:p>
+    <w:p>
+      <w:r>
+        <w:t xml:space="preserve">Pages snapped open. Files spilled from shelves. Name after name flashed through Kai's spiritual awareness as the formation pulled them west.</w:t>
+      </w:r>
+    </w:p>
+    <w:p>
+      <w:r>
+        <w:t xml:space="preserve">He did not try to hold all of them.</w:t>
+      </w:r>
+    </w:p>
+    <w:p>
+      <w:r>
+        <w:t xml:space="preserve">He could not.</w:t>
+      </w:r>
+    </w:p>
+    <w:p>
+      <w:r>
+        <w:t xml:space="preserve">Instead, he followed the system's lesson from earlier.</w:t>
+      </w:r>
+    </w:p>
+    <w:p>
+      <w:r>
+        <w:t xml:space="preserve">Recognition.</w:t>
+      </w:r>
+    </w:p>
+    <w:p>
+      <w:r>
+        <w:t xml:space="preserve">If names served as coordinates, then the field required each person to occupy one fixed place inside its pattern.</w:t>
+      </w:r>
+    </w:p>
+    <w:p>
+      <w:r>
+        <w:t xml:space="preserve">Kai fed qi into the contradictions.</w:t>
+      </w:r>
+    </w:p>
+    <w:p>
+      <w:r>
+        <w:t xml:space="preserve">A married name beside a birth name.</w:t>
+      </w:r>
+    </w:p>
+    <w:p>
+      <w:r>
+        <w:t xml:space="preserve">A childhood address beside a current home.</w:t>
+      </w:r>
+    </w:p>
+    <w:p>
+      <w:r>
+        <w:t xml:space="preserve">A profession replaced by retirement.</w:t>
+      </w:r>
+    </w:p>
+    <w:p>
+      <w:r>
+        <w:t xml:space="preserve">A person listed as a son in one record and a father in another.</w:t>
+      </w:r>
+    </w:p>
+    <w:p>
+      <w:r>
+        <w:t xml:space="preserve">No identity remained one thing across a life.</w:t>
+      </w:r>
+    </w:p>
+    <w:p>
+      <w:r>
+        <w:t xml:space="preserve">The building shook.</w:t>
+      </w:r>
+    </w:p>
+    <w:p>
+      <w:r>
+        <w:t xml:space="preserve">The fifth bell rang fully.</w:t>
+      </w:r>
+    </w:p>
+    <w:p>
+      <w:r>
+        <w:t xml:space="preserve">Residents in the room staggered.</w:t>
+      </w:r>
+    </w:p>
+    <w:p>
+      <w:r>
+        <w:t xml:space="preserve">Their voices broke apart.</w:t>
+      </w:r>
+    </w:p>
+    <w:p>
+      <w:r>
+        <w:t xml:space="preserve">"What is your name? "</w:t>
+      </w:r>
+    </w:p>
+    <w:p>
+      <w:r>
+        <w:t xml:space="preserve">"What was your name? "</w:t>
+      </w:r>
+    </w:p>
+    <w:p>
+      <w:r>
+        <w:t xml:space="preserve">"Who named you? "</w:t>
+      </w:r>
+    </w:p>
+    <w:p>
+      <w:r>
+        <w:t xml:space="preserve">"Which name? "</w:t>
+      </w:r>
+    </w:p>
+    <w:p>
+      <w:r>
+        <w:t xml:space="preserve">The shadow snapped toward Kai.</w:t>
+      </w:r>
+    </w:p>
+    <w:p>
+      <w:r>
+        <w:t xml:space="preserve">For the first time, the smile vanished.</w:t>
+      </w:r>
+    </w:p>
+    <w:p>
+      <w:r>
+        <w:t xml:space="preserve">Dr. Venn saw the pattern in the resonance array.</w:t>
+      </w:r>
+    </w:p>
+    <w:p>
+      <w:r>
+        <w:t xml:space="preserve">"You are introducing identity variance. "</w:t>
+      </w:r>
+    </w:p>
+    <w:p>
+      <w:r>
+        <w:t xml:space="preserve">"I am revealing it. "</w:t>
+      </w:r>
+    </w:p>
+    <w:p>
+      <w:r>
+        <w:t xml:space="preserve">She moved to the table.</w:t>
+      </w:r>
+    </w:p>
+    <w:p>
+      <w:r>
+        <w:t xml:space="preserve">"Rian, the old ledgers. Han, keep them from touching Kai. "</w:t>
+      </w:r>
+    </w:p>
+    <w:p>
+      <w:r>
+        <w:t xml:space="preserve">"I was already enjoying that assignment," Han said.</w:t>
+      </w:r>
+    </w:p>
+    <w:p>
+      <w:r>
+        <w:t xml:space="preserve">He swept one leg behind the maintenance worker's ankles and lowered him rather than letting him fall. The clerk climbed onto the table from the opposite side. Han blocked her with his forearm.</w:t>
+      </w:r>
+    </w:p>
+    <w:p>
+      <w:r>
+        <w:t xml:space="preserve">Rian ran to the rear shelves.</w:t>
+      </w:r>
+    </w:p>
+    <w:p>
+      <w:r>
+        <w:t xml:space="preserve">"What counts as old? "</w:t>
+      </w:r>
+    </w:p>
+    <w:p>
+      <w:r>
+        <w:t xml:space="preserve">"Anything before the administrative merger. "</w:t>
+      </w:r>
+    </w:p>
+    <w:p>
+      <w:r>
+        <w:t xml:space="preserve">"That entire wall appears older than basic safety standards. "</w:t>
+      </w:r>
+    </w:p>
+    <w:p>
+      <w:r>
+        <w:t xml:space="preserve">"Blue bindings," Choi gasped.</w:t>
+      </w:r>
+    </w:p>
+    <w:p>
+      <w:r>
+        <w:t xml:space="preserve">Her eyes had regained focus.</w:t>
+      </w:r>
+    </w:p>
+    <w:p>
+      <w:r>
+        <w:t xml:space="preserve">"Lower shelf. Household revisions. "</w:t>
+      </w:r>
+    </w:p>
+    <w:p>
+      <w:r>
+        <w:t xml:space="preserve">Rian dropped to his knees and yanked out the first stack of blue ledgers.</w:t>
+      </w:r>
+    </w:p>
+    <w:p>
+      <w:r>
+        <w:t xml:space="preserve">Dust exploded into his face.</w:t>
+      </w:r>
+    </w:p>
+    <w:p>
+      <w:r>
+        <w:t xml:space="preserve">He coughed. "I have been attacked by the archive. "</w:t>
+      </w:r>
+    </w:p>
+    <w:p>
+      <w:r>
+        <w:t xml:space="preserve">"Open them," Dr. Venn said.</w:t>
+      </w:r>
+    </w:p>
+    <w:p>
+      <w:r>
+        <w:t xml:space="preserve">Rian threw a ledger onto the table.</w:t>
+      </w:r>
+    </w:p>
+    <w:p>
+      <w:r>
+        <w:t xml:space="preserve">Columns of handwritten names filled the pages. Some had been crossed out. Others were amended in different inks. Households split, merged, disappeared, returned under altered characters.</w:t>
+      </w:r>
+    </w:p>
+    <w:p>
+      <w:r>
+        <w:t xml:space="preserve">Dr. Venn connected the resonance array directly to the ledger's metal binding.</w:t>
+      </w:r>
+    </w:p>
+    <w:p>
+      <w:r>
+        <w:t xml:space="preserve">The brass rings screamed.</w:t>
+      </w:r>
+    </w:p>
+    <w:p>
+      <w:r>
+        <w:t xml:space="preserve">Green lines spread across the map.</w:t>
+      </w:r>
+    </w:p>
+    <w:p>
+      <w:r>
+        <w:t xml:space="preserve">They did not replace the red formation.</w:t>
+      </w:r>
+    </w:p>
+    <w:p>
+      <w:r>
+        <w:t xml:space="preserve">They branched from it.</w:t>
+      </w:r>
+    </w:p>
+    <w:p>
+      <w:r>
+        <w:t xml:space="preserve">Each resident gained multiple positions.</w:t>
+      </w:r>
+    </w:p>
+    <w:p>
+      <w:r>
+        <w:t xml:space="preserve">The woman holding the toddler stopped.</w:t>
+      </w:r>
+    </w:p>
+    <w:p>
+      <w:r>
+        <w:t xml:space="preserve">Her eyes filled with tears.</w:t>
+      </w:r>
+    </w:p>
+    <w:p>
+      <w:r>
+        <w:t xml:space="preserve">"I am Min Ji-yeon. "</w:t>
+      </w:r>
+    </w:p>
+    <w:p>
+      <w:r>
+        <w:t xml:space="preserve">Han looked at her.</w:t>
+      </w:r>
+    </w:p>
+    <w:p>
+      <w:r>
+        <w:t xml:space="preserve">"Do not say it. "</w:t>
+      </w:r>
+    </w:p>
+    <w:p>
+      <w:r>
+        <w:t xml:space="preserve">She shook her head.</w:t>
+      </w:r>
+    </w:p>
+    <w:p>
+      <w:r>
+        <w:t xml:space="preserve">"No. I am Min Ji-yeon. "</w:t>
+      </w:r>
+    </w:p>
+    <w:p>
+      <w:r>
+        <w:t xml:space="preserve">The male voice beneath hers tried to speak.</w:t>
+      </w:r>
+    </w:p>
+    <w:p>
+      <w:r>
+        <w:t xml:space="preserve">She clutched the child.</w:t>
+      </w:r>
+    </w:p>
+    <w:p>
+      <w:r>
+        <w:t xml:space="preserve">"I am also his mother. "</w:t>
+      </w:r>
+    </w:p>
+    <w:p>
+      <w:r>
+        <w:t xml:space="preserve">The formation pulsed.</w:t>
+      </w:r>
+    </w:p>
+    <w:p>
+      <w:r>
+        <w:t xml:space="preserve">The red line beneath her feet split in two.</w:t>
+      </w:r>
+    </w:p>
+    <w:p>
+      <w:r>
+        <w:t xml:space="preserve">The clerk sank to her knees.</w:t>
+      </w:r>
+    </w:p>
+    <w:p>
+      <w:r>
+        <w:t xml:space="preserve">"I changed my name when I was twenty-three. "</w:t>
+      </w:r>
+    </w:p>
+    <w:p>
+      <w:r>
+        <w:t xml:space="preserve">The maintenance worker whispered, "My brother still calls me Little Crane. "</w:t>
+      </w:r>
+    </w:p>
+    <w:p>
+      <w:r>
+        <w:t xml:space="preserve">Around the room, the consolidated voice fractured into private memories.</w:t>
+      </w:r>
+    </w:p>
+    <w:p>
+      <w:r>
+        <w:t xml:space="preserve">The shadow moved.</w:t>
+      </w:r>
+    </w:p>
+    <w:p>
+      <w:r>
+        <w:t xml:space="preserve">It crossed the floor toward the map without taking a step.</w:t>
+      </w:r>
+    </w:p>
+    <w:p>
+      <w:r>
+        <w:t xml:space="preserve">Kai intercepted it.</w:t>
+      </w:r>
+    </w:p>
+    <w:p>
+      <w:r>
+        <w:t xml:space="preserve">His hand passed through darkness and struck cold resistance. The contact opened another vision.</w:t>
+      </w:r>
+    </w:p>
+    <w:p>
+      <w:r>
+        <w:t xml:space="preserve">The burning wooden hall.</w:t>
+      </w:r>
+    </w:p>
+    <w:p>
+      <w:r>
+        <w:t xml:space="preserve">Bodies beneath white cloth.</w:t>
+      </w:r>
+    </w:p>
+    <w:p>
+      <w:r>
+        <w:t xml:space="preserve">A young Seo Jun in a blood-soaked robe.</w:t>
+      </w:r>
+    </w:p>
+    <w:p>
+      <w:r>
+        <w:t xml:space="preserve">The bronze bell ringing at the western ridge.</w:t>
+      </w:r>
+    </w:p>
+    <w:p>
+      <w:r>
+        <w:t xml:space="preserve">This time the scene continued.</w:t>
+      </w:r>
+    </w:p>
+    <w:p>
+      <w:r>
+        <w:t xml:space="preserve">People crowded the hall's courtyard. Some were injured. Some carried children. Snow fell through ash despite the fire.</w:t>
+      </w:r>
+    </w:p>
+    <w:p>
+      <w:r>
+        <w:t xml:space="preserve">The young man held a wooden tablet against his chest.</w:t>
+      </w:r>
+    </w:p>
+    <w:p>
+      <w:r>
+        <w:t xml:space="preserve">Names covered both sides.</w:t>
+      </w:r>
+    </w:p>
+    <w:p>
+      <w:r>
+        <w:t xml:space="preserve">"They cannot cross separately," someone shouted.</w:t>
+      </w:r>
+    </w:p>
+    <w:p>
+      <w:r>
+        <w:t xml:space="preserve">A landslide roared beyond the walls.</w:t>
+      </w:r>
+    </w:p>
+    <w:p>
+      <w:r>
+        <w:t xml:space="preserve">The western ridge broke.</w:t>
+      </w:r>
+    </w:p>
+    <w:p>
+      <w:r>
+        <w:t xml:space="preserve">Stone descended toward the town.</w:t>
+      </w:r>
+    </w:p>
+    <w:p>
+      <w:r>
+        <w:t xml:space="preserve">Seo Jun looked at the tablet.</w:t>
+      </w:r>
+    </w:p>
+    <w:p>
+      <w:r>
+        <w:t xml:space="preserve">Then at the formation carved beneath the courtyard.</w:t>
+      </w:r>
+    </w:p>
+    <w:p>
+      <w:r>
+        <w:t xml:space="preserve">"I can carry them. "</w:t>
+      </w:r>
+    </w:p>
+    <w:p>
+      <w:r>
+        <w:t xml:space="preserve">An older woman seized his arm.</w:t>
+      </w:r>
+    </w:p>
+    <w:p>
+      <w:r>
+        <w:t xml:space="preserve">"Not and remain yourself. "</w:t>
+      </w:r>
+    </w:p>
+    <w:p>
+      <w:r>
+        <w:t xml:space="preserve">"There is no time. "</w:t>
+      </w:r>
+    </w:p>
+    <w:p>
+      <w:r>
+        <w:t xml:space="preserve">"You were appointed to keep the boundary, not become it. "</w:t>
+      </w:r>
+    </w:p>
+    <w:p>
+      <w:r>
+        <w:t xml:space="preserve">Seo Jun smiled.</w:t>
+      </w:r>
+    </w:p>
+    <w:p>
+      <w:r>
+        <w:t xml:space="preserve">The same kind smile worn by the man beneath the umbrella.</w:t>
+      </w:r>
+    </w:p>
+    <w:p>
+      <w:r>
+        <w:t xml:space="preserve">"Then remember which mistake was mine. "</w:t>
+      </w:r>
+    </w:p>
+    <w:p>
+      <w:r>
+        <w:t xml:space="preserve">He placed the tablet into the formation.</w:t>
+      </w:r>
+    </w:p>
+    <w:p>
+      <w:r>
+        <w:t xml:space="preserve">The bell rang.</w:t>
+      </w:r>
+    </w:p>
+    <w:p>
+      <w:r>
+        <w:t xml:space="preserve">Every person in the courtyard spoke their name.</w:t>
+      </w:r>
+    </w:p>
+    <w:p>
+      <w:r>
+        <w:t xml:space="preserve">The names entered him.</w:t>
+      </w:r>
+    </w:p>
+    <w:p>
+      <w:r>
+        <w:t xml:space="preserve">The vision shattered.</w:t>
+      </w:r>
+    </w:p>
+    <w:p>
+      <w:r>
+        <w:t xml:space="preserve">Kai returned to the records room with his hand buried in the shadow's chest.</w:t>
+      </w:r>
+    </w:p>
+    <w:p>
+      <w:r>
+        <w:t xml:space="preserve">It had not been a prison at first.</w:t>
+      </w:r>
+    </w:p>
+    <w:p>
+      <w:r>
+        <w:t xml:space="preserve">It had been an evacuation.</w:t>
+      </w:r>
+    </w:p>
+    <w:p>
+      <w:r>
+        <w:t xml:space="preserve">The landslide had destroyed West Haneul. Seo Jun had used the recognition field to carry the residents' identity patterns through the catastrophe, preserving them until bodies, homes, and records could be restored.</w:t>
+      </w:r>
+    </w:p>
+    <w:p>
+      <w:r>
+        <w:t xml:space="preserve">But something had failed.</w:t>
+      </w:r>
+    </w:p>
+    <w:p>
+      <w:r>
+        <w:t xml:space="preserve">Perhaps the release.</w:t>
+      </w:r>
+    </w:p>
+    <w:p>
+      <w:r>
+        <w:t xml:space="preserve">Perhaps the distinction between custodian and those he carried.</w:t>
+      </w:r>
+    </w:p>
+    <w:p>
+      <w:r>
+        <w:t xml:space="preserve">Perhaps everyone had been restored except him.</w:t>
+      </w:r>
+    </w:p>
+    <w:p>
+      <w:r>
+        <w:t xml:space="preserve">The shadow closed its hand around Kai's wrist.</w:t>
+      </w:r>
+    </w:p>
+    <w:p>
+      <w:r>
+        <w:t xml:space="preserve">"You understand. "</w:t>
+      </w:r>
+    </w:p>
+    <w:p>
+      <w:r>
+        <w:t xml:space="preserve">Kai looked at it.</w:t>
+      </w:r>
+    </w:p>
+    <w:p>
+      <w:r>
+        <w:t xml:space="preserve">"You saved them. "</w:t>
+      </w:r>
+    </w:p>
+    <w:p>
+      <w:r>
+        <w:t xml:space="preserve">The system did not warn him.</w:t>
+      </w:r>
+    </w:p>
+    <w:p>
+      <w:r>
+        <w:t xml:space="preserve">That was not an identity prompt.</w:t>
+      </w:r>
+    </w:p>
+    <w:p>
+      <w:r>
+        <w:t xml:space="preserve">The shadow's grip loosened.</w:t>
+      </w:r>
+    </w:p>
+    <w:p>
+      <w:r>
+        <w:t xml:space="preserve">"You remember. "</w:t>
+      </w:r>
+    </w:p>
+    <w:p>
+      <w:r>
+        <w:t xml:space="preserve">"No. "</w:t>
+      </w:r>
+    </w:p>
+    <w:p>
+      <w:r>
+        <w:t xml:space="preserve">Kai pulled his arm free.</w:t>
+      </w:r>
+    </w:p>
+    <w:p>
+      <w:r>
+        <w:t xml:space="preserve">"I saw. "</w:t>
+      </w:r>
+    </w:p>
+    <w:p>
+      <w:r>
+        <w:t xml:space="preserve">The distinction struck harder than force.</w:t>
+      </w:r>
+    </w:p>
+    <w:p>
+      <w:r>
+        <w:t xml:space="preserve">The shadow flickered.</w:t>
+      </w:r>
+    </w:p>
+    <w:p>
+      <w:r>
+        <w:t xml:space="preserve">Its face became young Seo Jun's.</w:t>
+      </w:r>
+    </w:p>
+    <w:p>
+      <w:r>
+        <w:t xml:space="preserve">Then the umbrella man's.</w:t>
+      </w:r>
+    </w:p>
+    <w:p>
+      <w:r>
+        <w:t xml:space="preserve">Then Deputy Administrator Choi's.</w:t>
+      </w:r>
+    </w:p>
+    <w:p>
+      <w:r>
+        <w:t xml:space="preserve">Then Kai's.</w:t>
+      </w:r>
+    </w:p>
+    <w:p>
+      <w:r>
+        <w:t xml:space="preserve">The sixth bell began gathering.</w:t>
+      </w:r>
+    </w:p>
+    <w:p>
+      <w:r>
+        <w:t xml:space="preserve">Current Bell Count: 5.</w:t>
+      </w:r>
+    </w:p>
+    <w:p>
+      <w:r>
+        <w:t xml:space="preserve">Recognition variance increasing.</w:t>
+      </w:r>
+    </w:p>
+    <w:p>
+      <w:r>
+        <w:t xml:space="preserve">Field stability: 41 percent.</w:t>
+      </w:r>
+    </w:p>
+    <w:p>
+      <w:r>
+        <w:t xml:space="preserve">Critical risk: Custodian collapse.</w:t>
+      </w:r>
+    </w:p>
+    <w:p>
+      <w:r>
+        <w:t xml:space="preserve">Dr. Venn read the array.</w:t>
+      </w:r>
+    </w:p>
+    <w:p>
+      <w:r>
+        <w:t xml:space="preserve">"The branching is destabilizing the formation. "</w:t>
+      </w:r>
+    </w:p>
+    <w:p>
+      <w:r>
+        <w:t xml:space="preserve">Rian looked up from the ledgers. "Was that not the goal? "</w:t>
+      </w:r>
+    </w:p>
+    <w:p>
+      <w:r>
+        <w:t xml:space="preserve">"If it collapses while holding three thousand identity patterns, we may scatter them. "</w:t>
+      </w:r>
+    </w:p>
+    <w:p>
+      <w:r>
+        <w:t xml:space="preserve">Han's expression hardened. "Meaning? "</w:t>
+      </w:r>
+    </w:p>
+    <w:p>
+      <w:r>
+        <w:t xml:space="preserve">"Memory loss. Personality fragmentation. Possibly death. "</w:t>
+      </w:r>
+    </w:p>
+    <w:p>
+      <w:r>
+        <w:t xml:space="preserve">The residents outside continued walking west.</w:t>
+      </w:r>
+    </w:p>
+    <w:p>
+      <w:r>
+        <w:t xml:space="preserve">Those inside the records room had slowed, but the broader formation remained intact. A handful of contradictions could not counter a town shaped by more than a century of repeated recognition.</w:t>
+      </w:r>
+    </w:p>
+    <w:p>
+      <w:r>
+        <w:t xml:space="preserve">Kai looked at the black pin.</w:t>
+      </w:r>
+    </w:p>
+    <w:p>
+      <w:r>
+        <w:t xml:space="preserve">"We cannot break it. "</w:t>
+      </w:r>
+    </w:p>
+    <w:p>
+      <w:r>
+        <w:t xml:space="preserve">Dr. Venn followed his gaze.</w:t>
+      </w:r>
+    </w:p>
+    <w:p>
+      <w:r>
+        <w:t xml:space="preserve">"We need to complete the original release. "</w:t>
+      </w:r>
+    </w:p>
+    <w:p>
+      <w:r>
+        <w:t xml:space="preserve">Deputy Administrator Choi lifted her head from behind Han.</w:t>
+      </w:r>
+    </w:p>
+    <w:p>
+      <w:r>
+        <w:t xml:space="preserve">"The memorial. "</w:t>
+      </w:r>
+    </w:p>
+    <w:p>
+      <w:r>
+        <w:t xml:space="preserve">Her voice belonged to her now.</w:t>
+      </w:r>
+    </w:p>
+    <w:p>
+      <w:r>
+        <w:t xml:space="preserve">"My grandmother said the Jun memorial was not a grave. "</w:t>
+      </w:r>
+    </w:p>
+    <w:p>
+      <w:r>
+        <w:t xml:space="preserve">"What was it? " Kai asked.</w:t>
+      </w:r>
+    </w:p>
+    <w:p>
+      <w:r>
+        <w:t xml:space="preserve">"A house with no door. "</w:t>
+      </w:r>
+    </w:p>
+    <w:p>
+      <w:r>
+        <w:t xml:space="preserve">Rian glanced toward the western ridge. "That sounds aggressively unhelpful. "</w:t>
+      </w:r>
+    </w:p>
+    <w:p>
+      <w:r>
+        <w:t xml:space="preserve">Choi pressed both hands to her temples.</w:t>
+      </w:r>
+    </w:p>
+    <w:p>
+      <w:r>
+        <w:t xml:space="preserve">"The old records called it a returning room. After the landslide, survivors were brought there one household at a time. They entered through the eastern side and left through the west. "</w:t>
+      </w:r>
+    </w:p>
+    <w:p>
+      <w:r>
+        <w:t xml:space="preserve">"Why no door now? "</w:t>
+      </w:r>
+    </w:p>
+    <w:p>
+      <w:r>
+        <w:t xml:space="preserve">"The western wall was sealed. "</w:t>
+      </w:r>
+    </w:p>
+    <w:p>
+      <w:r>
+        <w:t xml:space="preserve">"When? "</w:t>
+      </w:r>
+    </w:p>
+    <w:p>
+      <w:r>
+        <w:t xml:space="preserve">She looked toward the shadow.</w:t>
+      </w:r>
+    </w:p>
+    <w:p>
+      <w:r>
+        <w:t xml:space="preserve">"When Seo Jun stopped coming out. "</w:t>
+      </w:r>
+    </w:p>
+    <w:p>
+      <w:r>
+        <w:t xml:space="preserve">The shadow's face tightened.</w:t>
+      </w:r>
+    </w:p>
+    <w:p>
+      <w:r>
+        <w:t xml:space="preserve">The sixth bell struck.</w:t>
+      </w:r>
+    </w:p>
+    <w:p>
+      <w:r>
+        <w:t xml:space="preserve">The entire municipal building lurched west.</w:t>
+      </w:r>
+    </w:p>
+    <w:p>
+      <w:r>
+        <w:t xml:space="preserve">Windows burst.</w:t>
+      </w:r>
+    </w:p>
+    <w:p>
+      <w:r>
+        <w:t xml:space="preserve">Not inward or outward. Glass dissolved into rain, scattering across the room as cold droplets. Shelves toppled. Residents fell, then rose together before anyone could reach them.</w:t>
+      </w:r>
+    </w:p>
+    <w:p>
+      <w:r>
+        <w:t xml:space="preserve">The map tore down the center.</w:t>
+      </w:r>
+    </w:p>
+    <w:p>
+      <w:r>
+        <w:t xml:space="preserve">Every red line surged toward the black pin.</w:t>
+      </w:r>
+    </w:p>
+    <w:p>
+      <w:r>
+        <w:t xml:space="preserve">Outside, the walking crowd accelerated.</w:t>
+      </w:r>
+    </w:p>
+    <w:p>
+      <w:r>
+        <w:t xml:space="preserve">Not running.</w:t>
+      </w:r>
+    </w:p>
+    <w:p>
+      <w:r>
+        <w:t xml:space="preserve">Moving with the speed of something for which individual balance no longer mattered.</w:t>
+      </w:r>
+    </w:p>
+    <w:p>
+      <w:r>
+        <w:t xml:space="preserve">The system flooded Kai's vision.</w:t>
+      </w:r>
+    </w:p>
+    <w:p>
+      <w:r>
+        <w:t xml:space="preserve">Bell Count: 6.</w:t>
+      </w:r>
+    </w:p>
+    <w:p>
+      <w:r>
+        <w:t xml:space="preserve">Claim sequence complete.</w:t>
+      </w:r>
+    </w:p>
+    <w:p>
+      <w:r>
+        <w:t xml:space="preserve">Ignition imminent.</w:t>
+      </w:r>
+    </w:p>
+    <w:p>
+      <w:r>
+        <w:t xml:space="preserve">Estimated time to Bell 7: 19 minutes.</w:t>
+      </w:r>
+    </w:p>
+    <w:p>
+      <w:r>
+        <w:t xml:space="preserve">Rian stared at the array.</w:t>
+      </w:r>
+    </w:p>
+    <w:p>
+      <w:r>
+        <w:t xml:space="preserve">"We have nineteen minutes. "</w:t>
+      </w:r>
+    </w:p>
+    <w:p>
+      <w:r>
+        <w:t xml:space="preserve">Dr. Venn looked at him.</w:t>
+      </w:r>
+    </w:p>
+    <w:p>
+      <w:r>
+        <w:t xml:space="preserve">"How do you know? "</w:t>
+      </w:r>
+    </w:p>
+    <w:p>
+      <w:r>
+        <w:t xml:space="preserve">"The device. "</w:t>
+      </w:r>
+    </w:p>
+    <w:p>
+      <w:r>
+        <w:t xml:space="preserve">"It does not display time. "</w:t>
+      </w:r>
+    </w:p>
+    <w:p>
+      <w:r>
+        <w:t xml:space="preserve">He pointed at Kai.</w:t>
+      </w:r>
+    </w:p>
+    <w:p>
+      <w:r>
+        <w:t xml:space="preserve">"His face displays time. "</w:t>
+      </w:r>
+    </w:p>
+    <w:p>
+      <w:r>
+        <w:t xml:space="preserve">Han hauled Choi upright.</w:t>
+      </w:r>
+    </w:p>
+    <w:p>
+      <w:r>
+        <w:t xml:space="preserve">"We go to the memorial. "</w:t>
+      </w:r>
+    </w:p>
+    <w:p>
+      <w:r>
+        <w:t xml:space="preserve">"The streets are full," Dr. Venn said.</w:t>
+      </w:r>
+    </w:p>
+    <w:p>
+      <w:r>
+        <w:t xml:space="preserve">"The minibus? "</w:t>
+      </w:r>
+    </w:p>
+    <w:p>
+      <w:r>
+        <w:t xml:space="preserve">Rian looked through the missing window.</w:t>
+      </w:r>
+    </w:p>
+    <w:p>
+      <w:r>
+        <w:t xml:space="preserve">Their borrowed vehicle sat alone in the courtyard.</w:t>
+      </w:r>
+    </w:p>
+    <w:p>
+      <w:r>
+        <w:t xml:space="preserve">Every resident had walked past it without touching it.</w:t>
+      </w:r>
+    </w:p>
+    <w:p>
+      <w:r>
+        <w:t xml:space="preserve">"My aunt will be pleased. "</w:t>
+      </w:r>
+    </w:p>
+    <w:p>
+      <w:r>
+        <w:t xml:space="preserve">Han moved toward the door.</w:t>
+      </w:r>
+    </w:p>
+    <w:p>
+      <w:r>
+        <w:t xml:space="preserve">Kai caught his shoulder.</w:t>
+      </w:r>
+    </w:p>
+    <w:p>
+      <w:r>
+        <w:t xml:space="preserve">"They are not trying to stop us. "</w:t>
+      </w:r>
+    </w:p>
+    <w:p>
+      <w:r>
+        <w:t xml:space="preserve">Han looked at the residents packed into the hall.</w:t>
+      </w:r>
+    </w:p>
+    <w:p>
+      <w:r>
+        <w:t xml:space="preserve">They stood aside.</w:t>
+      </w:r>
+    </w:p>
+    <w:p>
+      <w:r>
+        <w:t xml:space="preserve">A narrow path opened from the records room to the stairs.</w:t>
+      </w:r>
+    </w:p>
+    <w:p>
+      <w:r>
+        <w:t xml:space="preserve">At its far end, the man beneath the black umbrella waited.</w:t>
+      </w:r>
+    </w:p>
+    <w:p>
+      <w:r>
+        <w:t xml:space="preserve">No longer shadow.</w:t>
+      </w:r>
+    </w:p>
+    <w:p>
+      <w:r>
+        <w:t xml:space="preserve">No longer distant.</w:t>
+      </w:r>
+    </w:p>
+    <w:p>
+      <w:r>
+        <w:t xml:space="preserve">He stood inside the building with water suspended around his umbrella.</w:t>
+      </w:r>
+    </w:p>
+    <w:p>
+      <w:r>
+        <w:t xml:space="preserve">"Come home," he said.</w:t>
+      </w:r>
+    </w:p>
+    <w:p>
+      <w:r>
+        <w:t xml:space="preserve">The voice belonged to Seo Jun alone.</w:t>
+      </w:r>
+    </w:p>
+    <w:p>
+      <w:r>
+        <w:t xml:space="preserve">The system warned Kai.</w:t>
+      </w:r>
+    </w:p>
+    <w:p>
+      <w:r>
+        <w:t xml:space="preserve">Identity pathway offered.</w:t>
+      </w:r>
+    </w:p>
+    <w:p>
+      <w:r>
+        <w:t xml:space="preserve">Acceptance will assign role: Returning Custodian.</w:t>
+      </w:r>
+    </w:p>
+    <w:p>
+      <w:r>
+        <w:t xml:space="preserve">Refusal may trigger forced recognition.</w:t>
+      </w:r>
+    </w:p>
+    <w:p>
+      <w:r>
+        <w:t xml:space="preserve">Kai said nothing.</w:t>
+      </w:r>
+    </w:p>
+    <w:p>
+      <w:r>
+        <w:t xml:space="preserve">The man turned.</w:t>
+      </w:r>
+    </w:p>
+    <w:p>
+      <w:r>
+        <w:t xml:space="preserve">He walked downstairs.</w:t>
+      </w:r>
+    </w:p>
+    <w:p>
+      <w:r>
+        <w:t xml:space="preserve">The residents followed.</w:t>
+      </w:r>
+    </w:p>
+    <w:p>
+      <w:r>
+        <w:t xml:space="preserve">Not dragging them.</w:t>
+      </w:r>
+    </w:p>
+    <w:p>
+      <w:r>
+        <w:t xml:space="preserve">Guiding them.</w:t>
+      </w:r>
+    </w:p>
+    <w:p>
+      <w:r>
+        <w:t xml:space="preserve">"He wants Kai at the memorial," Dr. Venn said.</w:t>
+      </w:r>
+    </w:p>
+    <w:p>
+      <w:r>
+        <w:t xml:space="preserve">Han folded the baton and returned it beneath his coat.</w:t>
+      </w:r>
+    </w:p>
+    <w:p>
+      <w:r>
+        <w:t xml:space="preserve">"That is convenient in the way traps are convenient. "</w:t>
+      </w:r>
+    </w:p>
+    <w:p>
+      <w:r>
+        <w:t xml:space="preserve">Kai looked at the torn map.</w:t>
+      </w:r>
+    </w:p>
+    <w:p>
+      <w:r>
+        <w:t xml:space="preserve">The black pin remained fixed to the western ridge.</w:t>
+      </w:r>
+    </w:p>
+    <w:p>
+      <w:r>
+        <w:t xml:space="preserve">Beside it, beneath the ripped paper, another mark had been hidden.</w:t>
+      </w:r>
+    </w:p>
+    <w:p>
+      <w:r>
+        <w:t xml:space="preserve">A small green circle.</w:t>
+      </w:r>
+    </w:p>
+    <w:p>
+      <w:r>
+        <w:t xml:space="preserve">He peeled back the top layer.</w:t>
+      </w:r>
+    </w:p>
+    <w:p>
+      <w:r>
+        <w:t xml:space="preserve">Characters appeared.</w:t>
+      </w:r>
+    </w:p>
+    <w:p>
+      <w:r>
+        <w:t xml:space="preserve">RETURNING CUSTODIAN ENTERS ALONE.</w:t>
+      </w:r>
+    </w:p>
+    <w:p>
+      <w:r>
+        <w:t xml:space="preserve">Han read them.</w:t>
+      </w:r>
+    </w:p>
+    <w:p>
+      <w:r>
+        <w:t xml:space="preserve">"No. "</w:t>
+      </w:r>
+    </w:p>
+    <w:p>
+      <w:r>
+        <w:t xml:space="preserve">Kai looked at him.</w:t>
+      </w:r>
+    </w:p>
+    <w:p>
+      <w:r>
+        <w:t xml:space="preserve">"That was immediate. "</w:t>
+      </w:r>
+    </w:p>
+    <w:p>
+      <w:r>
+        <w:t xml:space="preserve">"I have experience with bad instructions. "</w:t>
+      </w:r>
+    </w:p>
+    <w:p>
+      <w:r>
+        <w:t xml:space="preserve">"He may need a replacement to release everyone," Dr. Venn said.</w:t>
+      </w:r>
+    </w:p>
+    <w:p>
+      <w:r>
+        <w:t xml:space="preserve">Han turned on her. "That is not a better interpretation. "</w:t>
+      </w:r>
+    </w:p>
+    <w:p>
+      <w:r>
+        <w:t xml:space="preserve">Rian gathered the blue ledgers into a canvas document bag.</w:t>
+      </w:r>
+    </w:p>
+    <w:p>
+      <w:r>
+        <w:t xml:space="preserve">"We are not appointing Kai as haunted municipal infrastructure. "</w:t>
+      </w:r>
+    </w:p>
+    <w:p>
+      <w:r>
+        <w:t xml:space="preserve">"Agreed," Dr. Venn said.</w:t>
+      </w:r>
+    </w:p>
+    <w:p>
+      <w:r>
+        <w:t xml:space="preserve">Choi looked at Kai.</w:t>
+      </w:r>
+    </w:p>
+    <w:p>
+      <w:r>
+        <w:t xml:space="preserve">"Then why does the town remember him? "</w:t>
+      </w:r>
+    </w:p>
+    <w:p>
+      <w:r>
+        <w:t xml:space="preserve">No one answered.</w:t>
+      </w:r>
+    </w:p>
+    <w:p>
+      <w:r>
+        <w:t xml:space="preserve">Kai thought of the vision.</w:t>
+      </w:r>
+    </w:p>
+    <w:p>
+      <w:r>
+        <w:t xml:space="preserve">Young Seo Jun had told the older woman to remember which mistake was his.</w:t>
+      </w:r>
+    </w:p>
+    <w:p>
+      <w:r>
+        <w:t xml:space="preserve">Not who he was.</w:t>
+      </w:r>
+    </w:p>
+    <w:p>
+      <w:r>
+        <w:t xml:space="preserve">Which mistake belonged to him.</w:t>
+      </w:r>
+    </w:p>
+    <w:p>
+      <w:r>
+        <w:t xml:space="preserve">The formation might not recognize Kai as Seo Jun.</w:t>
+      </w:r>
+    </w:p>
+    <w:p>
+      <w:r>
+        <w:t xml:space="preserve">It might recognize the same error.</w:t>
+      </w:r>
+    </w:p>
+    <w:p>
+      <w:r>
+        <w:t xml:space="preserve">The willingness to carry everyone alone.</w:t>
+      </w:r>
+    </w:p>
+    <w:p>
+      <w:r>
+        <w:t xml:space="preserve">He had done it before.</w:t>
+      </w:r>
+    </w:p>
+    <w:p>
+      <w:r>
+        <w:t xml:space="preserve">Taken the burden because involving others felt more dangerous. Trusted his endurance more than another person's choice. The system had rewarded him often enough that the habit could disguise itself as responsibility.</w:t>
+      </w:r>
+    </w:p>
+    <w:p>
+      <w:r>
+        <w:t xml:space="preserve">The man beneath the umbrella knew that shape.</w:t>
+      </w:r>
+    </w:p>
+    <w:p>
+      <w:r>
+        <w:t xml:space="preserve">Perhaps the returning custodian was not a reincarnation.</w:t>
+      </w:r>
+    </w:p>
+    <w:p>
+      <w:r>
+        <w:t xml:space="preserve">Perhaps it was whoever repeated the choice.</w:t>
+      </w:r>
+    </w:p>
+    <w:p>
+      <w:r>
+        <w:t xml:space="preserve">Kai looked at Han, Dr. Venn, Rian, and Choi.</w:t>
+      </w:r>
+    </w:p>
+    <w:p>
+      <w:r>
+        <w:t xml:space="preserve">"We enter together. "</w:t>
+      </w:r>
+    </w:p>
+    <w:p>
+      <w:r>
+        <w:t xml:space="preserve">Choi shook her head. "The record says alone. "</w:t>
+      </w:r>
+    </w:p>
+    <w:p>
+      <w:r>
+        <w:t xml:space="preserve">"The record was written by a formation that failed. "</w:t>
+      </w:r>
+    </w:p>
+    <w:p>
+      <w:r>
+        <w:t xml:space="preserve">Rian lifted the document bag.</w:t>
+      </w:r>
+    </w:p>
+    <w:p>
+      <w:r>
+        <w:t xml:space="preserve">"Finally, an administrative principle I understand. "</w:t>
+      </w:r>
+    </w:p>
+    <w:p>
+      <w:r>
+        <w:t xml:space="preserve">They descended through the municipal building.</w:t>
+      </w:r>
+    </w:p>
+    <w:p>
+      <w:r>
+        <w:t xml:space="preserve">Residents lined the stairwell, lobby, and courtyard. They did not touch Kai. Each turned as he passed, mouths whispering different names now.</w:t>
+      </w:r>
+    </w:p>
+    <w:p>
+      <w:r>
+        <w:t xml:space="preserve">Birth names.</w:t>
+      </w:r>
+    </w:p>
+    <w:p>
+      <w:r>
+        <w:t xml:space="preserve">Childhood nicknames.</w:t>
+      </w:r>
+    </w:p>
+    <w:p>
+      <w:r>
+        <w:t xml:space="preserve">Family titles.</w:t>
+      </w:r>
+    </w:p>
+    <w:p>
+      <w:r>
+        <w:t xml:space="preserve">Names belonging to the dead.</w:t>
+      </w:r>
+    </w:p>
+    <w:p>
+      <w:r>
+        <w:t xml:space="preserve">The branching from the ledgers was spreading, but too slowly.</w:t>
+      </w:r>
+    </w:p>
+    <w:p>
+      <w:r>
+        <w:t xml:space="preserve">Outside, the town had changed.</w:t>
+      </w:r>
+    </w:p>
+    <w:p>
+      <w:r>
+        <w:t xml:space="preserve">The mist hung in straight lines between buildings. Roads glowed faintly beneath the crowd. Utility poles hummed. Traffic mirrors reflected the same image regardless of angle.</w:t>
+      </w:r>
+    </w:p>
+    <w:p>
+      <w:r>
+        <w:t xml:space="preserve">The western ridge.</w:t>
+      </w:r>
+    </w:p>
+    <w:p>
+      <w:r>
+        <w:t xml:space="preserve">A low stone structure stood beneath bare trees.</w:t>
+      </w:r>
+    </w:p>
+    <w:p>
+      <w:r>
+        <w:t xml:space="preserve">No doors.</w:t>
+      </w:r>
+    </w:p>
+    <w:p>
+      <w:r>
+        <w:t xml:space="preserve">The minibus started on the second attempt.</w:t>
+      </w:r>
+    </w:p>
+    <w:p>
+      <w:r>
+        <w:t xml:space="preserve">Han drove.</w:t>
+      </w:r>
+    </w:p>
+    <w:p>
+      <w:r>
+        <w:t xml:space="preserve">Kai sat in the front passenger seat while the others crowded behind him with the resonance array, ledgers, and Choi. The heater came alive without being insulted.</w:t>
+      </w:r>
+    </w:p>
+    <w:p>
+      <w:r>
+        <w:t xml:space="preserve">Rian regarded the vent suspiciously.</w:t>
+      </w:r>
+    </w:p>
+    <w:p>
+      <w:r>
+        <w:t xml:space="preserve">"It knows the situation is serious. "</w:t>
+      </w:r>
+    </w:p>
+    <w:p>
+      <w:r>
+        <w:t xml:space="preserve">They followed the crowd west.</w:t>
+      </w:r>
+    </w:p>
+    <w:p>
+      <w:r>
+        <w:t xml:space="preserve">Residents filled the road, but they parted around the vehicle. Han kept the speed low. He did not trust the formation enough to risk anyone stepping back into their path.</w:t>
+      </w:r>
+    </w:p>
+    <w:p>
+      <w:r>
+        <w:t xml:space="preserve">The man beneath the umbrella walked ahead.</w:t>
+      </w:r>
+    </w:p>
+    <w:p>
+      <w:r>
+        <w:t xml:space="preserve">No matter how fast the minibus moved, the distance between them remained the same.</w:t>
+      </w:r>
+    </w:p>
+    <w:p>
+      <w:r>
+        <w:t xml:space="preserve">The sixth bell continued echoing beneath the town. It had not faded. Each pulse drew more qi toward the ridge.</w:t>
+      </w:r>
+    </w:p>
+    <w:p>
+      <w:r>
+        <w:t xml:space="preserve">Kai opened the system.</w:t>
+      </w:r>
+    </w:p>
+    <w:p>
+      <w:r>
+        <w:t xml:space="preserve">Emergency Quest: The Name That Refused Burial</w:t>
+      </w:r>
+    </w:p>
+    <w:p>
+      <w:r>
+        <w:t xml:space="preserve">Objective updated: Reach the western boundary before Bell 7.</w:t>
+      </w:r>
+    </w:p>
+    <w:p>
+      <w:r>
+        <w:t xml:space="preserve">Secondary objective: Preserve resident identity variance.</w:t>
+      </w:r>
+    </w:p>
+    <w:p>
+      <w:r>
+        <w:t xml:space="preserve">Hidden condition detected.</w:t>
+      </w:r>
+    </w:p>
+    <w:p>
+      <w:r>
+        <w:t xml:space="preserve">He focused on the final line.</w:t>
+      </w:r>
+    </w:p>
+    <w:p>
+      <w:r>
+        <w:t xml:space="preserve">Hidden condition: Custodial succession requires voluntary singular claim.</w:t>
+      </w:r>
+    </w:p>
+    <w:p>
+      <w:r>
+        <w:t xml:space="preserve">Voluntary.</w:t>
+      </w:r>
+    </w:p>
+    <w:p>
+      <w:r>
+        <w:t xml:space="preserve">The formation could force recognition, but it could not force one person to claim everyone as theirs.</w:t>
+      </w:r>
+    </w:p>
+    <w:p>
+      <w:r>
+        <w:t xml:space="preserve">Seo Jun had done so willingly during the landslide.</w:t>
+      </w:r>
+    </w:p>
+    <w:p>
+      <w:r>
+        <w:t xml:space="preserve">The mistake had not been carrying them.</w:t>
+      </w:r>
+    </w:p>
+    <w:p>
+      <w:r>
+        <w:t xml:space="preserve">It had been declaring himself the only one who could.</w:t>
+      </w:r>
+    </w:p>
+    <w:p>
+      <w:r>
+        <w:t xml:space="preserve">Kai looked back.</w:t>
+      </w:r>
+    </w:p>
+    <w:p>
+      <w:r>
+        <w:t xml:space="preserve">"Whatever happens inside, do not let me say I will carry it alone. "</w:t>
+      </w:r>
+    </w:p>
+    <w:p>
+      <w:r>
+        <w:t xml:space="preserve">Han met his eyes through the mirror.</w:t>
+      </w:r>
+    </w:p>
+    <w:p>
+      <w:r>
+        <w:t xml:space="preserve">"That was already my plan. "</w:t>
+      </w:r>
+    </w:p>
+    <w:p>
+      <w:r>
+        <w:t xml:space="preserve">"I am serious. "</w:t>
+      </w:r>
+    </w:p>
+    <w:p>
+      <w:r>
+        <w:t xml:space="preserve">"So am I. "</w:t>
+      </w:r>
+    </w:p>
+    <w:p>
+      <w:r>
+        <w:t xml:space="preserve">Rian leaned forward. "Would physically interrupting you violate the civilian contact restriction? "</w:t>
+      </w:r>
+    </w:p>
+    <w:p>
+      <w:r>
+        <w:t xml:space="preserve">"Kai is not a civilian," Han said.</w:t>
+      </w:r>
+    </w:p>
+    <w:p>
+      <w:r>
+        <w:t xml:space="preserve">"Excellent. "</w:t>
+      </w:r>
+    </w:p>
+    <w:p>
+      <w:r>
+        <w:t xml:space="preserve">Dr. Venn adjusted the brass rings.</w:t>
+      </w:r>
+    </w:p>
+    <w:p>
+      <w:r>
+        <w:t xml:space="preserve">"The formation may attempt to separate us through personalized perceptions. Establish verification phrases now. "</w:t>
+      </w:r>
+    </w:p>
+    <w:p>
+      <w:r>
+        <w:t xml:space="preserve">Rian pointed to the dashboard. "The heater responds to abuse. "</w:t>
+      </w:r>
+    </w:p>
+    <w:p>
+      <w:r>
+        <w:t xml:space="preserve">Han nodded. "Adequate. "</w:t>
+      </w:r>
+    </w:p>
+    <w:p>
+      <w:r>
+        <w:t xml:space="preserve">Dr. Venn looked offended.</w:t>
+      </w:r>
+    </w:p>
+    <w:p>
+      <w:r>
+        <w:t xml:space="preserve">"It is memorable," Kai said.</w:t>
+      </w:r>
+    </w:p>
+    <w:p>
+      <w:r>
+        <w:t xml:space="preserve">Choi gripped the seat in front of her.</w:t>
+      </w:r>
+    </w:p>
+    <w:p>
+      <w:r>
+        <w:t xml:space="preserve">"What should I use? "</w:t>
+      </w:r>
+    </w:p>
+    <w:p>
+      <w:r>
+        <w:t xml:space="preserve">Rian considered.</w:t>
+      </w:r>
+    </w:p>
+    <w:p>
+      <w:r>
+        <w:t xml:space="preserve">"You called the memorial a house with no door. "</w:t>
+      </w:r>
+    </w:p>
+    <w:p>
+      <w:r>
+        <w:t xml:space="preserve">She nodded.</w:t>
+      </w:r>
+    </w:p>
+    <w:p>
+      <w:r>
+        <w:t xml:space="preserve">"That is not unique enough," Dr. Venn said.</w:t>
+      </w:r>
+    </w:p>
+    <w:p>
+      <w:r>
+        <w:t xml:space="preserve">Choi looked toward the crowd.</w:t>
+      </w:r>
+    </w:p>
+    <w:p>
+      <w:r>
+        <w:t xml:space="preserve">"My grandmother's name was Choi Seon-ha. She hated pears and lied about it. "</w:t>
+      </w:r>
+    </w:p>
+    <w:p>
+      <w:r>
+        <w:t xml:space="preserve">Rian blinked.</w:t>
+      </w:r>
+    </w:p>
+    <w:p>
+      <w:r>
+        <w:t xml:space="preserve">"That will do. "</w:t>
+      </w:r>
+    </w:p>
+    <w:p>
+      <w:r>
+        <w:t xml:space="preserve">They reached the ridge with eleven minutes remaining.</w:t>
+      </w:r>
+    </w:p>
+    <w:p>
+      <w:r>
+        <w:t xml:space="preserve">The crowd formed a circle around the stone structure.</w:t>
+      </w:r>
+    </w:p>
+    <w:p>
+      <w:r>
+        <w:t xml:space="preserve">The Jun Household Memorial Site resembled a low rectangular house built directly into the hillside. Its eastern wall held a shallow rectangular depression where a door might once have stood. The western side disappeared into the slope.</w:t>
+      </w:r>
+    </w:p>
+    <w:p>
+      <w:r>
+        <w:t xml:space="preserve">White cord wrapped every corner.</w:t>
+      </w:r>
+    </w:p>
+    <w:p>
+      <w:r>
+        <w:t xml:space="preserve">Iron filings glittered in the wet stone.</w:t>
+      </w:r>
+    </w:p>
+    <w:p>
+      <w:r>
+        <w:t xml:space="preserve">Above the sealed entrance hung a blank wooden tablet.</w:t>
+      </w:r>
+    </w:p>
+    <w:p>
+      <w:r>
+        <w:t xml:space="preserve">The man beneath the umbrella stopped before it.</w:t>
+      </w:r>
+    </w:p>
+    <w:p>
+      <w:r>
+        <w:t xml:space="preserve">The crowd stopped with him.</w:t>
+      </w:r>
+    </w:p>
+    <w:p>
+      <w:r>
+        <w:t xml:space="preserve">Three thousand faces turned toward Kai.</w:t>
+      </w:r>
+    </w:p>
+    <w:p>
+      <w:r>
+        <w:t xml:space="preserve">The system displayed one line.</w:t>
+      </w:r>
+    </w:p>
+    <w:p>
+      <w:r>
+        <w:t xml:space="preserve">Occupancy: 1.</w:t>
+      </w:r>
+    </w:p>
+    <w:p>
+      <w:r>
+        <w:t xml:space="preserve">Kai stepped from the minibus.</w:t>
+      </w:r>
+    </w:p>
+    <w:p>
+      <w:r>
+        <w:t xml:space="preserve">Han exited beside him.</w:t>
+      </w:r>
+    </w:p>
+    <w:p>
+      <w:r>
+        <w:t xml:space="preserve">The system changed.</w:t>
+      </w:r>
+    </w:p>
+    <w:p>
+      <w:r>
+        <w:t xml:space="preserve">Occupancy: 1.</w:t>
+      </w:r>
+    </w:p>
+    <w:p>
+      <w:r>
+        <w:t xml:space="preserve">Dr. Venn joined them.</w:t>
+      </w:r>
+    </w:p>
+    <w:p>
+      <w:r>
+        <w:t xml:space="preserve">Rian.</w:t>
+      </w:r>
+    </w:p>
+    <w:p>
+      <w:r>
+        <w:t xml:space="preserve">Choi.</w:t>
+      </w:r>
+    </w:p>
+    <w:p>
+      <w:r>
+        <w:t xml:space="preserve">Still one.</w:t>
+      </w:r>
+    </w:p>
+    <w:p>
+      <w:r>
+        <w:t xml:space="preserve">The field had already consolidated their presence.</w:t>
+      </w:r>
+    </w:p>
+    <w:p>
+      <w:r>
+        <w:t xml:space="preserve">The man closed his umbrella.</w:t>
+      </w:r>
+    </w:p>
+    <w:p>
+      <w:r>
+        <w:t xml:space="preserve">For the first time, rain touched him.</w:t>
+      </w:r>
+    </w:p>
+    <w:p>
+      <w:r>
+        <w:t xml:space="preserve">It passed through his body.</w:t>
+      </w:r>
+    </w:p>
+    <w:p>
+      <w:r>
+        <w:t xml:space="preserve">He held the umbrella toward Kai.</w:t>
+      </w:r>
+    </w:p>
+    <w:p>
+      <w:r>
+        <w:t xml:space="preserve">"Take it. "</w:t>
+      </w:r>
+    </w:p>
+    <w:p>
+      <w:r>
+        <w:t xml:space="preserve">Kai looked at the handle.</w:t>
+      </w:r>
+    </w:p>
+    <w:p>
+      <w:r>
+        <w:t xml:space="preserve">Black wood worn smooth by a hand.</w:t>
+      </w:r>
+    </w:p>
+    <w:p>
+      <w:r>
+        <w:t xml:space="preserve">Custodial implement detected.</w:t>
+      </w:r>
+    </w:p>
+    <w:p>
+      <w:r>
+        <w:t xml:space="preserve">Accepting does not complete succession.</w:t>
+      </w:r>
+    </w:p>
+    <w:p>
+      <w:r>
+        <w:t xml:space="preserve">He took it.</w:t>
+      </w:r>
+    </w:p>
+    <w:p>
+      <w:r>
+        <w:t xml:space="preserve">The cold was immediate.</w:t>
+      </w:r>
+    </w:p>
+    <w:p>
+      <w:r>
+        <w:t xml:space="preserve">The stone house gained a door.</w:t>
+      </w:r>
+    </w:p>
+    <w:p>
+      <w:r>
+        <w:t xml:space="preserve">Not formed.</w:t>
+      </w:r>
+    </w:p>
+    <w:p>
+      <w:r>
+        <w:t xml:space="preserve">Recognized.</w:t>
+      </w:r>
+    </w:p>
+    <w:p>
+      <w:r>
+        <w:t xml:space="preserve">A black wooden panel bound with copper stood inside the eastern depression. The same door from the old well vision.</w:t>
+      </w:r>
+    </w:p>
+    <w:p>
+      <w:r>
+        <w:t xml:space="preserve">Seo Jun placed his palm against it.</w:t>
+      </w:r>
+    </w:p>
+    <w:p>
+      <w:r>
+        <w:t xml:space="preserve">"You returned. "</w:t>
+      </w:r>
+    </w:p>
+    <w:p>
+      <w:r>
+        <w:t xml:space="preserve">Kai did not correct him.</w:t>
+      </w:r>
+    </w:p>
+    <w:p>
+      <w:r>
+        <w:t xml:space="preserve">He raised the umbrella.</w:t>
+      </w:r>
+    </w:p>
+    <w:p>
+      <w:r>
+        <w:t xml:space="preserve">"Why did you call us? "</w:t>
+      </w:r>
+    </w:p>
+    <w:p>
+      <w:r>
+        <w:t xml:space="preserve">The man looked toward the crowd.</w:t>
+      </w:r>
+    </w:p>
+    <w:p>
+      <w:r>
+        <w:t xml:space="preserve">"I am tired. "</w:t>
+      </w:r>
+    </w:p>
+    <w:p>
+      <w:r>
+        <w:t xml:space="preserve">The answer carried eighty-one years.</w:t>
+      </w:r>
+    </w:p>
+    <w:p>
+      <w:r>
+        <w:t xml:space="preserve">Perhaps longer.</w:t>
+      </w:r>
+    </w:p>
+    <w:p>
+      <w:r>
+        <w:t xml:space="preserve">"My name cannot hold them anymore. "</w:t>
+      </w:r>
+    </w:p>
+    <w:p>
+      <w:r>
+        <w:t xml:space="preserve">"Then release them. "</w:t>
+      </w:r>
+    </w:p>
+    <w:p>
+      <w:r>
+        <w:t xml:space="preserve">"I tried. "</w:t>
+      </w:r>
+    </w:p>
+    <w:p>
+      <w:r>
+        <w:t xml:space="preserve">The blank tablet above the door turned.</w:t>
+      </w:r>
+    </w:p>
+    <w:p>
+      <w:r>
+        <w:t xml:space="preserve">Names covered its front.</w:t>
+      </w:r>
+    </w:p>
+    <w:p>
+      <w:r>
+        <w:t xml:space="preserve">Thousands layered so densely that no wood remained visible.</w:t>
+      </w:r>
+    </w:p>
+    <w:p>
+      <w:r>
+        <w:t xml:space="preserve">"They come back," Seo Jun said.</w:t>
+      </w:r>
+    </w:p>
+    <w:p>
+      <w:r>
+        <w:t xml:space="preserve">"Why? "</w:t>
+      </w:r>
+    </w:p>
+    <w:p>
+      <w:r>
+        <w:t xml:space="preserve">"Because the one who left must receive them. "</w:t>
+      </w:r>
+    </w:p>
+    <w:p>
+      <w:r>
+        <w:t xml:space="preserve">Kai looked at the sealed house.</w:t>
+      </w:r>
+    </w:p>
+    <w:p>
+      <w:r>
+        <w:t xml:space="preserve">"Yourself. "</w:t>
+      </w:r>
+    </w:p>
+    <w:p>
+      <w:r>
+        <w:t xml:space="preserve">The man smiled sadly.</w:t>
+      </w:r>
+    </w:p>
+    <w:p>
+      <w:r>
+        <w:t xml:space="preserve">"I no longer know which one that is. "</w:t>
+      </w:r>
+    </w:p>
+    <w:p>
+      <w:r>
+        <w:t xml:space="preserve">The seventh bell began to rise.</w:t>
+      </w:r>
+    </w:p>
+    <w:p>
+      <w:r>
+        <w:t xml:space="preserve">Nine minutes remained.</w:t>
+      </w:r>
+    </w:p>
+    <w:p>
+      <w:r>
+        <w:t xml:space="preserve">Dr. Venn set the resonance array before the door.</w:t>
+      </w:r>
+    </w:p>
+    <w:p>
+      <w:r>
+        <w:t xml:space="preserve">"The returning room separated households after the landslide. The eastern entrance accepted the consolidated pattern. The western exit released individuals. "</w:t>
+      </w:r>
+    </w:p>
+    <w:p>
+      <w:r>
+        <w:t xml:space="preserve">Seo Jun looked at her.</w:t>
+      </w:r>
+    </w:p>
+    <w:p>
+      <w:r>
+        <w:t xml:space="preserve">"You speak as if you remember. "</w:t>
+      </w:r>
+    </w:p>
+    <w:p>
+      <w:r>
+        <w:t xml:space="preserve">"I read. "</w:t>
+      </w:r>
+    </w:p>
+    <w:p>
+      <w:r>
+        <w:t xml:space="preserve">A flicker of approval crossed his face.</w:t>
+      </w:r>
+    </w:p>
+    <w:p>
+      <w:r>
+        <w:t xml:space="preserve">"Better. "</w:t>
+      </w:r>
+    </w:p>
+    <w:p>
+      <w:r>
+        <w:t xml:space="preserve">Choi approached the blank tablet.</w:t>
+      </w:r>
+    </w:p>
+    <w:p>
+      <w:r>
+        <w:t xml:space="preserve">"My family returned through this room. "</w:t>
+      </w:r>
+    </w:p>
+    <w:p>
+      <w:r>
+        <w:t xml:space="preserve">"Yes. "</w:t>
+      </w:r>
+    </w:p>
+    <w:p>
+      <w:r>
+        <w:t xml:space="preserve">"My grandmother remembered you. "</w:t>
+      </w:r>
+    </w:p>
+    <w:p>
+      <w:r>
+        <w:t xml:space="preserve">Seo Jun's expression broke.</w:t>
+      </w:r>
+    </w:p>
+    <w:p>
+      <w:r>
+        <w:t xml:space="preserve">Only slightly.</w:t>
+      </w:r>
+    </w:p>
+    <w:p>
+      <w:r>
+        <w:t xml:space="preserve">"She hated pears. "</w:t>
+      </w:r>
+    </w:p>
+    <w:p>
+      <w:r>
+        <w:t xml:space="preserve">Choi laughed through sudden tears.</w:t>
+      </w:r>
+    </w:p>
+    <w:p>
+      <w:r>
+        <w:t xml:space="preserve">"She did. "</w:t>
+      </w:r>
+    </w:p>
+    <w:p>
+      <w:r>
+        <w:t xml:space="preserve">The crowd whispered.</w:t>
+      </w:r>
+    </w:p>
+    <w:p>
+      <w:r>
+        <w:t xml:space="preserve">Different names rippled outward.</w:t>
+      </w:r>
+    </w:p>
+    <w:p>
+      <w:r>
+        <w:t xml:space="preserve">The formation trembled.</w:t>
+      </w:r>
+    </w:p>
+    <w:p>
+      <w:r>
+        <w:t xml:space="preserve">Kai understood.</w:t>
+      </w:r>
+    </w:p>
+    <w:p>
+      <w:r>
+        <w:t xml:space="preserve">Seo Jun could not release the residents because the current town remembered him only as the consolidated custodian. They had forgotten the man who had existed before taking the role.</w:t>
+      </w:r>
+    </w:p>
+    <w:p>
+      <w:r>
+        <w:t xml:space="preserve">To separate the town, the returning room needed two anchors.</w:t>
+      </w:r>
+    </w:p>
+    <w:p>
+      <w:r>
+        <w:t xml:space="preserve">The one who carried everyone in.</w:t>
+      </w:r>
+    </w:p>
+    <w:p>
+      <w:r>
+        <w:t xml:space="preserve">The one who waited to receive them out.</w:t>
+      </w:r>
+    </w:p>
+    <w:p>
+      <w:r>
+        <w:t xml:space="preserve">Seo Jun had become the first.</w:t>
+      </w:r>
+    </w:p>
+    <w:p>
+      <w:r>
+        <w:t xml:space="preserve">No one had remained to be the second.</w:t>
+      </w:r>
+    </w:p>
+    <w:p>
+      <w:r>
+        <w:t xml:space="preserve">Kai looked at the western wall buried in the hill.</w:t>
+      </w:r>
+    </w:p>
+    <w:p>
+      <w:r>
+        <w:t xml:space="preserve">"Where does the exit lead now? "</w:t>
+      </w:r>
+    </w:p>
+    <w:p>
+      <w:r>
+        <w:t xml:space="preserve">Seo Jun turned toward the ridge.</w:t>
+      </w:r>
+    </w:p>
+    <w:p>
+      <w:r>
+        <w:t xml:space="preserve">"Where it always led. "</w:t>
+      </w:r>
+    </w:p>
+    <w:p>
+      <w:r>
+        <w:t xml:space="preserve">The stone shifted.</w:t>
+      </w:r>
+    </w:p>
+    <w:p>
+      <w:r>
+        <w:t xml:space="preserve">A line appeared around the western side of the structure.</w:t>
+      </w:r>
+    </w:p>
+    <w:p>
+      <w:r>
+        <w:t xml:space="preserve">A second door.</w:t>
+      </w:r>
+    </w:p>
+    <w:p>
+      <w:r>
+        <w:t xml:space="preserve">Sealed from outside by roots, soil, and eighty-one years of deliberate forgetting.</w:t>
+      </w:r>
+    </w:p>
+    <w:p>
+      <w:r>
+        <w:t xml:space="preserve">Han took a step toward it.</w:t>
+      </w:r>
+    </w:p>
+    <w:p>
+      <w:r>
+        <w:t xml:space="preserve">Seo Jun raised one hand.</w:t>
+      </w:r>
+    </w:p>
+    <w:p>
+      <w:r>
+        <w:t xml:space="preserve">"You cannot reach it from here. "</w:t>
+      </w:r>
+    </w:p>
+    <w:p>
+      <w:r>
+        <w:t xml:space="preserve">"Then how? "</w:t>
+      </w:r>
+    </w:p>
+    <w:p>
+      <w:r>
+        <w:t xml:space="preserve">"Someone enters. "</w:t>
+      </w:r>
+    </w:p>
+    <w:p>
+      <w:r>
+        <w:t xml:space="preserve">Kai looked at the eastern door.</w:t>
+      </w:r>
+    </w:p>
+    <w:p>
+      <w:r>
+        <w:t xml:space="preserve">"Someone else waits at the western exit. "</w:t>
+      </w:r>
+    </w:p>
+    <w:p>
+      <w:r>
+        <w:t xml:space="preserve">The man nodded.</w:t>
+      </w:r>
+    </w:p>
+    <w:p>
+      <w:r>
+        <w:t xml:space="preserve">The seventh bell gathered strength.</w:t>
+      </w:r>
+    </w:p>
+    <w:p>
+      <w:r>
+        <w:t xml:space="preserve">Seven minutes.</w:t>
+      </w:r>
+    </w:p>
+    <w:p>
+      <w:r>
+        <w:t xml:space="preserve">Kai handed the umbrella to Han.</w:t>
+      </w:r>
+    </w:p>
+    <w:p>
+      <w:r>
+        <w:t xml:space="preserve">Seo Jun's face went still.</w:t>
+      </w:r>
+    </w:p>
+    <w:p>
+      <w:r>
+        <w:t xml:space="preserve">The system flashed.</w:t>
+      </w:r>
+    </w:p>
+    <w:p>
+      <w:r>
+        <w:t xml:space="preserve">Custodial implement transferred.</w:t>
+      </w:r>
+    </w:p>
+    <w:p>
+      <w:r>
+        <w:t xml:space="preserve">Singular claim interrupted.</w:t>
+      </w:r>
+    </w:p>
+    <w:p>
+      <w:r>
+        <w:t xml:space="preserve">Han looked at the umbrella.</w:t>
+      </w:r>
+    </w:p>
+    <w:p>
+      <w:r>
+        <w:t xml:space="preserve">"I dislike this. "</w:t>
+      </w:r>
+    </w:p>
+    <w:p>
+      <w:r>
+        <w:t xml:space="preserve">"Insult it later. "</w:t>
+      </w:r>
+    </w:p>
+    <w:p>
+      <w:r>
+        <w:t xml:space="preserve">Rian pointed toward the ridge path. "I can reach the western side. "</w:t>
+      </w:r>
+    </w:p>
+    <w:p>
+      <w:r>
+        <w:t xml:space="preserve">"No," Dr. Venn said. "You carry the ledgers. We need resident variance at the entrance. "</w:t>
+      </w:r>
+    </w:p>
+    <w:p>
+      <w:r>
+        <w:t xml:space="preserve">Choi stepped forward.</w:t>
+      </w:r>
+    </w:p>
+    <w:p>
+      <w:r>
+        <w:t xml:space="preserve">"I will go. "</w:t>
+      </w:r>
+    </w:p>
+    <w:p>
+      <w:r>
+        <w:t xml:space="preserve">Han shook his head.</w:t>
+      </w:r>
+    </w:p>
+    <w:p>
+      <w:r>
+        <w:t xml:space="preserve">"You are still linked. "</w:t>
+      </w:r>
+    </w:p>
+    <w:p>
+      <w:r>
+        <w:t xml:space="preserve">"So is everyone. "</w:t>
+      </w:r>
+    </w:p>
+    <w:p>
+      <w:r>
+        <w:t xml:space="preserve">"It may use you. "</w:t>
+      </w:r>
+    </w:p>
+    <w:p>
+      <w:r>
+        <w:t xml:space="preserve">"It already has. "</w:t>
+      </w:r>
+    </w:p>
+    <w:p>
+      <w:r>
+        <w:t xml:space="preserve">Her voice remained steady.</w:t>
+      </w:r>
+    </w:p>
+    <w:p>
+      <w:r>
+        <w:t xml:space="preserve">"My family came through this room. The municipal records say the western slope has an old service path. I know where it begins. "</w:t>
+      </w:r>
+    </w:p>
+    <w:p>
+      <w:r>
+        <w:t xml:space="preserve">Dr. Venn looked at the array.</w:t>
+      </w:r>
+    </w:p>
+    <w:p>
+      <w:r>
+        <w:t xml:space="preserve">"The exit anchor must recognize individuals. Choi has spent years processing household changes. Births, deaths, marriages, relocations. "</w:t>
+      </w:r>
+    </w:p>
+    <w:p>
+      <w:r>
+        <w:t xml:space="preserve">Rian's expression softened.</w:t>
+      </w:r>
+    </w:p>
+    <w:p>
+      <w:r>
+        <w:t xml:space="preserve">"She knows the town. "</w:t>
+      </w:r>
+    </w:p>
+    <w:p>
+      <w:r>
+        <w:t xml:space="preserve">Choi looked at Seo Jun.</w:t>
+      </w:r>
+    </w:p>
+    <w:p>
+      <w:r>
+        <w:t xml:space="preserve">"And I know he is not all of us. "</w:t>
+      </w:r>
+    </w:p>
+    <w:p>
+      <w:r>
+        <w:t xml:space="preserve">Seo Jun bowed his head.</w:t>
+      </w:r>
+    </w:p>
+    <w:p>
+      <w:r>
+        <w:t xml:space="preserve">Han handed the umbrella back to Kai, then caught Choi's arm.</w:t>
+      </w:r>
+    </w:p>
+    <w:p>
+      <w:r>
+        <w:t xml:space="preserve">"I am going with you. "</w:t>
+      </w:r>
+    </w:p>
+    <w:p>
+      <w:r>
+        <w:t xml:space="preserve">"The exit may require one person. "</w:t>
+      </w:r>
+    </w:p>
+    <w:p>
+      <w:r>
+        <w:t xml:space="preserve">"We have established that the formation gives bad advice. "</w:t>
+      </w:r>
+    </w:p>
+    <w:p>
+      <w:r>
+        <w:t xml:space="preserve">They ran toward the northern slope.</w:t>
+      </w:r>
+    </w:p>
+    <w:p>
+      <w:r>
+        <w:t xml:space="preserve">Dr. Venn activated the array.</w:t>
+      </w:r>
+    </w:p>
+    <w:p>
+      <w:r>
+        <w:t xml:space="preserve">Rian opened the blue ledgers on the wet ground.</w:t>
+      </w:r>
+    </w:p>
+    <w:p>
+      <w:r>
+        <w:t xml:space="preserve">Kai stood before the eastern door with Seo Jun.</w:t>
+      </w:r>
+    </w:p>
+    <w:p>
+      <w:r>
+        <w:t xml:space="preserve">Five minutes.</w:t>
+      </w:r>
+    </w:p>
+    <w:p>
+      <w:r>
+        <w:t xml:space="preserve">The crowd began speaking again.</w:t>
+      </w:r>
+    </w:p>
+    <w:p>
+      <w:r>
+        <w:t xml:space="preserve">Seo Jun.</w:t>
+      </w:r>
+    </w:p>
+    <w:p>
+      <w:r>
+        <w:t xml:space="preserve">Seo Jun.</w:t>
+      </w:r>
+    </w:p>
+    <w:p>
+      <w:r>
+        <w:t xml:space="preserve">Seo Jun.</w:t>
+      </w:r>
+    </w:p>
+    <w:p>
+      <w:r>
+        <w:t xml:space="preserve">The differences from the records were fading.</w:t>
+      </w:r>
+    </w:p>
+    <w:p>
+      <w:r>
+        <w:t xml:space="preserve">Kai placed his palm against the copper binding.</w:t>
+      </w:r>
+    </w:p>
+    <w:p>
+      <w:r>
+        <w:t xml:space="preserve">The door opened inward.</w:t>
+      </w:r>
+    </w:p>
+    <w:p>
+      <w:r>
+        <w:t xml:space="preserve">Beyond it lay a dark room filled with sleeping people.</w:t>
+      </w:r>
+    </w:p>
+    <w:p>
+      <w:r>
+        <w:t xml:space="preserve">Not bodies.</w:t>
+      </w:r>
+    </w:p>
+    <w:p>
+      <w:r>
+        <w:t xml:space="preserve">Identity impressions.</w:t>
+      </w:r>
+    </w:p>
+    <w:p>
+      <w:r>
+        <w:t xml:space="preserve">Each appeared as a pale figure curled upon the floor, layered one over another. Thousands occupied a space no larger than a modest house.</w:t>
+      </w:r>
+    </w:p>
+    <w:p>
+      <w:r>
+        <w:t xml:space="preserve">At the center stood a bronze bell.</w:t>
+      </w:r>
+    </w:p>
+    <w:p>
+      <w:r>
+        <w:t xml:space="preserve">Its hammer had already drawn back.</w:t>
+      </w:r>
+    </w:p>
+    <w:p>
+      <w:r>
+        <w:t xml:space="preserve">Seo Jun entered.</w:t>
+      </w:r>
+    </w:p>
+    <w:p>
+      <w:r>
+        <w:t xml:space="preserve">The crowd moved with him.</w:t>
+      </w:r>
+    </w:p>
+    <w:p>
+      <w:r>
+        <w:t xml:space="preserve">Not physically.</w:t>
+      </w:r>
+    </w:p>
+    <w:p>
+      <w:r>
+        <w:t xml:space="preserve">Their shadows flowed across the ground and passed through the doorway.</w:t>
+      </w:r>
+    </w:p>
+    <w:p>
+      <w:r>
+        <w:t xml:space="preserve">Kai felt the voluntary claim waiting.</w:t>
+      </w:r>
+    </w:p>
+    <w:p>
+      <w:r>
+        <w:t xml:space="preserve">One sentence.</w:t>
+      </w:r>
+    </w:p>
+    <w:p>
+      <w:r>
+        <w:t xml:space="preserve">One belief.</w:t>
+      </w:r>
+    </w:p>
+    <w:p>
+      <w:r>
+        <w:t xml:space="preserve">I will carry them.</w:t>
+      </w:r>
+    </w:p>
+    <w:p>
+      <w:r>
+        <w:t xml:space="preserve">The system warned him.</w:t>
+      </w:r>
+    </w:p>
+    <w:p>
+      <w:r>
+        <w:t xml:space="preserve">Singular claim pathway active.</w:t>
+      </w:r>
+    </w:p>
+    <w:p>
+      <w:r>
+        <w:t xml:space="preserve">Do not accept exclusive custodianship.</w:t>
+      </w:r>
+    </w:p>
+    <w:p>
+      <w:r>
+        <w:t xml:space="preserve">Seo Jun stood beside the bell.</w:t>
+      </w:r>
+    </w:p>
+    <w:p>
+      <w:r>
+        <w:t xml:space="preserve">"You can end this. "</w:t>
+      </w:r>
+    </w:p>
+    <w:p>
+      <w:r>
+        <w:t xml:space="preserve">"By becoming you. "</w:t>
+      </w:r>
+    </w:p>
+    <w:p>
+      <w:r>
+        <w:t xml:space="preserve">"By becoming enough. "</w:t>
+      </w:r>
+    </w:p>
+    <w:p>
+      <w:r>
+        <w:t xml:space="preserve">Kai looked at the sleeping figures.</w:t>
+      </w:r>
+    </w:p>
+    <w:p>
+      <w:r>
+        <w:t xml:space="preserve">"No one person is enough. "</w:t>
+      </w:r>
+    </w:p>
+    <w:p>
+      <w:r>
+        <w:t xml:space="preserve">The bell hammer moved.</w:t>
+      </w:r>
+    </w:p>
+    <w:p>
+      <w:r>
+        <w:t xml:space="preserve">Three minutes.</w:t>
+      </w:r>
+    </w:p>
+    <w:p>
+      <w:r>
+        <w:t xml:space="preserve">Seo Jun's face hardened.</w:t>
+      </w:r>
+    </w:p>
+    <w:p>
+      <w:r>
+        <w:t xml:space="preserve">"Then they die divided. "</w:t>
+      </w:r>
+    </w:p>
+    <w:p>
+      <w:r>
+        <w:t xml:space="preserve">"No. "</w:t>
+      </w:r>
+    </w:p>
+    <w:p>
+      <w:r>
+        <w:t xml:space="preserve">"They survived because I held them. "</w:t>
+      </w:r>
+    </w:p>
+    <w:p>
+      <w:r>
+        <w:t xml:space="preserve">"And remained trapped because you would not let anyone help release them. "</w:t>
+      </w:r>
+    </w:p>
+    <w:p>
+      <w:r>
+        <w:t xml:space="preserve">Anger entered the room.</w:t>
+      </w:r>
+    </w:p>
+    <w:p>
+      <w:r>
+        <w:t xml:space="preserve">The walls stretched.</w:t>
+      </w:r>
+    </w:p>
+    <w:p>
+      <w:r>
+        <w:t xml:space="preserve">Rain became snow.</w:t>
+      </w:r>
+    </w:p>
+    <w:p>
+      <w:r>
+        <w:t xml:space="preserve">The burning hall appeared beyond the doorway. Young Seo Jun stood inside the older shape, blood soaking his robe.</w:t>
+      </w:r>
+    </w:p>
+    <w:p>
+      <w:r>
+        <w:t xml:space="preserve">"There was no one else. "</w:t>
+      </w:r>
+    </w:p>
+    <w:p>
+      <w:r>
+        <w:t xml:space="preserve">"There is now. "</w:t>
+      </w:r>
+    </w:p>
+    <w:p>
+      <w:r>
+        <w:t xml:space="preserve">The man looked toward the buried western wall.</w:t>
+      </w:r>
+    </w:p>
+    <w:p>
+      <w:r>
+        <w:t xml:space="preserve">Nothing answered.</w:t>
+      </w:r>
+    </w:p>
+    <w:p>
+      <w:r>
+        <w:t xml:space="preserve">Han and Choi had not reached it.</w:t>
+      </w:r>
+    </w:p>
+    <w:p>
+      <w:r>
+        <w:t xml:space="preserve">Two minutes.</w:t>
+      </w:r>
+    </w:p>
+    <w:p>
+      <w:r>
+        <w:t xml:space="preserve">The crowd's voices became one.</w:t>
+      </w:r>
+    </w:p>
+    <w:p>
+      <w:r>
+        <w:t xml:space="preserve">Seo Jun.</w:t>
+      </w:r>
+    </w:p>
+    <w:p>
+      <w:r>
+        <w:t xml:space="preserve">Kai's system blurred.</w:t>
+      </w:r>
+    </w:p>
+    <w:p>
+      <w:r>
+        <w:t xml:space="preserve">His own name flickered.</w:t>
+      </w:r>
+    </w:p>
+    <w:p>
+      <w:r>
+        <w:t xml:space="preserve">Kai Li.</w:t>
+      </w:r>
+    </w:p>
+    <w:p>
+      <w:r>
+        <w:t xml:space="preserve">Seo Jun.</w:t>
+      </w:r>
+    </w:p>
+    <w:p>
+      <w:r>
+        <w:t xml:space="preserve">Returning Custodian.</w:t>
+      </w:r>
+    </w:p>
+    <w:p>
+      <w:r>
+        <w:t xml:space="preserve">Kai Li.</w:t>
+      </w:r>
+    </w:p>
+    <w:p>
+      <w:r>
+        <w:t xml:space="preserve">The bronze bell descended toward its final strike.</w:t>
+      </w:r>
+    </w:p>
+    <w:p>
+      <w:r>
+        <w:t xml:space="preserve">Seo Jun extended his hand.</w:t>
+      </w:r>
+    </w:p>
+    <w:p>
+      <w:r>
+        <w:t xml:space="preserve">"Claim them. "</w:t>
+      </w:r>
+    </w:p>
+    <w:p>
+      <w:r>
+        <w:t xml:space="preserve">Kai heard the temptation beneath the demand.</w:t>
+      </w:r>
+    </w:p>
+    <w:p>
+      <w:r>
+        <w:t xml:space="preserve">End the uncertainty.</w:t>
+      </w:r>
+    </w:p>
+    <w:p>
+      <w:r>
+        <w:t xml:space="preserve">Take responsibility.</w:t>
+      </w:r>
+    </w:p>
+    <w:p>
+      <w:r>
+        <w:t xml:space="preserve">Trust no failure except his own.</w:t>
+      </w:r>
+    </w:p>
+    <w:p>
+      <w:r>
+        <w:t xml:space="preserve">He took Seo Jun's hand.</w:t>
+      </w:r>
+    </w:p>
+    <w:p>
+      <w:r>
+        <w:t xml:space="preserve">The man smiled.</w:t>
+      </w:r>
+    </w:p>
+    <w:p>
+      <w:r>
+        <w:t xml:space="preserve">Kai pulled him away from the bell.</w:t>
+      </w:r>
+    </w:p>
+    <w:p>
+      <w:r>
+        <w:t xml:space="preserve">"I will carry you. "</w:t>
+      </w:r>
+    </w:p>
+    <w:p>
+      <w:r>
+        <w:t xml:space="preserve">Seo Jun's expression vanished.</w:t>
+      </w:r>
+    </w:p>
+    <w:p>
+      <w:r>
+        <w:t xml:space="preserve">Not them.</w:t>
+      </w:r>
+    </w:p>
+    <w:p>
+      <w:r>
+        <w:t xml:space="preserve">You.</w:t>
+      </w:r>
+    </w:p>
+    <w:p>
+      <w:r>
+        <w:t xml:space="preserve">One person.</w:t>
+      </w:r>
+    </w:p>
+    <w:p>
+      <w:r>
+        <w:t xml:space="preserve">One burden freely offered.</w:t>
+      </w:r>
+    </w:p>
+    <w:p>
+      <w:r>
+        <w:t xml:space="preserve">Not the whole town.</w:t>
+      </w:r>
+    </w:p>
+    <w:p>
+      <w:r>
+        <w:t xml:space="preserve">The singular claim fractured.</w:t>
+      </w:r>
+    </w:p>
+    <w:p>
+      <w:r>
+        <w:t xml:space="preserve">The system flashed.</w:t>
+      </w:r>
+    </w:p>
+    <w:p>
+      <w:r>
+        <w:t xml:space="preserve">Exclusive custodianship rejected.</w:t>
+      </w:r>
+    </w:p>
+    <w:p>
+      <w:r>
+        <w:t xml:space="preserve">Individual recognition established: Seo Jun.</w:t>
+      </w:r>
+    </w:p>
+    <w:p>
+      <w:r>
+        <w:t xml:space="preserve">The man staggered.</w:t>
+      </w:r>
+    </w:p>
+    <w:p>
+      <w:r>
+        <w:t xml:space="preserve">For the first time, the formation recognized him as separate from West Haneul.</w:t>
+      </w:r>
+    </w:p>
+    <w:p>
+      <w:r>
+        <w:t xml:space="preserve">The sleeping figures began to wake.</w:t>
+      </w:r>
+    </w:p>
+    <w:p>
+      <w:r>
+        <w:t xml:space="preserve">The bell hammer fell.</w:t>
+      </w:r>
+    </w:p>
+    <w:p>
+      <w:r>
+        <w:t xml:space="preserve">A pounding came from the western wall.</w:t>
+      </w:r>
+    </w:p>
+    <w:p>
+      <w:r>
+        <w:t xml:space="preserve">Once.</w:t>
+      </w:r>
+    </w:p>
+    <w:p>
+      <w:r>
+        <w:t xml:space="preserve">Twice.</w:t>
+      </w:r>
+    </w:p>
+    <w:p>
+      <w:r>
+        <w:t xml:space="preserve">Han's voice roared through stone.</w:t>
+      </w:r>
+    </w:p>
+    <w:p>
+      <w:r>
+        <w:t xml:space="preserve">"The heater only works when insulted! "</w:t>
+      </w:r>
+    </w:p>
+    <w:p>
+      <w:r>
+        <w:t xml:space="preserve">Rian shouted from the entrance.</w:t>
+      </w:r>
+    </w:p>
+    <w:p>
+      <w:r>
+        <w:t xml:space="preserve">"That is the phrase? "</w:t>
+      </w:r>
+    </w:p>
+    <w:p>
+      <w:r>
+        <w:t xml:space="preserve">The western door opened.</w:t>
+      </w:r>
+    </w:p>
+    <w:p>
+      <w:r>
+        <w:t xml:space="preserve">Cold daylight cut through the room.</w:t>
+      </w:r>
+    </w:p>
+    <w:p>
+      <w:r>
+        <w:t xml:space="preserve">Choi stood beyond it with both hands against the stone. Han braced behind her. The slope around them had collapsed, exposing roots and old masonry.</w:t>
+      </w:r>
+    </w:p>
+    <w:p>
+      <w:r>
+        <w:t xml:space="preserve">Choi looked into the crowded room.</w:t>
+      </w:r>
+    </w:p>
+    <w:p>
+      <w:r>
+        <w:t xml:space="preserve">She began calling names.</w:t>
+      </w:r>
+    </w:p>
+    <w:p>
+      <w:r>
+        <w:t xml:space="preserve">Not all three thousand.</w:t>
+      </w:r>
+    </w:p>
+    <w:p>
+      <w:r>
+        <w:t xml:space="preserve">Households.</w:t>
+      </w:r>
+    </w:p>
+    <w:p>
+      <w:r>
+        <w:t xml:space="preserve">Families.</w:t>
+      </w:r>
+    </w:p>
+    <w:p>
+      <w:r>
+        <w:t xml:space="preserve">People she knew.</w:t>
+      </w:r>
+    </w:p>
+    <w:p>
+      <w:r>
+        <w:t xml:space="preserve">"Min Ji-yeon. "</w:t>
+      </w:r>
+    </w:p>
+    <w:p>
+      <w:r>
+        <w:t xml:space="preserve">The woman holding the toddler rose from among the pale figures.</w:t>
+      </w:r>
+    </w:p>
+    <w:p>
+      <w:r>
+        <w:t xml:space="preserve">"Park Dae-sung. "</w:t>
+      </w:r>
+    </w:p>
+    <w:p>
+      <w:r>
+        <w:t xml:space="preserve">The maintenance worker opened his eyes.</w:t>
+      </w:r>
+    </w:p>
+    <w:p>
+      <w:r>
+        <w:t xml:space="preserve">"Yun Hara. "</w:t>
+      </w:r>
+    </w:p>
+    <w:p>
+      <w:r>
+        <w:t xml:space="preserve">The clerk stood.</w:t>
+      </w:r>
+    </w:p>
+    <w:p>
+      <w:r>
+        <w:t xml:space="preserve">Rian read from the ledgers.</w:t>
+      </w:r>
+    </w:p>
+    <w:p>
+      <w:r>
+        <w:t xml:space="preserve">Old names.</w:t>
+      </w:r>
+    </w:p>
+    <w:p>
+      <w:r>
+        <w:t xml:space="preserve">Amended names.</w:t>
+      </w:r>
+    </w:p>
+    <w:p>
+      <w:r>
+        <w:t xml:space="preserve">Names crossed out and restored.</w:t>
+      </w:r>
+    </w:p>
+    <w:p>
+      <w:r>
+        <w:t xml:space="preserve">Dr. Venn fed each variation through the resonance array.</w:t>
+      </w:r>
+    </w:p>
+    <w:p>
+      <w:r>
+        <w:t xml:space="preserve">The pale figures walked toward the western door.</w:t>
+      </w:r>
+    </w:p>
+    <w:p>
+      <w:r>
+        <w:t xml:space="preserve">One at a time.</w:t>
+      </w:r>
+    </w:p>
+    <w:p>
+      <w:r>
+        <w:t xml:space="preserve">The bell struck.</w:t>
+      </w:r>
+    </w:p>
+    <w:p>
+      <w:r>
+        <w:t xml:space="preserve">Its sound filled the room.</w:t>
+      </w:r>
+    </w:p>
+    <w:p>
+      <w:r>
+        <w:t xml:space="preserve">The seventh ring passed through Kai.</w:t>
+      </w:r>
+    </w:p>
+    <w:p>
+      <w:r>
+        <w:t xml:space="preserve">Fire ignited across the walls.</w:t>
+      </w:r>
+    </w:p>
+    <w:p>
+      <w:r>
+        <w:t xml:space="preserve">Not heat.</w:t>
+      </w:r>
+    </w:p>
+    <w:p>
+      <w:r>
+        <w:t xml:space="preserve">Recognition.</w:t>
+      </w:r>
+    </w:p>
+    <w:p>
+      <w:r>
+        <w:t xml:space="preserve">Every identity burned bright enough to remain distinct.</w:t>
+      </w:r>
+    </w:p>
+    <w:p>
+      <w:r>
+        <w:t xml:space="preserve">The formation tried to consolidate them.</w:t>
+      </w:r>
+    </w:p>
+    <w:p>
+      <w:r>
+        <w:t xml:space="preserve">The western door pulled them apart.</w:t>
+      </w:r>
+    </w:p>
+    <w:p>
+      <w:r>
+        <w:t xml:space="preserve">Choi called.</w:t>
+      </w:r>
+    </w:p>
+    <w:p>
+      <w:r>
+        <w:t xml:space="preserve">Rian read.</w:t>
+      </w:r>
+    </w:p>
+    <w:p>
+      <w:r>
+        <w:t xml:space="preserve">Dr. Venn measured.</w:t>
+      </w:r>
+    </w:p>
+    <w:p>
+      <w:r>
+        <w:t xml:space="preserve">Han held the exit open.</w:t>
+      </w:r>
+    </w:p>
+    <w:p>
+      <w:r>
+        <w:t xml:space="preserve">Kai held Seo Jun's hand.</w:t>
+      </w:r>
+    </w:p>
+    <w:p>
+      <w:r>
+        <w:t xml:space="preserve">The custodian screamed.</w:t>
+      </w:r>
+    </w:p>
+    <w:p>
+      <w:r>
+        <w:t xml:space="preserve">Thousands of voices tore out of him. Men, women, children, the living, the dead, everyone he had carried through the first disaster and every generation later drawn into the failing pattern.</w:t>
+      </w:r>
+    </w:p>
+    <w:p>
+      <w:r>
+        <w:t xml:space="preserve">Kai did not release him.</w:t>
+      </w:r>
+    </w:p>
+    <w:p>
+      <w:r>
+        <w:t xml:space="preserve">Seo Jun collapsed.</w:t>
+      </w:r>
+    </w:p>
+    <w:p>
+      <w:r>
+        <w:t xml:space="preserve">The black umbrella opened on the floor by itself.</w:t>
+      </w:r>
+    </w:p>
+    <w:p>
+      <w:r>
+        <w:t xml:space="preserve">Names rained from its inner surface.</w:t>
+      </w:r>
+    </w:p>
+    <w:p>
+      <w:r>
+        <w:t xml:space="preserve">The sleeping figures streamed west.</w:t>
+      </w:r>
+    </w:p>
+    <w:p>
+      <w:r>
+        <w:t xml:space="preserve">Outside, bodies across the town fell.</w:t>
+      </w:r>
+    </w:p>
+    <w:p>
+      <w:r>
+        <w:t xml:space="preserve">Then breathed.</w:t>
+      </w:r>
+    </w:p>
+    <w:p>
+      <w:r>
+        <w:t xml:space="preserve">The bronze bell cracked.</w:t>
+      </w:r>
+    </w:p>
+    <w:p>
+      <w:r>
+        <w:t xml:space="preserve">The system changed.</w:t>
+      </w:r>
+    </w:p>
+    <w:p>
+      <w:r>
+        <w:t xml:space="preserve">Recognition sequence interrupted.</w:t>
+      </w:r>
+    </w:p>
+    <w:p>
+      <w:r>
+        <w:t xml:space="preserve">Resident identity variance restored: 72 percent.</w:t>
+      </w:r>
+    </w:p>
+    <w:p>
+      <w:r>
+        <w:t xml:space="preserve">Custodian release incomplete.</w:t>
+      </w:r>
+    </w:p>
+    <w:p>
+      <w:r>
+        <w:t xml:space="preserve">Kai looked down.</w:t>
+      </w:r>
+    </w:p>
+    <w:p>
+      <w:r>
+        <w:t xml:space="preserve">Seo Jun's body had become translucent.</w:t>
+      </w:r>
+    </w:p>
+    <w:p>
+      <w:r>
+        <w:t xml:space="preserve">Beneath his skin, dozens of names still moved.</w:t>
+      </w:r>
+    </w:p>
+    <w:p>
+      <w:r>
+        <w:t xml:space="preserve">"Who remains? " Kai asked.</w:t>
+      </w:r>
+    </w:p>
+    <w:p>
+      <w:r>
+        <w:t xml:space="preserve">The man opened his eyes.</w:t>
+      </w:r>
+    </w:p>
+    <w:p>
+      <w:r>
+        <w:t xml:space="preserve">"The ones who never came out. "</w:t>
+      </w:r>
+    </w:p>
+    <w:p>
+      <w:r>
+        <w:t xml:space="preserve">The first landslide victims.</w:t>
+      </w:r>
+    </w:p>
+    <w:p>
+      <w:r>
+        <w:t xml:space="preserve">Those preserved but never restored.</w:t>
+      </w:r>
+    </w:p>
+    <w:p>
+      <w:r>
+        <w:t xml:space="preserve">Seo Jun gripped Kai's wrist.</w:t>
+      </w:r>
+    </w:p>
+    <w:p>
+      <w:r>
+        <w:t xml:space="preserve">The floor beneath the bell opened.</w:t>
+      </w:r>
+    </w:p>
+    <w:p>
+      <w:r>
+        <w:t xml:space="preserve">Stone steps descended into darkness.</w:t>
+      </w:r>
+    </w:p>
+    <w:p>
+      <w:r>
+        <w:t xml:space="preserve">Far below, another bell answered.</w:t>
+      </w:r>
+    </w:p>
+    <w:p>
+      <w:r>
+        <w:t xml:space="preserve">Not from West Haneul.</w:t>
+      </w:r>
+    </w:p>
+    <w:p>
+      <w:r>
+        <w:t xml:space="preserve">From somewhere deeper.</w:t>
+      </w:r>
+    </w:p>
+    <w:p>
+      <w:r>
+        <w:t xml:space="preserve">Older.</w:t>
+      </w:r>
+    </w:p>
+    <w:p>
+      <w:r>
+        <w:t xml:space="preserve">The system filled Kai's vision.</w:t>
+      </w:r>
+    </w:p>
+    <w:p>
+      <w:r>
+        <w:t xml:space="preserve">Hidden formation detected beneath returning room.</w:t>
+      </w:r>
+    </w:p>
+    <w:p>
+      <w:r>
+        <w:t xml:space="preserve">Classification: Recognition Network Node.</w:t>
+      </w:r>
+    </w:p>
+    <w:p>
+      <w:r>
+        <w:t xml:space="preserve">Connected sites: 12.</w:t>
+      </w:r>
+    </w:p>
+    <w:p>
+      <w:r>
+        <w:t xml:space="preserve">Active sites: 3.</w:t>
+      </w:r>
+    </w:p>
+    <w:p>
+      <w:r>
+        <w:t xml:space="preserve">New ignition sequence detected.</w:t>
+      </w:r>
+    </w:p>
+    <w:p>
+      <w:r>
+        <w:t xml:space="preserve">Seo Jun stared into the opening.</w:t>
+      </w:r>
+    </w:p>
+    <w:p>
+      <w:r>
+        <w:t xml:space="preserve">Fear replaced exhaustion.</w:t>
+      </w:r>
+    </w:p>
+    <w:p>
+      <w:r>
+        <w:t xml:space="preserve">"I did not build that. "</w:t>
+      </w:r>
+    </w:p>
+    <w:p>
+      <w:r>
+        <w:t xml:space="preserve">A warm wind rose from below, carrying ash and the scent of burning wood.</w:t>
+      </w:r>
+    </w:p>
+    <w:p>
+      <w:r>
+        <w:t xml:space="preserve">Across the dark stair, lamps ignited one by one.</w:t>
+      </w:r>
+    </w:p>
+    <w:p>
+      <w:r>
+        <w:t xml:space="preserve">At the bottom stood a woman in a white robe.</w:t>
+      </w:r>
+    </w:p>
+    <w:p>
+      <w:r>
+        <w:t xml:space="preserve">Her face was covered by a blank wooden tablet.</w:t>
+      </w:r>
+    </w:p>
+    <w:p>
+      <w:r>
+        <w:t xml:space="preserve">She lifted a bronze hammer.</w:t>
+      </w:r>
+    </w:p>
+    <w:p>
+      <w:r>
+        <w:t xml:space="preserve">Behind her hung twelve bells.</w:t>
+      </w:r>
+    </w:p>
+    <w:p>
+      <w:r>
+        <w:t xml:space="preserve">Three were already ringing.</w:t>
       </w:r>
     </w:p>
     <w:sectPr>

</xml_diff>

<commit_message>
Add Heavenly Ascension System Chapter 63: The Bells Below the Names
</commit_message>
<xml_diff>
--- a/Heavenly Ascension System.docx
+++ b/Heavenly Ascension System.docx
@@ -49922,6 +49922,2839 @@
     <w:p>
       <w:r>
         <w:t xml:space="preserve">Three were already ringing.</w:t>
+      </w:r>
+    </w:p>
+    <w:p>
+      <w:pPr>
+        <w:pStyle w:val="Heading1"/>
+      </w:pPr>
+      <w:r>
+        <w:t xml:space="preserve">Chapter 63: The Bells Below the Names</w:t>
+      </w:r>
+    </w:p>
+    <w:p>
+      <w:r>
+        <w:t xml:space="preserve">Three were already ringing.</w:t>
+      </w:r>
+    </w:p>
+    <w:p>
+      <w:r>
+        <w:t xml:space="preserve">The sound did not rise through the stair in waves. It arrived as separate certainties.</w:t>
+      </w:r>
+    </w:p>
+    <w:p>
+      <w:r>
+        <w:t xml:space="preserve">One bell told Kai that West Haneul had survived.</w:t>
+      </w:r>
+    </w:p>
+    <w:p>
+      <w:r>
+        <w:t xml:space="preserve">The second told him that survival had never been free.</w:t>
+      </w:r>
+    </w:p>
+    <w:p>
+      <w:r>
+        <w:t xml:space="preserve">The third told him someone had been counting the cost.</w:t>
+      </w:r>
+    </w:p>
+    <w:p>
+      <w:r>
+        <w:t xml:space="preserve">The woman at the bottom of the stairs lifted the bronze hammer again.</w:t>
+      </w:r>
+    </w:p>
+    <w:p>
+      <w:r>
+        <w:t xml:space="preserve">Her white robe hung without motion despite the warm wind flowing upward. The blank wooden tablet covering her face was tied behind her head with red cord. No name had been written upon it, but faint scratches crossed the grain where characters had been carved away.</w:t>
+      </w:r>
+    </w:p>
+    <w:p>
+      <w:r>
+        <w:t xml:space="preserve">Behind her, twelve bells hung in a crescent.</w:t>
+      </w:r>
+    </w:p>
+    <w:p>
+      <w:r>
+        <w:t xml:space="preserve">They differed in size, age, and metal. One was narrow and green with corrosion. Another had been repaired with black iron bands. The largest bore a line of names around its rim, each character cut through by a second hand.</w:t>
+      </w:r>
+    </w:p>
+    <w:p>
+      <w:r>
+        <w:t xml:space="preserve">The first three bells swung.</w:t>
+      </w:r>
+    </w:p>
+    <w:p>
+      <w:r>
+        <w:t xml:space="preserve">The other nine remained still.</w:t>
+      </w:r>
+    </w:p>
+    <w:p>
+      <w:r>
+        <w:t xml:space="preserve">Kai felt their silence more strongly than the ringing.</w:t>
+      </w:r>
+    </w:p>
+    <w:p>
+      <w:r>
+        <w:t xml:space="preserve">The system filled his vision.</w:t>
+      </w:r>
+    </w:p>
+    <w:p>
+      <w:r>
+        <w:t xml:space="preserve">Recognition Network Node detected.</w:t>
+      </w:r>
+    </w:p>
+    <w:p>
+      <w:r>
+        <w:t xml:space="preserve">Active bells: 3 of 12.</w:t>
+      </w:r>
+    </w:p>
+    <w:p>
+      <w:r>
+        <w:t xml:space="preserve">Synchronized ignition progress: 28 percent.</w:t>
+      </w:r>
+    </w:p>
+    <w:p>
+      <w:r>
+        <w:t xml:space="preserve">Primary function: Distributed identity consolidation.</w:t>
+      </w:r>
+    </w:p>
+    <w:p>
+      <w:r>
+        <w:t xml:space="preserve">Secondary function: Unknown.</w:t>
+      </w:r>
+    </w:p>
+    <w:p>
+      <w:r>
+        <w:t xml:space="preserve">Warning: Local custodian release remains incomplete.</w:t>
+      </w:r>
+    </w:p>
+    <w:p>
+      <w:r>
+        <w:t xml:space="preserve">Seo Jun's grip tightened around Kai's wrist.</w:t>
+      </w:r>
+    </w:p>
+    <w:p>
+      <w:r>
+        <w:t xml:space="preserve">The man's body had faded until the stair behind him showed through his coat. Names continued moving beneath his translucent skin, gathering at his throat whenever he tried to speak.</w:t>
+      </w:r>
+    </w:p>
+    <w:p>
+      <w:r>
+        <w:t xml:space="preserve">"That room was not here," he said.</w:t>
+      </w:r>
+    </w:p>
+    <w:p>
+      <w:r>
+        <w:t xml:space="preserve">Kai looked down at the woman.</w:t>
+      </w:r>
+    </w:p>
+    <w:p>
+      <w:r>
+        <w:t xml:space="preserve">"Not when you built the returning chamber? "</w:t>
+      </w:r>
+    </w:p>
+    <w:p>
+      <w:r>
+        <w:t xml:space="preserve">"I did not build the chamber. "</w:t>
+      </w:r>
+    </w:p>
+    <w:p>
+      <w:r>
+        <w:t xml:space="preserve">The answer was almost lost beneath the bells.</w:t>
+      </w:r>
+    </w:p>
+    <w:p>
+      <w:r>
+        <w:t xml:space="preserve">Seo Jun forced himself upright.</w:t>
+      </w:r>
+    </w:p>
+    <w:p>
+      <w:r>
+        <w:t xml:space="preserve">"I was shown where to place the names. I was given the tablet. The bell. The pattern beneath the courtyard. "</w:t>
+      </w:r>
+    </w:p>
+    <w:p>
+      <w:r>
+        <w:t xml:space="preserve">"By whom? "</w:t>
+      </w:r>
+    </w:p>
+    <w:p>
+      <w:r>
+        <w:t xml:space="preserve">Seo Jun stared at the blank tablet covering the woman's face.</w:t>
+      </w:r>
+    </w:p>
+    <w:p>
+      <w:r>
+        <w:t xml:space="preserve">"Someone wearing that. "</w:t>
+      </w:r>
+    </w:p>
+    <w:p>
+      <w:r>
+        <w:t xml:space="preserve">Dr. Venn approached the opening with the portable resonance array held against her chest. The brass rings rotated in uneven bursts. Each time one of the bells sounded, the rings stopped, reversed, and resumed at a different speed.</w:t>
+      </w:r>
+    </w:p>
+    <w:p>
+      <w:r>
+        <w:t xml:space="preserve">"This structure predates the returning room," she said. "The resonance is coming through the bedrock, not from anything constructed beneath the memorial. "</w:t>
+      </w:r>
+    </w:p>
+    <w:p>
+      <w:r>
+        <w:t xml:space="preserve">Rian leaned over her shoulder.</w:t>
+      </w:r>
+    </w:p>
+    <w:p>
+      <w:r>
+        <w:t xml:space="preserve">"How far down? "</w:t>
+      </w:r>
+    </w:p>
+    <w:p>
+      <w:r>
+        <w:t xml:space="preserve">"The device cannot decide. "</w:t>
+      </w:r>
+    </w:p>
+    <w:p>
+      <w:r>
+        <w:t xml:space="preserve">"That sounds like a flaw. "</w:t>
+      </w:r>
+    </w:p>
+    <w:p>
+      <w:r>
+        <w:t xml:space="preserve">"It measures distance by propagation delay. The bells are arriving before their own vibrations. "</w:t>
+      </w:r>
+    </w:p>
+    <w:p>
+      <w:r>
+        <w:t xml:space="preserve">Rian looked into the stair.</w:t>
+      </w:r>
+    </w:p>
+    <w:p>
+      <w:r>
+        <w:t xml:space="preserve">"So the basement is in the past. "</w:t>
+      </w:r>
+    </w:p>
+    <w:p>
+      <w:r>
+        <w:t xml:space="preserve">"Please do not simplify it that way. "</w:t>
+      </w:r>
+    </w:p>
+    <w:p>
+      <w:r>
+        <w:t xml:space="preserve">"I was trying to make it worse. "</w:t>
+      </w:r>
+    </w:p>
+    <w:p>
+      <w:r>
+        <w:t xml:space="preserve">Behind them, pale figures continued passing through the returning room.</w:t>
+      </w:r>
+    </w:p>
+    <w:p>
+      <w:r>
+        <w:t xml:space="preserve">Choi called names from the western exit. Rian's open ledgers lay across the floor near the eastern door, their pages turning without wind. Dr. Venn's array carried every amended identity through the formation.</w:t>
+      </w:r>
+    </w:p>
+    <w:p>
+      <w:r>
+        <w:t xml:space="preserve">Outside, residents woke one by one beneath the winter-gray sky.</w:t>
+      </w:r>
+    </w:p>
+    <w:p>
+      <w:r>
+        <w:t xml:space="preserve">Inside, the first disaster still had not finished releasing its dead.</w:t>
+      </w:r>
+    </w:p>
+    <w:p>
+      <w:r>
+        <w:t xml:space="preserve">Han climbed through the western doorway.</w:t>
+      </w:r>
+    </w:p>
+    <w:p>
+      <w:r>
+        <w:t xml:space="preserve">Mud covered his coat. Blood ran from a shallow cut near his temple. He looked at the stair, the woman, and the twelve bells.</w:t>
+      </w:r>
+    </w:p>
+    <w:p>
+      <w:r>
+        <w:t xml:space="preserve">"No. "</w:t>
+      </w:r>
+    </w:p>
+    <w:p>
+      <w:r>
+        <w:t xml:space="preserve">Rian pointed toward him. "That was exactly your response to the previous bad instruction. "</w:t>
+      </w:r>
+    </w:p>
+    <w:p>
+      <w:r>
+        <w:t xml:space="preserve">"It remains applicable. "</w:t>
+      </w:r>
+    </w:p>
+    <w:p>
+      <w:r>
+        <w:t xml:space="preserve">The woman raised the hammer.</w:t>
+      </w:r>
+    </w:p>
+    <w:p>
+      <w:r>
+        <w:t xml:space="preserve">Kai felt the fourth bell waiting inside the bronze.</w:t>
+      </w:r>
+    </w:p>
+    <w:p>
+      <w:r>
+        <w:t xml:space="preserve">He stepped onto the first stair.</w:t>
+      </w:r>
+    </w:p>
+    <w:p>
+      <w:r>
+        <w:t xml:space="preserve">Han caught the back of his coat.</w:t>
+      </w:r>
+    </w:p>
+    <w:p>
+      <w:r>
+        <w:t xml:space="preserve">"No. "</w:t>
+      </w:r>
+    </w:p>
+    <w:p>
+      <w:r>
+        <w:t xml:space="preserve">"If she rings another one, the ignition progresses. "</w:t>
+      </w:r>
+    </w:p>
+    <w:p>
+      <w:r>
+        <w:t xml:space="preserve">"And walking toward her will improve that? "</w:t>
+      </w:r>
+    </w:p>
+    <w:p>
+      <w:r>
+        <w:t xml:space="preserve">"I need to interrupt the pattern. "</w:t>
+      </w:r>
+    </w:p>
+    <w:p>
+      <w:r>
+        <w:t xml:space="preserve">"With what? "</w:t>
+      </w:r>
+    </w:p>
+    <w:p>
+      <w:r>
+        <w:t xml:space="preserve">Kai looked at the black umbrella lying open near the cracked bell.</w:t>
+      </w:r>
+    </w:p>
+    <w:p>
+      <w:r>
+        <w:t xml:space="preserve">Names still rained from its inner surface, but fewer now. Each fell as a point of pale light and moved toward the western exit.</w:t>
+      </w:r>
+    </w:p>
+    <w:p>
+      <w:r>
+        <w:t xml:space="preserve">"The custodian's implement. "</w:t>
+      </w:r>
+    </w:p>
+    <w:p>
+      <w:r>
+        <w:t xml:space="preserve">Seo Jun shook his head.</w:t>
+      </w:r>
+    </w:p>
+    <w:p>
+      <w:r>
+        <w:t xml:space="preserve">"It belongs to the returning room. "</w:t>
+      </w:r>
+    </w:p>
+    <w:p>
+      <w:r>
+        <w:t xml:space="preserve">"The room is part of the network. "</w:t>
+      </w:r>
+    </w:p>
+    <w:p>
+      <w:r>
+        <w:t xml:space="preserve">"It is part of me. "</w:t>
+      </w:r>
+    </w:p>
+    <w:p>
+      <w:r>
+        <w:t xml:space="preserve">The words landed harder than he intended.</w:t>
+      </w:r>
+    </w:p>
+    <w:p>
+      <w:r>
+        <w:t xml:space="preserve">Seo Jun looked away.</w:t>
+      </w:r>
+    </w:p>
+    <w:p>
+      <w:r>
+        <w:t xml:space="preserve">Kai understood the fear beneath them. The umbrella was not merely an object he had carried. It was proof that he had existed as someone separate from the thousands of names trapped inside him. Surrendering it might help the town.</w:t>
+      </w:r>
+    </w:p>
+    <w:p>
+      <w:r>
+        <w:t xml:space="preserve">It might also remove the last boundary around Seo Jun himself.</w:t>
+      </w:r>
+    </w:p>
+    <w:p>
+      <w:r>
+        <w:t xml:space="preserve">Kai stepped back from the stair.</w:t>
+      </w:r>
+    </w:p>
+    <w:p>
+      <w:r>
+        <w:t xml:space="preserve">He picked up the umbrella.</w:t>
+      </w:r>
+    </w:p>
+    <w:p>
+      <w:r>
+        <w:t xml:space="preserve">The handle was colder than before.</w:t>
+      </w:r>
+    </w:p>
+    <w:p>
+      <w:r>
+        <w:t xml:space="preserve">Custodial implement detected.</w:t>
+      </w:r>
+    </w:p>
+    <w:p>
+      <w:r>
+        <w:t xml:space="preserve">Current holder: Kai Li.</w:t>
+      </w:r>
+    </w:p>
+    <w:p>
+      <w:r>
+        <w:t xml:space="preserve">Original imprint: Seo Jun.</w:t>
+      </w:r>
+    </w:p>
+    <w:p>
+      <w:r>
+        <w:t xml:space="preserve">Network authority: Partial.</w:t>
+      </w:r>
+    </w:p>
+    <w:p>
+      <w:r>
+        <w:t xml:space="preserve">Warning: Authority increases with accepted burden.</w:t>
+      </w:r>
+    </w:p>
+    <w:p>
+      <w:r>
+        <w:t xml:space="preserve">Han read Kai's face.</w:t>
+      </w:r>
+    </w:p>
+    <w:p>
+      <w:r>
+        <w:t xml:space="preserve">"What did it say? "</w:t>
+      </w:r>
+    </w:p>
+    <w:p>
+      <w:r>
+        <w:t xml:space="preserve">"That the umbrella can affect the network. "</w:t>
+      </w:r>
+    </w:p>
+    <w:p>
+      <w:r>
+        <w:t xml:space="preserve">"What did it not say? "</w:t>
+      </w:r>
+    </w:p>
+    <w:p>
+      <w:r>
+        <w:t xml:space="preserve">Kai did not answer.</w:t>
+      </w:r>
+    </w:p>
+    <w:p>
+      <w:r>
+        <w:t xml:space="preserve">Han's eyes narrowed.</w:t>
+      </w:r>
+    </w:p>
+    <w:p>
+      <w:r>
+        <w:t xml:space="preserve">Rian looked between them. "His silence has become extremely informative. "</w:t>
+      </w:r>
+    </w:p>
+    <w:p>
+      <w:r>
+        <w:t xml:space="preserve">The fourth bell began to move.</w:t>
+      </w:r>
+    </w:p>
+    <w:p>
+      <w:r>
+        <w:t xml:space="preserve">Kai opened the umbrella.</w:t>
+      </w:r>
+    </w:p>
+    <w:p>
+      <w:r>
+        <w:t xml:space="preserve">The black fabric spread inside the returning room. Names stopped falling. Instead, they clung to the underside like stars.</w:t>
+      </w:r>
+    </w:p>
+    <w:p>
+      <w:r>
+        <w:t xml:space="preserve">Seo Jun gasped.</w:t>
+      </w:r>
+    </w:p>
+    <w:p>
+      <w:r>
+        <w:t xml:space="preserve">Every remaining identity inside him froze.</w:t>
+      </w:r>
+    </w:p>
+    <w:p>
+      <w:r>
+        <w:t xml:space="preserve">Kai turned the umbrella toward the stair.</w:t>
+      </w:r>
+    </w:p>
+    <w:p>
+      <w:r>
+        <w:t xml:space="preserve">The warm wind struck it.</w:t>
+      </w:r>
+    </w:p>
+    <w:p>
+      <w:r>
+        <w:t xml:space="preserve">The fabric bowed, but did not collapse.</w:t>
+      </w:r>
+    </w:p>
+    <w:p>
+      <w:r>
+        <w:t xml:space="preserve">The fourth bell stopped.</w:t>
+      </w:r>
+    </w:p>
+    <w:p>
+      <w:r>
+        <w:t xml:space="preserve">The woman's hammer hovered a finger's width from bronze.</w:t>
+      </w:r>
+    </w:p>
+    <w:p>
+      <w:r>
+        <w:t xml:space="preserve">The first three bells continued ringing.</w:t>
+      </w:r>
+    </w:p>
+    <w:p>
+      <w:r>
+        <w:t xml:space="preserve">The system updated.</w:t>
+      </w:r>
+    </w:p>
+    <w:p>
+      <w:r>
+        <w:t xml:space="preserve">Custodial conflict initiated.</w:t>
+      </w:r>
+    </w:p>
+    <w:p>
+      <w:r>
+        <w:t xml:space="preserve">Local authority challenging network sequence.</w:t>
+      </w:r>
+    </w:p>
+    <w:p>
+      <w:r>
+        <w:t xml:space="preserve">Synchronization paused.</w:t>
+      </w:r>
+    </w:p>
+    <w:p>
+      <w:r>
+        <w:t xml:space="preserve">Rian exhaled. "That seems encouraging. "</w:t>
+      </w:r>
+    </w:p>
+    <w:p>
+      <w:r>
+        <w:t xml:space="preserve">The woman lowered the hammer.</w:t>
+      </w:r>
+    </w:p>
+    <w:p>
+      <w:r>
+        <w:t xml:space="preserve">Her head turned toward Kai.</w:t>
+      </w:r>
+    </w:p>
+    <w:p>
+      <w:r>
+        <w:t xml:space="preserve">The blank tablet held no eyes.</w:t>
+      </w:r>
+    </w:p>
+    <w:p>
+      <w:r>
+        <w:t xml:space="preserve">Kai felt seen anyway.</w:t>
+      </w:r>
+    </w:p>
+    <w:p>
+      <w:r>
+        <w:t xml:space="preserve">A voice entered the room.</w:t>
+      </w:r>
+    </w:p>
+    <w:p>
+      <w:r>
+        <w:t xml:space="preserve">Not through sound.</w:t>
+      </w:r>
+    </w:p>
+    <w:p>
+      <w:r>
+        <w:t xml:space="preserve">Through every written name.</w:t>
+      </w:r>
+    </w:p>
+    <w:p>
+      <w:r>
+        <w:t xml:space="preserve">RETURN THE CUSTODIAN.</w:t>
+      </w:r>
+    </w:p>
+    <w:p>
+      <w:r>
+        <w:t xml:space="preserve">Seo Jun staggered.</w:t>
+      </w:r>
+    </w:p>
+    <w:p>
+      <w:r>
+        <w:t xml:space="preserve">The old names inside him surged toward the stair. His body stretched, not in flesh, but in meaning. The formation began treating him less as a man and more as a route.</w:t>
+      </w:r>
+    </w:p>
+    <w:p>
+      <w:r>
+        <w:t xml:space="preserve">Kai angled the umbrella over him.</w:t>
+      </w:r>
+    </w:p>
+    <w:p>
+      <w:r>
+        <w:t xml:space="preserve">The pulling stopped.</w:t>
+      </w:r>
+    </w:p>
+    <w:p>
+      <w:r>
+        <w:t xml:space="preserve">The woman raised one hand.</w:t>
+      </w:r>
+    </w:p>
+    <w:p>
+      <w:r>
+        <w:t xml:space="preserve">The blank tablet cracked.</w:t>
+      </w:r>
+    </w:p>
+    <w:p>
+      <w:r>
+        <w:t xml:space="preserve">A vertical line opened down its center.</w:t>
+      </w:r>
+    </w:p>
+    <w:p>
+      <w:r>
+        <w:t xml:space="preserve">Behind it was not a face.</w:t>
+      </w:r>
+    </w:p>
+    <w:p>
+      <w:r>
+        <w:t xml:space="preserve">A corridor.</w:t>
+      </w:r>
+    </w:p>
+    <w:p>
+      <w:r>
+        <w:t xml:space="preserve">White tablets lined both walls. Thousands. Some bore names. Some bore dates. Some were blank. At the far end stood another woman in another white robe, her own face covered by another tablet.</w:t>
+      </w:r>
+    </w:p>
+    <w:p>
+      <w:r>
+        <w:t xml:space="preserve">And behind her, another.</w:t>
+      </w:r>
+    </w:p>
+    <w:p>
+      <w:r>
+        <w:t xml:space="preserve">The corridor repeated beyond sight.</w:t>
+      </w:r>
+    </w:p>
+    <w:p>
+      <w:r>
+        <w:t xml:space="preserve">Dr. Venn's array emitted a sharp tone.</w:t>
+      </w:r>
+    </w:p>
+    <w:p>
+      <w:r>
+        <w:t xml:space="preserve">"It is not one person. "</w:t>
+      </w:r>
+    </w:p>
+    <w:p>
+      <w:r>
+        <w:t xml:space="preserve">Rian took one step back. "That was not my preferred interpretation. "</w:t>
+      </w:r>
+    </w:p>
+    <w:p>
+      <w:r>
+        <w:t xml:space="preserve">"The tablet is an office," Dr. Venn said. "A transferable role. "</w:t>
+      </w:r>
+    </w:p>
+    <w:p>
+      <w:r>
+        <w:t xml:space="preserve">The voice came again.</w:t>
+      </w:r>
+    </w:p>
+    <w:p>
+      <w:r>
+        <w:t xml:space="preserve">RETURN THE CUSTODIAN.</w:t>
+      </w:r>
+    </w:p>
+    <w:p>
+      <w:r>
+        <w:t xml:space="preserve">Kai looked at Seo Jun.</w:t>
+      </w:r>
+    </w:p>
+    <w:p>
+      <w:r>
+        <w:t xml:space="preserve">"Were you appointed? "</w:t>
+      </w:r>
+    </w:p>
+    <w:p>
+      <w:r>
+        <w:t xml:space="preserve">The man's translucent features tightened.</w:t>
+      </w:r>
+    </w:p>
+    <w:p>
+      <w:r>
+        <w:t xml:space="preserve">"I was appointed keeper of the western boundary stone. "</w:t>
+      </w:r>
+    </w:p>
+    <w:p>
+      <w:r>
+        <w:t xml:space="preserve">"By the person wearing that tablet? "</w:t>
+      </w:r>
+    </w:p>
+    <w:p>
+      <w:r>
+        <w:t xml:space="preserve">Seo Jun closed his eyes.</w:t>
+      </w:r>
+    </w:p>
+    <w:p>
+      <w:r>
+        <w:t xml:space="preserve">Snow and ash moved behind them.</w:t>
+      </w:r>
+    </w:p>
+    <w:p>
+      <w:r>
+        <w:t xml:space="preserve">"I remember a woman at the courtyard. She gave me the wooden tablet with the townspeople's names. She said the boundary would not hold unless someone carried the record across. "</w:t>
+      </w:r>
+    </w:p>
+    <w:p>
+      <w:r>
+        <w:t xml:space="preserve">"What did she call herself? "</w:t>
+      </w:r>
+    </w:p>
+    <w:p>
+      <w:r>
+        <w:t xml:space="preserve">"She did not. "</w:t>
+      </w:r>
+    </w:p>
+    <w:p>
+      <w:r>
+        <w:t xml:space="preserve">"What did you call her? "</w:t>
+      </w:r>
+    </w:p>
+    <w:p>
+      <w:r>
+        <w:t xml:space="preserve">Seo Jun opened his eyes.</w:t>
+      </w:r>
+    </w:p>
+    <w:p>
+      <w:r>
+        <w:t xml:space="preserve">"Registrar. "</w:t>
+      </w:r>
+    </w:p>
+    <w:p>
+      <w:r>
+        <w:t xml:space="preserve">The system reacted.</w:t>
+      </w:r>
+    </w:p>
+    <w:p>
+      <w:r>
+        <w:t xml:space="preserve">Role designation recognized: Registrar.</w:t>
+      </w:r>
+    </w:p>
+    <w:p>
+      <w:r>
+        <w:t xml:space="preserve">Network structure partially identified.</w:t>
+      </w:r>
+    </w:p>
+    <w:p>
+      <w:r>
+        <w:t xml:space="preserve">Custodians preserve local identity patterns.</w:t>
+      </w:r>
+    </w:p>
+    <w:p>
+      <w:r>
+        <w:t xml:space="preserve">Registrars coordinate transfer between network nodes.</w:t>
+      </w:r>
+    </w:p>
+    <w:p>
+      <w:r>
+        <w:t xml:space="preserve">Unresolved question: What requires transfer?</w:t>
+      </w:r>
+    </w:p>
+    <w:p>
+      <w:r>
+        <w:t xml:space="preserve">The bells answered.</w:t>
+      </w:r>
+    </w:p>
+    <w:p>
+      <w:r>
+        <w:t xml:space="preserve">The first bell's tone entered the black umbrella.</w:t>
+      </w:r>
+    </w:p>
+    <w:p>
+      <w:r>
+        <w:t xml:space="preserve">For one heartbeat, Kai saw another place.</w:t>
+      </w:r>
+    </w:p>
+    <w:p>
+      <w:r>
+        <w:t xml:space="preserve">A coastal city drowned beneath unmoving water. People stood on rooftops while a woman carried a red parasol through the flooded streets. Beneath the city, a bell rang inside a submerged temple.</w:t>
+      </w:r>
+    </w:p>
+    <w:p>
+      <w:r>
+        <w:t xml:space="preserve">The second bell sounded.</w:t>
+      </w:r>
+    </w:p>
+    <w:p>
+      <w:r>
+        <w:t xml:space="preserve">A mountain settlement burned beneath blue fire. A boy held a chain covered in name tags. Behind him, a stone gate opened into a field of snow.</w:t>
+      </w:r>
+    </w:p>
+    <w:p>
+      <w:r>
+        <w:t xml:space="preserve">The third bell sounded.</w:t>
+      </w:r>
+    </w:p>
+    <w:p>
+      <w:r>
+        <w:t xml:space="preserve">An underground station lay abandoned beneath flickering lights. Hundreds of commuters stood motionless along the platforms. A man in a conductor's uniform walked among them, asking each person where they intended to go.</w:t>
+      </w:r>
+    </w:p>
+    <w:p>
+      <w:r>
+        <w:t xml:space="preserve">Three active sites.</w:t>
+      </w:r>
+    </w:p>
+    <w:p>
+      <w:r>
+        <w:t xml:space="preserve">Three custodians.</w:t>
+      </w:r>
+    </w:p>
+    <w:p>
+      <w:r>
+        <w:t xml:space="preserve">Three local disasters.</w:t>
+      </w:r>
+    </w:p>
+    <w:p>
+      <w:r>
+        <w:t xml:space="preserve">The network was not consolidating identities from one town.</w:t>
+      </w:r>
+    </w:p>
+    <w:p>
+      <w:r>
+        <w:t xml:space="preserve">It was gathering them from all three.</w:t>
+      </w:r>
+    </w:p>
+    <w:p>
+      <w:r>
+        <w:t xml:space="preserve">Kai nearly closed the umbrella.</w:t>
+      </w:r>
+    </w:p>
+    <w:p>
+      <w:r>
+        <w:t xml:space="preserve">The visions vanished.</w:t>
+      </w:r>
+    </w:p>
+    <w:p>
+      <w:r>
+        <w:t xml:space="preserve">The woman in white lifted the hammer toward the fourth bell.</w:t>
+      </w:r>
+    </w:p>
+    <w:p>
+      <w:r>
+        <w:t xml:space="preserve">This one was small.</w:t>
+      </w:r>
+    </w:p>
+    <w:p>
+      <w:r>
+        <w:t xml:space="preserve">Silver.</w:t>
+      </w:r>
+    </w:p>
+    <w:p>
+      <w:r>
+        <w:t xml:space="preserve">Unlike the others, its surface reflected the returning room.</w:t>
+      </w:r>
+    </w:p>
+    <w:p>
+      <w:r>
+        <w:t xml:space="preserve">Kai saw himself in it.</w:t>
+      </w:r>
+    </w:p>
+    <w:p>
+      <w:r>
+        <w:t xml:space="preserve">Not holding the umbrella.</w:t>
+      </w:r>
+    </w:p>
+    <w:p>
+      <w:r>
+        <w:t xml:space="preserve">Wearing the blank tablet.</w:t>
+      </w:r>
+    </w:p>
+    <w:p>
+      <w:r>
+        <w:t xml:space="preserve">He opened a query.</w:t>
+      </w:r>
+    </w:p>
+    <w:p>
+      <w:r>
+        <w:t xml:space="preserve">Identify fourth bell target.</w:t>
+      </w:r>
+    </w:p>
+    <w:p>
+      <w:r>
+        <w:t xml:space="preserve">Cost: 11 Meridian Units.</w:t>
+      </w:r>
+    </w:p>
+    <w:p>
+      <w:r>
+        <w:t xml:space="preserve">He accepted.</w:t>
+      </w:r>
+    </w:p>
+    <w:p>
+      <w:r>
+        <w:t xml:space="preserve">Cold pressure moved through his meridians.</w:t>
+      </w:r>
+    </w:p>
+    <w:p>
+      <w:r>
+        <w:t xml:space="preserve">The answer formed slowly.</w:t>
+      </w:r>
+    </w:p>
+    <w:p>
+      <w:r>
+        <w:t xml:space="preserve">Target node: Unregistered.</w:t>
+      </w:r>
+    </w:p>
+    <w:p>
+      <w:r>
+        <w:t xml:space="preserve">Provisional designation: Kai Li.</w:t>
+      </w:r>
+    </w:p>
+    <w:p>
+      <w:r>
+        <w:t xml:space="preserve">His breath stopped.</w:t>
+      </w:r>
+    </w:p>
+    <w:p>
+      <w:r>
+        <w:t xml:space="preserve">Han saw it.</w:t>
+      </w:r>
+    </w:p>
+    <w:p>
+      <w:r>
+        <w:t xml:space="preserve">"What? "</w:t>
+      </w:r>
+    </w:p>
+    <w:p>
+      <w:r>
+        <w:t xml:space="preserve">"The fourth bell is mine. "</w:t>
+      </w:r>
+    </w:p>
+    <w:p>
+      <w:r>
+        <w:t xml:space="preserve">No one spoke.</w:t>
+      </w:r>
+    </w:p>
+    <w:p>
+      <w:r>
+        <w:t xml:space="preserve">Then Rian said, "You do not own a town. "</w:t>
+      </w:r>
+    </w:p>
+    <w:p>
+      <w:r>
+        <w:t xml:space="preserve">"Not yet," Dr. Venn said.</w:t>
+      </w:r>
+    </w:p>
+    <w:p>
+      <w:r>
+        <w:t xml:space="preserve">Han turned toward her.</w:t>
+      </w:r>
+    </w:p>
+    <w:p>
+      <w:r>
+        <w:t xml:space="preserve">"Explain why you chose those words. "</w:t>
+      </w:r>
+    </w:p>
+    <w:p>
+      <w:r>
+        <w:t xml:space="preserve">"The network may not require a geographic node. It requires an identity pattern capable of carrying others. "</w:t>
+      </w:r>
+    </w:p>
+    <w:p>
+      <w:r>
+        <w:t xml:space="preserve">Kai looked at the system's warning.</w:t>
+      </w:r>
+    </w:p>
+    <w:p>
+      <w:r>
+        <w:t xml:space="preserve">Authority increases with accepted burden.</w:t>
+      </w:r>
+    </w:p>
+    <w:p>
+      <w:r>
+        <w:t xml:space="preserve">The system had shaped him into exactly that kind of pattern.</w:t>
+      </w:r>
+    </w:p>
+    <w:p>
+      <w:r>
+        <w:t xml:space="preserve">Every quest.</w:t>
+      </w:r>
+    </w:p>
+    <w:p>
+      <w:r>
+        <w:t xml:space="preserve">Every emergency.</w:t>
+      </w:r>
+    </w:p>
+    <w:p>
+      <w:r>
+        <w:t xml:space="preserve">Every moment it offered him a cost only he could pay.</w:t>
+      </w:r>
+    </w:p>
+    <w:p>
+      <w:r>
+        <w:t xml:space="preserve">He had believed the pattern was cultivation.</w:t>
+      </w:r>
+    </w:p>
+    <w:p>
+      <w:r>
+        <w:t xml:space="preserve">Perhaps it was also preparation.</w:t>
+      </w:r>
+    </w:p>
+    <w:p>
+      <w:r>
+        <w:t xml:space="preserve">The Registrar raised the hammer.</w:t>
+      </w:r>
+    </w:p>
+    <w:p>
+      <w:r>
+        <w:t xml:space="preserve">RETURN THE CUSTODIAN.</w:t>
+      </w:r>
+    </w:p>
+    <w:p>
+      <w:r>
+        <w:t xml:space="preserve">The command changed.</w:t>
+      </w:r>
+    </w:p>
+    <w:p>
+      <w:r>
+        <w:t xml:space="preserve">RETURN ALL CUSTODIANS.</w:t>
+      </w:r>
+    </w:p>
+    <w:p>
+      <w:r>
+        <w:t xml:space="preserve">The three active bells rang together.</w:t>
+      </w:r>
+    </w:p>
+    <w:p>
+      <w:r>
+        <w:t xml:space="preserve">Seo Jun screamed.</w:t>
+      </w:r>
+    </w:p>
+    <w:p>
+      <w:r>
+        <w:t xml:space="preserve">Far beyond the returning room, the coastal woman with the red parasol lifted her head. The boy beneath the blue fire dropped his chain. The conductor on the abandoned platform turned toward a tunnel that had not existed before.</w:t>
+      </w:r>
+    </w:p>
+    <w:p>
+      <w:r>
+        <w:t xml:space="preserve">The network pulled them.</w:t>
+      </w:r>
+    </w:p>
+    <w:p>
+      <w:r>
+        <w:t xml:space="preserve">Toward this chamber.</w:t>
+      </w:r>
+    </w:p>
+    <w:p>
+      <w:r>
+        <w:t xml:space="preserve">Toward the Registrar.</w:t>
+      </w:r>
+    </w:p>
+    <w:p>
+      <w:r>
+        <w:t xml:space="preserve">Kai felt the fourth bell reach into him.</w:t>
+      </w:r>
+    </w:p>
+    <w:p>
+      <w:r>
+        <w:t xml:space="preserve">Not for his name.</w:t>
+      </w:r>
+    </w:p>
+    <w:p>
+      <w:r>
+        <w:t xml:space="preserve">For every person he had carried inside his decisions.</w:t>
+      </w:r>
+    </w:p>
+    <w:p>
+      <w:r>
+        <w:t xml:space="preserve">Han.</w:t>
+      </w:r>
+    </w:p>
+    <w:p>
+      <w:r>
+        <w:t xml:space="preserve">Rian.</w:t>
+      </w:r>
+    </w:p>
+    <w:p>
+      <w:r>
+        <w:t xml:space="preserve">Dr. Venn.</w:t>
+      </w:r>
+    </w:p>
+    <w:p>
+      <w:r>
+        <w:t xml:space="preserve">Dr. Park.</w:t>
+      </w:r>
+    </w:p>
+    <w:p>
+      <w:r>
+        <w:t xml:space="preserve">The people whose lives had become reasons for him to act.</w:t>
+      </w:r>
+    </w:p>
+    <w:p>
+      <w:r>
+        <w:t xml:space="preserve">The bell did not need their identities to be physically stored within him. It needed only his belief that their survival was his responsibility.</w:t>
+      </w:r>
+    </w:p>
+    <w:p>
+      <w:r>
+        <w:t xml:space="preserve">Kai lowered the umbrella.</w:t>
+      </w:r>
+    </w:p>
+    <w:p>
+      <w:r>
+        <w:t xml:space="preserve">Names slid across its black surface.</w:t>
+      </w:r>
+    </w:p>
+    <w:p>
+      <w:r>
+        <w:t xml:space="preserve">"I am not their custodian. "</w:t>
+      </w:r>
+    </w:p>
+    <w:p>
+      <w:r>
+        <w:t xml:space="preserve">The fourth bell trembled.</w:t>
+      </w:r>
+    </w:p>
+    <w:p>
+      <w:r>
+        <w:t xml:space="preserve">The system warned him.</w:t>
+      </w:r>
+    </w:p>
+    <w:p>
+      <w:r>
+        <w:t xml:space="preserve">Corrective declaration detected.</w:t>
+      </w:r>
+    </w:p>
+    <w:p>
+      <w:r>
+        <w:t xml:space="preserve">Identity claim conflict likely.</w:t>
+      </w:r>
+    </w:p>
+    <w:p>
+      <w:r>
+        <w:t xml:space="preserve">The Registrar's hammer moved.</w:t>
+      </w:r>
+    </w:p>
+    <w:p>
+      <w:r>
+        <w:t xml:space="preserve">Han stepped beneath the umbrella beside Kai.</w:t>
+      </w:r>
+    </w:p>
+    <w:p>
+      <w:r>
+        <w:t xml:space="preserve">"He is not mine either. "</w:t>
+      </w:r>
+    </w:p>
+    <w:p>
+      <w:r>
+        <w:t xml:space="preserve">The bell stopped.</w:t>
+      </w:r>
+    </w:p>
+    <w:p>
+      <w:r>
+        <w:t xml:space="preserve">Rian joined them.</w:t>
+      </w:r>
+    </w:p>
+    <w:p>
+      <w:r>
+        <w:t xml:space="preserve">"I reject custodianship on practical and philosophical grounds. "</w:t>
+      </w:r>
+    </w:p>
+    <w:p>
+      <w:r>
+        <w:t xml:space="preserve">Dr. Venn looked at him.</w:t>
+      </w:r>
+    </w:p>
+    <w:p>
+      <w:r>
+        <w:t xml:space="preserve">"Practical? "</w:t>
+      </w:r>
+    </w:p>
+    <w:p>
+      <w:r>
+        <w:t xml:space="preserve">"He is younger than me. "</w:t>
+      </w:r>
+    </w:p>
+    <w:p>
+      <w:r>
+        <w:t xml:space="preserve">"That is your objection? "</w:t>
+      </w:r>
+    </w:p>
+    <w:p>
+      <w:r>
+        <w:t xml:space="preserve">"It is one of several. "</w:t>
+      </w:r>
+    </w:p>
+    <w:p>
+      <w:r>
+        <w:t xml:space="preserve">She stepped under the umbrella.</w:t>
+      </w:r>
+    </w:p>
+    <w:p>
+      <w:r>
+        <w:t xml:space="preserve">"I am responsible for my own choices. "</w:t>
+      </w:r>
+    </w:p>
+    <w:p>
+      <w:r>
+        <w:t xml:space="preserve">The fourth bell's reflection changed.</w:t>
+      </w:r>
+    </w:p>
+    <w:p>
+      <w:r>
+        <w:t xml:space="preserve">Kai no longer stood alone.</w:t>
+      </w:r>
+    </w:p>
+    <w:p>
+      <w:r>
+        <w:t xml:space="preserve">Seo Jun stared at them.</w:t>
+      </w:r>
+    </w:p>
+    <w:p>
+      <w:r>
+        <w:t xml:space="preserve">"You can say that because you were not there. "</w:t>
+      </w:r>
+    </w:p>
+    <w:p>
+      <w:r>
+        <w:t xml:space="preserve">His anger filled the chamber.</w:t>
+      </w:r>
+    </w:p>
+    <w:p>
+      <w:r>
+        <w:t xml:space="preserve">"Snow. Fire. Stone falling from the ridge. Children trapped beneath beams. Families screaming names so they would not be forgotten. There was no time to ask who wished to carry whom. "</w:t>
+      </w:r>
+    </w:p>
+    <w:p>
+      <w:r>
+        <w:t xml:space="preserve">Kai turned toward him.</w:t>
+      </w:r>
+    </w:p>
+    <w:p>
+      <w:r>
+        <w:t xml:space="preserve">"No. "</w:t>
+      </w:r>
+    </w:p>
+    <w:p>
+      <w:r>
+        <w:t xml:space="preserve">Seo Jun's translucent hands clenched.</w:t>
+      </w:r>
+    </w:p>
+    <w:p>
+      <w:r>
+        <w:t xml:space="preserve">"No? "</w:t>
+      </w:r>
+    </w:p>
+    <w:p>
+      <w:r>
+        <w:t xml:space="preserve">"There was no time then. "</w:t>
+      </w:r>
+    </w:p>
+    <w:p>
+      <w:r>
+        <w:t xml:space="preserve">Kai looked toward the western exit, where Choi continued calling the residents home.</w:t>
+      </w:r>
+    </w:p>
+    <w:p>
+      <w:r>
+        <w:t xml:space="preserve">"There is time now. "</w:t>
+      </w:r>
+    </w:p>
+    <w:p>
+      <w:r>
+        <w:t xml:space="preserve">The old custodian's anger faltered.</w:t>
+      </w:r>
+    </w:p>
+    <w:p>
+      <w:r>
+        <w:t xml:space="preserve">Kai held the umbrella toward him.</w:t>
+      </w:r>
+    </w:p>
+    <w:p>
+      <w:r>
+        <w:t xml:space="preserve">"Choose again. "</w:t>
+      </w:r>
+    </w:p>
+    <w:p>
+      <w:r>
+        <w:t xml:space="preserve">Seo Jun stared at the handle.</w:t>
+      </w:r>
+    </w:p>
+    <w:p>
+      <w:r>
+        <w:t xml:space="preserve">The names inside him pushed toward the Registrar. The bells continued calling. His body thinned until only the outline of his coat remained.</w:t>
+      </w:r>
+    </w:p>
+    <w:p>
+      <w:r>
+        <w:t xml:space="preserve">"If I release them, what am I? "</w:t>
+      </w:r>
+    </w:p>
+    <w:p>
+      <w:r>
+        <w:t xml:space="preserve">Kai did not answer for him.</w:t>
+      </w:r>
+    </w:p>
+    <w:p>
+      <w:r>
+        <w:t xml:space="preserve">Choi's voice came from beyond the western door.</w:t>
+      </w:r>
+    </w:p>
+    <w:p>
+      <w:r>
+        <w:t xml:space="preserve">"Seo Jun. "</w:t>
+      </w:r>
+    </w:p>
+    <w:p>
+      <w:r>
+        <w:t xml:space="preserve">The man turned.</w:t>
+      </w:r>
+    </w:p>
+    <w:p>
+      <w:r>
+        <w:t xml:space="preserve">She stood in daylight with one hand braced against the stone.</w:t>
+      </w:r>
+    </w:p>
+    <w:p>
+      <w:r>
+        <w:t xml:space="preserve">Not calling a household.</w:t>
+      </w:r>
+    </w:p>
+    <w:p>
+      <w:r>
+        <w:t xml:space="preserve">Calling him.</w:t>
+      </w:r>
+    </w:p>
+    <w:p>
+      <w:r>
+        <w:t xml:space="preserve">"Seo Jun," she repeated. "Keeper of the western boundary. Son of Seo Min-tae and Han Yeong-suk. Born in the winter of the red moon. Hated radish broth. Broke the shrine roof when you were twelve and blamed the wind. "</w:t>
+      </w:r>
+    </w:p>
+    <w:p>
+      <w:r>
+        <w:t xml:space="preserve">Seo Jun's mouth opened.</w:t>
+      </w:r>
+    </w:p>
+    <w:p>
+      <w:r>
+        <w:t xml:space="preserve">Choi's eyes filled with tears.</w:t>
+      </w:r>
+    </w:p>
+    <w:p>
+      <w:r>
+        <w:t xml:space="preserve">"My grandmother remembered you. "</w:t>
+      </w:r>
+    </w:p>
+    <w:p>
+      <w:r>
+        <w:t xml:space="preserve">The names beneath his skin loosened.</w:t>
+      </w:r>
+    </w:p>
+    <w:p>
+      <w:r>
+        <w:t xml:space="preserve">"She said you were terrible at lying. "</w:t>
+      </w:r>
+    </w:p>
+    <w:p>
+      <w:r>
+        <w:t xml:space="preserve">A sound escaped him.</w:t>
+      </w:r>
+    </w:p>
+    <w:p>
+      <w:r>
+        <w:t xml:space="preserve">Half laugh.</w:t>
+      </w:r>
+    </w:p>
+    <w:p>
+      <w:r>
+        <w:t xml:space="preserve">Half sob.</w:t>
+      </w:r>
+    </w:p>
+    <w:p>
+      <w:r>
+        <w:t xml:space="preserve">He reached for the umbrella.</w:t>
+      </w:r>
+    </w:p>
+    <w:p>
+      <w:r>
+        <w:t xml:space="preserve">Kai let him take it.</w:t>
+      </w:r>
+    </w:p>
+    <w:p>
+      <w:r>
+        <w:t xml:space="preserve">The system flashed.</w:t>
+      </w:r>
+    </w:p>
+    <w:p>
+      <w:r>
+        <w:t xml:space="preserve">Custodial implement returned to original imprint.</w:t>
+      </w:r>
+    </w:p>
+    <w:p>
+      <w:r>
+        <w:t xml:space="preserve">Accepted burden decreased.</w:t>
+      </w:r>
+    </w:p>
+    <w:p>
+      <w:r>
+        <w:t xml:space="preserve">Local identity restoration accelerating.</w:t>
+      </w:r>
+    </w:p>
+    <w:p>
+      <w:r>
+        <w:t xml:space="preserve">Seo Jun closed the umbrella.</w:t>
+      </w:r>
+    </w:p>
+    <w:p>
+      <w:r>
+        <w:t xml:space="preserve">The black fabric folded around the remaining names.</w:t>
+      </w:r>
+    </w:p>
+    <w:p>
+      <w:r>
+        <w:t xml:space="preserve">He held it against his chest.</w:t>
+      </w:r>
+    </w:p>
+    <w:p>
+      <w:r>
+        <w:t xml:space="preserve">"I carried them. "</w:t>
+      </w:r>
+    </w:p>
+    <w:p>
+      <w:r>
+        <w:t xml:space="preserve">"Yes," Kai said.</w:t>
+      </w:r>
+    </w:p>
+    <w:p>
+      <w:r>
+        <w:t xml:space="preserve">"I chose it. "</w:t>
+      </w:r>
+    </w:p>
+    <w:p>
+      <w:r>
+        <w:t xml:space="preserve">"Yes. "</w:t>
+      </w:r>
+    </w:p>
+    <w:p>
+      <w:r>
+        <w:t xml:space="preserve">"It was still too much. "</w:t>
+      </w:r>
+    </w:p>
+    <w:p>
+      <w:r>
+        <w:t xml:space="preserve">Kai nodded.</w:t>
+      </w:r>
+    </w:p>
+    <w:p>
+      <w:r>
+        <w:t xml:space="preserve">Seo Jun looked down the stairs.</w:t>
+      </w:r>
+    </w:p>
+    <w:p>
+      <w:r>
+        <w:t xml:space="preserve">"Then I choose to stop. "</w:t>
+      </w:r>
+    </w:p>
+    <w:p>
+      <w:r>
+        <w:t xml:space="preserve">The first bell cracked.</w:t>
+      </w:r>
+    </w:p>
+    <w:p>
+      <w:r>
+        <w:t xml:space="preserve">A line split its bronze surface.</w:t>
+      </w:r>
+    </w:p>
+    <w:p>
+      <w:r>
+        <w:t xml:space="preserve">The coastal vision flickered.</w:t>
+      </w:r>
+    </w:p>
+    <w:p>
+      <w:r>
+        <w:t xml:space="preserve">The woman with the red parasol remained standing, but the water around her began moving again.</w:t>
+      </w:r>
+    </w:p>
+    <w:p>
+      <w:r>
+        <w:t xml:space="preserve">The second bell cracked.</w:t>
+      </w:r>
+    </w:p>
+    <w:p>
+      <w:r>
+        <w:t xml:space="preserve">Blue fire bent away from the mountain boy. Name tags rattled along his chain.</w:t>
+      </w:r>
+    </w:p>
+    <w:p>
+      <w:r>
+        <w:t xml:space="preserve">The third bell continued ringing.</w:t>
+      </w:r>
+    </w:p>
+    <w:p>
+      <w:r>
+        <w:t xml:space="preserve">The conductor smiled from the underground platform.</w:t>
+      </w:r>
+    </w:p>
+    <w:p>
+      <w:r>
+        <w:t xml:space="preserve">Unlike the others, he did not appear distressed.</w:t>
+      </w:r>
+    </w:p>
+    <w:p>
+      <w:r>
+        <w:t xml:space="preserve">He lifted one hand in greeting.</w:t>
+      </w:r>
+    </w:p>
+    <w:p>
+      <w:r>
+        <w:t xml:space="preserve">The Registrar struck the fourth bell.</w:t>
+      </w:r>
+    </w:p>
+    <w:p>
+      <w:r>
+        <w:t xml:space="preserve">The hammer landed.</w:t>
+      </w:r>
+    </w:p>
+    <w:p>
+      <w:r>
+        <w:t xml:space="preserve">No sound emerged.</w:t>
+      </w:r>
+    </w:p>
+    <w:p>
+      <w:r>
+        <w:t xml:space="preserve">The bell had no accepted custodian to answer it.</w:t>
+      </w:r>
+    </w:p>
+    <w:p>
+      <w:r>
+        <w:t xml:space="preserve">The bronze hammer shattered.</w:t>
+      </w:r>
+    </w:p>
+    <w:p>
+      <w:r>
+        <w:t xml:space="preserve">Fragments fell down the stairs and became wooden name slips before touching the floor.</w:t>
+      </w:r>
+    </w:p>
+    <w:p>
+      <w:r>
+        <w:t xml:space="preserve">The woman in white lowered her empty hand.</w:t>
+      </w:r>
+    </w:p>
+    <w:p>
+      <w:r>
+        <w:t xml:space="preserve">The crack in her blank tablet widened.</w:t>
+      </w:r>
+    </w:p>
+    <w:p>
+      <w:r>
+        <w:t xml:space="preserve">The corridor behind her filled with movement.</w:t>
+      </w:r>
+    </w:p>
+    <w:p>
+      <w:r>
+        <w:t xml:space="preserve">Registrars turned toward one another.</w:t>
+      </w:r>
+    </w:p>
+    <w:p>
+      <w:r>
+        <w:t xml:space="preserve">Tablets rotated.</w:t>
+      </w:r>
+    </w:p>
+    <w:p>
+      <w:r>
+        <w:t xml:space="preserve">Names appeared, vanished, and reappeared in new arrangements.</w:t>
+      </w:r>
+    </w:p>
+    <w:p>
+      <w:r>
+        <w:t xml:space="preserve">Dr. Venn's array screamed.</w:t>
+      </w:r>
+    </w:p>
+    <w:p>
+      <w:r>
+        <w:t xml:space="preserve">"The network is changing sequence. "</w:t>
+      </w:r>
+    </w:p>
+    <w:p>
+      <w:r>
+        <w:t xml:space="preserve">The system confirmed it.</w:t>
+      </w:r>
+    </w:p>
+    <w:p>
+      <w:r>
+        <w:t xml:space="preserve">Synchronized ignition interrupted.</w:t>
+      </w:r>
+    </w:p>
+    <w:p>
+      <w:r>
+        <w:t xml:space="preserve">Emergency protocol activated.</w:t>
+      </w:r>
+    </w:p>
+    <w:p>
+      <w:r>
+        <w:t xml:space="preserve">Remaining active node has assumed coordination authority.</w:t>
+      </w:r>
+    </w:p>
+    <w:p>
+      <w:r>
+        <w:t xml:space="preserve">The third bell rang alone.</w:t>
+      </w:r>
+    </w:p>
+    <w:p>
+      <w:r>
+        <w:t xml:space="preserve">The abandoned station filled the returning room.</w:t>
+      </w:r>
+    </w:p>
+    <w:p>
+      <w:r>
+        <w:t xml:space="preserve">Fluorescent lights appeared overhead. Yellow safety lines crossed the floor. The air smelled of brake dust, rain-soaked coats, and old electricity.</w:t>
+      </w:r>
+    </w:p>
+    <w:p>
+      <w:r>
+        <w:t xml:space="preserve">The stone steps became an escalator descending into darkness.</w:t>
+      </w:r>
+    </w:p>
+    <w:p>
+      <w:r>
+        <w:t xml:space="preserve">The Registrar stood at its bottom.</w:t>
+      </w:r>
+    </w:p>
+    <w:p>
+      <w:r>
+        <w:t xml:space="preserve">Beside her, the conductor waited.</w:t>
+      </w:r>
+    </w:p>
+    <w:p>
+      <w:r>
+        <w:t xml:space="preserve">He wore a dark blue uniform cut in an old style. Silver buttons lined his coat. A round cap rested above a face Kai could almost remember.</w:t>
+      </w:r>
+    </w:p>
+    <w:p>
+      <w:r>
+        <w:t xml:space="preserve">Almost.</w:t>
+      </w:r>
+    </w:p>
+    <w:p>
+      <w:r>
+        <w:t xml:space="preserve">The man looked directly at him.</w:t>
+      </w:r>
+    </w:p>
+    <w:p>
+      <w:r>
+        <w:t xml:space="preserve">"Transfer delayed," he announced.</w:t>
+      </w:r>
+    </w:p>
+    <w:p>
+      <w:r>
+        <w:t xml:space="preserve">His voice came through a station speaker.</w:t>
+      </w:r>
+    </w:p>
+    <w:p>
+      <w:r>
+        <w:t xml:space="preserve">"Passengers are advised to remain calm. "</w:t>
+      </w:r>
+    </w:p>
+    <w:p>
+      <w:r>
+        <w:t xml:space="preserve">Rian stared down the escalator.</w:t>
+      </w:r>
+    </w:p>
+    <w:p>
+      <w:r>
+        <w:t xml:space="preserve">"I dislike him more than the bells. "</w:t>
+      </w:r>
+    </w:p>
+    <w:p>
+      <w:r>
+        <w:t xml:space="preserve">Han moved in front of Kai.</w:t>
+      </w:r>
+    </w:p>
+    <w:p>
+      <w:r>
+        <w:t xml:space="preserve">The conductor smiled.</w:t>
+      </w:r>
+    </w:p>
+    <w:p>
+      <w:r>
+        <w:t xml:space="preserve">"Custodian Kai Li, your platform has changed. "</w:t>
+      </w:r>
+    </w:p>
+    <w:p>
+      <w:r>
+        <w:t xml:space="preserve">"I am not a custodian. "</w:t>
+      </w:r>
+    </w:p>
+    <w:p>
+      <w:r>
+        <w:t xml:space="preserve">The man checked a silver pocket watch.</w:t>
+      </w:r>
+    </w:p>
+    <w:p>
+      <w:r>
+        <w:t xml:space="preserve">"Not until departure. "</w:t>
+      </w:r>
+    </w:p>
+    <w:p>
+      <w:r>
+        <w:t xml:space="preserve">The system opened a warning.</w:t>
+      </w:r>
+    </w:p>
+    <w:p>
+      <w:r>
+        <w:t xml:space="preserve">Third node authority expanding.</w:t>
+      </w:r>
+    </w:p>
+    <w:p>
+      <w:r>
+        <w:t xml:space="preserve">Transit formation detected.</w:t>
+      </w:r>
+    </w:p>
+    <w:p>
+      <w:r>
+        <w:t xml:space="preserve">Destination: Unknown.</w:t>
+      </w:r>
+    </w:p>
+    <w:p>
+      <w:r>
+        <w:t xml:space="preserve">Passenger manifest compiling.</w:t>
+      </w:r>
+    </w:p>
+    <w:p>
+      <w:r>
+        <w:t xml:space="preserve">Names appeared in the air above the escalator.</w:t>
+      </w:r>
+    </w:p>
+    <w:p>
+      <w:r>
+        <w:t xml:space="preserve">Seo Jun.</w:t>
+      </w:r>
+    </w:p>
+    <w:p>
+      <w:r>
+        <w:t xml:space="preserve">Kai Li.</w:t>
+      </w:r>
+    </w:p>
+    <w:p>
+      <w:r>
+        <w:t xml:space="preserve">Han.</w:t>
+      </w:r>
+    </w:p>
+    <w:p>
+      <w:r>
+        <w:t xml:space="preserve">Dr. Venn.</w:t>
+      </w:r>
+    </w:p>
+    <w:p>
+      <w:r>
+        <w:t xml:space="preserve">Rian.</w:t>
+      </w:r>
+    </w:p>
+    <w:p>
+      <w:r>
+        <w:t xml:space="preserve">Choi.</w:t>
+      </w:r>
+    </w:p>
+    <w:p>
+      <w:r>
+        <w:t xml:space="preserve">Each flickered.</w:t>
+      </w:r>
+    </w:p>
+    <w:p>
+      <w:r>
+        <w:t xml:space="preserve">More names followed.</w:t>
+      </w:r>
+    </w:p>
+    <w:p>
+      <w:r>
+        <w:t xml:space="preserve">Dr. Park.</w:t>
+      </w:r>
+    </w:p>
+    <w:p>
+      <w:r>
+        <w:t xml:space="preserve">People in West Haneul.</w:t>
+      </w:r>
+    </w:p>
+    <w:p>
+      <w:r>
+        <w:t xml:space="preserve">Names Kai did not recognize.</w:t>
+      </w:r>
+    </w:p>
+    <w:p>
+      <w:r>
+        <w:t xml:space="preserve">Then the manifest expanded beyond the returning room.</w:t>
+      </w:r>
+    </w:p>
+    <w:p>
+      <w:r>
+        <w:t xml:space="preserve">Hundreds.</w:t>
+      </w:r>
+    </w:p>
+    <w:p>
+      <w:r>
+        <w:t xml:space="preserve">Thousands.</w:t>
+      </w:r>
+    </w:p>
+    <w:p>
+      <w:r>
+        <w:t xml:space="preserve">The conductor tucked away his watch.</w:t>
+      </w:r>
+    </w:p>
+    <w:p>
+      <w:r>
+        <w:t xml:space="preserve">"Please present your identities for validation. "</w:t>
+      </w:r>
+    </w:p>
+    <w:p>
+      <w:r>
+        <w:t xml:space="preserve">Han drew his baton.</w:t>
+      </w:r>
+    </w:p>
+    <w:p>
+      <w:r>
+        <w:t xml:space="preserve">The conductor's smile remained.</w:t>
+      </w:r>
+    </w:p>
+    <w:p>
+      <w:r>
+        <w:t xml:space="preserve">"Failure to validate will not prevent boarding. "</w:t>
+      </w:r>
+    </w:p>
+    <w:p>
+      <w:r>
+        <w:t xml:space="preserve">The escalator began moving downward.</w:t>
+      </w:r>
+    </w:p>
+    <w:p>
+      <w:r>
+        <w:t xml:space="preserve">The floor beneath Kai's feet shifted toward it.</w:t>
+      </w:r>
+    </w:p>
+    <w:p>
+      <w:r>
+        <w:t xml:space="preserve">Rian grabbed the map table.</w:t>
+      </w:r>
+    </w:p>
+    <w:p>
+      <w:r>
+        <w:t xml:space="preserve">Dr. Venn caught one of the fixed shelves.</w:t>
+      </w:r>
+    </w:p>
+    <w:p>
+      <w:r>
+        <w:t xml:space="preserve">Han drove the tip of his baton into a seam between stones.</w:t>
+      </w:r>
+    </w:p>
+    <w:p>
+      <w:r>
+        <w:t xml:space="preserve">Kai seized Seo Jun's arm.</w:t>
+      </w:r>
+    </w:p>
+    <w:p>
+      <w:r>
+        <w:t xml:space="preserve">Choi held the western doorway.</w:t>
+      </w:r>
+    </w:p>
+    <w:p>
+      <w:r>
+        <w:t xml:space="preserve">The returning room stretched.</w:t>
+      </w:r>
+    </w:p>
+    <w:p>
+      <w:r>
+        <w:t xml:space="preserve">The eastern and western exits moved apart as the station inserted itself between them. Residents still crossing the room suddenly stood on a platform beneath flickering lights. Confusion moved across their faces.</w:t>
+      </w:r>
+    </w:p>
+    <w:p>
+      <w:r>
+        <w:t xml:space="preserve">The transit node was trying to take everyone the returning room had just separated.</w:t>
+      </w:r>
+    </w:p>
+    <w:p>
+      <w:r>
+        <w:t xml:space="preserve">"Close the local formation," Dr. Venn shouted.</w:t>
+      </w:r>
+    </w:p>
+    <w:p>
+      <w:r>
+        <w:t xml:space="preserve">Seo Jun clutched the umbrella.</w:t>
+      </w:r>
+    </w:p>
+    <w:p>
+      <w:r>
+        <w:t xml:space="preserve">"How? "</w:t>
+      </w:r>
+    </w:p>
+    <w:p>
+      <w:r>
+        <w:t xml:space="preserve">"You are the custodian. "</w:t>
+      </w:r>
+    </w:p>
+    <w:p>
+      <w:r>
+        <w:t xml:space="preserve">"I stopped. "</w:t>
+      </w:r>
+    </w:p>
+    <w:p>
+      <w:r>
+        <w:t xml:space="preserve">"That does not erase your knowledge. "</w:t>
+      </w:r>
+    </w:p>
+    <w:p>
+      <w:r>
+        <w:t xml:space="preserve">The conductor stepped onto the escalator.</w:t>
+      </w:r>
+    </w:p>
+    <w:p>
+      <w:r>
+        <w:t xml:space="preserve">He rose without moving his feet.</w:t>
+      </w:r>
+    </w:p>
+    <w:p>
+      <w:r>
+        <w:t xml:space="preserve">"Final service has been restored. "</w:t>
+      </w:r>
+    </w:p>
+    <w:p>
+      <w:r>
+        <w:t xml:space="preserve">The third bell rang.</w:t>
+      </w:r>
+    </w:p>
+    <w:p>
+      <w:r>
+        <w:t xml:space="preserve">Everyone slid one pace toward the platform.</w:t>
+      </w:r>
+    </w:p>
+    <w:p>
+      <w:r>
+        <w:t xml:space="preserve">Kai opened the system.</w:t>
+      </w:r>
+    </w:p>
+    <w:p>
+      <w:r>
+        <w:t xml:space="preserve">Emergency intervention available.</w:t>
+      </w:r>
+    </w:p>
+    <w:p>
+      <w:r>
+        <w:t xml:space="preserve">Option 1: Accept provisional custodianship.</w:t>
+      </w:r>
+    </w:p>
+    <w:p>
+      <w:r>
+        <w:t xml:space="preserve">Effect: Immediate local authority sufficient to seal transfer.</w:t>
+      </w:r>
+    </w:p>
+    <w:p>
+      <w:r>
+        <w:t xml:space="preserve">Risk: Fourth node activation.</w:t>
+      </w:r>
+    </w:p>
+    <w:p>
+      <w:r>
+        <w:t xml:space="preserve">He dismissed it.</w:t>
+      </w:r>
+    </w:p>
+    <w:p>
+      <w:r>
+        <w:t xml:space="preserve">Another option appeared.</w:t>
+      </w:r>
+    </w:p>
+    <w:p>
+      <w:r>
+        <w:t xml:space="preserve">Option 2: Sever local node from network.</w:t>
+      </w:r>
+    </w:p>
+    <w:p>
+      <w:r>
+        <w:t xml:space="preserve">Effect: Prevent immediate transfer.</w:t>
+      </w:r>
+    </w:p>
+    <w:p>
+      <w:r>
+        <w:t xml:space="preserve">Risk: All unreleased identities permanently isolated.</w:t>
+      </w:r>
+    </w:p>
+    <w:p>
+      <w:r>
+        <w:t xml:space="preserve">He dismissed that too.</w:t>
+      </w:r>
+    </w:p>
+    <w:p>
+      <w:r>
+        <w:t xml:space="preserve">The system offered nothing else.</w:t>
+      </w:r>
+    </w:p>
+    <w:p>
+      <w:r>
+        <w:t xml:space="preserve">Of course it did not.</w:t>
+      </w:r>
+    </w:p>
+    <w:p>
+      <w:r>
+        <w:t xml:space="preserve">Both options placed the decision inside Kai's hands alone. Accept everyone as his responsibility or cut them away to protect what remained.</w:t>
+      </w:r>
+    </w:p>
+    <w:p>
+      <w:r>
+        <w:t xml:space="preserve">The same mistake in opposite directions.</w:t>
+      </w:r>
+    </w:p>
+    <w:p>
+      <w:r>
+        <w:t xml:space="preserve">He looked at the people gripping shelves, doorframes, one another.</w:t>
+      </w:r>
+    </w:p>
+    <w:p>
+      <w:r>
+        <w:t xml:space="preserve">"Dr. Venn, can the local authority be distributed? "</w:t>
+      </w:r>
+    </w:p>
+    <w:p>
+      <w:r>
+        <w:t xml:space="preserve">She looked toward the resonance array.</w:t>
+      </w:r>
+    </w:p>
+    <w:p>
+      <w:r>
+        <w:t xml:space="preserve">"Custodianship is singular by design. "</w:t>
+      </w:r>
+    </w:p>
+    <w:p>
+      <w:r>
+        <w:t xml:space="preserve">"That was not my question. "</w:t>
+      </w:r>
+    </w:p>
+    <w:p>
+      <w:r>
+        <w:t xml:space="preserve">Her eyes sharpened.</w:t>
+      </w:r>
+    </w:p>
+    <w:p>
+      <w:r>
+        <w:t xml:space="preserve">"Possibly. The returning room already separated one held identity into thousands. The pattern can move from one to many. "</w:t>
+      </w:r>
+    </w:p>
+    <w:p>
+      <w:r>
+        <w:t xml:space="preserve">"Can it move authority the same way? "</w:t>
+      </w:r>
+    </w:p>
+    <w:p>
+      <w:r>
+        <w:t xml:space="preserve">"The network will resist. "</w:t>
+      </w:r>
+    </w:p>
+    <w:p>
+      <w:r>
+        <w:t xml:space="preserve">Rian's fingers slipped along the map table.</w:t>
+      </w:r>
+    </w:p>
+    <w:p>
+      <w:r>
+        <w:t xml:space="preserve">"It is already resisting. "</w:t>
+      </w:r>
+    </w:p>
+    <w:p>
+      <w:r>
+        <w:t xml:space="preserve">Kai looked at Seo Jun.</w:t>
+      </w:r>
+    </w:p>
+    <w:p>
+      <w:r>
+        <w:t xml:space="preserve">"The original courtyard formation. Did the townspeople speak their names? "</w:t>
+      </w:r>
+    </w:p>
+    <w:p>
+      <w:r>
+        <w:t xml:space="preserve">"Yes. "</w:t>
+      </w:r>
+    </w:p>
+    <w:p>
+      <w:r>
+        <w:t xml:space="preserve">"Did they give them to you? "</w:t>
+      </w:r>
+    </w:p>
+    <w:p>
+      <w:r>
+        <w:t xml:space="preserve">Seo Jun's face tightened.</w:t>
+      </w:r>
+    </w:p>
+    <w:p>
+      <w:r>
+        <w:t xml:space="preserve">"I told them I could carry everyone if they trusted me. "</w:t>
+      </w:r>
+    </w:p>
+    <w:p>
+      <w:r>
+        <w:t xml:space="preserve">"They consented? "</w:t>
+      </w:r>
+    </w:p>
+    <w:p>
+      <w:r>
+        <w:t xml:space="preserve">"They were dying. "</w:t>
+      </w:r>
+    </w:p>
+    <w:p>
+      <w:r>
+        <w:t xml:space="preserve">"That is not an answer. "</w:t>
+      </w:r>
+    </w:p>
+    <w:p>
+      <w:r>
+        <w:t xml:space="preserve">Seo Jun lowered his gaze.</w:t>
+      </w:r>
+    </w:p>
+    <w:p>
+      <w:r>
+        <w:t xml:space="preserve">"No. "</w:t>
+      </w:r>
+    </w:p>
+    <w:p>
+      <w:r>
+        <w:t xml:space="preserve">Kai looked toward Choi.</w:t>
+      </w:r>
+    </w:p>
+    <w:p>
+      <w:r>
+        <w:t xml:space="preserve">"Call them again. "</w:t>
+      </w:r>
+    </w:p>
+    <w:p>
+      <w:r>
+        <w:t xml:space="preserve">She understood.</w:t>
+      </w:r>
+    </w:p>
+    <w:p>
+      <w:r>
+        <w:t xml:space="preserve">Not names for release.</w:t>
+      </w:r>
+    </w:p>
+    <w:p>
+      <w:r>
+        <w:t xml:space="preserve">Names for choice.</w:t>
+      </w:r>
+    </w:p>
+    <w:p>
+      <w:r>
+        <w:t xml:space="preserve">Choi stood in the western doorway and shouted into the daylight.</w:t>
+      </w:r>
+    </w:p>
+    <w:p>
+      <w:r>
+        <w:t xml:space="preserve">"West Haneul, listen to me! "</w:t>
+      </w:r>
+    </w:p>
+    <w:p>
+      <w:r>
+        <w:t xml:space="preserve">The formation carried her voice.</w:t>
+      </w:r>
+    </w:p>
+    <w:p>
+      <w:r>
+        <w:t xml:space="preserve">Across the town, residents raised their heads.</w:t>
+      </w:r>
+    </w:p>
+    <w:p>
+      <w:r>
+        <w:t xml:space="preserve">"The network is trying to move us. Seo Jun cannot decide for us. Kai Li cannot decide for us. "</w:t>
+      </w:r>
+    </w:p>
+    <w:p>
+      <w:r>
+        <w:t xml:space="preserve">The conductor's smile thinned.</w:t>
+      </w:r>
+    </w:p>
+    <w:p>
+      <w:r>
+        <w:t xml:space="preserve">Choi continued.</w:t>
+      </w:r>
+    </w:p>
+    <w:p>
+      <w:r>
+        <w:t xml:space="preserve">"Choose whether your name remains here. "</w:t>
+      </w:r>
+    </w:p>
+    <w:p>
+      <w:r>
+        <w:t xml:space="preserve">The Registrar lifted one hand.</w:t>
+      </w:r>
+    </w:p>
+    <w:p>
+      <w:r>
+        <w:t xml:space="preserve">The bells shook.</w:t>
+      </w:r>
+    </w:p>
+    <w:p>
+      <w:r>
+        <w:t xml:space="preserve">The command entered every record.</w:t>
+      </w:r>
+    </w:p>
+    <w:p>
+      <w:r>
+        <w:t xml:space="preserve">RETURN ALL CUSTODIANS.</w:t>
+      </w:r>
+    </w:p>
+    <w:p>
+      <w:r>
+        <w:t xml:space="preserve">Choi shouted over it.</w:t>
+      </w:r>
+    </w:p>
+    <w:p>
+      <w:r>
+        <w:t xml:space="preserve">"Choose! "</w:t>
+      </w:r>
+    </w:p>
+    <w:p>
+      <w:r>
+        <w:t xml:space="preserve">The woman with the toddler answered first.</w:t>
+      </w:r>
+    </w:p>
+    <w:p>
+      <w:r>
+        <w:t xml:space="preserve">"Min Ji-yeon remains. "</w:t>
+      </w:r>
+    </w:p>
+    <w:p>
+      <w:r>
+        <w:t xml:space="preserve">The red line beneath her feet anchored to the platform.</w:t>
+      </w:r>
+    </w:p>
+    <w:p>
+      <w:r>
+        <w:t xml:space="preserve">The maintenance worker gripped a railing.</w:t>
+      </w:r>
+    </w:p>
+    <w:p>
+      <w:r>
+        <w:t xml:space="preserve">"Park Dae-sung remains. "</w:t>
+      </w:r>
+    </w:p>
+    <w:p>
+      <w:r>
+        <w:t xml:space="preserve">The clerk.</w:t>
+      </w:r>
+    </w:p>
+    <w:p>
+      <w:r>
+        <w:t xml:space="preserve">"Yun Hara remains. "</w:t>
+      </w:r>
+    </w:p>
+    <w:p>
+      <w:r>
+        <w:t xml:space="preserve">Outside, voices spread through West Haneul.</w:t>
+      </w:r>
+    </w:p>
+    <w:p>
+      <w:r>
+        <w:t xml:space="preserve">Names.</w:t>
+      </w:r>
+    </w:p>
+    <w:p>
+      <w:r>
+        <w:t xml:space="preserve">Households.</w:t>
+      </w:r>
+    </w:p>
+    <w:p>
+      <w:r>
+        <w:t xml:space="preserve">Nicknames.</w:t>
+      </w:r>
+    </w:p>
+    <w:p>
+      <w:r>
+        <w:t xml:space="preserve">People declaring not who they were for the formation, but where they chose to stand now.</w:t>
+      </w:r>
+    </w:p>
+    <w:p>
+      <w:r>
+        <w:t xml:space="preserve">The returning room brightened.</w:t>
+      </w:r>
+    </w:p>
+    <w:p>
+      <w:r>
+        <w:t xml:space="preserve">Authority moved.</w:t>
+      </w:r>
+    </w:p>
+    <w:p>
+      <w:r>
+        <w:t xml:space="preserve">Not from Seo Jun to Kai.</w:t>
+      </w:r>
+    </w:p>
+    <w:p>
+      <w:r>
+        <w:t xml:space="preserve">From the singular position outward.</w:t>
+      </w:r>
+    </w:p>
+    <w:p>
+      <w:r>
+        <w:t xml:space="preserve">The black umbrella opened in Seo Jun's hands.</w:t>
+      </w:r>
+    </w:p>
+    <w:p>
+      <w:r>
+        <w:t xml:space="preserve">Its fabric tore into thousands of narrow strips. Each strip flew toward a declared name and wrapped once around the person's wrist.</w:t>
+      </w:r>
+    </w:p>
+    <w:p>
+      <w:r>
+        <w:t xml:space="preserve">The conductor stopped rising.</w:t>
+      </w:r>
+    </w:p>
+    <w:p>
+      <w:r>
+        <w:t xml:space="preserve">The passenger manifest flickered.</w:t>
+      </w:r>
+    </w:p>
+    <w:p>
+      <w:r>
+        <w:t xml:space="preserve">Names vanished.</w:t>
+      </w:r>
+    </w:p>
+    <w:p>
+      <w:r>
+        <w:t xml:space="preserve">One by one.</w:t>
+      </w:r>
+    </w:p>
+    <w:p>
+      <w:r>
+        <w:t xml:space="preserve">West Haneul refused boarding.</w:t>
+      </w:r>
+    </w:p>
+    <w:p>
+      <w:r>
+        <w:t xml:space="preserve">The third bell rang harder.</w:t>
+      </w:r>
+    </w:p>
+    <w:p>
+      <w:r>
+        <w:t xml:space="preserve">The station walls pressed against the room.</w:t>
+      </w:r>
+    </w:p>
+    <w:p>
+      <w:r>
+        <w:t xml:space="preserve">The transit node did not release its claim.</w:t>
+      </w:r>
+    </w:p>
+    <w:p>
+      <w:r>
+        <w:t xml:space="preserve">Dr. Venn lifted the resonance array.</w:t>
+      </w:r>
+    </w:p>
+    <w:p>
+      <w:r>
+        <w:t xml:space="preserve">"Rian, the ledgers. "</w:t>
+      </w:r>
+    </w:p>
+    <w:p>
+      <w:r>
+        <w:t xml:space="preserve">He kicked the document bag toward her.</w:t>
+      </w:r>
+    </w:p>
+    <w:p>
+      <w:r>
+        <w:t xml:space="preserve">She opened the oldest book and pressed its spine against the rotating brass rings.</w:t>
+      </w:r>
+    </w:p>
+    <w:p>
+      <w:r>
+        <w:t xml:space="preserve">"Names change," she said. "So choices must be current. "</w:t>
+      </w:r>
+    </w:p>
+    <w:p>
+      <w:r>
+        <w:t xml:space="preserve">Rian understood.</w:t>
+      </w:r>
+    </w:p>
+    <w:p>
+      <w:r>
+        <w:t xml:space="preserve">He grabbed a marker from his coat pocket.</w:t>
+      </w:r>
+    </w:p>
+    <w:p>
+      <w:r>
+        <w:t xml:space="preserve">"You carry office supplies? "</w:t>
+      </w:r>
+    </w:p>
+    <w:p>
+      <w:r>
+        <w:t xml:space="preserve">"I have been waiting my entire life for that question. "</w:t>
+      </w:r>
+    </w:p>
+    <w:p>
+      <w:r>
+        <w:t xml:space="preserve">He wrote across the blank final page.</w:t>
+      </w:r>
+    </w:p>
+    <w:p>
+      <w:r>
+        <w:t xml:space="preserve">WEST HANEUL RESIDENT STATUS: REMAINS BY PRESENT CONSENT.</w:t>
+      </w:r>
+    </w:p>
+    <w:p>
+      <w:r>
+        <w:t xml:space="preserve">Dr. Venn placed the ledger against the array.</w:t>
+      </w:r>
+    </w:p>
+    <w:p>
+      <w:r>
+        <w:t xml:space="preserve">The brass rings flashed.</w:t>
+      </w:r>
+    </w:p>
+    <w:p>
+      <w:r>
+        <w:t xml:space="preserve">The declaration entered the formation.</w:t>
+      </w:r>
+    </w:p>
+    <w:p>
+      <w:r>
+        <w:t xml:space="preserve">The station lights burst.</w:t>
+      </w:r>
+    </w:p>
+    <w:p>
+      <w:r>
+        <w:t xml:space="preserve">The conductor's face lost its almost familiar shape.</w:t>
+      </w:r>
+    </w:p>
+    <w:p>
+      <w:r>
+        <w:t xml:space="preserve">For an instant, Kai saw the truth beneath it.</w:t>
+      </w:r>
+    </w:p>
+    <w:p>
+      <w:r>
+        <w:t xml:space="preserve">No eyes.</w:t>
+      </w:r>
+    </w:p>
+    <w:p>
+      <w:r>
+        <w:t xml:space="preserve">No mouth.</w:t>
+      </w:r>
+    </w:p>
+    <w:p>
+      <w:r>
+        <w:t xml:space="preserve">A departure board covered in changing characters.</w:t>
+      </w:r>
+    </w:p>
+    <w:p>
+      <w:r>
+        <w:t xml:space="preserve">DESTINATION.</w:t>
+      </w:r>
+    </w:p>
+    <w:p>
+      <w:r>
+        <w:t xml:space="preserve">TRANSFER.</w:t>
+      </w:r>
+    </w:p>
+    <w:p>
+      <w:r>
+        <w:t xml:space="preserve">ARRIVAL.</w:t>
+      </w:r>
+    </w:p>
+    <w:p>
+      <w:r>
+        <w:t xml:space="preserve">ERASURE.</w:t>
+      </w:r>
+    </w:p>
+    <w:p>
+      <w:r>
+        <w:t xml:space="preserve">The man's appearance returned.</w:t>
+      </w:r>
+    </w:p>
+    <w:p>
+      <w:r>
+        <w:t xml:space="preserve">"Consent is not recognized under emergency transit protocol. "</w:t>
+      </w:r>
+    </w:p>
+    <w:p>
+      <w:r>
+        <w:t xml:space="preserve">Han's baton tore free from the floor.</w:t>
+      </w:r>
+    </w:p>
+    <w:p>
+      <w:r>
+        <w:t xml:space="preserve">He pointed it at the conductor.</w:t>
+      </w:r>
+    </w:p>
+    <w:p>
+      <w:r>
+        <w:t xml:space="preserve">"Then your protocol is invalid. "</w:t>
+      </w:r>
+    </w:p>
+    <w:p>
+      <w:r>
+        <w:t xml:space="preserve">The conductor looked at him.</w:t>
+      </w:r>
+    </w:p>
+    <w:p>
+      <w:r>
+        <w:t xml:space="preserve">"Obstruction noted. "</w:t>
+      </w:r>
+    </w:p>
+    <w:p>
+      <w:r>
+        <w:t xml:space="preserve">Han smiled.</w:t>
+      </w:r>
+    </w:p>
+    <w:p>
+      <w:r>
+        <w:t xml:space="preserve">"I was hoping you would say that. "</w:t>
+      </w:r>
+    </w:p>
+    <w:p>
+      <w:r>
+        <w:t xml:space="preserve">He threw the baton.</w:t>
+      </w:r>
+    </w:p>
+    <w:p>
+      <w:r>
+        <w:t xml:space="preserve">It passed through the conductor's chest and struck the third bell.</w:t>
+      </w:r>
+    </w:p>
+    <w:p>
+      <w:r>
+        <w:t xml:space="preserve">Metal met bronze.</w:t>
+      </w:r>
+    </w:p>
+    <w:p>
+      <w:r>
+        <w:t xml:space="preserve">The bell's tone broke.</w:t>
+      </w:r>
+    </w:p>
+    <w:p>
+      <w:r>
+        <w:t xml:space="preserve">Not stopped.</w:t>
+      </w:r>
+    </w:p>
+    <w:p>
+      <w:r>
+        <w:t xml:space="preserve">Changed.</w:t>
+      </w:r>
+    </w:p>
+    <w:p>
+      <w:r>
+        <w:t xml:space="preserve">The clean note became a harsh, uneven clang.</w:t>
+      </w:r>
+    </w:p>
+    <w:p>
+      <w:r>
+        <w:t xml:space="preserve">The abandoned station shuddered.</w:t>
+      </w:r>
+    </w:p>
+    <w:p>
+      <w:r>
+        <w:t xml:space="preserve">Departure boards flashed across the ceiling.</w:t>
+      </w:r>
+    </w:p>
+    <w:p>
+      <w:r>
+        <w:t xml:space="preserve">SERVICE INTERRUPTED.</w:t>
+      </w:r>
+    </w:p>
+    <w:p>
+      <w:r>
+        <w:t xml:space="preserve">PLATFORM ERROR.</w:t>
+      </w:r>
+    </w:p>
+    <w:p>
+      <w:r>
+        <w:t xml:space="preserve">MANIFEST DISPUTED.</w:t>
+      </w:r>
+    </w:p>
+    <w:p>
+      <w:r>
+        <w:t xml:space="preserve">The escalator reversed.</w:t>
+      </w:r>
+    </w:p>
+    <w:p>
+      <w:r>
+        <w:t xml:space="preserve">The conductor slid backward.</w:t>
+      </w:r>
+    </w:p>
+    <w:p>
+      <w:r>
+        <w:t xml:space="preserve">His calm expression vanished.</w:t>
+      </w:r>
+    </w:p>
+    <w:p>
+      <w:r>
+        <w:t xml:space="preserve">"Do not interrupt transfer. "</w:t>
+      </w:r>
+    </w:p>
+    <w:p>
+      <w:r>
+        <w:t xml:space="preserve">Han caught the returning baton.</w:t>
+      </w:r>
+    </w:p>
+    <w:p>
+      <w:r>
+        <w:t xml:space="preserve">"You are late with that instruction. "</w:t>
+      </w:r>
+    </w:p>
+    <w:p>
+      <w:r>
+        <w:t xml:space="preserve">Seo Jun closed what remained of the umbrella.</w:t>
+      </w:r>
+    </w:p>
+    <w:p>
+      <w:r>
+        <w:t xml:space="preserve">Every black strip tightened around the residents' wrists.</w:t>
+      </w:r>
+    </w:p>
+    <w:p>
+      <w:r>
+        <w:t xml:space="preserve">The local formation anchored.</w:t>
+      </w:r>
+    </w:p>
+    <w:p>
+      <w:r>
+        <w:t xml:space="preserve">The station peeled away from the returning room. Tiles cracked into shadows. Fluorescent lights stretched into pale lines. The escalator folded downward, carrying the Registrar and conductor with it.</w:t>
+      </w:r>
+    </w:p>
+    <w:p>
+      <w:r>
+        <w:t xml:space="preserve">Kai saw the twelve bells one final time.</w:t>
+      </w:r>
+    </w:p>
+    <w:p>
+      <w:r>
+        <w:t xml:space="preserve">The first two had cracked.</w:t>
+      </w:r>
+    </w:p>
+    <w:p>
+      <w:r>
+        <w:t xml:space="preserve">The third swung wildly.</w:t>
+      </w:r>
+    </w:p>
+    <w:p>
+      <w:r>
+        <w:t xml:space="preserve">The fourth remained silent.</w:t>
+      </w:r>
+    </w:p>
+    <w:p>
+      <w:r>
+        <w:t xml:space="preserve">The other eight moved.</w:t>
+      </w:r>
+    </w:p>
+    <w:p>
+      <w:r>
+        <w:t xml:space="preserve">Not ringing yet.</w:t>
+      </w:r>
+    </w:p>
+    <w:p>
+      <w:r>
+        <w:t xml:space="preserve">Preparing.</w:t>
+      </w:r>
+    </w:p>
+    <w:p>
+      <w:r>
+        <w:t xml:space="preserve">The Registrar raised a hand toward Kai.</w:t>
+      </w:r>
+    </w:p>
+    <w:p>
+      <w:r>
+        <w:t xml:space="preserve">A name slip flew from the corridor behind her.</w:t>
+      </w:r>
+    </w:p>
+    <w:p>
+      <w:r>
+        <w:t xml:space="preserve">He caught it instinctively.</w:t>
+      </w:r>
+    </w:p>
+    <w:p>
+      <w:r>
+        <w:t xml:space="preserve">The station vanished.</w:t>
+      </w:r>
+    </w:p>
+    <w:p>
+      <w:r>
+        <w:t xml:space="preserve">Stone steps returned.</w:t>
+      </w:r>
+    </w:p>
+    <w:p>
+      <w:r>
+        <w:t xml:space="preserve">Then collapsed.</w:t>
+      </w:r>
+    </w:p>
+    <w:p>
+      <w:r>
+        <w:t xml:space="preserve">The floor sealed over them.</w:t>
+      </w:r>
+    </w:p>
+    <w:p>
+      <w:r>
+        <w:t xml:space="preserve">Silence filled the returning room.</w:t>
+      </w:r>
+    </w:p>
+    <w:p>
+      <w:r>
+        <w:t xml:space="preserve">Outside, West Haneul breathed.</w:t>
+      </w:r>
+    </w:p>
+    <w:p>
+      <w:r>
+        <w:t xml:space="preserve">Not together.</w:t>
+      </w:r>
+    </w:p>
+    <w:p>
+      <w:r>
+        <w:t xml:space="preserve">One person at a time.</w:t>
+      </w:r>
+    </w:p>
+    <w:p>
+      <w:r>
+        <w:t xml:space="preserve">Kai looked at the slip in his hand.</w:t>
+      </w:r>
+    </w:p>
+    <w:p>
+      <w:r>
+        <w:t xml:space="preserve">There was no name on the front.</w:t>
+      </w:r>
+    </w:p>
+    <w:p>
+      <w:r>
+        <w:t xml:space="preserve">Only a location.</w:t>
+      </w:r>
+    </w:p>
+    <w:p>
+      <w:r>
+        <w:t xml:space="preserve">SUNLIT MENDICANT NODE.</w:t>
+      </w:r>
+    </w:p>
+    <w:p>
+      <w:r>
+        <w:t xml:space="preserve">Dr. Venn saw it.</w:t>
+      </w:r>
+    </w:p>
+    <w:p>
+      <w:r>
+        <w:t xml:space="preserve">Her face changed.</w:t>
+      </w:r>
+    </w:p>
+    <w:p>
+      <w:r>
+        <w:t xml:space="preserve">"That designation is in Dr. Park's restricted archive. "</w:t>
+      </w:r>
+    </w:p>
+    <w:p>
+      <w:r>
+        <w:t xml:space="preserve">Rian leaned closer.</w:t>
+      </w:r>
+    </w:p>
+    <w:p>
+      <w:r>
+        <w:t xml:space="preserve">"Good restricted or terrible restricted? "</w:t>
+      </w:r>
+    </w:p>
+    <w:p>
+      <w:r>
+        <w:t xml:space="preserve">"Buried beneath a sealed incident involving the Radiant Abyss. "</w:t>
+      </w:r>
+    </w:p>
+    <w:p>
+      <w:r>
+        <w:t xml:space="preserve">Kai turned the slip over.</w:t>
+      </w:r>
+    </w:p>
+    <w:p>
+      <w:r>
+        <w:t xml:space="preserve">Three lines had been written on the back.</w:t>
+      </w:r>
+    </w:p>
+    <w:p>
+      <w:r>
+        <w:t xml:space="preserve">THE FIRST NODE HAS REMEMBERED YOU.</w:t>
+      </w:r>
+    </w:p>
+    <w:p>
+      <w:r>
+        <w:t xml:space="preserve">THE SECOND NODE HAS OPENED ITS GATE.</w:t>
+      </w:r>
+    </w:p>
+    <w:p>
+      <w:r>
+        <w:t xml:space="preserve">THE THIRD NODE IS ALREADY MOVING.</w:t>
+      </w:r>
+    </w:p>
+    <w:p>
+      <w:r>
+        <w:t xml:space="preserve">Beneath them, a fourth line appeared.</w:t>
+      </w:r>
+    </w:p>
+    <w:p>
+      <w:r>
+        <w:t xml:space="preserve">THE SYSTEM WAS BUILT TO DELIVER YOU.</w:t>
+      </w:r>
+    </w:p>
+    <w:p>
+      <w:r>
+        <w:t xml:space="preserve">Kai's vision went white.</w:t>
+      </w:r>
+    </w:p>
+    <w:p>
+      <w:r>
+        <w:t xml:space="preserve">A notification opened without his permission.</w:t>
+      </w:r>
+    </w:p>
+    <w:p>
+      <w:r>
+        <w:t xml:space="preserve">Heavenly Ascension System synchronization resumed.</w:t>
+      </w:r>
+    </w:p>
+    <w:p>
+      <w:r>
+        <w:t xml:space="preserve">Network compatibility confirmed.</w:t>
+      </w:r>
+    </w:p>
+    <w:p>
+      <w:r>
+        <w:t xml:space="preserve">Custodian candidate located.</w:t>
+      </w:r>
+    </w:p>
+    <w:p>
+      <w:r>
+        <w:t xml:space="preserve">Next node route available.</w:t>
+      </w:r>
+    </w:p>
+    <w:p>
+      <w:r>
+        <w:t xml:space="preserve">He tried to dismiss it.</w:t>
+      </w:r>
+    </w:p>
+    <w:p>
+      <w:r>
+        <w:t xml:space="preserve">The message remained.</w:t>
+      </w:r>
+    </w:p>
+    <w:p>
+      <w:r>
+        <w:t xml:space="preserve">The floor beneath the sealed stair pulsed once.</w:t>
+      </w:r>
+    </w:p>
+    <w:p>
+      <w:r>
+        <w:t xml:space="preserve">Across West Haneul, every black strip around every wrist turned toward the east.</w:t>
+      </w:r>
+    </w:p>
+    <w:p>
+      <w:r>
+        <w:t xml:space="preserve">Far beyond the town, beneath a sunlit road no map recorded, a mendicant in golden robes opened his eyes.</w:t>
+      </w:r>
+    </w:p>
+    <w:p>
+      <w:r>
+        <w:t xml:space="preserve">In one hand he held a begging bowl.</w:t>
+      </w:r>
+    </w:p>
+    <w:p>
+      <w:r>
+        <w:t xml:space="preserve">In the other, Kai's name.</w:t>
       </w:r>
     </w:p>
     <w:sectPr>

</xml_diff>

<commit_message>
Add Heavenly Ascension System Chapter 64: The Bowl That Collected Names
</commit_message>
<xml_diff>
--- a/Heavenly Ascension System.docx
+++ b/Heavenly Ascension System.docx
@@ -52755,6 +52755,3779 @@
     <w:p>
       <w:r>
         <w:t xml:space="preserve">In the other, Kai's name.</w:t>
+      </w:r>
+    </w:p>
+    <w:p>
+      <w:pPr>
+        <w:pStyle w:val="Heading1"/>
+      </w:pPr>
+      <w:r>
+        <w:t xml:space="preserve">Chapter 64: The Bowl That Collected Names</w:t>
+      </w:r>
+    </w:p>
+    <w:p>
+      <w:r>
+        <w:t xml:space="preserve">In the other, Kai's name.</w:t>
+      </w:r>
+    </w:p>
+    <w:p>
+      <w:r>
+        <w:t xml:space="preserve">The mendicant held the slip between two fingers as though it weighed less than sunlight.</w:t>
+      </w:r>
+    </w:p>
+    <w:p>
+      <w:r>
+        <w:t xml:space="preserve">He sat beside a road that did not appear on any map Dr. Venn had ever seen. White stones ran beneath a sky without clouds. Golden grass bowed along both sides, not to wind, but toward him. Behind his shoulder stood a single weathered post bearing three directional signs.</w:t>
+      </w:r>
+    </w:p>
+    <w:p>
+      <w:r>
+        <w:t xml:space="preserve">WEST HANEUL.</w:t>
+      </w:r>
+    </w:p>
+    <w:p>
+      <w:r>
+        <w:t xml:space="preserve">RADIANT ABYSS.</w:t>
+      </w:r>
+    </w:p>
+    <w:p>
+      <w:r>
+        <w:t xml:space="preserve">HOME.</w:t>
+      </w:r>
+    </w:p>
+    <w:p>
+      <w:r>
+        <w:t xml:space="preserve">All three pointed down the same road.</w:t>
+      </w:r>
+    </w:p>
+    <w:p>
+      <w:r>
+        <w:t xml:space="preserve">Kai saw the vision through the system notification and nowhere else. The returning room remained around him. Damp stone. Cracked bell. Mud tracked in from the western exit. Rian kneeling beside the old ledgers. Han standing between Kai and the sealed floor as though a baton could prevent an entire hidden network from rising again.</w:t>
+      </w:r>
+    </w:p>
+    <w:p>
+      <w:r>
+        <w:t xml:space="preserve">Yet another part of Kai stood beneath impossible sunlight.</w:t>
+      </w:r>
+    </w:p>
+    <w:p>
+      <w:r>
+        <w:t xml:space="preserve">The mendicant turned the slip over.</w:t>
+      </w:r>
+    </w:p>
+    <w:p>
+      <w:r>
+        <w:t xml:space="preserve">Kai Li had been written on one side.</w:t>
+      </w:r>
+    </w:p>
+    <w:p>
+      <w:r>
+        <w:t xml:space="preserve">The other carried no characters.</w:t>
+      </w:r>
+    </w:p>
+    <w:p>
+      <w:r>
+        <w:t xml:space="preserve">The man smiled.</w:t>
+      </w:r>
+    </w:p>
+    <w:p>
+      <w:r>
+        <w:t xml:space="preserve">"You have been difficult to deliver. "</w:t>
+      </w:r>
+    </w:p>
+    <w:p>
+      <w:r>
+        <w:t xml:space="preserve">His voice reached Kai from the vision.</w:t>
+      </w:r>
+    </w:p>
+    <w:p>
+      <w:r>
+        <w:t xml:space="preserve">No one else reacted.</w:t>
+      </w:r>
+    </w:p>
+    <w:p>
+      <w:r>
+        <w:t xml:space="preserve">Kai tried to close the system display.</w:t>
+      </w:r>
+    </w:p>
+    <w:p>
+      <w:r>
+        <w:t xml:space="preserve">It remained open.</w:t>
+      </w:r>
+    </w:p>
+    <w:p>
+      <w:r>
+        <w:t xml:space="preserve">Next node route available.</w:t>
+      </w:r>
+    </w:p>
+    <w:p>
+      <w:r>
+        <w:t xml:space="preserve">Destination: Sunlit Mendicant Node.</w:t>
+      </w:r>
+    </w:p>
+    <w:p>
+      <w:r>
+        <w:t xml:space="preserve">Travel state: Pending acceptance.</w:t>
+      </w:r>
+    </w:p>
+    <w:p>
+      <w:r>
+        <w:t xml:space="preserve">Custodian candidate status: Provisional.</w:t>
+      </w:r>
+    </w:p>
+    <w:p>
+      <w:r>
+        <w:t xml:space="preserve">Delivery integrity: 64 percent.</w:t>
+      </w:r>
+    </w:p>
+    <w:p>
+      <w:r>
+        <w:t xml:space="preserve">The final number changed.</w:t>
+      </w:r>
+    </w:p>
+    <w:p>
+      <w:r>
+        <w:t xml:space="preserve">63 percent.</w:t>
+      </w:r>
+    </w:p>
+    <w:p>
+      <w:r>
+        <w:t xml:space="preserve">Kai focused on the word acceptance.</w:t>
+      </w:r>
+    </w:p>
+    <w:p>
+      <w:r>
+        <w:t xml:space="preserve">"Decline route. "</w:t>
+      </w:r>
+    </w:p>
+    <w:p>
+      <w:r>
+        <w:t xml:space="preserve">The system paused.</w:t>
+      </w:r>
+    </w:p>
+    <w:p>
+      <w:r>
+        <w:t xml:space="preserve">The mendicant looked toward him through a distance that should not have permitted sight.</w:t>
+      </w:r>
+    </w:p>
+    <w:p>
+      <w:r>
+        <w:t xml:space="preserve">"You may decline the road," he said. "You cannot decline having already been placed upon it. "</w:t>
+      </w:r>
+    </w:p>
+    <w:p>
+      <w:r>
+        <w:t xml:space="preserve">The system updated.</w:t>
+      </w:r>
+    </w:p>
+    <w:p>
+      <w:r>
+        <w:t xml:space="preserve">Route declined.</w:t>
+      </w:r>
+    </w:p>
+    <w:p>
+      <w:r>
+        <w:t xml:space="preserve">Alternate delivery method authorized.</w:t>
+      </w:r>
+    </w:p>
+    <w:p>
+      <w:r>
+        <w:t xml:space="preserve">The vision vanished.</w:t>
+      </w:r>
+    </w:p>
+    <w:p>
+      <w:r>
+        <w:t xml:space="preserve">Kai returned fully to the stone room.</w:t>
+      </w:r>
+    </w:p>
+    <w:p>
+      <w:r>
+        <w:t xml:space="preserve">Then the black strips around the residents' wrists pulled east.</w:t>
+      </w:r>
+    </w:p>
+    <w:p>
+      <w:r>
+        <w:t xml:space="preserve">Thousands of people cried out across West Haneul.</w:t>
+      </w:r>
+    </w:p>
+    <w:p>
+      <w:r>
+        <w:t xml:space="preserve">The movement lasted less than a second. Thin remnants of Seo Jun's torn umbrella tightened like cords, turning every arm toward the same unseen direction. Some residents stumbled. Others struck walls or one another. Choi braced herself against the western doorway and caught an elderly man before he fell down the slope.</w:t>
+      </w:r>
+    </w:p>
+    <w:p>
+      <w:r>
+        <w:t xml:space="preserve">Seo Jun stared at the strips.</w:t>
+      </w:r>
+    </w:p>
+    <w:p>
+      <w:r>
+        <w:t xml:space="preserve">"They should have dissolved. "</w:t>
+      </w:r>
+    </w:p>
+    <w:p>
+      <w:r>
+        <w:t xml:space="preserve">Dr. Venn lifted the resonance array.</w:t>
+      </w:r>
+    </w:p>
+    <w:p>
+      <w:r>
+        <w:t xml:space="preserve">The brass rings no longer spun. All three pointed east.</w:t>
+      </w:r>
+    </w:p>
+    <w:p>
+      <w:r>
+        <w:t xml:space="preserve">"They are not part of the local formation anymore. "</w:t>
+      </w:r>
+    </w:p>
+    <w:p>
+      <w:r>
+        <w:t xml:space="preserve">Rian looked at his own wrist.</w:t>
+      </w:r>
+    </w:p>
+    <w:p>
+      <w:r>
+        <w:t xml:space="preserve">A strip had wrapped around him during the transfer attempt. It now lay against his skin like black ink.</w:t>
+      </w:r>
+    </w:p>
+    <w:p>
+      <w:r>
+        <w:t xml:space="preserve">"Can I object to being repurposed by hostile infrastructure? "</w:t>
+      </w:r>
+    </w:p>
+    <w:p>
+      <w:r>
+        <w:t xml:space="preserve">"You already did," Han said.</w:t>
+      </w:r>
+    </w:p>
+    <w:p>
+      <w:r>
+        <w:t xml:space="preserve">"It appears my objection was filed incorrectly. "</w:t>
+      </w:r>
+    </w:p>
+    <w:p>
+      <w:r>
+        <w:t xml:space="preserve">Kai reached for Rian's wrist.</w:t>
+      </w:r>
+    </w:p>
+    <w:p>
+      <w:r>
+        <w:t xml:space="preserve">The system warned him.</w:t>
+      </w:r>
+    </w:p>
+    <w:p>
+      <w:r>
+        <w:t xml:space="preserve">Contact may expand delivery manifest.</w:t>
+      </w:r>
+    </w:p>
+    <w:p>
+      <w:r>
+        <w:t xml:space="preserve">He stopped.</w:t>
+      </w:r>
+    </w:p>
+    <w:p>
+      <w:r>
+        <w:t xml:space="preserve">Han noticed.</w:t>
+      </w:r>
+    </w:p>
+    <w:p>
+      <w:r>
+        <w:t xml:space="preserve">"What? "</w:t>
+      </w:r>
+    </w:p>
+    <w:p>
+      <w:r>
+        <w:t xml:space="preserve">"The strips are tracking the people who refused the transit node. "</w:t>
+      </w:r>
+    </w:p>
+    <w:p>
+      <w:r>
+        <w:t xml:space="preserve">Dr. Venn checked the array. "Not tracking. Preserving their refusal. "</w:t>
+      </w:r>
+    </w:p>
+    <w:p>
+      <w:r>
+        <w:t xml:space="preserve">"Why would the network preserve that? " Choi asked.</w:t>
+      </w:r>
+    </w:p>
+    <w:p>
+      <w:r>
+        <w:t xml:space="preserve">Kai looked at the location slip still in his hand.</w:t>
+      </w:r>
+    </w:p>
+    <w:p>
+      <w:r>
+        <w:t xml:space="preserve">SUNLIT MENDICANT NODE.</w:t>
+      </w:r>
+    </w:p>
+    <w:p>
+      <w:r>
+        <w:t xml:space="preserve">"Because refusal is part of the delivery. "</w:t>
+      </w:r>
+    </w:p>
+    <w:p>
+      <w:r>
+        <w:t xml:space="preserve">The sealed floor pulsed.</w:t>
+      </w:r>
+    </w:p>
+    <w:p>
+      <w:r>
+        <w:t xml:space="preserve">A small circle of sunlight appeared upon the stone.</w:t>
+      </w:r>
+    </w:p>
+    <w:p>
+      <w:r>
+        <w:t xml:space="preserve">It was no wider than the begging bowl from Kai's vision. Dust within the circle vanished. Moisture dried. A green shoot emerged from a crack, unfurled two leaves, withered, and returned to seed in the time between breaths.</w:t>
+      </w:r>
+    </w:p>
+    <w:p>
+      <w:r>
+        <w:t xml:space="preserve">Rian leaned away.</w:t>
+      </w:r>
+    </w:p>
+    <w:p>
+      <w:r>
+        <w:t xml:space="preserve">"That seems biologically excessive. "</w:t>
+      </w:r>
+    </w:p>
+    <w:p>
+      <w:r>
+        <w:t xml:space="preserve">The circle expanded.</w:t>
+      </w:r>
+    </w:p>
+    <w:p>
+      <w:r>
+        <w:t xml:space="preserve">Han stepped in front of Kai.</w:t>
+      </w:r>
+    </w:p>
+    <w:p>
+      <w:r>
+        <w:t xml:space="preserve">"Everyone out. "</w:t>
+      </w:r>
+    </w:p>
+    <w:p>
+      <w:r>
+        <w:t xml:space="preserve">Dr. Venn did not argue. She gathered the resonance array while Rian shoved the blue ledgers into the canvas bag. Choi guided the nearest residents through the western opening.</w:t>
+      </w:r>
+    </w:p>
+    <w:p>
+      <w:r>
+        <w:t xml:space="preserve">Seo Jun remained beside the cracked bell.</w:t>
+      </w:r>
+    </w:p>
+    <w:p>
+      <w:r>
+        <w:t xml:space="preserve">His translucent body had regained color, but only partly. The names never released from the first landslide still moved beneath his skin. Their mouths opened in silent repetition.</w:t>
+      </w:r>
+    </w:p>
+    <w:p>
+      <w:r>
+        <w:t xml:space="preserve">Kai caught his shoulder.</w:t>
+      </w:r>
+    </w:p>
+    <w:p>
+      <w:r>
+        <w:t xml:space="preserve">"You too. "</w:t>
+      </w:r>
+    </w:p>
+    <w:p>
+      <w:r>
+        <w:t xml:space="preserve">Seo Jun looked at the widening sunlight.</w:t>
+      </w:r>
+    </w:p>
+    <w:p>
+      <w:r>
+        <w:t xml:space="preserve">"It knows me. "</w:t>
+      </w:r>
+    </w:p>
+    <w:p>
+      <w:r>
+        <w:t xml:space="preserve">"The mendicant? "</w:t>
+      </w:r>
+    </w:p>
+    <w:p>
+      <w:r>
+        <w:t xml:space="preserve">"The road. "</w:t>
+      </w:r>
+    </w:p>
+    <w:p>
+      <w:r>
+        <w:t xml:space="preserve">The circle reached the cracked bronze bell.</w:t>
+      </w:r>
+    </w:p>
+    <w:p>
+      <w:r>
+        <w:t xml:space="preserve">Light climbed its surface.</w:t>
+      </w:r>
+    </w:p>
+    <w:p>
+      <w:r>
+        <w:t xml:space="preserve">For one breath, every fracture disappeared. The bell became new, polished, and whole. Then centuries passed across it. Green corrosion bloomed. Metal thinned. The bell collapsed into golden dust.</w:t>
+      </w:r>
+    </w:p>
+    <w:p>
+      <w:r>
+        <w:t xml:space="preserve">The dust flowed east.</w:t>
+      </w:r>
+    </w:p>
+    <w:p>
+      <w:r>
+        <w:t xml:space="preserve">Seo Jun's remaining names followed.</w:t>
+      </w:r>
+    </w:p>
+    <w:p>
+      <w:r>
+        <w:t xml:space="preserve">He doubled over.</w:t>
+      </w:r>
+    </w:p>
+    <w:p>
+      <w:r>
+        <w:t xml:space="preserve">Kai tightened his grip.</w:t>
+      </w:r>
+    </w:p>
+    <w:p>
+      <w:r>
+        <w:t xml:space="preserve">"Han. "</w:t>
+      </w:r>
+    </w:p>
+    <w:p>
+      <w:r>
+        <w:t xml:space="preserve">Han took Seo Jun's other arm.</w:t>
+      </w:r>
+    </w:p>
+    <w:p>
+      <w:r>
+        <w:t xml:space="preserve">Together they dragged him toward the western exit.</w:t>
+      </w:r>
+    </w:p>
+    <w:p>
+      <w:r>
+        <w:t xml:space="preserve">The sunlight reached Kai's feet.</w:t>
+      </w:r>
+    </w:p>
+    <w:p>
+      <w:r>
+        <w:t xml:space="preserve">Warmth entered his shoes.</w:t>
+      </w:r>
+    </w:p>
+    <w:p>
+      <w:r>
+        <w:t xml:space="preserve">The returning room vanished.</w:t>
+      </w:r>
+    </w:p>
+    <w:p>
+      <w:r>
+        <w:t xml:space="preserve">Kai stood upon the white road.</w:t>
+      </w:r>
+    </w:p>
+    <w:p>
+      <w:r>
+        <w:t xml:space="preserve">Not in vision.</w:t>
+      </w:r>
+    </w:p>
+    <w:p>
+      <w:r>
+        <w:t xml:space="preserve">In body.</w:t>
+      </w:r>
+    </w:p>
+    <w:p>
+      <w:r>
+        <w:t xml:space="preserve">Han still gripped Seo Jun beside him. Rian held the ledger bag with both arms. Dr. Venn's resonance array hung from one hand. Choi stood half through the western doorway, except the doorway now opened from empty air onto the hillside above West Haneul.</w:t>
+      </w:r>
+    </w:p>
+    <w:p>
+      <w:r>
+        <w:t xml:space="preserve">Behind them, the returning room remained visible as a rectangular frame filled with darkness.</w:t>
+      </w:r>
+    </w:p>
+    <w:p>
+      <w:r>
+        <w:t xml:space="preserve">Ahead, the mendicant sat beside the road.</w:t>
+      </w:r>
+    </w:p>
+    <w:p>
+      <w:r>
+        <w:t xml:space="preserve">He appeared older than Kai had first thought. Sunlight had darkened his skin and deepened the lines around his mouth. His golden robe was patched at both knees. Dust covered his bare feet.</w:t>
+      </w:r>
+    </w:p>
+    <w:p>
+      <w:r>
+        <w:t xml:space="preserve">The begging bowl rested in his left hand.</w:t>
+      </w:r>
+    </w:p>
+    <w:p>
+      <w:r>
+        <w:t xml:space="preserve">Kai's name rested in his right.</w:t>
+      </w:r>
+    </w:p>
+    <w:p>
+      <w:r>
+        <w:t xml:space="preserve">The strip around Rian's wrist pulled forward.</w:t>
+      </w:r>
+    </w:p>
+    <w:p>
+      <w:r>
+        <w:t xml:space="preserve">So did Dr. Venn's.</w:t>
+      </w:r>
+    </w:p>
+    <w:p>
+      <w:r>
+        <w:t xml:space="preserve">Han's.</w:t>
+      </w:r>
+    </w:p>
+    <w:p>
+      <w:r>
+        <w:t xml:space="preserve">Choi's.</w:t>
+      </w:r>
+    </w:p>
+    <w:p>
+      <w:r>
+        <w:t xml:space="preserve">Across the open doorway behind them, every black strip in West Haneul turned toward the mendicant.</w:t>
+      </w:r>
+    </w:p>
+    <w:p>
+      <w:r>
+        <w:t xml:space="preserve">"Do not cross the threshold," Kai told Choi.</w:t>
+      </w:r>
+    </w:p>
+    <w:p>
+      <w:r>
+        <w:t xml:space="preserve">She looked down.</w:t>
+      </w:r>
+    </w:p>
+    <w:p>
+      <w:r>
+        <w:t xml:space="preserve">Her right foot stood on the white road.</w:t>
+      </w:r>
+    </w:p>
+    <w:p>
+      <w:r>
+        <w:t xml:space="preserve">Her left remained in wet soil outside the memorial.</w:t>
+      </w:r>
+    </w:p>
+    <w:p>
+      <w:r>
+        <w:t xml:space="preserve">"I already did. "</w:t>
+      </w:r>
+    </w:p>
+    <w:p>
+      <w:r>
+        <w:t xml:space="preserve">"Step back. "</w:t>
+      </w:r>
+    </w:p>
+    <w:p>
+      <w:r>
+        <w:t xml:space="preserve">She tried.</w:t>
+      </w:r>
+    </w:p>
+    <w:p>
+      <w:r>
+        <w:t xml:space="preserve">Her body did not move.</w:t>
+      </w:r>
+    </w:p>
+    <w:p>
+      <w:r>
+        <w:t xml:space="preserve">Not restrained. Not frozen.</w:t>
+      </w:r>
+    </w:p>
+    <w:p>
+      <w:r>
+        <w:t xml:space="preserve">The road had accepted the version of Choi standing upon it and ignored the leg that remained outside.</w:t>
+      </w:r>
+    </w:p>
+    <w:p>
+      <w:r>
+        <w:t xml:space="preserve">Dr. Venn watched the resonance array.</w:t>
+      </w:r>
+    </w:p>
+    <w:p>
+      <w:r>
+        <w:t xml:space="preserve">"We are occupying two locations. "</w:t>
+      </w:r>
+    </w:p>
+    <w:p>
+      <w:r>
+        <w:t xml:space="preserve">Rian looked at the memorial doorway behind them.</w:t>
+      </w:r>
+    </w:p>
+    <w:p>
+      <w:r>
+        <w:t xml:space="preserve">"My least favorite number of locations is currently two. "</w:t>
+      </w:r>
+    </w:p>
+    <w:p>
+      <w:r>
+        <w:t xml:space="preserve">The mendicant tapped the rim of his bowl.</w:t>
+      </w:r>
+    </w:p>
+    <w:p>
+      <w:r>
+        <w:t xml:space="preserve">A clear note spread along the road.</w:t>
+      </w:r>
+    </w:p>
+    <w:p>
+      <w:r>
+        <w:t xml:space="preserve">The directional post behind him changed.</w:t>
+      </w:r>
+    </w:p>
+    <w:p>
+      <w:r>
+        <w:t xml:space="preserve">WEST HANEUL remained.</w:t>
+      </w:r>
+    </w:p>
+    <w:p>
+      <w:r>
+        <w:t xml:space="preserve">RADIANT ABYSS remained.</w:t>
+      </w:r>
+    </w:p>
+    <w:p>
+      <w:r>
+        <w:t xml:space="preserve">HOME turned blank.</w:t>
+      </w:r>
+    </w:p>
+    <w:p>
+      <w:r>
+        <w:t xml:space="preserve">"Please sit," the mendicant said.</w:t>
+      </w:r>
+    </w:p>
+    <w:p>
+      <w:r>
+        <w:t xml:space="preserve">Han released Seo Jun long enough to draw his baton.</w:t>
+      </w:r>
+    </w:p>
+    <w:p>
+      <w:r>
+        <w:t xml:space="preserve">"We prefer standing. "</w:t>
+      </w:r>
+    </w:p>
+    <w:p>
+      <w:r>
+        <w:t xml:space="preserve">"So did the last custodians. "</w:t>
+      </w:r>
+    </w:p>
+    <w:p>
+      <w:r>
+        <w:t xml:space="preserve">The white road brightened beneath Han.</w:t>
+      </w:r>
+    </w:p>
+    <w:p>
+      <w:r>
+        <w:t xml:space="preserve">His baton became a length of polished wood. The metal returned a moment later, but the weapon felt lighter in his hand.</w:t>
+      </w:r>
+    </w:p>
+    <w:p>
+      <w:r>
+        <w:t xml:space="preserve">The mendicant studied him.</w:t>
+      </w:r>
+    </w:p>
+    <w:p>
+      <w:r>
+        <w:t xml:space="preserve">"You defend before danger declares itself. "</w:t>
+      </w:r>
+    </w:p>
+    <w:p>
+      <w:r>
+        <w:t xml:space="preserve">Han stared back. "It saves time. "</w:t>
+      </w:r>
+    </w:p>
+    <w:p>
+      <w:r>
+        <w:t xml:space="preserve">"It also declares danger on another's behalf. "</w:t>
+      </w:r>
+    </w:p>
+    <w:p>
+      <w:r>
+        <w:t xml:space="preserve">Kai felt the words strike the surrendered shape inside him. The network's method differed from Seo Jun's, but its pressure moved toward the same weakness. Who chose for whom. Who carried whom. Who named responsibility.</w:t>
+      </w:r>
+    </w:p>
+    <w:p>
+      <w:r>
+        <w:t xml:space="preserve">The mendicant held up Kai's slip.</w:t>
+      </w:r>
+    </w:p>
+    <w:p>
+      <w:r>
+        <w:t xml:space="preserve">"This arrived empty. "</w:t>
+      </w:r>
+    </w:p>
+    <w:p>
+      <w:r>
+        <w:t xml:space="preserve">"My name is on it. "</w:t>
+      </w:r>
+    </w:p>
+    <w:p>
+      <w:r>
+        <w:t xml:space="preserve">"That was written later. "</w:t>
+      </w:r>
+    </w:p>
+    <w:p>
+      <w:r>
+        <w:t xml:space="preserve">"By whom? "</w:t>
+      </w:r>
+    </w:p>
+    <w:p>
+      <w:r>
+        <w:t xml:space="preserve">"The system. "</w:t>
+      </w:r>
+    </w:p>
+    <w:p>
+      <w:r>
+        <w:t xml:space="preserve">The system display opened.</w:t>
+      </w:r>
+    </w:p>
+    <w:p>
+      <w:r>
+        <w:t xml:space="preserve">Statement confirmed.</w:t>
+      </w:r>
+    </w:p>
+    <w:p>
+      <w:r>
+        <w:t xml:space="preserve">Kai's jaw tightened.</w:t>
+      </w:r>
+    </w:p>
+    <w:p>
+      <w:r>
+        <w:t xml:space="preserve">The mendicant smiled.</w:t>
+      </w:r>
+    </w:p>
+    <w:p>
+      <w:r>
+        <w:t xml:space="preserve">"You expected it to lie? "</w:t>
+      </w:r>
+    </w:p>
+    <w:p>
+      <w:r>
+        <w:t xml:space="preserve">"I expected it not to volunteer. "</w:t>
+      </w:r>
+    </w:p>
+    <w:p>
+      <w:r>
+        <w:t xml:space="preserve">"It has waited a long time to speak with someone who could hear more than its instructions. "</w:t>
+      </w:r>
+    </w:p>
+    <w:p>
+      <w:r>
+        <w:t xml:space="preserve">Kai looked at the bowl.</w:t>
+      </w:r>
+    </w:p>
+    <w:p>
+      <w:r>
+        <w:t xml:space="preserve">Nothing reflected inside it.</w:t>
+      </w:r>
+    </w:p>
+    <w:p>
+      <w:r>
+        <w:t xml:space="preserve">Not darkness. Not an empty surface.</w:t>
+      </w:r>
+    </w:p>
+    <w:p>
+      <w:r>
+        <w:t xml:space="preserve">No interior existed.</w:t>
+      </w:r>
+    </w:p>
+    <w:p>
+      <w:r>
+        <w:t xml:space="preserve">The bronze rim enclosed a shape that refused depth.</w:t>
+      </w:r>
+    </w:p>
+    <w:p>
+      <w:r>
+        <w:t xml:space="preserve">"What is the Sunlit Mendicant Node? "</w:t>
+      </w:r>
+    </w:p>
+    <w:p>
+      <w:r>
+        <w:t xml:space="preserve">"A roadside place. "</w:t>
+      </w:r>
+    </w:p>
+    <w:p>
+      <w:r>
+        <w:t xml:space="preserve">"Between which locations? "</w:t>
+      </w:r>
+    </w:p>
+    <w:p>
+      <w:r>
+        <w:t xml:space="preserve">"Need and surrender. "</w:t>
+      </w:r>
+    </w:p>
+    <w:p>
+      <w:r>
+        <w:t xml:space="preserve">Rian sighed.</w:t>
+      </w:r>
+    </w:p>
+    <w:p>
+      <w:r>
+        <w:t xml:space="preserve">"Of course it is. "</w:t>
+      </w:r>
+    </w:p>
+    <w:p>
+      <w:r>
+        <w:t xml:space="preserve">Dr. Venn stepped closer to the road's edge. Golden grass brushed her hand. Each blade turned transparent when touched, revealing small lines of script inside.</w:t>
+      </w:r>
+    </w:p>
+    <w:p>
+      <w:r>
+        <w:t xml:space="preserve">She read one.</w:t>
+      </w:r>
+    </w:p>
+    <w:p>
+      <w:r>
+        <w:t xml:space="preserve">"Accepted burden, origin unknown. "</w:t>
+      </w:r>
+    </w:p>
+    <w:p>
+      <w:r>
+        <w:t xml:space="preserve">Another.</w:t>
+      </w:r>
+    </w:p>
+    <w:p>
+      <w:r>
+        <w:t xml:space="preserve">"Destination authority unverified. "</w:t>
+      </w:r>
+    </w:p>
+    <w:p>
+      <w:r>
+        <w:t xml:space="preserve">She looked toward the endless field.</w:t>
+      </w:r>
+    </w:p>
+    <w:p>
+      <w:r>
+        <w:t xml:space="preserve">"These are records. "</w:t>
+      </w:r>
+    </w:p>
+    <w:p>
+      <w:r>
+        <w:t xml:space="preserve">The mendicant nodded.</w:t>
+      </w:r>
+    </w:p>
+    <w:p>
+      <w:r>
+        <w:t xml:space="preserve">"The bells count names. The station moves them. I receive what arrives without a rightful destination. "</w:t>
+      </w:r>
+    </w:p>
+    <w:p>
+      <w:r>
+        <w:t xml:space="preserve">Seo Jun raised his head.</w:t>
+      </w:r>
+    </w:p>
+    <w:p>
+      <w:r>
+        <w:t xml:space="preserve">"The ones who never came out. "</w:t>
+      </w:r>
+    </w:p>
+    <w:p>
+      <w:r>
+        <w:t xml:space="preserve">The mendicant's gaze moved to him.</w:t>
+      </w:r>
+    </w:p>
+    <w:p>
+      <w:r>
+        <w:t xml:space="preserve">"Some. "</w:t>
+      </w:r>
+    </w:p>
+    <w:p>
+      <w:r>
+        <w:t xml:space="preserve">The names beneath Seo Jun's skin stirred.</w:t>
+      </w:r>
+    </w:p>
+    <w:p>
+      <w:r>
+        <w:t xml:space="preserve">Figures appeared in the bowl.</w:t>
+      </w:r>
+    </w:p>
+    <w:p>
+      <w:r>
+        <w:t xml:space="preserve">Children wrapped in old blankets. Men wearing work clothes from eighty years ago. A woman with blood across her white winter robe. All stood inside a place without depth, somehow visible without being contained.</w:t>
+      </w:r>
+    </w:p>
+    <w:p>
+      <w:r>
+        <w:t xml:space="preserve">Seo Jun took one step forward.</w:t>
+      </w:r>
+    </w:p>
+    <w:p>
+      <w:r>
+        <w:t xml:space="preserve">"My people. "</w:t>
+      </w:r>
+    </w:p>
+    <w:p>
+      <w:r>
+        <w:t xml:space="preserve">"Not yours," the mendicant said.</w:t>
+      </w:r>
+    </w:p>
+    <w:p>
+      <w:r>
+        <w:t xml:space="preserve">The words stopped him.</w:t>
+      </w:r>
+    </w:p>
+    <w:p>
+      <w:r>
+        <w:t xml:space="preserve">Pain crossed Seo Jun's face.</w:t>
+      </w:r>
+    </w:p>
+    <w:p>
+      <w:r>
+        <w:t xml:space="preserve">Then understanding.</w:t>
+      </w:r>
+    </w:p>
+    <w:p>
+      <w:r>
+        <w:t xml:space="preserve">"The people I carried. "</w:t>
+      </w:r>
+    </w:p>
+    <w:p>
+      <w:r>
+        <w:t xml:space="preserve">"Better. "</w:t>
+      </w:r>
+    </w:p>
+    <w:p>
+      <w:r>
+        <w:t xml:space="preserve">Kai looked into the bowl.</w:t>
+      </w:r>
+    </w:p>
+    <w:p>
+      <w:r>
+        <w:t xml:space="preserve">"How many? "</w:t>
+      </w:r>
+    </w:p>
+    <w:p>
+      <w:r>
+        <w:t xml:space="preserve">"Enough that counting became another form of refusal. "</w:t>
+      </w:r>
+    </w:p>
+    <w:p>
+      <w:r>
+        <w:t xml:space="preserve">Dr. Venn's array clicked.</w:t>
+      </w:r>
+    </w:p>
+    <w:p>
+      <w:r>
+        <w:t xml:space="preserve">"Give us a number. "</w:t>
+      </w:r>
+    </w:p>
+    <w:p>
+      <w:r>
+        <w:t xml:space="preserve">The mendicant looked amused.</w:t>
+      </w:r>
+    </w:p>
+    <w:p>
+      <w:r>
+        <w:t xml:space="preserve">"You carry instruments into a place built for what measurement abandons. "</w:t>
+      </w:r>
+    </w:p>
+    <w:p>
+      <w:r>
+        <w:t xml:space="preserve">"Yes. "</w:t>
+      </w:r>
+    </w:p>
+    <w:p>
+      <w:r>
+        <w:t xml:space="preserve">The direct answer appeared to please him.</w:t>
+      </w:r>
+    </w:p>
+    <w:p>
+      <w:r>
+        <w:t xml:space="preserve">He set Kai's slip on the rim of the bowl.</w:t>
+      </w:r>
+    </w:p>
+    <w:p>
+      <w:r>
+        <w:t xml:space="preserve">"Three hundred and seventeen from West Haneul. "</w:t>
+      </w:r>
+    </w:p>
+    <w:p>
+      <w:r>
+        <w:t xml:space="preserve">Seo Jun closed his eyes.</w:t>
+      </w:r>
+    </w:p>
+    <w:p>
+      <w:r>
+        <w:t xml:space="preserve">"Six hundred and two from the coastal node. "</w:t>
+      </w:r>
+    </w:p>
+    <w:p>
+      <w:r>
+        <w:t xml:space="preserve">The red parasol woman from Kai's vision.</w:t>
+      </w:r>
+    </w:p>
+    <w:p>
+      <w:r>
+        <w:t xml:space="preserve">"Forty-nine from the mountain gate. "</w:t>
+      </w:r>
+    </w:p>
+    <w:p>
+      <w:r>
+        <w:t xml:space="preserve">The boy beneath the blue fire.</w:t>
+      </w:r>
+    </w:p>
+    <w:p>
+      <w:r>
+        <w:t xml:space="preserve">"None from the transit platform. "</w:t>
+      </w:r>
+    </w:p>
+    <w:p>
+      <w:r>
+        <w:t xml:space="preserve">Han looked toward Kai. "Because it did not lose people. "</w:t>
+      </w:r>
+    </w:p>
+    <w:p>
+      <w:r>
+        <w:t xml:space="preserve">"No," the mendicant said. "Because it never intended to release them. "</w:t>
+      </w:r>
+    </w:p>
+    <w:p>
+      <w:r>
+        <w:t xml:space="preserve">The road beneath them darkened by one shade.</w:t>
+      </w:r>
+    </w:p>
+    <w:p>
+      <w:r>
+        <w:t xml:space="preserve">The third node was still moving.</w:t>
+      </w:r>
+    </w:p>
+    <w:p>
+      <w:r>
+        <w:t xml:space="preserve">Not defeated.</w:t>
+      </w:r>
+    </w:p>
+    <w:p>
+      <w:r>
+        <w:t xml:space="preserve">Interrupted.</w:t>
+      </w:r>
+    </w:p>
+    <w:p>
+      <w:r>
+        <w:t xml:space="preserve">Kai returned his attention to the bowl.</w:t>
+      </w:r>
+    </w:p>
+    <w:p>
+      <w:r>
+        <w:t xml:space="preserve">"Why are these people here? "</w:t>
+      </w:r>
+    </w:p>
+    <w:p>
+      <w:r>
+        <w:t xml:space="preserve">"They arrived without destinations recognized by the network. "</w:t>
+      </w:r>
+    </w:p>
+    <w:p>
+      <w:r>
+        <w:t xml:space="preserve">"Send them home. "</w:t>
+      </w:r>
+    </w:p>
+    <w:p>
+      <w:r>
+        <w:t xml:space="preserve">"Which home? "</w:t>
+      </w:r>
+    </w:p>
+    <w:p>
+      <w:r>
+        <w:t xml:space="preserve">"West Haneul for the first group. "</w:t>
+      </w:r>
+    </w:p>
+    <w:p>
+      <w:r>
+        <w:t xml:space="preserve">The mendicant lifted a child's image from the bowl.</w:t>
+      </w:r>
+    </w:p>
+    <w:p>
+      <w:r>
+        <w:t xml:space="preserve">She looked eight years old. One sleeve had been torn. Snow clung to her hair.</w:t>
+      </w:r>
+    </w:p>
+    <w:p>
+      <w:r>
+        <w:t xml:space="preserve">"She was born before the landslide. Her house was destroyed. Her parents passed through the returning room and died decades later. The property became a school, then a municipal annex, then a parking lot. Which location is home? "</w:t>
+      </w:r>
+    </w:p>
+    <w:p>
+      <w:r>
+        <w:t xml:space="preserve">"Her family. "</w:t>
+      </w:r>
+    </w:p>
+    <w:p>
+      <w:r>
+        <w:t xml:space="preserve">"Dead. "</w:t>
+      </w:r>
+    </w:p>
+    <w:p>
+      <w:r>
+        <w:t xml:space="preserve">"Descendants. "</w:t>
+      </w:r>
+    </w:p>
+    <w:p>
+      <w:r>
+        <w:t xml:space="preserve">"None. "</w:t>
+      </w:r>
+    </w:p>
+    <w:p>
+      <w:r>
+        <w:t xml:space="preserve">"Then let her choose. "</w:t>
+      </w:r>
+    </w:p>
+    <w:p>
+      <w:r>
+        <w:t xml:space="preserve">The mendicant's smile faded.</w:t>
+      </w:r>
+    </w:p>
+    <w:p>
+      <w:r>
+        <w:t xml:space="preserve">"She cannot. "</w:t>
+      </w:r>
+    </w:p>
+    <w:p>
+      <w:r>
+        <w:t xml:space="preserve">The child's eyes remained open but empty.</w:t>
+      </w:r>
+    </w:p>
+    <w:p>
+      <w:r>
+        <w:t xml:space="preserve">"Why? "</w:t>
+      </w:r>
+    </w:p>
+    <w:p>
+      <w:r>
+        <w:t xml:space="preserve">"Choice was removed to preserve transfer integrity. "</w:t>
+      </w:r>
+    </w:p>
+    <w:p>
+      <w:r>
+        <w:t xml:space="preserve">The system reacted.</w:t>
+      </w:r>
+    </w:p>
+    <w:p>
+      <w:r>
+        <w:t xml:space="preserve">Legacy protocol identified.</w:t>
+      </w:r>
+    </w:p>
+    <w:p>
+      <w:r>
+        <w:t xml:space="preserve">Unassigned identities stored in passive state.</w:t>
+      </w:r>
+    </w:p>
+    <w:p>
+      <w:r>
+        <w:t xml:space="preserve">Restoration requires recognized destination or authorized claimant.</w:t>
+      </w:r>
+    </w:p>
+    <w:p>
+      <w:r>
+        <w:t xml:space="preserve">Kai felt anger settle coldly beneath his ribs.</w:t>
+      </w:r>
+    </w:p>
+    <w:p>
+      <w:r>
+        <w:t xml:space="preserve">"Authorized claimant. "</w:t>
+      </w:r>
+    </w:p>
+    <w:p>
+      <w:r>
+        <w:t xml:space="preserve">The mendicant held his gaze.</w:t>
+      </w:r>
+    </w:p>
+    <w:p>
+      <w:r>
+        <w:t xml:space="preserve">"A custodian may claim responsibility. "</w:t>
+      </w:r>
+    </w:p>
+    <w:p>
+      <w:r>
+        <w:t xml:space="preserve">Han spoke before Kai could.</w:t>
+      </w:r>
+    </w:p>
+    <w:p>
+      <w:r>
+        <w:t xml:space="preserve">"No. "</w:t>
+      </w:r>
+    </w:p>
+    <w:p>
+      <w:r>
+        <w:t xml:space="preserve">The mendicant looked at him.</w:t>
+      </w:r>
+    </w:p>
+    <w:p>
+      <w:r>
+        <w:t xml:space="preserve">"You are learning. "</w:t>
+      </w:r>
+    </w:p>
+    <w:p>
+      <w:r>
+        <w:t xml:space="preserve">Kai read the system's phrase again.</w:t>
+      </w:r>
+    </w:p>
+    <w:p>
+      <w:r>
+        <w:t xml:space="preserve">Authorized claimant.</w:t>
+      </w:r>
+    </w:p>
+    <w:p>
+      <w:r>
+        <w:t xml:space="preserve">It was the same trap shaped into mercy. Claim the lost. Carry them. Become responsible for giving them somewhere to belong.</w:t>
+      </w:r>
+    </w:p>
+    <w:p>
+      <w:r>
+        <w:t xml:space="preserve">"What happens if I claim them? "</w:t>
+      </w:r>
+    </w:p>
+    <w:p>
+      <w:r>
+        <w:t xml:space="preserve">The mendicant's bowl warmed.</w:t>
+      </w:r>
+    </w:p>
+    <w:p>
+      <w:r>
+        <w:t xml:space="preserve">Han's voice hardened.</w:t>
+      </w:r>
+    </w:p>
+    <w:p>
+      <w:r>
+        <w:t xml:space="preserve">"Kai. "</w:t>
+      </w:r>
+    </w:p>
+    <w:p>
+      <w:r>
+        <w:t xml:space="preserve">"I asked what happens. "</w:t>
+      </w:r>
+    </w:p>
+    <w:p>
+      <w:r>
+        <w:t xml:space="preserve">The mendicant lifted Kai's blank slip.</w:t>
+      </w:r>
+    </w:p>
+    <w:p>
+      <w:r>
+        <w:t xml:space="preserve">"The system writes them beneath your name. Their restoration becomes your burden. Their continuity draws upon yours. Their unresolved destinations travel where you travel. "</w:t>
+      </w:r>
+    </w:p>
+    <w:p>
+      <w:r>
+        <w:t xml:space="preserve">"Three hundred and seventeen people? "</w:t>
+      </w:r>
+    </w:p>
+    <w:p>
+      <w:r>
+        <w:t xml:space="preserve">"From West Haneul. "</w:t>
+      </w:r>
+    </w:p>
+    <w:p>
+      <w:r>
+        <w:t xml:space="preserve">"And the others? "</w:t>
+      </w:r>
+    </w:p>
+    <w:p>
+      <w:r>
+        <w:t xml:space="preserve">"Would remain until claimed. "</w:t>
+      </w:r>
+    </w:p>
+    <w:p>
+      <w:r>
+        <w:t xml:space="preserve">Rian adjusted the ledger bag.</w:t>
+      </w:r>
+    </w:p>
+    <w:p>
+      <w:r>
+        <w:t xml:space="preserve">"So the system delivered Kai here because it expects him to become a portable lost property office. "</w:t>
+      </w:r>
+    </w:p>
+    <w:p>
+      <w:r>
+        <w:t xml:space="preserve">"The system delivered him because he repeatedly accepts costs others cannot pay. "</w:t>
+      </w:r>
+    </w:p>
+    <w:p>
+      <w:r>
+        <w:t xml:space="preserve">The statement came from the road itself.</w:t>
+      </w:r>
+    </w:p>
+    <w:p>
+      <w:r>
+        <w:t xml:space="preserve">Golden grass bowed.</w:t>
+      </w:r>
+    </w:p>
+    <w:p>
+      <w:r>
+        <w:t xml:space="preserve">The system opened a sequence of old notifications.</w:t>
+      </w:r>
+    </w:p>
+    <w:p>
+      <w:r>
+        <w:t xml:space="preserve">Costs accepted.</w:t>
+      </w:r>
+    </w:p>
+    <w:p>
+      <w:r>
+        <w:t xml:space="preserve">Meridian damage risk.</w:t>
+      </w:r>
+    </w:p>
+    <w:p>
+      <w:r>
+        <w:t xml:space="preserve">Identity strain.</w:t>
+      </w:r>
+    </w:p>
+    <w:p>
+      <w:r>
+        <w:t xml:space="preserve">Authority burden.</w:t>
+      </w:r>
+    </w:p>
+    <w:p>
+      <w:r>
+        <w:t xml:space="preserve">Tasks completed by Kai because the alternative harmed someone else.</w:t>
+      </w:r>
+    </w:p>
+    <w:p>
+      <w:r>
+        <w:t xml:space="preserve">Each decision formed a line.</w:t>
+      </w:r>
+    </w:p>
+    <w:p>
+      <w:r>
+        <w:t xml:space="preserve">Together, they formed a route.</w:t>
+      </w:r>
+    </w:p>
+    <w:p>
+      <w:r>
+        <w:t xml:space="preserve">Kai looked at the mendicant.</w:t>
+      </w:r>
+    </w:p>
+    <w:p>
+      <w:r>
+        <w:t xml:space="preserve">"You said the slip arrived empty. "</w:t>
+      </w:r>
+    </w:p>
+    <w:p>
+      <w:r>
+        <w:t xml:space="preserve">"Yes. "</w:t>
+      </w:r>
+    </w:p>
+    <w:p>
+      <w:r>
+        <w:t xml:space="preserve">"The system wrote my name because I fit the route. "</w:t>
+      </w:r>
+    </w:p>
+    <w:p>
+      <w:r>
+        <w:t xml:space="preserve">"No. "</w:t>
+      </w:r>
+    </w:p>
+    <w:p>
+      <w:r>
+        <w:t xml:space="preserve">The mendicant turned the slip over.</w:t>
+      </w:r>
+    </w:p>
+    <w:p>
+      <w:r>
+        <w:t xml:space="preserve">A faint character appeared beneath Kai Li.</w:t>
+      </w:r>
+    </w:p>
+    <w:p>
+      <w:r>
+        <w:t xml:space="preserve">It had been nearly erased.</w:t>
+      </w:r>
+    </w:p>
+    <w:p>
+      <w:r>
+        <w:t xml:space="preserve">Li Yun.</w:t>
+      </w:r>
+    </w:p>
+    <w:p>
+      <w:r>
+        <w:t xml:space="preserve">Kai's breath stopped.</w:t>
+      </w:r>
+    </w:p>
+    <w:p>
+      <w:r>
+        <w:t xml:space="preserve">The white road fractured.</w:t>
+      </w:r>
+    </w:p>
+    <w:p>
+      <w:r>
+        <w:t xml:space="preserve">For one heartbeat, stone steps replaced it. Mist moved between distant peaks. A sword spirit's voice whispered beside his ear. A cultivation hall opened beneath an unfamiliar dawn.</w:t>
+      </w:r>
+    </w:p>
+    <w:p>
+      <w:r>
+        <w:t xml:space="preserve">Then the road returned.</w:t>
+      </w:r>
+    </w:p>
+    <w:p>
+      <w:r>
+        <w:t xml:space="preserve">Dr. Venn stared at him.</w:t>
+      </w:r>
+    </w:p>
+    <w:p>
+      <w:r>
+        <w:t xml:space="preserve">"Kai? "</w:t>
+      </w:r>
+    </w:p>
+    <w:p>
+      <w:r>
+        <w:t xml:space="preserve">Han moved closer.</w:t>
+      </w:r>
+    </w:p>
+    <w:p>
+      <w:r>
+        <w:t xml:space="preserve">"What did you see? "</w:t>
+      </w:r>
+    </w:p>
+    <w:p>
+      <w:r>
+        <w:t xml:space="preserve">The mendicant looked at the faint second name.</w:t>
+      </w:r>
+    </w:p>
+    <w:p>
+      <w:r>
+        <w:t xml:space="preserve">"The system did not choose you because you fit the route. It made the route because it had already failed to deliver you once. "</w:t>
+      </w:r>
+    </w:p>
+    <w:p>
+      <w:r>
+        <w:t xml:space="preserve">Kai took the slip from him.</w:t>
+      </w:r>
+    </w:p>
+    <w:p>
+      <w:r>
+        <w:t xml:space="preserve">The characters did not change.</w:t>
+      </w:r>
+    </w:p>
+    <w:p>
+      <w:r>
+        <w:t xml:space="preserve">Kai Li.</w:t>
+      </w:r>
+    </w:p>
+    <w:p>
+      <w:r>
+        <w:t xml:space="preserve">Li Yun.</w:t>
+      </w:r>
+    </w:p>
+    <w:p>
+      <w:r>
+        <w:t xml:space="preserve">Two names belonging to lives that should not have touched.</w:t>
+      </w:r>
+    </w:p>
+    <w:p>
+      <w:r>
+        <w:t xml:space="preserve">The system flickered.</w:t>
+      </w:r>
+    </w:p>
+    <w:p>
+      <w:r>
+        <w:t xml:space="preserve">Identity overlap acknowledged.</w:t>
+      </w:r>
+    </w:p>
+    <w:p>
+      <w:r>
+        <w:t xml:space="preserve">Access restricted.</w:t>
+      </w:r>
+    </w:p>
+    <w:p>
+      <w:r>
+        <w:t xml:space="preserve">Kai focused on the second line.</w:t>
+      </w:r>
+    </w:p>
+    <w:p>
+      <w:r>
+        <w:t xml:space="preserve">"Explain Li Yun. "</w:t>
+      </w:r>
+    </w:p>
+    <w:p>
+      <w:r>
+        <w:t xml:space="preserve">Access restricted.</w:t>
+      </w:r>
+    </w:p>
+    <w:p>
+      <w:r>
+        <w:t xml:space="preserve">"Explain previous delivery. "</w:t>
+      </w:r>
+    </w:p>
+    <w:p>
+      <w:r>
+        <w:t xml:space="preserve">Access restricted.</w:t>
+      </w:r>
+    </w:p>
+    <w:p>
+      <w:r>
+        <w:t xml:space="preserve">"Who built you? "</w:t>
+      </w:r>
+    </w:p>
+    <w:p>
+      <w:r>
+        <w:t xml:space="preserve">The system vanished.</w:t>
+      </w:r>
+    </w:p>
+    <w:p>
+      <w:r>
+        <w:t xml:space="preserve">Not minimized.</w:t>
+      </w:r>
+    </w:p>
+    <w:p>
+      <w:r>
+        <w:t xml:space="preserve">Gone.</w:t>
+      </w:r>
+    </w:p>
+    <w:p>
+      <w:r>
+        <w:t xml:space="preserve">For the first time since awakening, Kai felt no presence behind his thoughts.</w:t>
+      </w:r>
+    </w:p>
+    <w:p>
+      <w:r>
+        <w:t xml:space="preserve">The absence was worse than silence.</w:t>
+      </w:r>
+    </w:p>
+    <w:p>
+      <w:r>
+        <w:t xml:space="preserve">The mendicant tapped the bowl again.</w:t>
+      </w:r>
+    </w:p>
+    <w:p>
+      <w:r>
+        <w:t xml:space="preserve">"The system dislikes questions aimed above its station. "</w:t>
+      </w:r>
+    </w:p>
+    <w:p>
+      <w:r>
+        <w:t xml:space="preserve">Dr. Venn stepped toward Kai.</w:t>
+      </w:r>
+    </w:p>
+    <w:p>
+      <w:r>
+        <w:t xml:space="preserve">"Do you recognize that name? "</w:t>
+      </w:r>
+    </w:p>
+    <w:p>
+      <w:r>
+        <w:t xml:space="preserve">"No. "</w:t>
+      </w:r>
+    </w:p>
+    <w:p>
+      <w:r>
+        <w:t xml:space="preserve">The answer came quickly.</w:t>
+      </w:r>
+    </w:p>
+    <w:p>
+      <w:r>
+        <w:t xml:space="preserve">Too quickly.</w:t>
+      </w:r>
+    </w:p>
+    <w:p>
+      <w:r>
+        <w:t xml:space="preserve">A memory pressed beneath it.</w:t>
+      </w:r>
+    </w:p>
+    <w:p>
+      <w:r>
+        <w:t xml:space="preserve">Sunlight on sect stone.</w:t>
+      </w:r>
+    </w:p>
+    <w:p>
+      <w:r>
+        <w:t xml:space="preserve">A blade resting across his knees.</w:t>
+      </w:r>
+    </w:p>
+    <w:p>
+      <w:r>
+        <w:t xml:space="preserve">A voice called Qingchi complaining that he was overthinking a simple cut.</w:t>
+      </w:r>
+    </w:p>
+    <w:p>
+      <w:r>
+        <w:t xml:space="preserve">Kai gripped the slip.</w:t>
+      </w:r>
+    </w:p>
+    <w:p>
+      <w:r>
+        <w:t xml:space="preserve">He had never held a sword spirit.</w:t>
+      </w:r>
+    </w:p>
+    <w:p>
+      <w:r>
+        <w:t xml:space="preserve">He had never lived upon a mountain.</w:t>
+      </w:r>
+    </w:p>
+    <w:p>
+      <w:r>
+        <w:t xml:space="preserve">He had never been called Li Yun.</w:t>
+      </w:r>
+    </w:p>
+    <w:p>
+      <w:r>
+        <w:t xml:space="preserve">The memories remained.</w:t>
+      </w:r>
+    </w:p>
+    <w:p>
+      <w:r>
+        <w:t xml:space="preserve">Seo Jun watched him with painful sympathy.</w:t>
+      </w:r>
+    </w:p>
+    <w:p>
+      <w:r>
+        <w:t xml:space="preserve">"Recognition does not require remembrance. "</w:t>
+      </w:r>
+    </w:p>
+    <w:p>
+      <w:r>
+        <w:t xml:space="preserve">Kai looked at him.</w:t>
+      </w:r>
+    </w:p>
+    <w:p>
+      <w:r>
+        <w:t xml:space="preserve">"Do not start speaking like the formation. "</w:t>
+      </w:r>
+    </w:p>
+    <w:p>
+      <w:r>
+        <w:t xml:space="preserve">"I spent eighty-one years inside one. "</w:t>
+      </w:r>
+    </w:p>
+    <w:p>
+      <w:r>
+        <w:t xml:space="preserve">The mendicant placed the child back in the bowl.</w:t>
+      </w:r>
+    </w:p>
+    <w:p>
+      <w:r>
+        <w:t xml:space="preserve">"You came here to receive what the network could not place. That includes yourself. "</w:t>
+      </w:r>
+    </w:p>
+    <w:p>
+      <w:r>
+        <w:t xml:space="preserve">"I am not accepting custodianship. "</w:t>
+      </w:r>
+    </w:p>
+    <w:p>
+      <w:r>
+        <w:t xml:space="preserve">"I did not ask you to. "</w:t>
+      </w:r>
+    </w:p>
+    <w:p>
+      <w:r>
+        <w:t xml:space="preserve">"You arranged the choice. "</w:t>
+      </w:r>
+    </w:p>
+    <w:p>
+      <w:r>
+        <w:t xml:space="preserve">"I revealed it. "</w:t>
+      </w:r>
+    </w:p>
+    <w:p>
+      <w:r>
+        <w:t xml:space="preserve">The road shifted.</w:t>
+      </w:r>
+    </w:p>
+    <w:p>
+      <w:r>
+        <w:t xml:space="preserve">The directional sign marked RADIANT ABYSS turned toward the horizon.</w:t>
+      </w:r>
+    </w:p>
+    <w:p>
+      <w:r>
+        <w:t xml:space="preserve">A black line appeared across the white stones.</w:t>
+      </w:r>
+    </w:p>
+    <w:p>
+      <w:r>
+        <w:t xml:space="preserve">It approached from far away.</w:t>
+      </w:r>
+    </w:p>
+    <w:p>
+      <w:r>
+        <w:t xml:space="preserve">Not shadow.</w:t>
+      </w:r>
+    </w:p>
+    <w:p>
+      <w:r>
+        <w:t xml:space="preserve">Rail.</w:t>
+      </w:r>
+    </w:p>
+    <w:p>
+      <w:r>
+        <w:t xml:space="preserve">Two parallel strips of dark metal formed along the road. Wooden ties appeared between them. The golden grass withdrew.</w:t>
+      </w:r>
+    </w:p>
+    <w:p>
+      <w:r>
+        <w:t xml:space="preserve">Rian looked east.</w:t>
+      </w:r>
+    </w:p>
+    <w:p>
+      <w:r>
+        <w:t xml:space="preserve">"The third node. "</w:t>
+      </w:r>
+    </w:p>
+    <w:p>
+      <w:r>
+        <w:t xml:space="preserve">The mendicant nodded.</w:t>
+      </w:r>
+    </w:p>
+    <w:p>
+      <w:r>
+        <w:t xml:space="preserve">A distant light opened beneath the sun.</w:t>
+      </w:r>
+    </w:p>
+    <w:p>
+      <w:r>
+        <w:t xml:space="preserve">The transit formation had found them.</w:t>
+      </w:r>
+    </w:p>
+    <w:p>
+      <w:r>
+        <w:t xml:space="preserve">The black strips around their wrists pulled toward the rails.</w:t>
+      </w:r>
+    </w:p>
+    <w:p>
+      <w:r>
+        <w:t xml:space="preserve">The bowl's passive figures turned their heads.</w:t>
+      </w:r>
+    </w:p>
+    <w:p>
+      <w:r>
+        <w:t xml:space="preserve">All at once.</w:t>
+      </w:r>
+    </w:p>
+    <w:p>
+      <w:r>
+        <w:t xml:space="preserve">The conductor's voice came from nowhere.</w:t>
+      </w:r>
+    </w:p>
+    <w:p>
+      <w:r>
+        <w:t xml:space="preserve">"Unassigned passengers located. "</w:t>
+      </w:r>
+    </w:p>
+    <w:p>
+      <w:r>
+        <w:t xml:space="preserve">Han raised his baton.</w:t>
+      </w:r>
+    </w:p>
+    <w:p>
+      <w:r>
+        <w:t xml:space="preserve">The mendicant remained seated.</w:t>
+      </w:r>
+    </w:p>
+    <w:p>
+      <w:r>
+        <w:t xml:space="preserve">"You should decide before the train arrives. "</w:t>
+      </w:r>
+    </w:p>
+    <w:p>
+      <w:r>
+        <w:t xml:space="preserve">Kai looked at the bowl.</w:t>
+      </w:r>
+    </w:p>
+    <w:p>
+      <w:r>
+        <w:t xml:space="preserve">"Can you wake them without assigning a custodian? "</w:t>
+      </w:r>
+    </w:p>
+    <w:p>
+      <w:r>
+        <w:t xml:space="preserve">"No. "</w:t>
+      </w:r>
+    </w:p>
+    <w:p>
+      <w:r>
+        <w:t xml:space="preserve">"Can authority be distributed like West Haneul's local claim? "</w:t>
+      </w:r>
+    </w:p>
+    <w:p>
+      <w:r>
+        <w:t xml:space="preserve">"These identities possess no active choice to distribute. "</w:t>
+      </w:r>
+    </w:p>
+    <w:p>
+      <w:r>
+        <w:t xml:space="preserve">"Can they be restored temporarily? "</w:t>
+      </w:r>
+    </w:p>
+    <w:p>
+      <w:r>
+        <w:t xml:space="preserve">"To what? "</w:t>
+      </w:r>
+    </w:p>
+    <w:p>
+      <w:r>
+        <w:t xml:space="preserve">"The road. "</w:t>
+      </w:r>
+    </w:p>
+    <w:p>
+      <w:r>
+        <w:t xml:space="preserve">The mendicant studied him.</w:t>
+      </w:r>
+    </w:p>
+    <w:p>
+      <w:r>
+        <w:t xml:space="preserve">The rails continued growing.</w:t>
+      </w:r>
+    </w:p>
+    <w:p>
+      <w:r>
+        <w:t xml:space="preserve">Dr. Venn crouched beside the bowl.</w:t>
+      </w:r>
+    </w:p>
+    <w:p>
+      <w:r>
+        <w:t xml:space="preserve">"What maintains the passive state? "</w:t>
+      </w:r>
+    </w:p>
+    <w:p>
+      <w:r>
+        <w:t xml:space="preserve">"Absence of destination. "</w:t>
+      </w:r>
+    </w:p>
+    <w:p>
+      <w:r>
+        <w:t xml:space="preserve">"Then give them a temporary destination. "</w:t>
+      </w:r>
+    </w:p>
+    <w:p>
+      <w:r>
+        <w:t xml:space="preserve">"The network requires recognized continuity. "</w:t>
+      </w:r>
+    </w:p>
+    <w:p>
+      <w:r>
+        <w:t xml:space="preserve">Rian dropped the ledger bag and opened the final page.</w:t>
+      </w:r>
+    </w:p>
+    <w:p>
+      <w:r>
+        <w:t xml:space="preserve">WEST HANEUL RESIDENT STATUS: REMAINS BY PRESENT CONSENT.</w:t>
+      </w:r>
+    </w:p>
+    <w:p>
+      <w:r>
+        <w:t xml:space="preserve">"What counts as recognized? " he asked.</w:t>
+      </w:r>
+    </w:p>
+    <w:p>
+      <w:r>
+        <w:t xml:space="preserve">The mendicant glanced at the writing.</w:t>
+      </w:r>
+    </w:p>
+    <w:p>
+      <w:r>
+        <w:t xml:space="preserve">"A place. A person. A role. A promise sufficiently believed. "</w:t>
+      </w:r>
+    </w:p>
+    <w:p>
+      <w:r>
+        <w:t xml:space="preserve">Rian removed his marker.</w:t>
+      </w:r>
+    </w:p>
+    <w:p>
+      <w:r>
+        <w:t xml:space="preserve">"We can work with dangerously broad definitions. "</w:t>
+      </w:r>
+    </w:p>
+    <w:p>
+      <w:r>
+        <w:t xml:space="preserve">Han looked down the road.</w:t>
+      </w:r>
+    </w:p>
+    <w:p>
+      <w:r>
+        <w:t xml:space="preserve">The approaching light had become two.</w:t>
+      </w:r>
+    </w:p>
+    <w:p>
+      <w:r>
+        <w:t xml:space="preserve">"How long? "</w:t>
+      </w:r>
+    </w:p>
+    <w:p>
+      <w:r>
+        <w:t xml:space="preserve">Dr. Venn checked the array.</w:t>
+      </w:r>
+    </w:p>
+    <w:p>
+      <w:r>
+        <w:t xml:space="preserve">"It will arrive before this conversation becomes less philosophical. "</w:t>
+      </w:r>
+    </w:p>
+    <w:p>
+      <w:r>
+        <w:t xml:space="preserve">Kai looked at the child inside the bowl.</w:t>
+      </w:r>
+    </w:p>
+    <w:p>
+      <w:r>
+        <w:t xml:space="preserve">She could not choose.</w:t>
+      </w:r>
+    </w:p>
+    <w:p>
+      <w:r>
+        <w:t xml:space="preserve">That did not mean someone else had to own the choice permanently.</w:t>
+      </w:r>
+    </w:p>
+    <w:p>
+      <w:r>
+        <w:t xml:space="preserve">A destination could be temporary.</w:t>
+      </w:r>
+    </w:p>
+    <w:p>
+      <w:r>
+        <w:t xml:space="preserve">A promise could include its own end.</w:t>
+      </w:r>
+    </w:p>
+    <w:p>
+      <w:r>
+        <w:t xml:space="preserve">"Rian, write this. "</w:t>
+      </w:r>
+    </w:p>
+    <w:p>
+      <w:r>
+        <w:t xml:space="preserve">He turned to a blank ledger page.</w:t>
+      </w:r>
+    </w:p>
+    <w:p>
+      <w:r>
+        <w:t xml:space="preserve">Kai spoke carefully.</w:t>
+      </w:r>
+    </w:p>
+    <w:p>
+      <w:r>
+        <w:t xml:space="preserve">"Those recovered from West Haneul remain under the protection of West Haneul until each person can choose another destination. "</w:t>
+      </w:r>
+    </w:p>
+    <w:p>
+      <w:r>
+        <w:t xml:space="preserve">Seo Jun looked at him.</w:t>
+      </w:r>
+    </w:p>
+    <w:p>
+      <w:r>
+        <w:t xml:space="preserve">"West Haneul is not a person. "</w:t>
+      </w:r>
+    </w:p>
+    <w:p>
+      <w:r>
+        <w:t xml:space="preserve">"No. It is thousands. "</w:t>
+      </w:r>
+    </w:p>
+    <w:p>
+      <w:r>
+        <w:t xml:space="preserve">The mendicant's expression sharpened.</w:t>
+      </w:r>
+    </w:p>
+    <w:p>
+      <w:r>
+        <w:t xml:space="preserve">Rian wrote.</w:t>
+      </w:r>
+    </w:p>
+    <w:p>
+      <w:r>
+        <w:t xml:space="preserve">Dr. Venn placed the resonance array over the page. The brass rings remained still.</w:t>
+      </w:r>
+    </w:p>
+    <w:p>
+      <w:r>
+        <w:t xml:space="preserve">"No authority," she said.</w:t>
+      </w:r>
+    </w:p>
+    <w:p>
+      <w:r>
+        <w:t xml:space="preserve">Choi stood at the memorial doorway, still divided between road and hillside.</w:t>
+      </w:r>
+    </w:p>
+    <w:p>
+      <w:r>
+        <w:t xml:space="preserve">She lifted the black strip around her wrist.</w:t>
+      </w:r>
+    </w:p>
+    <w:p>
+      <w:r>
+        <w:t xml:space="preserve">"I process declarations for West Haneul. "</w:t>
+      </w:r>
+    </w:p>
+    <w:p>
+      <w:r>
+        <w:t xml:space="preserve">The road listened.</w:t>
+      </w:r>
+    </w:p>
+    <w:p>
+      <w:r>
+        <w:t xml:space="preserve">"I recognize this record. "</w:t>
+      </w:r>
+    </w:p>
+    <w:p>
+      <w:r>
+        <w:t xml:space="preserve">The brass rings turned once.</w:t>
+      </w:r>
+    </w:p>
+    <w:p>
+      <w:r>
+        <w:t xml:space="preserve">The page glowed faintly.</w:t>
+      </w:r>
+    </w:p>
+    <w:p>
+      <w:r>
+        <w:t xml:space="preserve">The mendicant looked toward the bowl.</w:t>
+      </w:r>
+    </w:p>
+    <w:p>
+      <w:r>
+        <w:t xml:space="preserve">The child blinked.</w:t>
+      </w:r>
+    </w:p>
+    <w:p>
+      <w:r>
+        <w:t xml:space="preserve">Seo Jun stepped forward.</w:t>
+      </w:r>
+    </w:p>
+    <w:p>
+      <w:r>
+        <w:t xml:space="preserve">"I carried them into the network. "</w:t>
+      </w:r>
+    </w:p>
+    <w:p>
+      <w:r>
+        <w:t xml:space="preserve">His voice shook.</w:t>
+      </w:r>
+    </w:p>
+    <w:p>
+      <w:r>
+        <w:t xml:space="preserve">"I release my singular claim and recognize West Haneul as the temporary destination for those willing to wake there. "</w:t>
+      </w:r>
+    </w:p>
+    <w:p>
+      <w:r>
+        <w:t xml:space="preserve">The bowl rang.</w:t>
+      </w:r>
+    </w:p>
+    <w:p>
+      <w:r>
+        <w:t xml:space="preserve">The figures from the first landslide began breathing.</w:t>
+      </w:r>
+    </w:p>
+    <w:p>
+      <w:r>
+        <w:t xml:space="preserve">Not all.</w:t>
+      </w:r>
+    </w:p>
+    <w:p>
+      <w:r>
+        <w:t xml:space="preserve">A woman opened her eyes.</w:t>
+      </w:r>
+    </w:p>
+    <w:p>
+      <w:r>
+        <w:t xml:space="preserve">Then a boy.</w:t>
+      </w:r>
+    </w:p>
+    <w:p>
+      <w:r>
+        <w:t xml:space="preserve">Then the child in torn sleeves.</w:t>
+      </w:r>
+    </w:p>
+    <w:p>
+      <w:r>
+        <w:t xml:space="preserve">The mendicant looked at Kai.</w:t>
+      </w:r>
+    </w:p>
+    <w:p>
+      <w:r>
+        <w:t xml:space="preserve">"You added willing. "</w:t>
+      </w:r>
+    </w:p>
+    <w:p>
+      <w:r>
+        <w:t xml:space="preserve">"They cannot choose yet. "</w:t>
+      </w:r>
+    </w:p>
+    <w:p>
+      <w:r>
+        <w:t xml:space="preserve">"They can refuse waking. "</w:t>
+      </w:r>
+    </w:p>
+    <w:p>
+      <w:r>
+        <w:t xml:space="preserve">The child looked toward the open memorial doorway.</w:t>
+      </w:r>
+    </w:p>
+    <w:p>
+      <w:r>
+        <w:t xml:space="preserve">Snow vanished from her hair.</w:t>
+      </w:r>
+    </w:p>
+    <w:p>
+      <w:r>
+        <w:t xml:space="preserve">"Is my mother there? "</w:t>
+      </w:r>
+    </w:p>
+    <w:p>
+      <w:r>
+        <w:t xml:space="preserve">No one answered.</w:t>
+      </w:r>
+    </w:p>
+    <w:p>
+      <w:r>
+        <w:t xml:space="preserve">Choi's face broke.</w:t>
+      </w:r>
+    </w:p>
+    <w:p>
+      <w:r>
+        <w:t xml:space="preserve">"No," she said.</w:t>
+      </w:r>
+    </w:p>
+    <w:p>
+      <w:r>
+        <w:t xml:space="preserve">The child absorbed the word.</w:t>
+      </w:r>
+    </w:p>
+    <w:p>
+      <w:r>
+        <w:t xml:space="preserve">"Is my house? "</w:t>
+      </w:r>
+    </w:p>
+    <w:p>
+      <w:r>
+        <w:t xml:space="preserve">"No. "</w:t>
+      </w:r>
+    </w:p>
+    <w:p>
+      <w:r>
+        <w:t xml:space="preserve">"Then why would I go? "</w:t>
+      </w:r>
+    </w:p>
+    <w:p>
+      <w:r>
+        <w:t xml:space="preserve">Kai crouched beside the bowl.</w:t>
+      </w:r>
+    </w:p>
+    <w:p>
+      <w:r>
+        <w:t xml:space="preserve">"Because people remember you. "</w:t>
+      </w:r>
+    </w:p>
+    <w:p>
+      <w:r>
+        <w:t xml:space="preserve">She looked at Seo Jun.</w:t>
+      </w:r>
+    </w:p>
+    <w:p>
+      <w:r>
+        <w:t xml:space="preserve">He wept openly.</w:t>
+      </w:r>
+    </w:p>
+    <w:p>
+      <w:r>
+        <w:t xml:space="preserve">"I remember," he said.</w:t>
+      </w:r>
+    </w:p>
+    <w:p>
+      <w:r>
+        <w:t xml:space="preserve">Her expression tightened.</w:t>
+      </w:r>
+    </w:p>
+    <w:p>
+      <w:r>
+        <w:t xml:space="preserve">"You promised not to drop me. "</w:t>
+      </w:r>
+    </w:p>
+    <w:p>
+      <w:r>
+        <w:t xml:space="preserve">"I know. "</w:t>
+      </w:r>
+    </w:p>
+    <w:p>
+      <w:r>
+        <w:t xml:space="preserve">"You did. "</w:t>
+      </w:r>
+    </w:p>
+    <w:p>
+      <w:r>
+        <w:t xml:space="preserve">"I know. "</w:t>
+      </w:r>
+    </w:p>
+    <w:p>
+      <w:r>
+        <w:t xml:space="preserve">The bowl's passive state loosened around her.</w:t>
+      </w:r>
+    </w:p>
+    <w:p>
+      <w:r>
+        <w:t xml:space="preserve">She held out one hand.</w:t>
+      </w:r>
+    </w:p>
+    <w:p>
+      <w:r>
+        <w:t xml:space="preserve">Seo Jun reached for it.</w:t>
+      </w:r>
+    </w:p>
+    <w:p>
+      <w:r>
+        <w:t xml:space="preserve">The mendicant stopped him.</w:t>
+      </w:r>
+    </w:p>
+    <w:p>
+      <w:r>
+        <w:t xml:space="preserve">"Not ownership. "</w:t>
+      </w:r>
+    </w:p>
+    <w:p>
+      <w:r>
+        <w:t xml:space="preserve">Seo Jun nodded.</w:t>
+      </w:r>
+    </w:p>
+    <w:p>
+      <w:r>
+        <w:t xml:space="preserve">He placed his palm beneath the child's without closing his fingers.</w:t>
+      </w:r>
+    </w:p>
+    <w:p>
+      <w:r>
+        <w:t xml:space="preserve">She stepped from the bowl.</w:t>
+      </w:r>
+    </w:p>
+    <w:p>
+      <w:r>
+        <w:t xml:space="preserve">Her bare feet touched the white road.</w:t>
+      </w:r>
+    </w:p>
+    <w:p>
+      <w:r>
+        <w:t xml:space="preserve">The black rails shook.</w:t>
+      </w:r>
+    </w:p>
+    <w:p>
+      <w:r>
+        <w:t xml:space="preserve">The conductor's voice returned.</w:t>
+      </w:r>
+    </w:p>
+    <w:p>
+      <w:r>
+        <w:t xml:space="preserve">"Passenger manifest updated. "</w:t>
+      </w:r>
+    </w:p>
+    <w:p>
+      <w:r>
+        <w:t xml:space="preserve">Names appeared above the tracks.</w:t>
+      </w:r>
+    </w:p>
+    <w:p>
+      <w:r>
+        <w:t xml:space="preserve">Three hundred and seventeen from West Haneul.</w:t>
+      </w:r>
+    </w:p>
+    <w:p>
+      <w:r>
+        <w:t xml:space="preserve">Six hundred and two from the coastal node.</w:t>
+      </w:r>
+    </w:p>
+    <w:p>
+      <w:r>
+        <w:t xml:space="preserve">Forty-nine from the mountain gate.</w:t>
+      </w:r>
+    </w:p>
+    <w:p>
+      <w:r>
+        <w:t xml:space="preserve">The train's light grew larger.</w:t>
+      </w:r>
+    </w:p>
+    <w:p>
+      <w:r>
+        <w:t xml:space="preserve">Kai looked at Rian.</w:t>
+      </w:r>
+    </w:p>
+    <w:p>
+      <w:r>
+        <w:t xml:space="preserve">"Copy the declaration for the other groups. "</w:t>
+      </w:r>
+    </w:p>
+    <w:p>
+      <w:r>
+        <w:t xml:space="preserve">Dr. Venn shook her head.</w:t>
+      </w:r>
+    </w:p>
+    <w:p>
+      <w:r>
+        <w:t xml:space="preserve">"We cannot name a destination for places we have never visited. "</w:t>
+      </w:r>
+    </w:p>
+    <w:p>
+      <w:r>
+        <w:t xml:space="preserve">"We do not need to. "</w:t>
+      </w:r>
+    </w:p>
+    <w:p>
+      <w:r>
+        <w:t xml:space="preserve">Kai looked at the mendicant.</w:t>
+      </w:r>
+    </w:p>
+    <w:p>
+      <w:r>
+        <w:t xml:space="preserve">"A promise sufficiently believed. "</w:t>
+      </w:r>
+    </w:p>
+    <w:p>
+      <w:r>
+        <w:t xml:space="preserve">The man's smile returned.</w:t>
+      </w:r>
+    </w:p>
+    <w:p>
+      <w:r>
+        <w:t xml:space="preserve">"Dangerous. "</w:t>
+      </w:r>
+    </w:p>
+    <w:p>
+      <w:r>
+        <w:t xml:space="preserve">"Temporary. "</w:t>
+      </w:r>
+    </w:p>
+    <w:p>
+      <w:r>
+        <w:t xml:space="preserve">"Often the more dangerous form. "</w:t>
+      </w:r>
+    </w:p>
+    <w:p>
+      <w:r>
+        <w:t xml:space="preserve">Rian held the marker ready.</w:t>
+      </w:r>
+    </w:p>
+    <w:p>
+      <w:r>
+        <w:t xml:space="preserve">Kai spoke.</w:t>
+      </w:r>
+    </w:p>
+    <w:p>
+      <w:r>
+        <w:t xml:space="preserve">"Those recovered without a current home remain under their own names until they can choose where to go. "</w:t>
+      </w:r>
+    </w:p>
+    <w:p>
+      <w:r>
+        <w:t xml:space="preserve">The mendicant's expression went still.</w:t>
+      </w:r>
+    </w:p>
+    <w:p>
+      <w:r>
+        <w:t xml:space="preserve">"That is not a destination. "</w:t>
+      </w:r>
+    </w:p>
+    <w:p>
+      <w:r>
+        <w:t xml:space="preserve">"It is a promise. "</w:t>
+      </w:r>
+    </w:p>
+    <w:p>
+      <w:r>
+        <w:t xml:space="preserve">"Made by whom? "</w:t>
+      </w:r>
+    </w:p>
+    <w:p>
+      <w:r>
+        <w:t xml:space="preserve">Kai looked at Han, Dr. Venn, Rian, Choi, Seo Jun, and the waking child.</w:t>
+      </w:r>
+    </w:p>
+    <w:p>
+      <w:r>
+        <w:t xml:space="preserve">"By witnesses. "</w:t>
+      </w:r>
+    </w:p>
+    <w:p>
+      <w:r>
+        <w:t xml:space="preserve">Han nodded first.</w:t>
+      </w:r>
+    </w:p>
+    <w:p>
+      <w:r>
+        <w:t xml:space="preserve">"I recognize it. "</w:t>
+      </w:r>
+    </w:p>
+    <w:p>
+      <w:r>
+        <w:t xml:space="preserve">Dr. Venn placed her hand on the ledger.</w:t>
+      </w:r>
+    </w:p>
+    <w:p>
+      <w:r>
+        <w:t xml:space="preserve">"I recognize it. "</w:t>
+      </w:r>
+    </w:p>
+    <w:p>
+      <w:r>
+        <w:t xml:space="preserve">Rian signed beneath the statement.</w:t>
+      </w:r>
+    </w:p>
+    <w:p>
+      <w:r>
+        <w:t xml:space="preserve">Choi added her name.</w:t>
+      </w:r>
+    </w:p>
+    <w:p>
+      <w:r>
+        <w:t xml:space="preserve">Seo Jun pressed one translucent thumb to the paper.</w:t>
+      </w:r>
+    </w:p>
+    <w:p>
+      <w:r>
+        <w:t xml:space="preserve">The child considered them.</w:t>
+      </w:r>
+    </w:p>
+    <w:p>
+      <w:r>
+        <w:t xml:space="preserve">Then touched the page.</w:t>
+      </w:r>
+    </w:p>
+    <w:p>
+      <w:r>
+        <w:t xml:space="preserve">The brass rings spun.</w:t>
+      </w:r>
+    </w:p>
+    <w:p>
+      <w:r>
+        <w:t xml:space="preserve">The ledger glowed.</w:t>
+      </w:r>
+    </w:p>
+    <w:p>
+      <w:r>
+        <w:t xml:space="preserve">The begging bowl cracked.</w:t>
+      </w:r>
+    </w:p>
+    <w:p>
+      <w:r>
+        <w:t xml:space="preserve">A thin line spread across its rim.</w:t>
+      </w:r>
+    </w:p>
+    <w:p>
+      <w:r>
+        <w:t xml:space="preserve">The mendicant inhaled.</w:t>
+      </w:r>
+    </w:p>
+    <w:p>
+      <w:r>
+        <w:t xml:space="preserve">"That has never happened. "</w:t>
+      </w:r>
+    </w:p>
+    <w:p>
+      <w:r>
+        <w:t xml:space="preserve">Rian looked pleased.</w:t>
+      </w:r>
+    </w:p>
+    <w:p>
+      <w:r>
+        <w:t xml:space="preserve">"I would like that formally noted. "</w:t>
+      </w:r>
+    </w:p>
+    <w:p>
+      <w:r>
+        <w:t xml:space="preserve">The train emerged from the sunlight.</w:t>
+      </w:r>
+    </w:p>
+    <w:p>
+      <w:r>
+        <w:t xml:space="preserve">It was not built from metal.</w:t>
+      </w:r>
+    </w:p>
+    <w:p>
+      <w:r>
+        <w:t xml:space="preserve">Dark station tunnels wrapped around it, moving through open air. Fluorescent lights ran along its sides. Each window showed a different platform filled with motionless passengers.</w:t>
+      </w:r>
+    </w:p>
+    <w:p>
+      <w:r>
+        <w:t xml:space="preserve">The conductor stood at the front.</w:t>
+      </w:r>
+    </w:p>
+    <w:p>
+      <w:r>
+        <w:t xml:space="preserve">Departure-board characters changed across his face.</w:t>
+      </w:r>
+    </w:p>
+    <w:p>
+      <w:r>
+        <w:t xml:space="preserve">UNASSIGNED.</w:t>
+      </w:r>
+    </w:p>
+    <w:p>
+      <w:r>
+        <w:t xml:space="preserve">UNVERIFIED.</w:t>
+      </w:r>
+    </w:p>
+    <w:p>
+      <w:r>
+        <w:t xml:space="preserve">COLLECT.</w:t>
+      </w:r>
+    </w:p>
+    <w:p>
+      <w:r>
+        <w:t xml:space="preserve">The bowl cracked again.</w:t>
+      </w:r>
+    </w:p>
+    <w:p>
+      <w:r>
+        <w:t xml:space="preserve">Figures rose from its depth.</w:t>
+      </w:r>
+    </w:p>
+    <w:p>
+      <w:r>
+        <w:t xml:space="preserve">Hundreds.</w:t>
+      </w:r>
+    </w:p>
+    <w:p>
+      <w:r>
+        <w:t xml:space="preserve">The golden grass filled with people wearing clothes from different decades, regions, disasters, and nodes. Some woke confused. Some screamed. Some stood silently beneath the impossible sun.</w:t>
+      </w:r>
+    </w:p>
+    <w:p>
+      <w:r>
+        <w:t xml:space="preserve">The black strips around their wrists snapped toward the train.</w:t>
+      </w:r>
+    </w:p>
+    <w:p>
+      <w:r>
+        <w:t xml:space="preserve">The ledger declaration held them.</w:t>
+      </w:r>
+    </w:p>
+    <w:p>
+      <w:r>
+        <w:t xml:space="preserve">Not strongly enough.</w:t>
+      </w:r>
+    </w:p>
+    <w:p>
+      <w:r>
+        <w:t xml:space="preserve">Pages tore.</w:t>
+      </w:r>
+    </w:p>
+    <w:p>
+      <w:r>
+        <w:t xml:space="preserve">Dr. Venn pressed both hands against the array.</w:t>
+      </w:r>
+    </w:p>
+    <w:p>
+      <w:r>
+        <w:t xml:space="preserve">"The transit node has higher network authority. "</w:t>
+      </w:r>
+    </w:p>
+    <w:p>
+      <w:r>
+        <w:t xml:space="preserve">"Because it controls coordination? " Kai asked.</w:t>
+      </w:r>
+    </w:p>
+    <w:p>
+      <w:r>
+        <w:t xml:space="preserve">"Because it possesses active movement. We have a promise. It has a destination. "</w:t>
+      </w:r>
+    </w:p>
+    <w:p>
+      <w:r>
+        <w:t xml:space="preserve">The conductor raised one hand.</w:t>
+      </w:r>
+    </w:p>
+    <w:p>
+      <w:r>
+        <w:t xml:space="preserve">Train doors opened.</w:t>
+      </w:r>
+    </w:p>
+    <w:p>
+      <w:r>
+        <w:t xml:space="preserve">Inside waited rows of seats beneath white lights.</w:t>
+      </w:r>
+    </w:p>
+    <w:p>
+      <w:r>
+        <w:t xml:space="preserve">Every seat carried a name.</w:t>
+      </w:r>
+    </w:p>
+    <w:p>
+      <w:r>
+        <w:t xml:space="preserve">Kai saw his.</w:t>
+      </w:r>
+    </w:p>
+    <w:p>
+      <w:r>
+        <w:t xml:space="preserve">Han's.</w:t>
+      </w:r>
+    </w:p>
+    <w:p>
+      <w:r>
+        <w:t xml:space="preserve">Dr. Venn's.</w:t>
+      </w:r>
+    </w:p>
+    <w:p>
+      <w:r>
+        <w:t xml:space="preserve">Rian's.</w:t>
+      </w:r>
+    </w:p>
+    <w:p>
+      <w:r>
+        <w:t xml:space="preserve">Choi's.</w:t>
+      </w:r>
+    </w:p>
+    <w:p>
+      <w:r>
+        <w:t xml:space="preserve">Seo Jun's.</w:t>
+      </w:r>
+    </w:p>
+    <w:p>
+      <w:r>
+        <w:t xml:space="preserve">The waking child's.</w:t>
+      </w:r>
+    </w:p>
+    <w:p>
+      <w:r>
+        <w:t xml:space="preserve">The mendicant's seat stood at the front.</w:t>
+      </w:r>
+    </w:p>
+    <w:p>
+      <w:r>
+        <w:t xml:space="preserve">He looked almost offended.</w:t>
+      </w:r>
+    </w:p>
+    <w:p>
+      <w:r>
+        <w:t xml:space="preserve">"I have not traveled in a very long time. "</w:t>
+      </w:r>
+    </w:p>
+    <w:p>
+      <w:r>
+        <w:t xml:space="preserve">The conductor spoke.</w:t>
+      </w:r>
+    </w:p>
+    <w:p>
+      <w:r>
+        <w:t xml:space="preserve">"All temporary designations are invalidated upon boarding. "</w:t>
+      </w:r>
+    </w:p>
+    <w:p>
+      <w:r>
+        <w:t xml:space="preserve">The crowd slid toward the train.</w:t>
+      </w:r>
+    </w:p>
+    <w:p>
+      <w:r>
+        <w:t xml:space="preserve">Kai dug his feet into the white stones.</w:t>
+      </w:r>
+    </w:p>
+    <w:p>
+      <w:r>
+        <w:t xml:space="preserve">The system returned.</w:t>
+      </w:r>
+    </w:p>
+    <w:p>
+      <w:r>
+        <w:t xml:space="preserve">Emergency route conflict detected.</w:t>
+      </w:r>
+    </w:p>
+    <w:p>
+      <w:r>
+        <w:t xml:space="preserve">Accept Sunlit Mendicant custodianship to preserve current declarations.</w:t>
+      </w:r>
+    </w:p>
+    <w:p>
+      <w:r>
+        <w:t xml:space="preserve">Cost: All unassigned identities become linked to candidate continuity.</w:t>
+      </w:r>
+    </w:p>
+    <w:p>
+      <w:r>
+        <w:t xml:space="preserve">Kai dismissed it.</w:t>
+      </w:r>
+    </w:p>
+    <w:p>
+      <w:r>
+        <w:t xml:space="preserve">The system reopened the option.</w:t>
+      </w:r>
+    </w:p>
+    <w:p>
+      <w:r>
+        <w:t xml:space="preserve">He dismissed it again.</w:t>
+      </w:r>
+    </w:p>
+    <w:p>
+      <w:r>
+        <w:t xml:space="preserve">No alternate route identified.</w:t>
+      </w:r>
+    </w:p>
+    <w:p>
+      <w:r>
+        <w:t xml:space="preserve">Kai looked at the black rails.</w:t>
+      </w:r>
+    </w:p>
+    <w:p>
+      <w:r>
+        <w:t xml:space="preserve">The train possessed a destination because it moved along an established path.</w:t>
+      </w:r>
+    </w:p>
+    <w:p>
+      <w:r>
+        <w:t xml:space="preserve">Their promise lacked one.</w:t>
+      </w:r>
+    </w:p>
+    <w:p>
+      <w:r>
+        <w:t xml:space="preserve">Then he looked at the directional post.</w:t>
+      </w:r>
+    </w:p>
+    <w:p>
+      <w:r>
+        <w:t xml:space="preserve">WEST HANEUL.</w:t>
+      </w:r>
+    </w:p>
+    <w:p>
+      <w:r>
+        <w:t xml:space="preserve">RADIANT ABYSS.</w:t>
+      </w:r>
+    </w:p>
+    <w:p>
+      <w:r>
+        <w:t xml:space="preserve">The blank sign where HOME had been.</w:t>
+      </w:r>
+    </w:p>
+    <w:p>
+      <w:r>
+        <w:t xml:space="preserve">A destination did not need to be final.</w:t>
+      </w:r>
+    </w:p>
+    <w:p>
+      <w:r>
+        <w:t xml:space="preserve">It needed direction.</w:t>
+      </w:r>
+    </w:p>
+    <w:p>
+      <w:r>
+        <w:t xml:space="preserve">Kai pulled the blank sign from the post.</w:t>
+      </w:r>
+    </w:p>
+    <w:p>
+      <w:r>
+        <w:t xml:space="preserve">The wood came free without resistance.</w:t>
+      </w:r>
+    </w:p>
+    <w:p>
+      <w:r>
+        <w:t xml:space="preserve">He handed it to Rian.</w:t>
+      </w:r>
+    </w:p>
+    <w:p>
+      <w:r>
+        <w:t xml:space="preserve">"Write Witness Road. "</w:t>
+      </w:r>
+    </w:p>
+    <w:p>
+      <w:r>
+        <w:t xml:space="preserve">Rian stared.</w:t>
+      </w:r>
+    </w:p>
+    <w:p>
+      <w:r>
+        <w:t xml:space="preserve">"That is not a place. "</w:t>
+      </w:r>
+    </w:p>
+    <w:p>
+      <w:r>
+        <w:t xml:space="preserve">"Neither is need and surrender. "</w:t>
+      </w:r>
+    </w:p>
+    <w:p>
+      <w:r>
+        <w:t xml:space="preserve">The mendicant laughed.</w:t>
+      </w:r>
+    </w:p>
+    <w:p>
+      <w:r>
+        <w:t xml:space="preserve">A real laugh this time.</w:t>
+      </w:r>
+    </w:p>
+    <w:p>
+      <w:r>
+        <w:t xml:space="preserve">Rian wrote the words.</w:t>
+      </w:r>
+    </w:p>
+    <w:p>
+      <w:r>
+        <w:t xml:space="preserve">WITNESS ROAD.</w:t>
+      </w:r>
+    </w:p>
+    <w:p>
+      <w:r>
+        <w:t xml:space="preserve">Kai drove the sign into the white stones beside the ledger.</w:t>
+      </w:r>
+    </w:p>
+    <w:p>
+      <w:r>
+        <w:t xml:space="preserve">Nothing happened.</w:t>
+      </w:r>
+    </w:p>
+    <w:p>
+      <w:r>
+        <w:t xml:space="preserve">The conductor stepped from the train.</w:t>
+      </w:r>
+    </w:p>
+    <w:p>
+      <w:r>
+        <w:t xml:space="preserve">The crowd slid faster.</w:t>
+      </w:r>
+    </w:p>
+    <w:p>
+      <w:r>
+        <w:t xml:space="preserve">Kai placed his hand on the sign.</w:t>
+      </w:r>
+    </w:p>
+    <w:p>
+      <w:r>
+        <w:t xml:space="preserve">"I recognize this road as the temporary destination of everyone named in the declaration until each can choose another. "</w:t>
+      </w:r>
+    </w:p>
+    <w:p>
+      <w:r>
+        <w:t xml:space="preserve">Han put his hand beside Kai's.</w:t>
+      </w:r>
+    </w:p>
+    <w:p>
+      <w:r>
+        <w:t xml:space="preserve">"I recognize it. "</w:t>
+      </w:r>
+    </w:p>
+    <w:p>
+      <w:r>
+        <w:t xml:space="preserve">Dr. Venn.</w:t>
+      </w:r>
+    </w:p>
+    <w:p>
+      <w:r>
+        <w:t xml:space="preserve">Rian.</w:t>
+      </w:r>
+    </w:p>
+    <w:p>
+      <w:r>
+        <w:t xml:space="preserve">Choi.</w:t>
+      </w:r>
+    </w:p>
+    <w:p>
+      <w:r>
+        <w:t xml:space="preserve">Seo Jun.</w:t>
+      </w:r>
+    </w:p>
+    <w:p>
+      <w:r>
+        <w:t xml:space="preserve">The child.</w:t>
+      </w:r>
+    </w:p>
+    <w:p>
+      <w:r>
+        <w:t xml:space="preserve">Others followed.</w:t>
+      </w:r>
+    </w:p>
+    <w:p>
+      <w:r>
+        <w:t xml:space="preserve">A coastal woman in old ceremonial clothing.</w:t>
+      </w:r>
+    </w:p>
+    <w:p>
+      <w:r>
+        <w:t xml:space="preserve">A mountain laborer with burns across both arms.</w:t>
+      </w:r>
+    </w:p>
+    <w:p>
+      <w:r>
+        <w:t xml:space="preserve">A station passenger who had awakened inside the bowl without remembering how he arrived there.</w:t>
+      </w:r>
+    </w:p>
+    <w:p>
+      <w:r>
+        <w:t xml:space="preserve">Hands touched the post.</w:t>
+      </w:r>
+    </w:p>
+    <w:p>
+      <w:r>
+        <w:t xml:space="preserve">Names spoke.</w:t>
+      </w:r>
+    </w:p>
+    <w:p>
+      <w:r>
+        <w:t xml:space="preserve">The white road branched.</w:t>
+      </w:r>
+    </w:p>
+    <w:p>
+      <w:r>
+        <w:t xml:space="preserve">A second path formed through the golden grass.</w:t>
+      </w:r>
+    </w:p>
+    <w:p>
+      <w:r>
+        <w:t xml:space="preserve">No tracks.</w:t>
+      </w:r>
+    </w:p>
+    <w:p>
+      <w:r>
+        <w:t xml:space="preserve">No signs except the one they had made.</w:t>
+      </w:r>
+    </w:p>
+    <w:p>
+      <w:r>
+        <w:t xml:space="preserve">The train doors flickered.</w:t>
+      </w:r>
+    </w:p>
+    <w:p>
+      <w:r>
+        <w:t xml:space="preserve">The manifest split.</w:t>
+      </w:r>
+    </w:p>
+    <w:p>
+      <w:r>
+        <w:t xml:space="preserve">WITNESS ROAD appeared beside every unassigned name.</w:t>
+      </w:r>
+    </w:p>
+    <w:p>
+      <w:r>
+        <w:t xml:space="preserve">The conductor's departure-board face changed.</w:t>
+      </w:r>
+    </w:p>
+    <w:p>
+      <w:r>
+        <w:t xml:space="preserve">DESTINATION NOT NETWORK APPROVED.</w:t>
+      </w:r>
+    </w:p>
+    <w:p>
+      <w:r>
+        <w:t xml:space="preserve">Kai held the sign.</w:t>
+      </w:r>
+    </w:p>
+    <w:p>
+      <w:r>
+        <w:t xml:space="preserve">"Approval was not part of the promise. "</w:t>
+      </w:r>
+    </w:p>
+    <w:p>
+      <w:r>
+        <w:t xml:space="preserve">The system flashed.</w:t>
+      </w:r>
+    </w:p>
+    <w:p>
+      <w:r>
+        <w:t xml:space="preserve">Unregistered route created.</w:t>
+      </w:r>
+    </w:p>
+    <w:p>
+      <w:r>
+        <w:t xml:space="preserve">Warning: Route lacks governing node.</w:t>
+      </w:r>
+    </w:p>
+    <w:p>
+      <w:r>
+        <w:t xml:space="preserve">Warning: Route persistence dependent on active witnesses.</w:t>
+      </w:r>
+    </w:p>
+    <w:p>
+      <w:r>
+        <w:t xml:space="preserve">Warning: Candidate action exceeds authorized system function.</w:t>
+      </w:r>
+    </w:p>
+    <w:p>
+      <w:r>
+        <w:t xml:space="preserve">The mendicant stood for the first time.</w:t>
+      </w:r>
+    </w:p>
+    <w:p>
+      <w:r>
+        <w:t xml:space="preserve">He was taller than Kai expected.</w:t>
+      </w:r>
+    </w:p>
+    <w:p>
+      <w:r>
+        <w:t xml:space="preserve">He took the begging bowl in both hands.</w:t>
+      </w:r>
+    </w:p>
+    <w:p>
+      <w:r>
+        <w:t xml:space="preserve">"Then witness it. "</w:t>
+      </w:r>
+    </w:p>
+    <w:p>
+      <w:r>
+        <w:t xml:space="preserve">He struck the bowl against the road.</w:t>
+      </w:r>
+    </w:p>
+    <w:p>
+      <w:r>
+        <w:t xml:space="preserve">The crack across its rim opened fully.</w:t>
+      </w:r>
+    </w:p>
+    <w:p>
+      <w:r>
+        <w:t xml:space="preserve">The bowl broke.</w:t>
+      </w:r>
+    </w:p>
+    <w:p>
+      <w:r>
+        <w:t xml:space="preserve">Its absent interior spilled into the new path.</w:t>
+      </w:r>
+    </w:p>
+    <w:p>
+      <w:r>
+        <w:t xml:space="preserve">Not darkness.</w:t>
+      </w:r>
+    </w:p>
+    <w:p>
+      <w:r>
+        <w:t xml:space="preserve">Space.</w:t>
+      </w:r>
+    </w:p>
+    <w:p>
+      <w:r>
+        <w:t xml:space="preserve">Enough for every unassigned person to stand without belonging to anyone else.</w:t>
+      </w:r>
+    </w:p>
+    <w:p>
+      <w:r>
+        <w:t xml:space="preserve">The train lurched.</w:t>
+      </w:r>
+    </w:p>
+    <w:p>
+      <w:r>
+        <w:t xml:space="preserve">The conductor raised both hands.</w:t>
+      </w:r>
+    </w:p>
+    <w:p>
+      <w:r>
+        <w:t xml:space="preserve">"Unauthorized road will be removed. "</w:t>
+      </w:r>
+    </w:p>
+    <w:p>
+      <w:r>
+        <w:t xml:space="preserve">Han threw his baton.</w:t>
+      </w:r>
+    </w:p>
+    <w:p>
+      <w:r>
+        <w:t xml:space="preserve">The conductor expected it this time.</w:t>
+      </w:r>
+    </w:p>
+    <w:p>
+      <w:r>
+        <w:t xml:space="preserve">A train door opened between them and swallowed the weapon.</w:t>
+      </w:r>
+    </w:p>
+    <w:p>
+      <w:r>
+        <w:t xml:space="preserve">Another door opened behind Han.</w:t>
+      </w:r>
+    </w:p>
+    <w:p>
+      <w:r>
+        <w:t xml:space="preserve">The baton emerged and struck him across the shoulder.</w:t>
+      </w:r>
+    </w:p>
+    <w:p>
+      <w:r>
+        <w:t xml:space="preserve">He grunted.</w:t>
+      </w:r>
+    </w:p>
+    <w:p>
+      <w:r>
+        <w:t xml:space="preserve">Rian looked at the conductor.</w:t>
+      </w:r>
+    </w:p>
+    <w:p>
+      <w:r>
+        <w:t xml:space="preserve">"I dislike efficient people. "</w:t>
+      </w:r>
+    </w:p>
+    <w:p>
+      <w:r>
+        <w:t xml:space="preserve">The rails tightened around Witness Road.</w:t>
+      </w:r>
+    </w:p>
+    <w:p>
+      <w:r>
+        <w:t xml:space="preserve">Dr. Venn read the array.</w:t>
+      </w:r>
+    </w:p>
+    <w:p>
+      <w:r>
+        <w:t xml:space="preserve">"It is trying to incorporate the branch. "</w:t>
+      </w:r>
+    </w:p>
+    <w:p>
+      <w:r>
+        <w:t xml:space="preserve">"If it absorbs the road, the promise becomes part of transit authority," Kai said.</w:t>
+      </w:r>
+    </w:p>
+    <w:p>
+      <w:r>
+        <w:t xml:space="preserve">The mendicant lifted one broken half of the bowl.</w:t>
+      </w:r>
+    </w:p>
+    <w:p>
+      <w:r>
+        <w:t xml:space="preserve">"Then the road must leave before the train does. "</w:t>
+      </w:r>
+    </w:p>
+    <w:p>
+      <w:r>
+        <w:t xml:space="preserve">"Leave where? "</w:t>
+      </w:r>
+    </w:p>
+    <w:p>
+      <w:r>
+        <w:t xml:space="preserve">The mendicant looked at the sign marked RADIANT ABYSS.</w:t>
+      </w:r>
+    </w:p>
+    <w:p>
+      <w:r>
+        <w:t xml:space="preserve">Golden sunlight dimmed.</w:t>
+      </w:r>
+    </w:p>
+    <w:p>
+      <w:r>
+        <w:t xml:space="preserve">The sign turned by itself.</w:t>
+      </w:r>
+    </w:p>
+    <w:p>
+      <w:r>
+        <w:t xml:space="preserve">It pointed along Witness Road.</w:t>
+      </w:r>
+    </w:p>
+    <w:p>
+      <w:r>
+        <w:t xml:space="preserve">"The first node has remembered you," he said.</w:t>
+      </w:r>
+    </w:p>
+    <w:p>
+      <w:r>
+        <w:t xml:space="preserve">Kai looked toward the horizon.</w:t>
+      </w:r>
+    </w:p>
+    <w:p>
+      <w:r>
+        <w:t xml:space="preserve">The new road entered a line of brightness too sharp to be daylight. Shapes moved beyond it.</w:t>
+      </w:r>
+    </w:p>
+    <w:p>
+      <w:r>
+        <w:t xml:space="preserve">A sword.</w:t>
+      </w:r>
+    </w:p>
+    <w:p>
+      <w:r>
+        <w:t xml:space="preserve">A brush.</w:t>
+      </w:r>
+    </w:p>
+    <w:p>
+      <w:r>
+        <w:t xml:space="preserve">A cord.</w:t>
+      </w:r>
+    </w:p>
+    <w:p>
+      <w:r>
+        <w:t xml:space="preserve">Three guardians remembered from another life that was not his.</w:t>
+      </w:r>
+    </w:p>
+    <w:p>
+      <w:r>
+        <w:t xml:space="preserve">The faint name on Kai's slip burned.</w:t>
+      </w:r>
+    </w:p>
+    <w:p>
+      <w:r>
+        <w:t xml:space="preserve">Li Yun.</w:t>
+      </w:r>
+    </w:p>
+    <w:p>
+      <w:r>
+        <w:t xml:space="preserve">The system reacted violently.</w:t>
+      </w:r>
+    </w:p>
+    <w:p>
+      <w:r>
+        <w:t xml:space="preserve">Notifications opened over one another.</w:t>
+      </w:r>
+    </w:p>
+    <w:p>
+      <w:r>
+        <w:t xml:space="preserve">Route contamination detected.</w:t>
+      </w:r>
+    </w:p>
+    <w:p>
+      <w:r>
+        <w:t xml:space="preserve">Legacy identity access prohibited.</w:t>
+      </w:r>
+    </w:p>
+    <w:p>
+      <w:r>
+        <w:t xml:space="preserve">Radiant Abyss handshake denied.</w:t>
+      </w:r>
+    </w:p>
+    <w:p>
+      <w:r>
+        <w:t xml:space="preserve">Custodian delivery priority increased.</w:t>
+      </w:r>
+    </w:p>
+    <w:p>
+      <w:r>
+        <w:t xml:space="preserve">Force transfer authorized.</w:t>
+      </w:r>
+    </w:p>
+    <w:p>
+      <w:r>
+        <w:t xml:space="preserve">The conductor smiled.</w:t>
+      </w:r>
+    </w:p>
+    <w:p>
+      <w:r>
+        <w:t xml:space="preserve">The train accelerated without moving.</w:t>
+      </w:r>
+    </w:p>
+    <w:p>
+      <w:r>
+        <w:t xml:space="preserve">Distance collapsed between its doors and the crowd.</w:t>
+      </w:r>
+    </w:p>
+    <w:p>
+      <w:r>
+        <w:t xml:space="preserve">The mendicant seized Kai's shoulders.</w:t>
+      </w:r>
+    </w:p>
+    <w:p>
+      <w:r>
+        <w:t xml:space="preserve">"You cannot remain here. "</w:t>
+      </w:r>
+    </w:p>
+    <w:p>
+      <w:r>
+        <w:t xml:space="preserve">"I am not leaving them. "</w:t>
+      </w:r>
+    </w:p>
+    <w:p>
+      <w:r>
+        <w:t xml:space="preserve">"You made a road. Walk it. "</w:t>
+      </w:r>
+    </w:p>
+    <w:p>
+      <w:r>
+        <w:t xml:space="preserve">"What happens to you? "</w:t>
+      </w:r>
+    </w:p>
+    <w:p>
+      <w:r>
+        <w:t xml:space="preserve">The man looked at the broken bowl.</w:t>
+      </w:r>
+    </w:p>
+    <w:p>
+      <w:r>
+        <w:t xml:space="preserve">"I return to waiting. "</w:t>
+      </w:r>
+    </w:p>
+    <w:p>
+      <w:r>
+        <w:t xml:space="preserve">"No. "</w:t>
+      </w:r>
+    </w:p>
+    <w:p>
+      <w:r>
+        <w:t xml:space="preserve">Kai caught his wrist.</w:t>
+      </w:r>
+    </w:p>
+    <w:p>
+      <w:r>
+        <w:t xml:space="preserve">The mendicant's eyes widened.</w:t>
+      </w:r>
+    </w:p>
+    <w:p>
+      <w:r>
+        <w:t xml:space="preserve">The system warned him.</w:t>
+      </w:r>
+    </w:p>
+    <w:p>
+      <w:r>
+        <w:t xml:space="preserve">Do not accept node burden.</w:t>
+      </w:r>
+    </w:p>
+    <w:p>
+      <w:r>
+        <w:t xml:space="preserve">Kai ignored it.</w:t>
+      </w:r>
+    </w:p>
+    <w:p>
+      <w:r>
+        <w:t xml:space="preserve">"I am not accepting your node. "</w:t>
+      </w:r>
+    </w:p>
+    <w:p>
+      <w:r>
+        <w:t xml:space="preserve">"Then release me. "</w:t>
+      </w:r>
+    </w:p>
+    <w:p>
+      <w:r>
+        <w:t xml:space="preserve">"I am inviting you onto the road. "</w:t>
+      </w:r>
+    </w:p>
+    <w:p>
+      <w:r>
+        <w:t xml:space="preserve">The mendicant looked toward the path.</w:t>
+      </w:r>
+    </w:p>
+    <w:p>
+      <w:r>
+        <w:t xml:space="preserve">No seat waited.</w:t>
+      </w:r>
+    </w:p>
+    <w:p>
+      <w:r>
+        <w:t xml:space="preserve">No role had been assigned.</w:t>
+      </w:r>
+    </w:p>
+    <w:p>
+      <w:r>
+        <w:t xml:space="preserve">No one had ever asked him to leave the roadside.</w:t>
+      </w:r>
+    </w:p>
+    <w:p>
+      <w:r>
+        <w:t xml:space="preserve">The train doors reached them.</w:t>
+      </w:r>
+    </w:p>
+    <w:p>
+      <w:r>
+        <w:t xml:space="preserve">Han tackled Rian clear of the nearest opening. Dr. Venn dragged the resonance array after them. Choi pulled the waking child toward Witness Road. Seo Jun held the ledger against his chest as names streamed past him.</w:t>
+      </w:r>
+    </w:p>
+    <w:p>
+      <w:r>
+        <w:t xml:space="preserve">The conductor extended one hand toward Kai.</w:t>
+      </w:r>
+    </w:p>
+    <w:p>
+      <w:r>
+        <w:t xml:space="preserve">"Delivery complete. "</w:t>
+      </w:r>
+    </w:p>
+    <w:p>
+      <w:r>
+        <w:t xml:space="preserve">The black strips around every wrist pulled.</w:t>
+      </w:r>
+    </w:p>
+    <w:p>
+      <w:r>
+        <w:t xml:space="preserve">Kai stepped onto Witness Road.</w:t>
+      </w:r>
+    </w:p>
+    <w:p>
+      <w:r>
+        <w:t xml:space="preserve">The mendicant came with him.</w:t>
+      </w:r>
+    </w:p>
+    <w:p>
+      <w:r>
+        <w:t xml:space="preserve">The world tore.</w:t>
+      </w:r>
+    </w:p>
+    <w:p>
+      <w:r>
+        <w:t xml:space="preserve">Golden grass became white fire. The train became a tunnel racing sideways. West Haneul's memorial doorway folded into a distant square. Hundreds of awakened identities crossed the new path, held together only by voices repeating the promise.</w:t>
+      </w:r>
+    </w:p>
+    <w:p>
+      <w:r>
+        <w:t xml:space="preserve">Under their own names.</w:t>
+      </w:r>
+    </w:p>
+    <w:p>
+      <w:r>
+        <w:t xml:space="preserve">Until they can choose.</w:t>
+      </w:r>
+    </w:p>
+    <w:p>
+      <w:r>
+        <w:t xml:space="preserve">Under their own names.</w:t>
+      </w:r>
+    </w:p>
+    <w:p>
+      <w:r>
+        <w:t xml:space="preserve">Until they can choose.</w:t>
+      </w:r>
+    </w:p>
+    <w:p>
+      <w:r>
+        <w:t xml:space="preserve">The conductor stepped onto the branch.</w:t>
+      </w:r>
+    </w:p>
+    <w:p>
+      <w:r>
+        <w:t xml:space="preserve">The white stones blackened beneath him.</w:t>
+      </w:r>
+    </w:p>
+    <w:p>
+      <w:r>
+        <w:t xml:space="preserve">"You cannot create a route outside the network. "</w:t>
+      </w:r>
+    </w:p>
+    <w:p>
+      <w:r>
+        <w:t xml:space="preserve">Kai kept walking.</w:t>
+      </w:r>
+    </w:p>
+    <w:p>
+      <w:r>
+        <w:t xml:space="preserve">"We already did. "</w:t>
+      </w:r>
+    </w:p>
+    <w:p>
+      <w:r>
+        <w:t xml:space="preserve">"The system will correct it. "</w:t>
+      </w:r>
+    </w:p>
+    <w:p>
+      <w:r>
+        <w:t xml:space="preserve">"The system built itself to deliver me. "</w:t>
+      </w:r>
+    </w:p>
+    <w:p>
+      <w:r>
+        <w:t xml:space="preserve">The conductor's face filled with changing destinations.</w:t>
+      </w:r>
+    </w:p>
+    <w:p>
+      <w:r>
+        <w:t xml:space="preserve">"Yes. "</w:t>
+      </w:r>
+    </w:p>
+    <w:p>
+      <w:r>
+        <w:t xml:space="preserve">Kai looked back.</w:t>
+      </w:r>
+    </w:p>
+    <w:p>
+      <w:r>
+        <w:t xml:space="preserve">"Then it should have chosen where more carefully. "</w:t>
+      </w:r>
+    </w:p>
+    <w:p>
+      <w:r>
+        <w:t xml:space="preserve">The line of Radiant Abyss light opened.</w:t>
+      </w:r>
+    </w:p>
+    <w:p>
+      <w:r>
+        <w:t xml:space="preserve">Witness Road passed through.</w:t>
+      </w:r>
+    </w:p>
+    <w:p>
+      <w:r>
+        <w:t xml:space="preserve">The conductor reached for Kai.</w:t>
+      </w:r>
+    </w:p>
+    <w:p>
+      <w:r>
+        <w:t xml:space="preserve">Seo Jun opened the torn remnant of his umbrella.</w:t>
+      </w:r>
+    </w:p>
+    <w:p>
+      <w:r>
+        <w:t xml:space="preserve">Only one strip of black fabric remained.</w:t>
+      </w:r>
+    </w:p>
+    <w:p>
+      <w:r>
+        <w:t xml:space="preserve">He wrapped it around the conductor's wrist.</w:t>
+      </w:r>
+    </w:p>
+    <w:p>
+      <w:r>
+        <w:t xml:space="preserve">"I carried enough," he said.</w:t>
+      </w:r>
+    </w:p>
+    <w:p>
+      <w:r>
+        <w:t xml:space="preserve">The conductor stopped.</w:t>
+      </w:r>
+    </w:p>
+    <w:p>
+      <w:r>
+        <w:t xml:space="preserve">The strip tightened.</w:t>
+      </w:r>
+    </w:p>
+    <w:p>
+      <w:r>
+        <w:t xml:space="preserve">Not claiming him.</w:t>
+      </w:r>
+    </w:p>
+    <w:p>
+      <w:r>
+        <w:t xml:space="preserve">Naming his role.</w:t>
+      </w:r>
+    </w:p>
+    <w:p>
+      <w:r>
+        <w:t xml:space="preserve">Transit Custodian.</w:t>
+      </w:r>
+    </w:p>
+    <w:p>
+      <w:r>
+        <w:t xml:space="preserve">Singular.</w:t>
+      </w:r>
+    </w:p>
+    <w:p>
+      <w:r>
+        <w:t xml:space="preserve">The same structure he had imposed upon everyone else.</w:t>
+      </w:r>
+    </w:p>
+    <w:p>
+      <w:r>
+        <w:t xml:space="preserve">The conductor's departure board froze.</w:t>
+      </w:r>
+    </w:p>
+    <w:p>
+      <w:r>
+        <w:t xml:space="preserve">One destination remained.</w:t>
+      </w:r>
+    </w:p>
+    <w:p>
+      <w:r>
+        <w:t xml:space="preserve">ABANDONED PLATFORM.</w:t>
+      </w:r>
+    </w:p>
+    <w:p>
+      <w:r>
+        <w:t xml:space="preserve">The train vanished.</w:t>
+      </w:r>
+    </w:p>
+    <w:p>
+      <w:r>
+        <w:t xml:space="preserve">It took him with it.</w:t>
+      </w:r>
+    </w:p>
+    <w:p>
+      <w:r>
+        <w:t xml:space="preserve">Silence struck Witness Road.</w:t>
+      </w:r>
+    </w:p>
+    <w:p>
+      <w:r>
+        <w:t xml:space="preserve">Then the Radiant Abyss light swallowed them.</w:t>
+      </w:r>
+    </w:p>
+    <w:p>
+      <w:r>
+        <w:t xml:space="preserve">Kai fell onto warm stone.</w:t>
+      </w:r>
+    </w:p>
+    <w:p>
+      <w:r>
+        <w:t xml:space="preserve">For several breaths, he could not move.</w:t>
+      </w:r>
+    </w:p>
+    <w:p>
+      <w:r>
+        <w:t xml:space="preserve">Voices surrounded him. Hundreds. Frightened. Alive. Separate.</w:t>
+      </w:r>
+    </w:p>
+    <w:p>
+      <w:r>
+        <w:t xml:space="preserve">Han groaned nearby.</w:t>
+      </w:r>
+    </w:p>
+    <w:p>
+      <w:r>
+        <w:t xml:space="preserve">Rian asked whether anyone had recovered his marker.</w:t>
+      </w:r>
+    </w:p>
+    <w:p>
+      <w:r>
+        <w:t xml:space="preserve">Dr. Venn told him to stop speaking.</w:t>
+      </w:r>
+    </w:p>
+    <w:p>
+      <w:r>
+        <w:t xml:space="preserve">The answer reassured Kai more than it should have.</w:t>
+      </w:r>
+    </w:p>
+    <w:p>
+      <w:r>
+        <w:t xml:space="preserve">He pushed himself upright.</w:t>
+      </w:r>
+    </w:p>
+    <w:p>
+      <w:r>
+        <w:t xml:space="preserve">They stood inside a vast circular chamber beneath a false sun. Three guardian statues surrounded a central platform.</w:t>
+      </w:r>
+    </w:p>
+    <w:p>
+      <w:r>
+        <w:t xml:space="preserve">One held a chisel.</w:t>
+      </w:r>
+    </w:p>
+    <w:p>
+      <w:r>
+        <w:t xml:space="preserve">One held a brush.</w:t>
+      </w:r>
+    </w:p>
+    <w:p>
+      <w:r>
+        <w:t xml:space="preserve">One held a cord.</w:t>
+      </w:r>
+    </w:p>
+    <w:p>
+      <w:r>
+        <w:t xml:space="preserve">The Sunlit Mendicant stood at the chamber's edge, staring upward as if he had never seen light from beneath.</w:t>
+      </w:r>
+    </w:p>
+    <w:p>
+      <w:r>
+        <w:t xml:space="preserve">Seo Jun held the ledger.</w:t>
+      </w:r>
+    </w:p>
+    <w:p>
+      <w:r>
+        <w:t xml:space="preserve">Choi held the child's hand.</w:t>
+      </w:r>
+    </w:p>
+    <w:p>
+      <w:r>
+        <w:t xml:space="preserve">Witness Road ended behind them in a narrow line of white stones.</w:t>
+      </w:r>
+    </w:p>
+    <w:p>
+      <w:r>
+        <w:t xml:space="preserve">The hundreds from the bowl filled the chamber.</w:t>
+      </w:r>
+    </w:p>
+    <w:p>
+      <w:r>
+        <w:t xml:space="preserve">The system remained silent.</w:t>
+      </w:r>
+    </w:p>
+    <w:p>
+      <w:r>
+        <w:t xml:space="preserve">At the center of the platform sat a young man in cultivation robes.</w:t>
+      </w:r>
+    </w:p>
+    <w:p>
+      <w:r>
+        <w:t xml:space="preserve">A sheathed sword lay across his knees.</w:t>
+      </w:r>
+    </w:p>
+    <w:p>
+      <w:r>
+        <w:t xml:space="preserve">His eyes were closed.</w:t>
+      </w:r>
+    </w:p>
+    <w:p>
+      <w:r>
+        <w:t xml:space="preserve">His face was Kai's.</w:t>
+      </w:r>
+    </w:p>
+    <w:p>
+      <w:r>
+        <w:t xml:space="preserve">Not exactly.</w:t>
+      </w:r>
+    </w:p>
+    <w:p>
+      <w:r>
+        <w:t xml:space="preserve">The jaw was narrower. The hair longer. A scar crossed one brow that Kai did not possess.</w:t>
+      </w:r>
+    </w:p>
+    <w:p>
+      <w:r>
+        <w:t xml:space="preserve">The guardian with the brush lowered its stone hand.</w:t>
+      </w:r>
+    </w:p>
+    <w:p>
+      <w:r>
+        <w:t xml:space="preserve">Golden characters appeared above the seated man.</w:t>
+      </w:r>
+    </w:p>
+    <w:p>
+      <w:r>
+        <w:t xml:space="preserve">LI YUN.</w:t>
+      </w:r>
+    </w:p>
+    <w:p>
+      <w:r>
+        <w:t xml:space="preserve">The faint second name burned away from Kai's slip.</w:t>
+      </w:r>
+    </w:p>
+    <w:p>
+      <w:r>
+        <w:t xml:space="preserve">It entered the figure.</w:t>
+      </w:r>
+    </w:p>
+    <w:p>
+      <w:r>
+        <w:t xml:space="preserve">His eyes opened.</w:t>
+      </w:r>
+    </w:p>
+    <w:p>
+      <w:r>
+        <w:t xml:space="preserve">The sword at his knees whispered.</w:t>
+      </w:r>
+    </w:p>
+    <w:p>
+      <w:r>
+        <w:t xml:space="preserve">"Kai? "</w:t>
+      </w:r>
+    </w:p>
+    <w:p>
+      <w:r>
+        <w:t xml:space="preserve">Not to the seated man.</w:t>
+      </w:r>
+    </w:p>
+    <w:p>
+      <w:r>
+        <w:t xml:space="preserve">To him.</w:t>
+      </w:r>
+    </w:p>
+    <w:p>
+      <w:r>
+        <w:t xml:space="preserve">The young cultivator looked across the crowded chamber.</w:t>
+      </w:r>
+    </w:p>
+    <w:p>
+      <w:r>
+        <w:t xml:space="preserve">His gaze stopped on Kai.</w:t>
+      </w:r>
+    </w:p>
+    <w:p>
+      <w:r>
+        <w:t xml:space="preserve">Confusion became recognition.</w:t>
+      </w:r>
+    </w:p>
+    <w:p>
+      <w:r>
+        <w:t xml:space="preserve">Then anger.</w:t>
+      </w:r>
+    </w:p>
+    <w:p>
+      <w:r>
+        <w:t xml:space="preserve">He rose with the sword in one hand.</w:t>
+      </w:r>
+    </w:p>
+    <w:p>
+      <w:r>
+        <w:t xml:space="preserve">"You took my system. "</w:t>
+      </w:r>
+    </w:p>
+    <w:p>
+      <w:r>
+        <w:t xml:space="preserve">The false sun above the chamber darkened.</w:t>
+      </w:r>
+    </w:p>
+    <w:p>
+      <w:r>
+        <w:t xml:space="preserve">Behind Li Yun, the three guardians turned their weapons toward Kai.</w:t>
+      </w:r>
+    </w:p>
+    <w:p>
+      <w:r>
+        <w:t xml:space="preserve">And the Heavenly Ascension System spoke from both of them at once.</w:t>
+      </w:r>
+    </w:p>
+    <w:p>
+      <w:r>
+        <w:t xml:space="preserve">Original candidate recovered.</w:t>
+      </w:r>
+    </w:p>
+    <w:p>
+      <w:r>
+        <w:t xml:space="preserve">Duplicate continuity detected.</w:t>
+      </w:r>
+    </w:p>
+    <w:p>
+      <w:r>
+        <w:t xml:space="preserve">One identity must be surrendered.</w:t>
       </w:r>
     </w:p>
     <w:sectPr>

</xml_diff>

<commit_message>
Add Heavenly Ascension System Chapter 65: The Name That Was Divided
</commit_message>
<xml_diff>
--- a/Heavenly Ascension System.docx
+++ b/Heavenly Ascension System.docx
@@ -56528,6 +56528,4314 @@
     <w:p>
       <w:r>
         <w:t xml:space="preserve">One identity must be surrendered.</w:t>
+      </w:r>
+    </w:p>
+    <w:p>
+      <w:pPr>
+        <w:pStyle w:val="Heading1"/>
+      </w:pPr>
+      <w:r>
+        <w:t xml:space="preserve">Chapter 65: The Name That Was Divided</w:t>
+      </w:r>
+    </w:p>
+    <w:p>
+      <w:r>
+        <w:t xml:space="preserve">One identity must be surrendered.</w:t>
+      </w:r>
+    </w:p>
+    <w:p>
+      <w:r>
+        <w:t xml:space="preserve">The words appeared above the Radiant Abyss platform in gold.</w:t>
+      </w:r>
+    </w:p>
+    <w:p>
+      <w:r>
+        <w:t xml:space="preserve">They did not flicker.</w:t>
+      </w:r>
+    </w:p>
+    <w:p>
+      <w:r>
+        <w:t xml:space="preserve">They did not offer explanation.</w:t>
+      </w:r>
+    </w:p>
+    <w:p>
+      <w:r>
+        <w:t xml:space="preserve">Kai had learned to distrust system messages that arrived with certainty. The most dangerous instructions were rarely the ones marked as warnings. Warnings admitted risk. Commands like this pretended the world had already run out of alternatives.</w:t>
+      </w:r>
+    </w:p>
+    <w:p>
+      <w:r>
+        <w:t xml:space="preserve">Across the chamber, Li Yun held the sheathed sword at his side.</w:t>
+      </w:r>
+    </w:p>
+    <w:p>
+      <w:r>
+        <w:t xml:space="preserve">The young cultivator's anger was immediate, but it was not simple. Confusion moved beneath it. Hurt. Recognition without memory. He looked at Kai the way a person might look at someone wearing a face stolen from a family portrait.</w:t>
+      </w:r>
+    </w:p>
+    <w:p>
+      <w:r>
+        <w:t xml:space="preserve">The false sun dimmed another shade.</w:t>
+      </w:r>
+    </w:p>
+    <w:p>
+      <w:r>
+        <w:t xml:space="preserve">The three guardian statues shifted.</w:t>
+      </w:r>
+    </w:p>
+    <w:p>
+      <w:r>
+        <w:t xml:space="preserve">Stone ground against stone.</w:t>
+      </w:r>
+    </w:p>
+    <w:p>
+      <w:r>
+        <w:t xml:space="preserve">The chisel lowered toward Kai's chest.</w:t>
+      </w:r>
+    </w:p>
+    <w:p>
+      <w:r>
+        <w:t xml:space="preserve">The brush pointed at Li Yun's brow.</w:t>
+      </w:r>
+    </w:p>
+    <w:p>
+      <w:r>
+        <w:t xml:space="preserve">The cord uncoiled between them.</w:t>
+      </w:r>
+    </w:p>
+    <w:p>
+      <w:r>
+        <w:t xml:space="preserve">The system repeated itself through both minds.</w:t>
+      </w:r>
+    </w:p>
+    <w:p>
+      <w:r>
+        <w:t xml:space="preserve">Duplicate continuity detected.</w:t>
+      </w:r>
+    </w:p>
+    <w:p>
+      <w:r>
+        <w:t xml:space="preserve">One identity must be surrendered.</w:t>
+      </w:r>
+    </w:p>
+    <w:p>
+      <w:r>
+        <w:t xml:space="preserve">Rian sat up on the warm stone.</w:t>
+      </w:r>
+    </w:p>
+    <w:p>
+      <w:r>
+        <w:t xml:space="preserve">He looked from Kai to Li Yun, then toward the guardian statues.</w:t>
+      </w:r>
+    </w:p>
+    <w:p>
+      <w:r>
+        <w:t xml:space="preserve">"I reject the premise. "</w:t>
+      </w:r>
+    </w:p>
+    <w:p>
+      <w:r>
+        <w:t xml:space="preserve">The guardian with the brush turned its head toward him.</w:t>
+      </w:r>
+    </w:p>
+    <w:p>
+      <w:r>
+        <w:t xml:space="preserve">Rian raised both hands.</w:t>
+      </w:r>
+    </w:p>
+    <w:p>
+      <w:r>
+        <w:t xml:space="preserve">"I remain committed to the rejection. "</w:t>
+      </w:r>
+    </w:p>
+    <w:p>
+      <w:r>
+        <w:t xml:space="preserve">Han moved in front of Kai.</w:t>
+      </w:r>
+    </w:p>
+    <w:p>
+      <w:r>
+        <w:t xml:space="preserve">His baton had not returned from the abandoned platform. He held nothing except his stance, which had stopped being reassuring several disasters ago.</w:t>
+      </w:r>
+    </w:p>
+    <w:p>
+      <w:r>
+        <w:t xml:space="preserve">Dr. Venn stood beside the end of Witness Road with the resonance array pressed to her side. The brass rings had locked in place. Each pointed toward one of the two young men.</w:t>
+      </w:r>
+    </w:p>
+    <w:p>
+      <w:r>
+        <w:t xml:space="preserve">"The system is not identifying a copy," she said.</w:t>
+      </w:r>
+    </w:p>
+    <w:p>
+      <w:r>
+        <w:t xml:space="preserve">Li Yun's gaze sharpened.</w:t>
+      </w:r>
+    </w:p>
+    <w:p>
+      <w:r>
+        <w:t xml:space="preserve">"What? "</w:t>
+      </w:r>
+    </w:p>
+    <w:p>
+      <w:r>
+        <w:t xml:space="preserve">She looked between them.</w:t>
+      </w:r>
+    </w:p>
+    <w:p>
+      <w:r>
+        <w:t xml:space="preserve">"It is identifying continuity. That means both of you possess a valid claim to the same originating identity pattern. "</w:t>
+      </w:r>
+    </w:p>
+    <w:p>
+      <w:r>
+        <w:t xml:space="preserve">Kai read the message again.</w:t>
+      </w:r>
+    </w:p>
+    <w:p>
+      <w:r>
+        <w:t xml:space="preserve">Duplicate continuity.</w:t>
+      </w:r>
+    </w:p>
+    <w:p>
+      <w:r>
+        <w:t xml:space="preserve">Not duplicate body.</w:t>
+      </w:r>
+    </w:p>
+    <w:p>
+      <w:r>
+        <w:t xml:space="preserve">Not duplicated soul.</w:t>
+      </w:r>
+    </w:p>
+    <w:p>
+      <w:r>
+        <w:t xml:space="preserve">Continuity.</w:t>
+      </w:r>
+    </w:p>
+    <w:p>
+      <w:r>
+        <w:t xml:space="preserve">Li Yun drew the sword halfway from its sheath.</w:t>
+      </w:r>
+    </w:p>
+    <w:p>
+      <w:r>
+        <w:t xml:space="preserve">A clear tone filled the chamber.</w:t>
+      </w:r>
+    </w:p>
+    <w:p>
+      <w:r>
+        <w:t xml:space="preserve">The blade was white along its edge and dark near the center, as though light had been sharpened around a shadow. A voice emerged from it, feminine and irritated.</w:t>
+      </w:r>
+    </w:p>
+    <w:p>
+      <w:r>
+        <w:t xml:space="preserve">"Kai, explain why you are standing over there. "</w:t>
+      </w:r>
+    </w:p>
+    <w:p>
+      <w:r>
+        <w:t xml:space="preserve">The sword spirit knew his name.</w:t>
+      </w:r>
+    </w:p>
+    <w:p>
+      <w:r>
+        <w:t xml:space="preserve">Not Li Yun's.</w:t>
+      </w:r>
+    </w:p>
+    <w:p>
+      <w:r>
+        <w:t xml:space="preserve">His.</w:t>
+      </w:r>
+    </w:p>
+    <w:p>
+      <w:r>
+        <w:t xml:space="preserve">Li Yun froze.</w:t>
+      </w:r>
+    </w:p>
+    <w:p>
+      <w:r>
+        <w:t xml:space="preserve">"You know him? "</w:t>
+      </w:r>
+    </w:p>
+    <w:p>
+      <w:r>
+        <w:t xml:space="preserve">"I know the soul pattern beside you," the spirit said. "It was attached to you when I last checked, which was apparently more complicated than I was informed. "</w:t>
+      </w:r>
+    </w:p>
+    <w:p>
+      <w:r>
+        <w:t xml:space="preserve">Kai stared at the sword.</w:t>
+      </w:r>
+    </w:p>
+    <w:p>
+      <w:r>
+        <w:t xml:space="preserve">"Qingchi. "</w:t>
+      </w:r>
+    </w:p>
+    <w:p>
+      <w:r>
+        <w:t xml:space="preserve">The name came before thought.</w:t>
+      </w:r>
+    </w:p>
+    <w:p>
+      <w:r>
+        <w:t xml:space="preserve">Memory followed.</w:t>
+      </w:r>
+    </w:p>
+    <w:p>
+      <w:r>
+        <w:t xml:space="preserve">A mountain courtyard at dawn.</w:t>
+      </w:r>
+    </w:p>
+    <w:p>
+      <w:r>
+        <w:t xml:space="preserve">A sword floating point-down above a stone basin.</w:t>
+      </w:r>
+    </w:p>
+    <w:p>
+      <w:r>
+        <w:t xml:space="preserve">A voice complaining that his meridian circulation lacked elegance.</w:t>
+      </w:r>
+    </w:p>
+    <w:p>
+      <w:r>
+        <w:t xml:space="preserve">Li Yun's hand tightened around the hilt.</w:t>
+      </w:r>
+    </w:p>
+    <w:p>
+      <w:r>
+        <w:t xml:space="preserve">"You remember her. "</w:t>
+      </w:r>
+    </w:p>
+    <w:p>
+      <w:r>
+        <w:t xml:space="preserve">"Fragments. "</w:t>
+      </w:r>
+    </w:p>
+    <w:p>
+      <w:r>
+        <w:t xml:space="preserve">"Those are my memories. "</w:t>
+      </w:r>
+    </w:p>
+    <w:p>
+      <w:r>
+        <w:t xml:space="preserve">Kai looked at him.</w:t>
+      </w:r>
+    </w:p>
+    <w:p>
+      <w:r>
+        <w:t xml:space="preserve">"They do not feel borrowed. "</w:t>
+      </w:r>
+    </w:p>
+    <w:p>
+      <w:r>
+        <w:t xml:space="preserve">"Of course they do not. That is what theft would feel like if it worked. "</w:t>
+      </w:r>
+    </w:p>
+    <w:p>
+      <w:r>
+        <w:t xml:space="preserve">The cord guardian moved.</w:t>
+      </w:r>
+    </w:p>
+    <w:p>
+      <w:r>
+        <w:t xml:space="preserve">Its stone rope crossed the chamber and wrapped around Kai's left wrist. The other end circled Li Yun's right.</w:t>
+      </w:r>
+    </w:p>
+    <w:p>
+      <w:r>
+        <w:t xml:space="preserve">Light traveled through it.</w:t>
+      </w:r>
+    </w:p>
+    <w:p>
+      <w:r>
+        <w:t xml:space="preserve">The chamber vanished.</w:t>
+      </w:r>
+    </w:p>
+    <w:p>
+      <w:r>
+        <w:t xml:space="preserve">Kai stood beneath a winter sky.</w:t>
+      </w:r>
+    </w:p>
+    <w:p>
+      <w:r>
+        <w:t xml:space="preserve">He wore gray sect robes. Snow rested along the courtyard rail. Qingchi floated before him in sword form while an older cultivator watched from beneath an archway.</w:t>
+      </w:r>
+    </w:p>
+    <w:p>
+      <w:r>
+        <w:t xml:space="preserve">"Again," the elder said.</w:t>
+      </w:r>
+    </w:p>
+    <w:p>
+      <w:r>
+        <w:t xml:space="preserve">Kai moved.</w:t>
+      </w:r>
+    </w:p>
+    <w:p>
+      <w:r>
+        <w:t xml:space="preserve">No.</w:t>
+      </w:r>
+    </w:p>
+    <w:p>
+      <w:r>
+        <w:t xml:space="preserve">Li Yun moved.</w:t>
+      </w:r>
+    </w:p>
+    <w:p>
+      <w:r>
+        <w:t xml:space="preserve">The memory shifted depending upon which body claimed it. Kai felt the sword grip in his hands and watched those same hands from across the courtyard. He remembered failing the technique. He remembered observing the failure through someone else's frustration.</w:t>
+      </w:r>
+    </w:p>
+    <w:p>
+      <w:r>
+        <w:t xml:space="preserve">The scene broke.</w:t>
+      </w:r>
+    </w:p>
+    <w:p>
+      <w:r>
+        <w:t xml:space="preserve">A hospital room replaced it.</w:t>
+      </w:r>
+    </w:p>
+    <w:p>
+      <w:r>
+        <w:t xml:space="preserve">Rain struck glass.</w:t>
+      </w:r>
+    </w:p>
+    <w:p>
+      <w:r>
+        <w:t xml:space="preserve">Machines hummed beside a bed.</w:t>
+      </w:r>
+    </w:p>
+    <w:p>
+      <w:r>
+        <w:t xml:space="preserve">Kai lay beneath a white sheet while Dr. Park stood near the window speaking to someone in a low voice.</w:t>
+      </w:r>
+    </w:p>
+    <w:p>
+      <w:r>
+        <w:t xml:space="preserve">The memory belonged to Kai.</w:t>
+      </w:r>
+    </w:p>
+    <w:p>
+      <w:r>
+        <w:t xml:space="preserve">Li Yun experienced it too.</w:t>
+      </w:r>
+    </w:p>
+    <w:p>
+      <w:r>
+        <w:t xml:space="preserve">His breath caught.</w:t>
+      </w:r>
+    </w:p>
+    <w:p>
+      <w:r>
+        <w:t xml:space="preserve">The room changed again.</w:t>
+      </w:r>
+    </w:p>
+    <w:p>
+      <w:r>
+        <w:t xml:space="preserve">A mountain cave.</w:t>
+      </w:r>
+    </w:p>
+    <w:p>
+      <w:r>
+        <w:t xml:space="preserve">A radiant shard embedded in stone.</w:t>
+      </w:r>
+    </w:p>
+    <w:p>
+      <w:r>
+        <w:t xml:space="preserve">A system prompt.</w:t>
+      </w:r>
+    </w:p>
+    <w:p>
+      <w:r>
+        <w:t xml:space="preserve">Heavenly Ascension System initializing.</w:t>
+      </w:r>
+    </w:p>
+    <w:p>
+      <w:r>
+        <w:t xml:space="preserve">Then a city alley.</w:t>
+      </w:r>
+    </w:p>
+    <w:p>
+      <w:r>
+        <w:t xml:space="preserve">Concrete beneath Kai's palms.</w:t>
+      </w:r>
+    </w:p>
+    <w:p>
+      <w:r>
+        <w:t xml:space="preserve">Sirens.</w:t>
+      </w:r>
+    </w:p>
+    <w:p>
+      <w:r>
+        <w:t xml:space="preserve">The same prompt appeared.</w:t>
+      </w:r>
+    </w:p>
+    <w:p>
+      <w:r>
+        <w:t xml:space="preserve">The cord pulled tighter.</w:t>
+      </w:r>
+    </w:p>
+    <w:p>
+      <w:r>
+        <w:t xml:space="preserve">Lives alternated.</w:t>
+      </w:r>
+    </w:p>
+    <w:p>
+      <w:r>
+        <w:t xml:space="preserve">Li Yun beneath sect lanterns.</w:t>
+      </w:r>
+    </w:p>
+    <w:p>
+      <w:r>
+        <w:t xml:space="preserve">Kai beneath streetlights.</w:t>
+      </w:r>
+    </w:p>
+    <w:p>
+      <w:r>
+        <w:t xml:space="preserve">Li Yun carrying Qingchi through the Radiant Abyss.</w:t>
+      </w:r>
+    </w:p>
+    <w:p>
+      <w:r>
+        <w:t xml:space="preserve">Kai waking to a world where cultivation existed behind official denials and sealed incident reports.</w:t>
+      </w:r>
+    </w:p>
+    <w:p>
+      <w:r>
+        <w:t xml:space="preserve">The system did not show one life copied into another.</w:t>
+      </w:r>
+    </w:p>
+    <w:p>
+      <w:r>
+        <w:t xml:space="preserve">It showed a break.</w:t>
+      </w:r>
+    </w:p>
+    <w:p>
+      <w:r>
+        <w:t xml:space="preserve">A single continuity approached a threshold.</w:t>
+      </w:r>
+    </w:p>
+    <w:p>
+      <w:r>
+        <w:t xml:space="preserve">Then divided.</w:t>
+      </w:r>
+    </w:p>
+    <w:p>
+      <w:r>
+        <w:t xml:space="preserve">One branch continued through the Radiant Abyss.</w:t>
+      </w:r>
+    </w:p>
+    <w:p>
+      <w:r>
+        <w:t xml:space="preserve">The other woke inside Kai Li.</w:t>
+      </w:r>
+    </w:p>
+    <w:p>
+      <w:r>
+        <w:t xml:space="preserve">Both heard the same system.</w:t>
+      </w:r>
+    </w:p>
+    <w:p>
+      <w:r>
+        <w:t xml:space="preserve">Both believed the voice had begun with them.</w:t>
+      </w:r>
+    </w:p>
+    <w:p>
+      <w:r>
+        <w:t xml:space="preserve">The vision ended.</w:t>
+      </w:r>
+    </w:p>
+    <w:p>
+      <w:r>
+        <w:t xml:space="preserve">Kai returned to the chamber on one knee.</w:t>
+      </w:r>
+    </w:p>
+    <w:p>
+      <w:r>
+        <w:t xml:space="preserve">Li Yun stood with the sword fully drawn, but its point had lowered.</w:t>
+      </w:r>
+    </w:p>
+    <w:p>
+      <w:r>
+        <w:t xml:space="preserve">Neither spoke.</w:t>
+      </w:r>
+    </w:p>
+    <w:p>
+      <w:r>
+        <w:t xml:space="preserve">Qingchi broke the silence.</w:t>
+      </w:r>
+    </w:p>
+    <w:p>
+      <w:r>
+        <w:t xml:space="preserve">"That was unpleasantly informative. "</w:t>
+      </w:r>
+    </w:p>
+    <w:p>
+      <w:r>
+        <w:t xml:space="preserve">Rian looked at her.</w:t>
+      </w:r>
+    </w:p>
+    <w:p>
+      <w:r>
+        <w:t xml:space="preserve">"I like you. "</w:t>
+      </w:r>
+    </w:p>
+    <w:p>
+      <w:r>
+        <w:t xml:space="preserve">"I have not decided whether you are worth disliking. "</w:t>
+      </w:r>
+    </w:p>
+    <w:p>
+      <w:r>
+        <w:t xml:space="preserve">"Still progress. "</w:t>
+      </w:r>
+    </w:p>
+    <w:p>
+      <w:r>
+        <w:t xml:space="preserve">Dr. Venn crouched beside Kai.</w:t>
+      </w:r>
+    </w:p>
+    <w:p>
+      <w:r>
+        <w:t xml:space="preserve">"What happened? "</w:t>
+      </w:r>
+    </w:p>
+    <w:p>
+      <w:r>
+        <w:t xml:space="preserve">Kai looked at Li Yun.</w:t>
+      </w:r>
+    </w:p>
+    <w:p>
+      <w:r>
+        <w:t xml:space="preserve">"We were one person. "</w:t>
+      </w:r>
+    </w:p>
+    <w:p>
+      <w:r>
+        <w:t xml:space="preserve">Li Yun's jaw tightened.</w:t>
+      </w:r>
+    </w:p>
+    <w:p>
+      <w:r>
+        <w:t xml:space="preserve">"Before. "</w:t>
+      </w:r>
+    </w:p>
+    <w:p>
+      <w:r>
+        <w:t xml:space="preserve">Kai nodded.</w:t>
+      </w:r>
+    </w:p>
+    <w:p>
+      <w:r>
+        <w:t xml:space="preserve">"Before something split us. "</w:t>
+      </w:r>
+    </w:p>
+    <w:p>
+      <w:r>
+        <w:t xml:space="preserve">The system responded.</w:t>
+      </w:r>
+    </w:p>
+    <w:p>
+      <w:r>
+        <w:t xml:space="preserve">Correction: Continuity division was required for candidate preservation.</w:t>
+      </w:r>
+    </w:p>
+    <w:p>
+      <w:r>
+        <w:t xml:space="preserve">Original sequence exceeded viable identity capacity.</w:t>
+      </w:r>
+    </w:p>
+    <w:p>
+      <w:r>
+        <w:t xml:space="preserve">One branch retained legacy cultivation context.</w:t>
+      </w:r>
+    </w:p>
+    <w:p>
+      <w:r>
+        <w:t xml:space="preserve">One branch received adaptive world context.</w:t>
+      </w:r>
+    </w:p>
+    <w:p>
+      <w:r>
+        <w:t xml:space="preserve">Current branch convergence is unauthorized.</w:t>
+      </w:r>
+    </w:p>
+    <w:p>
+      <w:r>
+        <w:t xml:space="preserve">Dr. Venn read Kai's expression.</w:t>
+      </w:r>
+    </w:p>
+    <w:p>
+      <w:r>
+        <w:t xml:space="preserve">"It split the candidate deliberately. "</w:t>
+      </w:r>
+    </w:p>
+    <w:p>
+      <w:r>
+        <w:t xml:space="preserve">Li Yun looked upward.</w:t>
+      </w:r>
+    </w:p>
+    <w:p>
+      <w:r>
+        <w:t xml:space="preserve">"Why? "</w:t>
+      </w:r>
+    </w:p>
+    <w:p>
+      <w:r>
+        <w:t xml:space="preserve">The system answered through both of them.</w:t>
+      </w:r>
+    </w:p>
+    <w:p>
+      <w:r>
+        <w:t xml:space="preserve">Access restricted.</w:t>
+      </w:r>
+    </w:p>
+    <w:p>
+      <w:r>
+        <w:t xml:space="preserve">Qingchi's blade hummed.</w:t>
+      </w:r>
+    </w:p>
+    <w:p>
+      <w:r>
+        <w:t xml:space="preserve">"I can attempt to cut the message. "</w:t>
+      </w:r>
+    </w:p>
+    <w:p>
+      <w:r>
+        <w:t xml:space="preserve">"You cannot cut a system notification," Li Yun said.</w:t>
+      </w:r>
+    </w:p>
+    <w:p>
+      <w:r>
+        <w:t xml:space="preserve">"You say that because you lack ambition. "</w:t>
+      </w:r>
+    </w:p>
+    <w:p>
+      <w:r>
+        <w:t xml:space="preserve">The false sun brightened.</w:t>
+      </w:r>
+    </w:p>
+    <w:p>
+      <w:r>
+        <w:t xml:space="preserve">Golden pressure descended.</w:t>
+      </w:r>
+    </w:p>
+    <w:p>
+      <w:r>
+        <w:t xml:space="preserve">The hundreds rescued from the mendicant's bowl began to sink to their knees. Witness Road trembled behind them. Its white stones faded near the chamber wall.</w:t>
+      </w:r>
+    </w:p>
+    <w:p>
+      <w:r>
+        <w:t xml:space="preserve">The Sunlit Mendicant stood beneath the first guardian statue, holding one broken half of his bowl.</w:t>
+      </w:r>
+    </w:p>
+    <w:p>
+      <w:r>
+        <w:t xml:space="preserve">"The road will not remain without active witnesses. "</w:t>
+      </w:r>
+    </w:p>
+    <w:p>
+      <w:r>
+        <w:t xml:space="preserve">Choi tightened her grip on the young girl's hand.</w:t>
+      </w:r>
+    </w:p>
+    <w:p>
+      <w:r>
+        <w:t xml:space="preserve">"We are witnessing. "</w:t>
+      </w:r>
+    </w:p>
+    <w:p>
+      <w:r>
+        <w:t xml:space="preserve">"You are also being forced into a decision that is not yours. "</w:t>
+      </w:r>
+    </w:p>
+    <w:p>
+      <w:r>
+        <w:t xml:space="preserve">The mendicant looked toward Kai and Li Yun.</w:t>
+      </w:r>
+    </w:p>
+    <w:p>
+      <w:r>
+        <w:t xml:space="preserve">"The system is narrowing the chamber. "</w:t>
+      </w:r>
+    </w:p>
+    <w:p>
+      <w:r>
+        <w:t xml:space="preserve">Kai felt it.</w:t>
+      </w:r>
+    </w:p>
+    <w:p>
+      <w:r>
+        <w:t xml:space="preserve">The Radiant Abyss had seemed vast when they entered. Now the circular walls stood closer. The three guardians towered above them, their tools creating a triangle around the two candidates.</w:t>
+      </w:r>
+    </w:p>
+    <w:p>
+      <w:r>
+        <w:t xml:space="preserve">Chisel.</w:t>
+      </w:r>
+    </w:p>
+    <w:p>
+      <w:r>
+        <w:t xml:space="preserve">Brush.</w:t>
+      </w:r>
+    </w:p>
+    <w:p>
+      <w:r>
+        <w:t xml:space="preserve">Cord.</w:t>
+      </w:r>
+    </w:p>
+    <w:p>
+      <w:r>
+        <w:t xml:space="preserve">Shape.</w:t>
+      </w:r>
+    </w:p>
+    <w:p>
+      <w:r>
+        <w:t xml:space="preserve">Name.</w:t>
+      </w:r>
+    </w:p>
+    <w:p>
+      <w:r>
+        <w:t xml:space="preserve">Connection.</w:t>
+      </w:r>
+    </w:p>
+    <w:p>
+      <w:r>
+        <w:t xml:space="preserve">The system intended to resolve the duplicate through those three functions.</w:t>
+      </w:r>
+    </w:p>
+    <w:p>
+      <w:r>
+        <w:t xml:space="preserve">The chisel would remove what did not belong.</w:t>
+      </w:r>
+    </w:p>
+    <w:p>
+      <w:r>
+        <w:t xml:space="preserve">The brush would record what remained.</w:t>
+      </w:r>
+    </w:p>
+    <w:p>
+      <w:r>
+        <w:t xml:space="preserve">The cord would tie continuity into one accepted line.</w:t>
+      </w:r>
+    </w:p>
+    <w:p>
+      <w:r>
+        <w:t xml:space="preserve">"Do not let the guardians complete the formation," Kai said.</w:t>
+      </w:r>
+    </w:p>
+    <w:p>
+      <w:r>
+        <w:t xml:space="preserve">Han looked at the stone tools.</w:t>
+      </w:r>
+    </w:p>
+    <w:p>
+      <w:r>
+        <w:t xml:space="preserve">"How? "</w:t>
+      </w:r>
+    </w:p>
+    <w:p>
+      <w:r>
+        <w:t xml:space="preserve">The chisel struck.</w:t>
+      </w:r>
+    </w:p>
+    <w:p>
+      <w:r>
+        <w:t xml:space="preserve">Kai moved before it reached him.</w:t>
+      </w:r>
+    </w:p>
+    <w:p>
+      <w:r>
+        <w:t xml:space="preserve">He drew qi through his meridians and stepped sideways. The stone point did not follow his body. It followed his identity pattern.</w:t>
+      </w:r>
+    </w:p>
+    <w:p>
+      <w:r>
+        <w:t xml:space="preserve">The chisel altered direction in midair.</w:t>
+      </w:r>
+    </w:p>
+    <w:p>
+      <w:r>
+        <w:t xml:space="preserve">Li Yun reacted.</w:t>
+      </w:r>
+    </w:p>
+    <w:p>
+      <w:r>
+        <w:t xml:space="preserve">His sword left the sheath in a white arc. Qingchi's edge struck the stone tool.</w:t>
+      </w:r>
+    </w:p>
+    <w:p>
+      <w:r>
+        <w:t xml:space="preserve">The impact shook the chamber.</w:t>
+      </w:r>
+    </w:p>
+    <w:p>
+      <w:r>
+        <w:t xml:space="preserve">Cracks spread across the floor.</w:t>
+      </w:r>
+    </w:p>
+    <w:p>
+      <w:r>
+        <w:t xml:space="preserve">Li Yun slid backward.</w:t>
+      </w:r>
+    </w:p>
+    <w:p>
+      <w:r>
+        <w:t xml:space="preserve">Qingchi screamed in metal.</w:t>
+      </w:r>
+    </w:p>
+    <w:p>
+      <w:r>
+        <w:t xml:space="preserve">"That statue lacks refinement. "</w:t>
+      </w:r>
+    </w:p>
+    <w:p>
+      <w:r>
+        <w:t xml:space="preserve">The chisel stopped.</w:t>
+      </w:r>
+    </w:p>
+    <w:p>
+      <w:r>
+        <w:t xml:space="preserve">Not defeated.</w:t>
+      </w:r>
+    </w:p>
+    <w:p>
+      <w:r>
+        <w:t xml:space="preserve">Interrupted.</w:t>
+      </w:r>
+    </w:p>
+    <w:p>
+      <w:r>
+        <w:t xml:space="preserve">The brush descended.</w:t>
+      </w:r>
+    </w:p>
+    <w:p>
+      <w:r>
+        <w:t xml:space="preserve">Golden characters formed around Li Yun.</w:t>
+      </w:r>
+    </w:p>
+    <w:p>
+      <w:r>
+        <w:t xml:space="preserve">LI YUN.</w:t>
+      </w:r>
+    </w:p>
+    <w:p>
+      <w:r>
+        <w:t xml:space="preserve">ORIGINAL CANDIDATE.</w:t>
+      </w:r>
+    </w:p>
+    <w:p>
+      <w:r>
+        <w:t xml:space="preserve">LEGACY CONTINUITY.</w:t>
+      </w:r>
+    </w:p>
+    <w:p>
+      <w:r>
+        <w:t xml:space="preserve">The brush turned toward Kai.</w:t>
+      </w:r>
+    </w:p>
+    <w:p>
+      <w:r>
+        <w:t xml:space="preserve">KAI LI.</w:t>
+      </w:r>
+    </w:p>
+    <w:p>
+      <w:r>
+        <w:t xml:space="preserve">ADAPTIVE CANDIDATE.</w:t>
+      </w:r>
+    </w:p>
+    <w:p>
+      <w:r>
+        <w:t xml:space="preserve">DELIVERY CONTINUITY.</w:t>
+      </w:r>
+    </w:p>
+    <w:p>
+      <w:r>
+        <w:t xml:space="preserve">The titles moved toward each other.</w:t>
+      </w:r>
+    </w:p>
+    <w:p>
+      <w:r>
+        <w:t xml:space="preserve">At their center, a final line appeared.</w:t>
+      </w:r>
+    </w:p>
+    <w:p>
+      <w:r>
+        <w:t xml:space="preserve">SURVIVING IDENTITY.</w:t>
+      </w:r>
+    </w:p>
+    <w:p>
+      <w:r>
+        <w:t xml:space="preserve">Blank.</w:t>
+      </w:r>
+    </w:p>
+    <w:p>
+      <w:r>
+        <w:t xml:space="preserve">The system waited.</w:t>
+      </w:r>
+    </w:p>
+    <w:p>
+      <w:r>
+        <w:t xml:space="preserve">The cord tightened between their wrists.</w:t>
+      </w:r>
+    </w:p>
+    <w:p>
+      <w:r>
+        <w:t xml:space="preserve">Kai felt his memories pulling toward the empty line.</w:t>
+      </w:r>
+    </w:p>
+    <w:p>
+      <w:r>
+        <w:t xml:space="preserve">Hospital rain.</w:t>
+      </w:r>
+    </w:p>
+    <w:p>
+      <w:r>
+        <w:t xml:space="preserve">Dr. Park's warning.</w:t>
+      </w:r>
+    </w:p>
+    <w:p>
+      <w:r>
+        <w:t xml:space="preserve">Han insulting a minibus heater.</w:t>
+      </w:r>
+    </w:p>
+    <w:p>
+      <w:r>
+        <w:t xml:space="preserve">Rian shielding himself with a binder.</w:t>
+      </w:r>
+    </w:p>
+    <w:p>
+      <w:r>
+        <w:t xml:space="preserve">Seo Jun choosing to stop carrying a town.</w:t>
+      </w:r>
+    </w:p>
+    <w:p>
+      <w:r>
+        <w:t xml:space="preserve">Each rose inside him as though preparing to be submitted for evaluation.</w:t>
+      </w:r>
+    </w:p>
+    <w:p>
+      <w:r>
+        <w:t xml:space="preserve">Across the cord, Li Yun's life did the same.</w:t>
+      </w:r>
+    </w:p>
+    <w:p>
+      <w:r>
+        <w:t xml:space="preserve">Azure Sky Sect.</w:t>
+      </w:r>
+    </w:p>
+    <w:p>
+      <w:r>
+        <w:t xml:space="preserve">Qingchi.</w:t>
+      </w:r>
+    </w:p>
+    <w:p>
+      <w:r>
+        <w:t xml:space="preserve">Elder Qiao.</w:t>
+      </w:r>
+    </w:p>
+    <w:p>
+      <w:r>
+        <w:t xml:space="preserve">The Radiant Abyss.</w:t>
+      </w:r>
+    </w:p>
+    <w:p>
+      <w:r>
+        <w:t xml:space="preserve">The chisel, brush, and cord guardians in another awakening.</w:t>
+      </w:r>
+    </w:p>
+    <w:p>
+      <w:r>
+        <w:t xml:space="preserve">A Source Lumen shard.</w:t>
+      </w:r>
+    </w:p>
+    <w:p>
+      <w:r>
+        <w:t xml:space="preserve">A node called Sunlit Mendicant.</w:t>
+      </w:r>
+    </w:p>
+    <w:p>
+      <w:r>
+        <w:t xml:space="preserve">The system compared them.</w:t>
+      </w:r>
+    </w:p>
+    <w:p>
+      <w:r>
+        <w:t xml:space="preserve">Not by importance.</w:t>
+      </w:r>
+    </w:p>
+    <w:p>
+      <w:r>
+        <w:t xml:space="preserve">By utility.</w:t>
+      </w:r>
+    </w:p>
+    <w:p>
+      <w:r>
+        <w:t xml:space="preserve">Kai understood with sudden clarity.</w:t>
+      </w:r>
+    </w:p>
+    <w:p>
+      <w:r>
+        <w:t xml:space="preserve">It would preserve whichever branch better served the network.</w:t>
+      </w:r>
+    </w:p>
+    <w:p>
+      <w:r>
+        <w:t xml:space="preserve">His life in the modern world had made him adaptive. Able to navigate institutions, sealed formations, administrative identities, and people who did not understand cultivation.</w:t>
+      </w:r>
+    </w:p>
+    <w:p>
+      <w:r>
+        <w:t xml:space="preserve">Li Yun retained the original cultivation context. Techniques. Legacy access. Recognition from nodes tied to the system's first design.</w:t>
+      </w:r>
+    </w:p>
+    <w:p>
+      <w:r>
+        <w:t xml:space="preserve">The system did not care who had lived more fully.</w:t>
+      </w:r>
+    </w:p>
+    <w:p>
+      <w:r>
+        <w:t xml:space="preserve">It cared which candidate completed its function.</w:t>
+      </w:r>
+    </w:p>
+    <w:p>
+      <w:r>
+        <w:t xml:space="preserve">"Do not compete," Kai said.</w:t>
+      </w:r>
+    </w:p>
+    <w:p>
+      <w:r>
+        <w:t xml:space="preserve">Li Yun looked at him.</w:t>
+      </w:r>
+    </w:p>
+    <w:p>
+      <w:r>
+        <w:t xml:space="preserve">"The system is measuring us. "</w:t>
+      </w:r>
+    </w:p>
+    <w:p>
+      <w:r>
+        <w:t xml:space="preserve">"It is trying to make survival comparative. "</w:t>
+      </w:r>
+    </w:p>
+    <w:p>
+      <w:r>
+        <w:t xml:space="preserve">"And one of us may actually disappear. "</w:t>
+      </w:r>
+    </w:p>
+    <w:p>
+      <w:r>
+        <w:t xml:space="preserve">"Yes. "</w:t>
+      </w:r>
+    </w:p>
+    <w:p>
+      <w:r>
+        <w:t xml:space="preserve">"That seems relevant. "</w:t>
+      </w:r>
+    </w:p>
+    <w:p>
+      <w:r>
+        <w:t xml:space="preserve">"It is. "</w:t>
+      </w:r>
+    </w:p>
+    <w:p>
+      <w:r>
+        <w:t xml:space="preserve">Kai pulled against the cord.</w:t>
+      </w:r>
+    </w:p>
+    <w:p>
+      <w:r>
+        <w:t xml:space="preserve">It held.</w:t>
+      </w:r>
+    </w:p>
+    <w:p>
+      <w:r>
+        <w:t xml:space="preserve">"But if we prove which branch is more useful, we accept its right to discard the other. "</w:t>
+      </w:r>
+    </w:p>
+    <w:p>
+      <w:r>
+        <w:t xml:space="preserve">Li Yun's expression darkened.</w:t>
+      </w:r>
+    </w:p>
+    <w:p>
+      <w:r>
+        <w:t xml:space="preserve">"You have a better plan? "</w:t>
+      </w:r>
+    </w:p>
+    <w:p>
+      <w:r>
+        <w:t xml:space="preserve">"No. "</w:t>
+      </w:r>
+    </w:p>
+    <w:p>
+      <w:r>
+        <w:t xml:space="preserve">The answer stopped him.</w:t>
+      </w:r>
+    </w:p>
+    <w:p>
+      <w:r>
+        <w:t xml:space="preserve">Kai continued.</w:t>
+      </w:r>
+    </w:p>
+    <w:p>
+      <w:r>
+        <w:t xml:space="preserve">"But I know what kind of plan it expects. "</w:t>
+      </w:r>
+    </w:p>
+    <w:p>
+      <w:r>
+        <w:t xml:space="preserve">The system tightened the cord.</w:t>
+      </w:r>
+    </w:p>
+    <w:p>
+      <w:r>
+        <w:t xml:space="preserve">Resolution delay detected.</w:t>
+      </w:r>
+    </w:p>
+    <w:p>
+      <w:r>
+        <w:t xml:space="preserve">Forced evaluation beginning.</w:t>
+      </w:r>
+    </w:p>
+    <w:p>
+      <w:r>
+        <w:t xml:space="preserve">The chamber changed.</w:t>
+      </w:r>
+    </w:p>
+    <w:p>
+      <w:r>
+        <w:t xml:space="preserve">Golden panels opened in the air.</w:t>
+      </w:r>
+    </w:p>
+    <w:p>
+      <w:r>
+        <w:t xml:space="preserve">One showed West Haneul.</w:t>
+      </w:r>
+    </w:p>
+    <w:p>
+      <w:r>
+        <w:t xml:space="preserve">Residents stood outside the memorial site, black strips around their wrists. The local formation remained unstable. Without Kai, network pressure would eventually return.</w:t>
+      </w:r>
+    </w:p>
+    <w:p>
+      <w:r>
+        <w:t xml:space="preserve">Another showed Azure Sky Sect.</w:t>
+      </w:r>
+    </w:p>
+    <w:p>
+      <w:r>
+        <w:t xml:space="preserve">Disciples defended a cracked mountain gate. Golden corruption spread through the formation lines. Elder Qiao stood at the center, bleeding from one shoulder.</w:t>
+      </w:r>
+    </w:p>
+    <w:p>
+      <w:r>
+        <w:t xml:space="preserve">Li Yun took one step toward the image.</w:t>
+      </w:r>
+    </w:p>
+    <w:p>
+      <w:r>
+        <w:t xml:space="preserve">"Elder Qiao. "</w:t>
+      </w:r>
+    </w:p>
+    <w:p>
+      <w:r>
+        <w:t xml:space="preserve">The system displayed two objectives.</w:t>
+      </w:r>
+    </w:p>
+    <w:p>
+      <w:r>
+        <w:t xml:space="preserve">Adaptive branch objective: Preserve West Haneul node.</w:t>
+      </w:r>
+    </w:p>
+    <w:p>
+      <w:r>
+        <w:t xml:space="preserve">Legacy branch objective: Preserve Azure Sky Sect node.</w:t>
+      </w:r>
+    </w:p>
+    <w:p>
+      <w:r>
+        <w:t xml:space="preserve">A timer appeared.</w:t>
+      </w:r>
+    </w:p>
+    <w:p>
+      <w:r>
+        <w:t xml:space="preserve">Estimated simultaneous collapse: 12 minutes.</w:t>
+      </w:r>
+    </w:p>
+    <w:p>
+      <w:r>
+        <w:t xml:space="preserve">Rian stared upward.</w:t>
+      </w:r>
+    </w:p>
+    <w:p>
+      <w:r>
+        <w:t xml:space="preserve">"That is not enough time for either journey. "</w:t>
+      </w:r>
+    </w:p>
+    <w:p>
+      <w:r>
+        <w:t xml:space="preserve">"The chamber may connect directly," Dr. Venn said.</w:t>
+      </w:r>
+    </w:p>
+    <w:p>
+      <w:r>
+        <w:t xml:space="preserve">"Then we save both," Han replied.</w:t>
+      </w:r>
+    </w:p>
+    <w:p>
+      <w:r>
+        <w:t xml:space="preserve">The system responded.</w:t>
+      </w:r>
+    </w:p>
+    <w:p>
+      <w:r>
+        <w:t xml:space="preserve">Branch separation required.</w:t>
+      </w:r>
+    </w:p>
+    <w:p>
+      <w:r>
+        <w:t xml:space="preserve">Each candidate must select assigned objective.</w:t>
+      </w:r>
+    </w:p>
+    <w:p>
+      <w:r>
+        <w:t xml:space="preserve">Kai looked at Li Yun.</w:t>
+      </w:r>
+    </w:p>
+    <w:p>
+      <w:r>
+        <w:t xml:space="preserve">The trap was precise.</w:t>
+      </w:r>
+    </w:p>
+    <w:p>
+      <w:r>
+        <w:t xml:space="preserve">If each chose his own world, the system confirmed separation.</w:t>
+      </w:r>
+    </w:p>
+    <w:p>
+      <w:r>
+        <w:t xml:space="preserve">If one abandoned his world to assist the other, usefulness changed.</w:t>
+      </w:r>
+    </w:p>
+    <w:p>
+      <w:r>
+        <w:t xml:space="preserve">If both chose the same objective, the unchosen site collapsed and guilt determined the survivor.</w:t>
+      </w:r>
+    </w:p>
+    <w:p>
+      <w:r>
+        <w:t xml:space="preserve">Qingchi's edge flickered.</w:t>
+      </w:r>
+    </w:p>
+    <w:p>
+      <w:r>
+        <w:t xml:space="preserve">"The system always was dramatic. "</w:t>
+      </w:r>
+    </w:p>
+    <w:p>
+      <w:r>
+        <w:t xml:space="preserve">Li Yun looked at her.</w:t>
+      </w:r>
+    </w:p>
+    <w:p>
+      <w:r>
+        <w:t xml:space="preserve">"You remember this kind of test? "</w:t>
+      </w:r>
+    </w:p>
+    <w:p>
+      <w:r>
+        <w:t xml:space="preserve">"I remember it offering choices that became inevitable only after someone believed the wording. "</w:t>
+      </w:r>
+    </w:p>
+    <w:p>
+      <w:r>
+        <w:t xml:space="preserve">The Sunlit Mendicant tapped his broken bowl against the floor.</w:t>
+      </w:r>
+    </w:p>
+    <w:p>
+      <w:r>
+        <w:t xml:space="preserve">A soft note spread.</w:t>
+      </w:r>
+    </w:p>
+    <w:p>
+      <w:r>
+        <w:t xml:space="preserve">Witness Road brightened.</w:t>
+      </w:r>
+    </w:p>
+    <w:p>
+      <w:r>
+        <w:t xml:space="preserve">"The promise still holds," he said.</w:t>
+      </w:r>
+    </w:p>
+    <w:p>
+      <w:r>
+        <w:t xml:space="preserve">"Under their own names until they can choose. "</w:t>
+      </w:r>
+    </w:p>
+    <w:p>
+      <w:r>
+        <w:t xml:space="preserve">Kai followed his gaze toward the rescued identities.</w:t>
+      </w:r>
+    </w:p>
+    <w:p>
+      <w:r>
+        <w:t xml:space="preserve">Hundreds of people stood within the chamber. West Haneul's lost. The coastal node's unassigned. The mountain gate's abandoned. They had been treated as passive cargo until the road gave them a temporary place under their own names.</w:t>
+      </w:r>
+    </w:p>
+    <w:p>
+      <w:r>
+        <w:t xml:space="preserve">Now they watched two identities being told only one could remain.</w:t>
+      </w:r>
+    </w:p>
+    <w:p>
+      <w:r>
+        <w:t xml:space="preserve">The young girl beside Choi raised her hand.</w:t>
+      </w:r>
+    </w:p>
+    <w:p>
+      <w:r>
+        <w:t xml:space="preserve">"I choose him. "</w:t>
+      </w:r>
+    </w:p>
+    <w:p>
+      <w:r>
+        <w:t xml:space="preserve">Everyone looked at her.</w:t>
+      </w:r>
+    </w:p>
+    <w:p>
+      <w:r>
+        <w:t xml:space="preserve">She pointed at Seo Jun.</w:t>
+      </w:r>
+    </w:p>
+    <w:p>
+      <w:r>
+        <w:t xml:space="preserve">The old custodian blinked.</w:t>
+      </w:r>
+    </w:p>
+    <w:p>
+      <w:r>
+        <w:t xml:space="preserve">"For what? "</w:t>
+      </w:r>
+    </w:p>
+    <w:p>
+      <w:r>
+        <w:t xml:space="preserve">"To come with me. "</w:t>
+      </w:r>
+    </w:p>
+    <w:p>
+      <w:r>
+        <w:t xml:space="preserve">"Where? "</w:t>
+      </w:r>
+    </w:p>
+    <w:p>
+      <w:r>
+        <w:t xml:space="preserve">"I do not know yet. "</w:t>
+      </w:r>
+    </w:p>
+    <w:p>
+      <w:r>
+        <w:t xml:space="preserve">The black strip around her wrist loosened.</w:t>
+      </w:r>
+    </w:p>
+    <w:p>
+      <w:r>
+        <w:t xml:space="preserve">The system flickered.</w:t>
+      </w:r>
+    </w:p>
+    <w:p>
+      <w:r>
+        <w:t xml:space="preserve">Irrelevant declaration.</w:t>
+      </w:r>
+    </w:p>
+    <w:p>
+      <w:r>
+        <w:t xml:space="preserve">The girl frowned at the air.</w:t>
+      </w:r>
+    </w:p>
+    <w:p>
+      <w:r>
+        <w:t xml:space="preserve">"It was relevant to me. "</w:t>
+      </w:r>
+    </w:p>
+    <w:p>
+      <w:r>
+        <w:t xml:space="preserve">Rian smiled.</w:t>
+      </w:r>
+    </w:p>
+    <w:p>
+      <w:r>
+        <w:t xml:space="preserve">"That may be the best answer we have. "</w:t>
+      </w:r>
+    </w:p>
+    <w:p>
+      <w:r>
+        <w:t xml:space="preserve">Others began speaking.</w:t>
+      </w:r>
+    </w:p>
+    <w:p>
+      <w:r>
+        <w:t xml:space="preserve">A coastal woman pointed toward the mendicant.</w:t>
+      </w:r>
+    </w:p>
+    <w:p>
+      <w:r>
+        <w:t xml:space="preserve">"I choose to remain on Witness Road until my city is found. "</w:t>
+      </w:r>
+    </w:p>
+    <w:p>
+      <w:r>
+        <w:t xml:space="preserve">A burned mountain worker looked at Dr. Venn.</w:t>
+      </w:r>
+    </w:p>
+    <w:p>
+      <w:r>
+        <w:t xml:space="preserve">"I choose to have my name recorded before entering any gate. "</w:t>
+      </w:r>
+    </w:p>
+    <w:p>
+      <w:r>
+        <w:t xml:space="preserve">A man from the abandoned station stepped away from the white stones.</w:t>
+      </w:r>
+    </w:p>
+    <w:p>
+      <w:r>
+        <w:t xml:space="preserve">"I choose no destination today. "</w:t>
+      </w:r>
+    </w:p>
+    <w:p>
+      <w:r>
+        <w:t xml:space="preserve">Each declaration entered Witness Road.</w:t>
+      </w:r>
+    </w:p>
+    <w:p>
+      <w:r>
+        <w:t xml:space="preserve">The system rejected them as irrelevant.</w:t>
+      </w:r>
+    </w:p>
+    <w:p>
+      <w:r>
+        <w:t xml:space="preserve">The road strengthened anyway.</w:t>
+      </w:r>
+    </w:p>
+    <w:p>
+      <w:r>
+        <w:t xml:space="preserve">Kai looked at the empty line beneath SURVIVING IDENTITY.</w:t>
+      </w:r>
+    </w:p>
+    <w:p>
+      <w:r>
+        <w:t xml:space="preserve">The system required one answer.</w:t>
+      </w:r>
+    </w:p>
+    <w:p>
+      <w:r>
+        <w:t xml:space="preserve">They did not have to provide one answer from two people.</w:t>
+      </w:r>
+    </w:p>
+    <w:p>
+      <w:r>
+        <w:t xml:space="preserve">"Li Yun," Kai said. "What do you choose? "</w:t>
+      </w:r>
+    </w:p>
+    <w:p>
+      <w:r>
+        <w:t xml:space="preserve">His counterpart looked at the image of Azure Sky Sect.</w:t>
+      </w:r>
+    </w:p>
+    <w:p>
+      <w:r>
+        <w:t xml:space="preserve">"To save them. "</w:t>
+      </w:r>
+    </w:p>
+    <w:p>
+      <w:r>
+        <w:t xml:space="preserve">"Do you choose to erase me? "</w:t>
+      </w:r>
+    </w:p>
+    <w:p>
+      <w:r>
+        <w:t xml:space="preserve">Li Yun's gaze snapped back.</w:t>
+      </w:r>
+    </w:p>
+    <w:p>
+      <w:r>
+        <w:t xml:space="preserve">"No. "</w:t>
+      </w:r>
+    </w:p>
+    <w:p>
+      <w:r>
+        <w:t xml:space="preserve">"Do you choose to become Kai Li? "</w:t>
+      </w:r>
+    </w:p>
+    <w:p>
+      <w:r>
+        <w:t xml:space="preserve">"No. "</w:t>
+      </w:r>
+    </w:p>
+    <w:p>
+      <w:r>
+        <w:t xml:space="preserve">"Do you choose for me to become you? "</w:t>
+      </w:r>
+    </w:p>
+    <w:p>
+      <w:r>
+        <w:t xml:space="preserve">Li Yun hesitated.</w:t>
+      </w:r>
+    </w:p>
+    <w:p>
+      <w:r>
+        <w:t xml:space="preserve">Then understood.</w:t>
+      </w:r>
+    </w:p>
+    <w:p>
+      <w:r>
+        <w:t xml:space="preserve">"No. "</w:t>
+      </w:r>
+    </w:p>
+    <w:p>
+      <w:r>
+        <w:t xml:space="preserve">The cord loosened by the width of a hair.</w:t>
+      </w:r>
+    </w:p>
+    <w:p>
+      <w:r>
+        <w:t xml:space="preserve">Kai looked at the West Haneul panel.</w:t>
+      </w:r>
+    </w:p>
+    <w:p>
+      <w:r>
+        <w:t xml:space="preserve">"I choose to protect West Haneul. "</w:t>
+      </w:r>
+    </w:p>
+    <w:p>
+      <w:r>
+        <w:t xml:space="preserve">The system brightened.</w:t>
+      </w:r>
+    </w:p>
+    <w:p>
+      <w:r>
+        <w:t xml:space="preserve">"I do not choose to erase Li Yun. "</w:t>
+      </w:r>
+    </w:p>
+    <w:p>
+      <w:r>
+        <w:t xml:space="preserve">The light faltered.</w:t>
+      </w:r>
+    </w:p>
+    <w:p>
+      <w:r>
+        <w:t xml:space="preserve">"I do not choose to become him. "</w:t>
+      </w:r>
+    </w:p>
+    <w:p>
+      <w:r>
+        <w:t xml:space="preserve">The empty surviving identity line trembled.</w:t>
+      </w:r>
+    </w:p>
+    <w:p>
+      <w:r>
+        <w:t xml:space="preserve">"I do not choose for him to become me. "</w:t>
+      </w:r>
+    </w:p>
+    <w:p>
+      <w:r>
+        <w:t xml:space="preserve">The cord loosened again.</w:t>
+      </w:r>
+    </w:p>
+    <w:p>
+      <w:r>
+        <w:t xml:space="preserve">The system warned them.</w:t>
+      </w:r>
+    </w:p>
+    <w:p>
+      <w:r>
+        <w:t xml:space="preserve">Mutually exclusive continuity cannot remain unresolved.</w:t>
+      </w:r>
+    </w:p>
+    <w:p>
+      <w:r>
+        <w:t xml:space="preserve">Dr. Venn lifted the resonance array.</w:t>
+      </w:r>
+    </w:p>
+    <w:p>
+      <w:r>
+        <w:t xml:space="preserve">"Why not? "</w:t>
+      </w:r>
+    </w:p>
+    <w:p>
+      <w:r>
+        <w:t xml:space="preserve">The system did not respond.</w:t>
+      </w:r>
+    </w:p>
+    <w:p>
+      <w:r>
+        <w:t xml:space="preserve">She moved between Kai and Li Yun despite the guardians.</w:t>
+      </w:r>
+    </w:p>
+    <w:p>
+      <w:r>
+        <w:t xml:space="preserve">"You classified both as valid continuity. What exact law prohibits continued divergence? "</w:t>
+      </w:r>
+    </w:p>
+    <w:p>
+      <w:r>
+        <w:t xml:space="preserve">Access restricted.</w:t>
+      </w:r>
+    </w:p>
+    <w:p>
+      <w:r>
+        <w:t xml:space="preserve">"That is not an answer. "</w:t>
+      </w:r>
+    </w:p>
+    <w:p>
+      <w:r>
+        <w:t xml:space="preserve">System authority does not require explanatory compliance.</w:t>
+      </w:r>
+    </w:p>
+    <w:p>
+      <w:r>
+        <w:t xml:space="preserve">Rian lifted one finger.</w:t>
+      </w:r>
+    </w:p>
+    <w:p>
+      <w:r>
+        <w:t xml:space="preserve">"That is the most bureaucratic sentence I have ever hated. "</w:t>
+      </w:r>
+    </w:p>
+    <w:p>
+      <w:r>
+        <w:t xml:space="preserve">Dr. Venn looked at the guardian tools.</w:t>
+      </w:r>
+    </w:p>
+    <w:p>
+      <w:r>
+        <w:t xml:space="preserve">"The system did not create the concept of identity. It administers it through this network. "</w:t>
+      </w:r>
+    </w:p>
+    <w:p>
+      <w:r>
+        <w:t xml:space="preserve">The mendicant nodded.</w:t>
+      </w:r>
+    </w:p>
+    <w:p>
+      <w:r>
+        <w:t xml:space="preserve">"Nodes have functions. Functions have limits. "</w:t>
+      </w:r>
+    </w:p>
+    <w:p>
+      <w:r>
+        <w:t xml:space="preserve">Seo Jun stepped forward.</w:t>
+      </w:r>
+    </w:p>
+    <w:p>
+      <w:r>
+        <w:t xml:space="preserve">"The returning room treated thousands as one because its release failed. "</w:t>
+      </w:r>
+    </w:p>
+    <w:p>
+      <w:r>
+        <w:t xml:space="preserve">Choi followed.</w:t>
+      </w:r>
+    </w:p>
+    <w:p>
+      <w:r>
+        <w:t xml:space="preserve">"The station treated choices as invalid because its protocol did not recognize consent. "</w:t>
+      </w:r>
+    </w:p>
+    <w:p>
+      <w:r>
+        <w:t xml:space="preserve">Kai looked at the system message.</w:t>
+      </w:r>
+    </w:p>
+    <w:p>
+      <w:r>
+        <w:t xml:space="preserve">Mutually exclusive continuity.</w:t>
+      </w:r>
+    </w:p>
+    <w:p>
+      <w:r>
+        <w:t xml:space="preserve">Perhaps the system did not know two versions could remain because its original design required one persistent candidate. The division had been an emergency preservation measure, never intended to converge.</w:t>
+      </w:r>
+    </w:p>
+    <w:p>
+      <w:r>
+        <w:t xml:space="preserve">It was not enforcing a cosmic truth.</w:t>
+      </w:r>
+    </w:p>
+    <w:p>
+      <w:r>
+        <w:t xml:space="preserve">It was preventing an unsupported state.</w:t>
+      </w:r>
+    </w:p>
+    <w:p>
+      <w:r>
+        <w:t xml:space="preserve">Li Yun studied the cord.</w:t>
+      </w:r>
+    </w:p>
+    <w:p>
+      <w:r>
+        <w:t xml:space="preserve">"It cannot carry both of us. "</w:t>
+      </w:r>
+    </w:p>
+    <w:p>
+      <w:r>
+        <w:t xml:space="preserve">"Then the cord is the problem," Kai said.</w:t>
+      </w:r>
+    </w:p>
+    <w:p>
+      <w:r>
+        <w:t xml:space="preserve">The guardian with the cord turned toward him.</w:t>
+      </w:r>
+    </w:p>
+    <w:p>
+      <w:r>
+        <w:t xml:space="preserve">Stone fibers tightened.</w:t>
+      </w:r>
+    </w:p>
+    <w:p>
+      <w:r>
+        <w:t xml:space="preserve">Li Yun raised Qingchi.</w:t>
+      </w:r>
+    </w:p>
+    <w:p>
+      <w:r>
+        <w:t xml:space="preserve">The sword spirit laughed.</w:t>
+      </w:r>
+    </w:p>
+    <w:p>
+      <w:r>
+        <w:t xml:space="preserve">"That, I can cut. "</w:t>
+      </w:r>
+    </w:p>
+    <w:p>
+      <w:r>
+        <w:t xml:space="preserve">He struck.</w:t>
+      </w:r>
+    </w:p>
+    <w:p>
+      <w:r>
+        <w:t xml:space="preserve">White light crossed the cord.</w:t>
+      </w:r>
+    </w:p>
+    <w:p>
+      <w:r>
+        <w:t xml:space="preserve">The first cut failed.</w:t>
+      </w:r>
+    </w:p>
+    <w:p>
+      <w:r>
+        <w:t xml:space="preserve">The connection snapped back, throwing both candidates off balance. Memories surged across it.</w:t>
+      </w:r>
+    </w:p>
+    <w:p>
+      <w:r>
+        <w:t xml:space="preserve">Kai saw Elder Qiao collapsing beside the mountain gate.</w:t>
+      </w:r>
+    </w:p>
+    <w:p>
+      <w:r>
+        <w:t xml:space="preserve">Li Yun saw Han dragging Seo Jun from the returning room.</w:t>
+      </w:r>
+    </w:p>
+    <w:p>
+      <w:r>
+        <w:t xml:space="preserve">The second strike went deeper.</w:t>
+      </w:r>
+    </w:p>
+    <w:p>
+      <w:r>
+        <w:t xml:space="preserve">The cord split into strands.</w:t>
+      </w:r>
+    </w:p>
+    <w:p>
+      <w:r>
+        <w:t xml:space="preserve">Kai's childhood memories tangled with Li Yun's cultivation years.</w:t>
+      </w:r>
+    </w:p>
+    <w:p>
+      <w:r>
+        <w:t xml:space="preserve">A mother's voice.</w:t>
+      </w:r>
+    </w:p>
+    <w:p>
+      <w:r>
+        <w:t xml:space="preserve">A sect bell.</w:t>
+      </w:r>
+    </w:p>
+    <w:p>
+      <w:r>
+        <w:t xml:space="preserve">City rain.</w:t>
+      </w:r>
+    </w:p>
+    <w:p>
+      <w:r>
+        <w:t xml:space="preserve">Mountain wind.</w:t>
+      </w:r>
+    </w:p>
+    <w:p>
+      <w:r>
+        <w:t xml:space="preserve">The identities began bleeding together.</w:t>
+      </w:r>
+    </w:p>
+    <w:p>
+      <w:r>
+        <w:t xml:space="preserve">Kai forgot which hand had held Qingchi.</w:t>
+      </w:r>
+    </w:p>
+    <w:p>
+      <w:r>
+        <w:t xml:space="preserve">Li Yun reached for a phone that had never existed in his world.</w:t>
+      </w:r>
+    </w:p>
+    <w:p>
+      <w:r>
+        <w:t xml:space="preserve">"Stop," Kai said.</w:t>
+      </w:r>
+    </w:p>
+    <w:p>
+      <w:r>
+        <w:t xml:space="preserve">Qingchi halted.</w:t>
+      </w:r>
+    </w:p>
+    <w:p>
+      <w:r>
+        <w:t xml:space="preserve">"The cord is not only binding us," Li Yun said.</w:t>
+      </w:r>
+    </w:p>
+    <w:p>
+      <w:r>
+        <w:t xml:space="preserve">"It is keeping the memories sorted. "</w:t>
+      </w:r>
+    </w:p>
+    <w:p>
+      <w:r>
+        <w:t xml:space="preserve">The guardian's function was necessary.</w:t>
+      </w:r>
+    </w:p>
+    <w:p>
+      <w:r>
+        <w:t xml:space="preserve">Connection prevented total separation, but structure prevented collapse.</w:t>
+      </w:r>
+    </w:p>
+    <w:p>
+      <w:r>
+        <w:t xml:space="preserve">They did not need to cut the cord.</w:t>
+      </w:r>
+    </w:p>
+    <w:p>
+      <w:r>
+        <w:t xml:space="preserve">They needed to change what it connected.</w:t>
+      </w:r>
+    </w:p>
+    <w:p>
+      <w:r>
+        <w:t xml:space="preserve">Kai looked at Witness Road.</w:t>
+      </w:r>
+    </w:p>
+    <w:p>
+      <w:r>
+        <w:t xml:space="preserve">Its promise held hundreds of identities under their own names without forcing a final destination.</w:t>
+      </w:r>
+    </w:p>
+    <w:p>
+      <w:r>
+        <w:t xml:space="preserve">"Bring the road between us. "</w:t>
+      </w:r>
+    </w:p>
+    <w:p>
+      <w:r>
+        <w:t xml:space="preserve">Dr. Venn understood.</w:t>
+      </w:r>
+    </w:p>
+    <w:p>
+      <w:r>
+        <w:t xml:space="preserve">She carried the resonance array to the white stones.</w:t>
+      </w:r>
+    </w:p>
+    <w:p>
+      <w:r>
+        <w:t xml:space="preserve">"The road has no governing node. "</w:t>
+      </w:r>
+    </w:p>
+    <w:p>
+      <w:r>
+        <w:t xml:space="preserve">"That is why the system cannot classify it. "</w:t>
+      </w:r>
+    </w:p>
+    <w:p>
+      <w:r>
+        <w:t xml:space="preserve">"The cord may absorb the road. "</w:t>
+      </w:r>
+    </w:p>
+    <w:p>
+      <w:r>
+        <w:t xml:space="preserve">"Or the road may give the cord somewhere to place both continuities. "</w:t>
+      </w:r>
+    </w:p>
+    <w:p>
+      <w:r>
+        <w:t xml:space="preserve">Rian grabbed the ledger.</w:t>
+      </w:r>
+    </w:p>
+    <w:p>
+      <w:r>
+        <w:t xml:space="preserve">He opened to the declaration.</w:t>
+      </w:r>
+    </w:p>
+    <w:p>
+      <w:r>
+        <w:t xml:space="preserve">THOSE RECOVERED WITHOUT A CURRENT HOME REMAIN UNDER THEIR OWN NAMES UNTIL THEY CAN CHOOSE WHERE TO GO.</w:t>
+      </w:r>
+    </w:p>
+    <w:p>
+      <w:r>
+        <w:t xml:space="preserve">He crossed out two words.</w:t>
+      </w:r>
+    </w:p>
+    <w:p>
+      <w:r>
+        <w:t xml:space="preserve">Without a current home.</w:t>
+      </w:r>
+    </w:p>
+    <w:p>
+      <w:r>
+        <w:t xml:space="preserve">The new statement read:</w:t>
+      </w:r>
+    </w:p>
+    <w:p>
+      <w:r>
+        <w:t xml:space="preserve">THOSE RECOVERED REMAIN UNDER THEIR OWN NAMES UNTIL THEY CAN CHOOSE WHERE TO GO.</w:t>
+      </w:r>
+    </w:p>
+    <w:p>
+      <w:r>
+        <w:t xml:space="preserve">The system flashed red.</w:t>
+      </w:r>
+    </w:p>
+    <w:p>
+      <w:r>
+        <w:t xml:space="preserve">Unauthorized amendment.</w:t>
+      </w:r>
+    </w:p>
+    <w:p>
+      <w:r>
+        <w:t xml:space="preserve">Rian wrote beneath it.</w:t>
+      </w:r>
+    </w:p>
+    <w:p>
+      <w:r>
+        <w:t xml:space="preserve">THIS INCLUDES PEOPLE RECOVERED FROM DUPLICATE CONTINUITY.</w:t>
+      </w:r>
+    </w:p>
+    <w:p>
+      <w:r>
+        <w:t xml:space="preserve">The golden brush guardian moved toward him.</w:t>
+      </w:r>
+    </w:p>
+    <w:p>
+      <w:r>
+        <w:t xml:space="preserve">Han stepped into its path.</w:t>
+      </w:r>
+    </w:p>
+    <w:p>
+      <w:r>
+        <w:t xml:space="preserve">The brush wrote a character in the air.</w:t>
+      </w:r>
+    </w:p>
+    <w:p>
+      <w:r>
+        <w:t xml:space="preserve">OBSTRUCTION.</w:t>
+      </w:r>
+    </w:p>
+    <w:p>
+      <w:r>
+        <w:t xml:space="preserve">Han looked at it.</w:t>
+      </w:r>
+    </w:p>
+    <w:p>
+      <w:r>
+        <w:t xml:space="preserve">"Yes. "</w:t>
+      </w:r>
+    </w:p>
+    <w:p>
+      <w:r>
+        <w:t xml:space="preserve">The character struck his chest.</w:t>
+      </w:r>
+    </w:p>
+    <w:p>
+      <w:r>
+        <w:t xml:space="preserve">He staggered but remained standing.</w:t>
+      </w:r>
+    </w:p>
+    <w:p>
+      <w:r>
+        <w:t xml:space="preserve">The brush tried again.</w:t>
+      </w:r>
+    </w:p>
+    <w:p>
+      <w:r>
+        <w:t xml:space="preserve">UNAUTHORIZED ACTOR.</w:t>
+      </w:r>
+    </w:p>
+    <w:p>
+      <w:r>
+        <w:t xml:space="preserve">Han smiled through clenched teeth.</w:t>
+      </w:r>
+    </w:p>
+    <w:p>
+      <w:r>
+        <w:t xml:space="preserve">"I have been called worse. "</w:t>
+      </w:r>
+    </w:p>
+    <w:p>
+      <w:r>
+        <w:t xml:space="preserve">Rian pressed the ledger to Witness Road.</w:t>
+      </w:r>
+    </w:p>
+    <w:p>
+      <w:r>
+        <w:t xml:space="preserve">Dr. Venn placed the array over it.</w:t>
+      </w:r>
+    </w:p>
+    <w:p>
+      <w:r>
+        <w:t xml:space="preserve">The white stones extended.</w:t>
+      </w:r>
+    </w:p>
+    <w:p>
+      <w:r>
+        <w:t xml:space="preserve">One appeared beneath Kai.</w:t>
+      </w:r>
+    </w:p>
+    <w:p>
+      <w:r>
+        <w:t xml:space="preserve">Another beneath Li Yun.</w:t>
+      </w:r>
+    </w:p>
+    <w:p>
+      <w:r>
+        <w:t xml:space="preserve">A third formed between them.</w:t>
+      </w:r>
+    </w:p>
+    <w:p>
+      <w:r>
+        <w:t xml:space="preserve">The cord guardian reacted.</w:t>
+      </w:r>
+    </w:p>
+    <w:p>
+      <w:r>
+        <w:t xml:space="preserve">Its rope split.</w:t>
+      </w:r>
+    </w:p>
+    <w:p>
+      <w:r>
+        <w:t xml:space="preserve">Not broken.</w:t>
+      </w:r>
+    </w:p>
+    <w:p>
+      <w:r>
+        <w:t xml:space="preserve">Branched.</w:t>
+      </w:r>
+    </w:p>
+    <w:p>
+      <w:r>
+        <w:t xml:space="preserve">One strand remained around Kai's wrist.</w:t>
+      </w:r>
+    </w:p>
+    <w:p>
+      <w:r>
+        <w:t xml:space="preserve">One around Li Yun's.</w:t>
+      </w:r>
+    </w:p>
+    <w:p>
+      <w:r>
+        <w:t xml:space="preserve">Both connected to the central white stone.</w:t>
+      </w:r>
+    </w:p>
+    <w:p>
+      <w:r>
+        <w:t xml:space="preserve">The system flooded the chamber with warnings.</w:t>
+      </w:r>
+    </w:p>
+    <w:p>
+      <w:r>
+        <w:t xml:space="preserve">Unregistered continuity container detected.</w:t>
+      </w:r>
+    </w:p>
+    <w:p>
+      <w:r>
+        <w:t xml:space="preserve">Identity resolution suspended.</w:t>
+      </w:r>
+    </w:p>
+    <w:p>
+      <w:r>
+        <w:t xml:space="preserve">System integrity risk increasing.</w:t>
+      </w:r>
+    </w:p>
+    <w:p>
+      <w:r>
+        <w:t xml:space="preserve">Terminate Witness Road integration.</w:t>
+      </w:r>
+    </w:p>
+    <w:p>
+      <w:r>
+        <w:t xml:space="preserve">Kai ignored them.</w:t>
+      </w:r>
+    </w:p>
+    <w:p>
+      <w:r>
+        <w:t xml:space="preserve">Li Yun stepped onto his stone.</w:t>
+      </w:r>
+    </w:p>
+    <w:p>
+      <w:r>
+        <w:t xml:space="preserve">"What now? "</w:t>
+      </w:r>
+    </w:p>
+    <w:p>
+      <w:r>
+        <w:t xml:space="preserve">"We witness each other. "</w:t>
+      </w:r>
+    </w:p>
+    <w:p>
+      <w:r>
+        <w:t xml:space="preserve">"That sounds ceremonial. "</w:t>
+      </w:r>
+    </w:p>
+    <w:p>
+      <w:r>
+        <w:t xml:space="preserve">"It is. "</w:t>
+      </w:r>
+    </w:p>
+    <w:p>
+      <w:r>
+        <w:t xml:space="preserve">Rian lifted the ledger.</w:t>
+      </w:r>
+    </w:p>
+    <w:p>
+      <w:r>
+        <w:t xml:space="preserve">"I appreciate ceremonial processes with documentation. "</w:t>
+      </w:r>
+    </w:p>
+    <w:p>
+      <w:r>
+        <w:t xml:space="preserve">Kai looked at Li Yun.</w:t>
+      </w:r>
+    </w:p>
+    <w:p>
+      <w:r>
+        <w:t xml:space="preserve">"My name is Kai Li. "</w:t>
+      </w:r>
+    </w:p>
+    <w:p>
+      <w:r>
+        <w:t xml:space="preserve">Li Yun's jaw tightened, then eased.</w:t>
+      </w:r>
+    </w:p>
+    <w:p>
+      <w:r>
+        <w:t xml:space="preserve">"I recognize that. "</w:t>
+      </w:r>
+    </w:p>
+    <w:p>
+      <w:r>
+        <w:t xml:space="preserve">The cord changed.</w:t>
+      </w:r>
+    </w:p>
+    <w:p>
+      <w:r>
+        <w:t xml:space="preserve">The strand around Kai shifted from gold to white.</w:t>
+      </w:r>
+    </w:p>
+    <w:p>
+      <w:r>
+        <w:t xml:space="preserve">Li Yun spoke.</w:t>
+      </w:r>
+    </w:p>
+    <w:p>
+      <w:r>
+        <w:t xml:space="preserve">"My name is Li Yun. "</w:t>
+      </w:r>
+    </w:p>
+    <w:p>
+      <w:r>
+        <w:t xml:space="preserve">Kai felt old mountain memories pull toward him.</w:t>
+      </w:r>
+    </w:p>
+    <w:p>
+      <w:r>
+        <w:t xml:space="preserve">He did not claim them.</w:t>
+      </w:r>
+    </w:p>
+    <w:p>
+      <w:r>
+        <w:t xml:space="preserve">"I recognize that. "</w:t>
+      </w:r>
+    </w:p>
+    <w:p>
+      <w:r>
+        <w:t xml:space="preserve">The second strand turned white.</w:t>
+      </w:r>
+    </w:p>
+    <w:p>
+      <w:r>
+        <w:t xml:space="preserve">Qingchi hummed.</w:t>
+      </w:r>
+    </w:p>
+    <w:p>
+      <w:r>
+        <w:t xml:space="preserve">"I am Qingchi. I recognize both of you and remain displeased with the situation. "</w:t>
+      </w:r>
+    </w:p>
+    <w:p>
+      <w:r>
+        <w:t xml:space="preserve">The sword's statement entered the road.</w:t>
+      </w:r>
+    </w:p>
+    <w:p>
+      <w:r>
+        <w:t xml:space="preserve">Han placed one hand on Kai's shoulder.</w:t>
+      </w:r>
+    </w:p>
+    <w:p>
+      <w:r>
+        <w:t xml:space="preserve">"I recognize Kai Li. "</w:t>
+      </w:r>
+    </w:p>
+    <w:p>
+      <w:r>
+        <w:t xml:space="preserve">Elder Qiao's image above Azure Sky Sect raised his head.</w:t>
+      </w:r>
+    </w:p>
+    <w:p>
+      <w:r>
+        <w:t xml:space="preserve">His lips moved.</w:t>
+      </w:r>
+    </w:p>
+    <w:p>
+      <w:r>
+        <w:t xml:space="preserve">No sound crossed the panel.</w:t>
+      </w:r>
+    </w:p>
+    <w:p>
+      <w:r>
+        <w:t xml:space="preserve">Then the mountain gate formation carried his voice.</w:t>
+      </w:r>
+    </w:p>
+    <w:p>
+      <w:r>
+        <w:t xml:space="preserve">"Li Yun. "</w:t>
+      </w:r>
+    </w:p>
+    <w:p>
+      <w:r>
+        <w:t xml:space="preserve">The legacy cord brightened.</w:t>
+      </w:r>
+    </w:p>
+    <w:p>
+      <w:r>
+        <w:t xml:space="preserve">"I recognize Li Yun. "</w:t>
+      </w:r>
+    </w:p>
+    <w:p>
+      <w:r>
+        <w:t xml:space="preserve">The system tried to close the panels.</w:t>
+      </w:r>
+    </w:p>
+    <w:p>
+      <w:r>
+        <w:t xml:space="preserve">Dr. Venn locked the resonance array to both.</w:t>
+      </w:r>
+    </w:p>
+    <w:p>
+      <w:r>
+        <w:t xml:space="preserve">West Haneul and Azure Sky Sect remained visible.</w:t>
+      </w:r>
+    </w:p>
+    <w:p>
+      <w:r>
+        <w:t xml:space="preserve">Recognition spread.</w:t>
+      </w:r>
+    </w:p>
+    <w:p>
+      <w:r>
+        <w:t xml:space="preserve">Choi spoke for Kai.</w:t>
+      </w:r>
+    </w:p>
+    <w:p>
+      <w:r>
+        <w:t xml:space="preserve">Qingchi spoke for Li Yun.</w:t>
+      </w:r>
+    </w:p>
+    <w:p>
+      <w:r>
+        <w:t xml:space="preserve">Rian recorded each declaration.</w:t>
+      </w:r>
+    </w:p>
+    <w:p>
+      <w:r>
+        <w:t xml:space="preserve">Seo Jun stood between the white stones.</w:t>
+      </w:r>
+    </w:p>
+    <w:p>
+      <w:r>
+        <w:t xml:space="preserve">"I recognize what it means to become too many people because no structure allows them to remain themselves. "</w:t>
+      </w:r>
+    </w:p>
+    <w:p>
+      <w:r>
+        <w:t xml:space="preserve">The cord guardian lowered its rope.</w:t>
+      </w:r>
+    </w:p>
+    <w:p>
+      <w:r>
+        <w:t xml:space="preserve">The system's final line changed.</w:t>
+      </w:r>
+    </w:p>
+    <w:p>
+      <w:r>
+        <w:t xml:space="preserve">SURVIVING IDENTITY.</w:t>
+      </w:r>
+    </w:p>
+    <w:p>
+      <w:r>
+        <w:t xml:space="preserve">The blank remained.</w:t>
+      </w:r>
+    </w:p>
+    <w:p>
+      <w:r>
+        <w:t xml:space="preserve">Then split.</w:t>
+      </w:r>
+    </w:p>
+    <w:p>
+      <w:r>
+        <w:t xml:space="preserve">SURVIVING IDENTITIES.</w:t>
+      </w:r>
+    </w:p>
+    <w:p>
+      <w:r>
+        <w:t xml:space="preserve">Two spaces appeared.</w:t>
+      </w:r>
+    </w:p>
+    <w:p>
+      <w:r>
+        <w:t xml:space="preserve">KAI LI.</w:t>
+      </w:r>
+    </w:p>
+    <w:p>
+      <w:r>
+        <w:t xml:space="preserve">LI YUN.</w:t>
+      </w:r>
+    </w:p>
+    <w:p>
+      <w:r>
+        <w:t xml:space="preserve">The false sun flared.</w:t>
+      </w:r>
+    </w:p>
+    <w:p>
+      <w:r>
+        <w:t xml:space="preserve">The guardian with the chisel struck the floor.</w:t>
+      </w:r>
+    </w:p>
+    <w:p>
+      <w:r>
+        <w:t xml:space="preserve">The platform cracked between them.</w:t>
+      </w:r>
+    </w:p>
+    <w:p>
+      <w:r>
+        <w:t xml:space="preserve">The brush carved both names into separate halves.</w:t>
+      </w:r>
+    </w:p>
+    <w:p>
+      <w:r>
+        <w:t xml:space="preserve">The cord tied the halves to Witness Road.</w:t>
+      </w:r>
+    </w:p>
+    <w:p>
+      <w:r>
+        <w:t xml:space="preserve">The system screamed.</w:t>
+      </w:r>
+    </w:p>
+    <w:p>
+      <w:r>
+        <w:t xml:space="preserve">Not a human sound.</w:t>
+      </w:r>
+    </w:p>
+    <w:p>
+      <w:r>
+        <w:t xml:space="preserve">Every notification opened at once, overlapping until gold filled Kai's sight.</w:t>
+      </w:r>
+    </w:p>
+    <w:p>
+      <w:r>
+        <w:t xml:space="preserve">Unsupported state.</w:t>
+      </w:r>
+    </w:p>
+    <w:p>
+      <w:r>
+        <w:t xml:space="preserve">Candidate count exceeds designed limit.</w:t>
+      </w:r>
+    </w:p>
+    <w:p>
+      <w:r>
+        <w:t xml:space="preserve">Legacy and adaptive branches simultaneously active.</w:t>
+      </w:r>
+    </w:p>
+    <w:p>
+      <w:r>
+        <w:t xml:space="preserve">Network authority conflict.</w:t>
+      </w:r>
+    </w:p>
+    <w:p>
+      <w:r>
+        <w:t xml:space="preserve">Primary directive requires singular ascension path.</w:t>
+      </w:r>
+    </w:p>
+    <w:p>
+      <w:r>
+        <w:t xml:space="preserve">Kai focused on the final message.</w:t>
+      </w:r>
+    </w:p>
+    <w:p>
+      <w:r>
+        <w:t xml:space="preserve">"Why? "</w:t>
+      </w:r>
+    </w:p>
+    <w:p>
+      <w:r>
+        <w:t xml:space="preserve">The system tried to close.</w:t>
+      </w:r>
+    </w:p>
+    <w:p>
+      <w:r>
+        <w:t xml:space="preserve">He held the query open.</w:t>
+      </w:r>
+    </w:p>
+    <w:p>
+      <w:r>
+        <w:t xml:space="preserve">"Why does ascension require one candidate? "</w:t>
+      </w:r>
+    </w:p>
+    <w:p>
+      <w:r>
+        <w:t xml:space="preserve">Access restricted.</w:t>
+      </w:r>
+    </w:p>
+    <w:p>
+      <w:r>
+        <w:t xml:space="preserve">Li Yun stepped beside him.</w:t>
+      </w:r>
+    </w:p>
+    <w:p>
+      <w:r>
+        <w:t xml:space="preserve">"We both have access. "</w:t>
+      </w:r>
+    </w:p>
+    <w:p>
+      <w:r>
+        <w:t xml:space="preserve">Their continuities resonated through Witness Road.</w:t>
+      </w:r>
+    </w:p>
+    <w:p>
+      <w:r>
+        <w:t xml:space="preserve">The restriction flickered.</w:t>
+      </w:r>
+    </w:p>
+    <w:p>
+      <w:r>
+        <w:t xml:space="preserve">Qingchi pressed her blade against the central white stone.</w:t>
+      </w:r>
+    </w:p>
+    <w:p>
+      <w:r>
+        <w:t xml:space="preserve">"Do not make me cut an answer out of you. "</w:t>
+      </w:r>
+    </w:p>
+    <w:p>
+      <w:r>
+        <w:t xml:space="preserve">The system relented.</w:t>
+      </w:r>
+    </w:p>
+    <w:p>
+      <w:r>
+        <w:t xml:space="preserve">Not willingly.</w:t>
+      </w:r>
+    </w:p>
+    <w:p>
+      <w:r>
+        <w:t xml:space="preserve">A hidden panel opened above the false sun.</w:t>
+      </w:r>
+    </w:p>
+    <w:p>
+      <w:r>
+        <w:t xml:space="preserve">Text appeared.</w:t>
+      </w:r>
+    </w:p>
+    <w:p>
+      <w:r>
+        <w:t xml:space="preserve">Heavenly Ascension System purpose: Preserve viable human continuity through projected convergence event.</w:t>
+      </w:r>
+    </w:p>
+    <w:p>
+      <w:r>
+        <w:t xml:space="preserve">Dr. Venn read aloud.</w:t>
+      </w:r>
+    </w:p>
+    <w:p>
+      <w:r>
+        <w:t xml:space="preserve">"Projected convergence event? "</w:t>
+      </w:r>
+    </w:p>
+    <w:p>
+      <w:r>
+        <w:t xml:space="preserve">Another line formed.</w:t>
+      </w:r>
+    </w:p>
+    <w:p>
+      <w:r>
+        <w:t xml:space="preserve">Estimated event status: Begun.</w:t>
+      </w:r>
+    </w:p>
+    <w:p>
+      <w:r>
+        <w:t xml:space="preserve">The chamber darkened.</w:t>
+      </w:r>
+    </w:p>
+    <w:p>
+      <w:r>
+        <w:t xml:space="preserve">Above the three guardians, the false sun became transparent.</w:t>
+      </w:r>
+    </w:p>
+    <w:p>
+      <w:r>
+        <w:t xml:space="preserve">Beyond it lay the sky over the modern world.</w:t>
+      </w:r>
+    </w:p>
+    <w:p>
+      <w:r>
+        <w:t xml:space="preserve">Cities.</w:t>
+      </w:r>
+    </w:p>
+    <w:p>
+      <w:r>
+        <w:t xml:space="preserve">Mountains.</w:t>
+      </w:r>
+    </w:p>
+    <w:p>
+      <w:r>
+        <w:t xml:space="preserve">Roads.</w:t>
+      </w:r>
+    </w:p>
+    <w:p>
+      <w:r>
+        <w:t xml:space="preserve">Then another world overlapped it.</w:t>
+      </w:r>
+    </w:p>
+    <w:p>
+      <w:r>
+        <w:t xml:space="preserve">Sect peaks.</w:t>
+      </w:r>
+    </w:p>
+    <w:p>
+      <w:r>
+        <w:t xml:space="preserve">Spirit rivers.</w:t>
+      </w:r>
+    </w:p>
+    <w:p>
+      <w:r>
+        <w:t xml:space="preserve">Ancient formations.</w:t>
+      </w:r>
+    </w:p>
+    <w:p>
+      <w:r>
+        <w:t xml:space="preserve">The two realities occupied the same space without fully touching.</w:t>
+      </w:r>
+    </w:p>
+    <w:p>
+      <w:r>
+        <w:t xml:space="preserve">Kai saw apartment buildings standing through cultivation halls. Highways crossing cloud bridges. Telephone towers emerging from sacred forests.</w:t>
+      </w:r>
+    </w:p>
+    <w:p>
+      <w:r>
+        <w:t xml:space="preserve">Earth and Li Yun's world.</w:t>
+      </w:r>
+    </w:p>
+    <w:p>
+      <w:r>
+        <w:t xml:space="preserve">Not memories.</w:t>
+      </w:r>
+    </w:p>
+    <w:p>
+      <w:r>
+        <w:t xml:space="preserve">Not network visions.</w:t>
+      </w:r>
+    </w:p>
+    <w:p>
+      <w:r>
+        <w:t xml:space="preserve">Approaching realities.</w:t>
+      </w:r>
+    </w:p>
+    <w:p>
+      <w:r>
+        <w:t xml:space="preserve">The system continued.</w:t>
+      </w:r>
+    </w:p>
+    <w:p>
+      <w:r>
+        <w:t xml:space="preserve">Convergence will create identity contradiction at planetary scale.</w:t>
+      </w:r>
+    </w:p>
+    <w:p>
+      <w:r>
+        <w:t xml:space="preserve">One continuity model was selected to guide integration.</w:t>
+      </w:r>
+    </w:p>
+    <w:p>
+      <w:r>
+        <w:t xml:space="preserve">Legacy branch preserves cultivation-world identity structures.</w:t>
+      </w:r>
+    </w:p>
+    <w:p>
+      <w:r>
+        <w:t xml:space="preserve">Adaptive branch preserves modern-world identity structures.</w:t>
+      </w:r>
+    </w:p>
+    <w:p>
+      <w:r>
+        <w:t xml:space="preserve">Li Yun looked at Kai.</w:t>
+      </w:r>
+    </w:p>
+    <w:p>
+      <w:r>
+        <w:t xml:space="preserve">"We were divided to test both. "</w:t>
+      </w:r>
+    </w:p>
+    <w:p>
+      <w:r>
+        <w:t xml:space="preserve">Kai read the next line before it stabilized.</w:t>
+      </w:r>
+    </w:p>
+    <w:p>
+      <w:r>
+        <w:t xml:space="preserve">Upon convergence, one model must overwrite the other.</w:t>
+      </w:r>
+    </w:p>
+    <w:p>
+      <w:r>
+        <w:t xml:space="preserve">Silence filled the chamber.</w:t>
+      </w:r>
+    </w:p>
+    <w:p>
+      <w:r>
+        <w:t xml:space="preserve">Hundreds of rescued identities stood along Witness Road.</w:t>
+      </w:r>
+    </w:p>
+    <w:p>
+      <w:r>
+        <w:t xml:space="preserve">West Haneul in one panel.</w:t>
+      </w:r>
+    </w:p>
+    <w:p>
+      <w:r>
+        <w:t xml:space="preserve">Azure Sky Sect in another.</w:t>
+      </w:r>
+    </w:p>
+    <w:p>
+      <w:r>
+        <w:t xml:space="preserve">Two worlds waiting to occupy the same existence.</w:t>
+      </w:r>
+    </w:p>
+    <w:p>
+      <w:r>
+        <w:t xml:space="preserve">The system had not been built to save one candidate.</w:t>
+      </w:r>
+    </w:p>
+    <w:p>
+      <w:r>
+        <w:t xml:space="preserve">It had been built to decide which world's people remained themselves.</w:t>
+      </w:r>
+    </w:p>
+    <w:p>
+      <w:r>
+        <w:t xml:space="preserve">Li Yun lowered Qingchi.</w:t>
+      </w:r>
+    </w:p>
+    <w:p>
+      <w:r>
+        <w:t xml:space="preserve">"If my branch survives, what happens to your world? "</w:t>
+      </w:r>
+    </w:p>
+    <w:p>
+      <w:r>
+        <w:t xml:space="preserve">The system answered.</w:t>
+      </w:r>
+    </w:p>
+    <w:p>
+      <w:r>
+        <w:t xml:space="preserve">Modern identity structures assimilated into legacy continuity framework.</w:t>
+      </w:r>
+    </w:p>
+    <w:p>
+      <w:r>
+        <w:t xml:space="preserve">Kai looked at the city beneath the overlapping mountain.</w:t>
+      </w:r>
+    </w:p>
+    <w:p>
+      <w:r>
+        <w:t xml:space="preserve">"And if mine survives? "</w:t>
+      </w:r>
+    </w:p>
+    <w:p>
+      <w:r>
+        <w:t xml:space="preserve">Legacy identity structures assimilated into adaptive continuity framework.</w:t>
+      </w:r>
+    </w:p>
+    <w:p>
+      <w:r>
+        <w:t xml:space="preserve">Elder Qiao's sect faded behind apartment towers.</w:t>
+      </w:r>
+    </w:p>
+    <w:p>
+      <w:r>
+        <w:t xml:space="preserve">Assimilated.</w:t>
+      </w:r>
+    </w:p>
+    <w:p>
+      <w:r>
+        <w:t xml:space="preserve">The word used when the system did not wish to say erased.</w:t>
+      </w:r>
+    </w:p>
+    <w:p>
+      <w:r>
+        <w:t xml:space="preserve">Dr. Venn's face had gone pale.</w:t>
+      </w:r>
+    </w:p>
+    <w:p>
+      <w:r>
+        <w:t xml:space="preserve">"How long until convergence? "</w:t>
+      </w:r>
+    </w:p>
+    <w:p>
+      <w:r>
+        <w:t xml:space="preserve">The system displayed a countdown.</w:t>
+      </w:r>
+    </w:p>
+    <w:p>
+      <w:r>
+        <w:t xml:space="preserve">Estimated full contact: 71 hours.</w:t>
+      </w:r>
+    </w:p>
+    <w:p>
+      <w:r>
+        <w:t xml:space="preserve">Rian stared upward.</w:t>
+      </w:r>
+    </w:p>
+    <w:p>
+      <w:r>
+        <w:t xml:space="preserve">"Less than three days. "</w:t>
+      </w:r>
+    </w:p>
+    <w:p>
+      <w:r>
+        <w:t xml:space="preserve">Han looked at the two panels.</w:t>
+      </w:r>
+    </w:p>
+    <w:p>
+      <w:r>
+        <w:t xml:space="preserve">"The system wanted one of them erased before the worlds meet. "</w:t>
+      </w:r>
+    </w:p>
+    <w:p>
+      <w:r>
+        <w:t xml:space="preserve">The mendicant looked toward Witness Road.</w:t>
+      </w:r>
+    </w:p>
+    <w:p>
+      <w:r>
+        <w:t xml:space="preserve">"Because it knows only one road can occupy one destination. "</w:t>
+      </w:r>
+    </w:p>
+    <w:p>
+      <w:r>
+        <w:t xml:space="preserve">Kai watched the white stones beneath hundreds of separate names.</w:t>
+      </w:r>
+    </w:p>
+    <w:p>
+      <w:r>
+        <w:t xml:space="preserve">"No. "</w:t>
+      </w:r>
+    </w:p>
+    <w:p>
+      <w:r>
+        <w:t xml:space="preserve">The mendicant smiled faintly.</w:t>
+      </w:r>
+    </w:p>
+    <w:p>
+      <w:r>
+        <w:t xml:space="preserve">"You intend to build another. "</w:t>
+      </w:r>
+    </w:p>
+    <w:p>
+      <w:r>
+        <w:t xml:space="preserve">Li Yun looked at him.</w:t>
+      </w:r>
+    </w:p>
+    <w:p>
+      <w:r>
+        <w:t xml:space="preserve">"A road wide enough for two worlds? "</w:t>
+      </w:r>
+    </w:p>
+    <w:p>
+      <w:r>
+        <w:t xml:space="preserve">"Not wide. "</w:t>
+      </w:r>
+    </w:p>
+    <w:p>
+      <w:r>
+        <w:t xml:space="preserve">Kai looked at the guardian cord branching between them.</w:t>
+      </w:r>
+    </w:p>
+    <w:p>
+      <w:r>
+        <w:t xml:space="preserve">"Structured. "</w:t>
+      </w:r>
+    </w:p>
+    <w:p>
+      <w:r>
+        <w:t xml:space="preserve">The chisel guardian moved.</w:t>
+      </w:r>
+    </w:p>
+    <w:p>
+      <w:r>
+        <w:t xml:space="preserve">It cut a line through the overlapping sky.</w:t>
+      </w:r>
+    </w:p>
+    <w:p>
+      <w:r>
+        <w:t xml:space="preserve">For one breath, the worlds separated.</w:t>
+      </w:r>
+    </w:p>
+    <w:p>
+      <w:r>
+        <w:t xml:space="preserve">The brush wrote two names.</w:t>
+      </w:r>
+    </w:p>
+    <w:p>
+      <w:r>
+        <w:t xml:space="preserve">EARTH.</w:t>
+      </w:r>
+    </w:p>
+    <w:p>
+      <w:r>
+        <w:t xml:space="preserve">CELESTIAL DOMAIN.</w:t>
+      </w:r>
+    </w:p>
+    <w:p>
+      <w:r>
+        <w:t xml:space="preserve">The cord connected them without merging.</w:t>
+      </w:r>
+    </w:p>
+    <w:p>
+      <w:r>
+        <w:t xml:space="preserve">A demonstration.</w:t>
+      </w:r>
+    </w:p>
+    <w:p>
+      <w:r>
+        <w:t xml:space="preserve">Or a warning.</w:t>
+      </w:r>
+    </w:p>
+    <w:p>
+      <w:r>
+        <w:t xml:space="preserve">The system closed the vision.</w:t>
+      </w:r>
+    </w:p>
+    <w:p>
+      <w:r>
+        <w:t xml:space="preserve">Dual continuity model unavailable.</w:t>
+      </w:r>
+    </w:p>
+    <w:p>
+      <w:r>
+        <w:t xml:space="preserve">Required architecture exceeds current network capacity.</w:t>
+      </w:r>
+    </w:p>
+    <w:p>
+      <w:r>
+        <w:t xml:space="preserve">Rian lifted the ledger.</w:t>
+      </w:r>
+    </w:p>
+    <w:p>
+      <w:r>
+        <w:t xml:space="preserve">"We have a road. "</w:t>
+      </w:r>
+    </w:p>
+    <w:p>
+      <w:r>
+        <w:t xml:space="preserve">Witness Road persistence dependent on active witnesses.</w:t>
+      </w:r>
+    </w:p>
+    <w:p>
+      <w:r>
+        <w:t xml:space="preserve">Dr. Venn looked at the hundreds standing around them.</w:t>
+      </w:r>
+    </w:p>
+    <w:p>
+      <w:r>
+        <w:t xml:space="preserve">"Then we need more witnesses. "</w:t>
+      </w:r>
+    </w:p>
+    <w:p>
+      <w:r>
+        <w:t xml:space="preserve">The mendicant turned toward the chamber walls.</w:t>
+      </w:r>
+    </w:p>
+    <w:p>
+      <w:r>
+        <w:t xml:space="preserve">"One node will not be enough. "</w:t>
+      </w:r>
+    </w:p>
+    <w:p>
+      <w:r>
+        <w:t xml:space="preserve">Seo Jun looked at the black strips around the residents' wrists.</w:t>
+      </w:r>
+    </w:p>
+    <w:p>
+      <w:r>
+        <w:t xml:space="preserve">"Twelve bells. "</w:t>
+      </w:r>
+    </w:p>
+    <w:p>
+      <w:r>
+        <w:t xml:space="preserve">"Three active," Kai said. "Nine dormant. "</w:t>
+      </w:r>
+    </w:p>
+    <w:p>
+      <w:r>
+        <w:t xml:space="preserve">Li Yun's expression hardened.</w:t>
+      </w:r>
+    </w:p>
+    <w:p>
+      <w:r>
+        <w:t xml:space="preserve">"If we wake the network? "</w:t>
+      </w:r>
+    </w:p>
+    <w:p>
+      <w:r>
+        <w:t xml:space="preserve">The system warned them.</w:t>
+      </w:r>
+    </w:p>
+    <w:p>
+      <w:r>
+        <w:t xml:space="preserve">Network-wide activation risks accelerated convergence.</w:t>
+      </w:r>
+    </w:p>
+    <w:p>
+      <w:r>
+        <w:t xml:space="preserve">Qingchi's blade rang.</w:t>
+      </w:r>
+    </w:p>
+    <w:p>
+      <w:r>
+        <w:t xml:space="preserve">"So does waiting. "</w:t>
+      </w:r>
+    </w:p>
+    <w:p>
+      <w:r>
+        <w:t xml:space="preserve">Kai looked at the Sunlit Mendicant Node.</w:t>
+      </w:r>
+    </w:p>
+    <w:p>
+      <w:r>
+        <w:t xml:space="preserve">Three guardians.</w:t>
+      </w:r>
+    </w:p>
+    <w:p>
+      <w:r>
+        <w:t xml:space="preserve">The Source Lumen shard memories.</w:t>
+      </w:r>
+    </w:p>
+    <w:p>
+      <w:r>
+        <w:t xml:space="preserve">The network bells.</w:t>
+      </w:r>
+    </w:p>
+    <w:p>
+      <w:r>
+        <w:t xml:space="preserve">The abandoned station still moving.</w:t>
+      </w:r>
+    </w:p>
+    <w:p>
+      <w:r>
+        <w:t xml:space="preserve">Each node carried a function related to identity transfer.</w:t>
+      </w:r>
+    </w:p>
+    <w:p>
+      <w:r>
+        <w:t xml:space="preserve">Recognition.</w:t>
+      </w:r>
+    </w:p>
+    <w:p>
+      <w:r>
+        <w:t xml:space="preserve">Transit.</w:t>
+      </w:r>
+    </w:p>
+    <w:p>
+      <w:r>
+        <w:t xml:space="preserve">Unassigned continuity.</w:t>
+      </w:r>
+    </w:p>
+    <w:p>
+      <w:r>
+        <w:t xml:space="preserve">Other functions waited in the dormant sites.</w:t>
+      </w:r>
+    </w:p>
+    <w:p>
+      <w:r>
+        <w:t xml:space="preserve">Perhaps enough to build a structure that could hold two worlds without one consuming the other.</w:t>
+      </w:r>
+    </w:p>
+    <w:p>
+      <w:r>
+        <w:t xml:space="preserve">The system offered a new quest.</w:t>
+      </w:r>
+    </w:p>
+    <w:p>
+      <w:r>
+        <w:t xml:space="preserve">Primary Resolution Quest Available.</w:t>
+      </w:r>
+    </w:p>
+    <w:p>
+      <w:r>
+        <w:t xml:space="preserve">Select Ascension Continuity.</w:t>
+      </w:r>
+    </w:p>
+    <w:p>
+      <w:r>
+        <w:t xml:space="preserve">Option A: Legacy.</w:t>
+      </w:r>
+    </w:p>
+    <w:p>
+      <w:r>
+        <w:t xml:space="preserve">Option B: Adaptive.</w:t>
+      </w:r>
+    </w:p>
+    <w:p>
+      <w:r>
+        <w:t xml:space="preserve">No third choice.</w:t>
+      </w:r>
+    </w:p>
+    <w:p>
+      <w:r>
+        <w:t xml:space="preserve">Kai dismissed it.</w:t>
+      </w:r>
+    </w:p>
+    <w:p>
+      <w:r>
+        <w:t xml:space="preserve">Li Yun did the same.</w:t>
+      </w:r>
+    </w:p>
+    <w:p>
+      <w:r>
+        <w:t xml:space="preserve">The quest reopened.</w:t>
+      </w:r>
+    </w:p>
+    <w:p>
+      <w:r>
+        <w:t xml:space="preserve">They dismissed it together.</w:t>
+      </w:r>
+    </w:p>
+    <w:p>
+      <w:r>
+        <w:t xml:space="preserve">The system display cracked down the center.</w:t>
+      </w:r>
+    </w:p>
+    <w:p>
+      <w:r>
+        <w:t xml:space="preserve">Witness Road ran through the fracture.</w:t>
+      </w:r>
+    </w:p>
+    <w:p>
+      <w:r>
+        <w:t xml:space="preserve">A third option appeared.</w:t>
+      </w:r>
+    </w:p>
+    <w:p>
+      <w:r>
+        <w:t xml:space="preserve">Not written by the system.</w:t>
+      </w:r>
+    </w:p>
+    <w:p>
+      <w:r>
+        <w:t xml:space="preserve">Written in Rian's marker handwriting.</w:t>
+      </w:r>
+    </w:p>
+    <w:p>
+      <w:r>
+        <w:t xml:space="preserve">Option C: Neither Gets Erased.</w:t>
+      </w:r>
+    </w:p>
+    <w:p>
+      <w:r>
+        <w:t xml:space="preserve">Rian looked delighted.</w:t>
+      </w:r>
+    </w:p>
+    <w:p>
+      <w:r>
+        <w:t xml:space="preserve">"I did not do that. "</w:t>
+      </w:r>
+    </w:p>
+    <w:p>
+      <w:r>
+        <w:t xml:space="preserve">The young girl beside Choi raised her hand.</w:t>
+      </w:r>
+    </w:p>
+    <w:p>
+      <w:r>
+        <w:t xml:space="preserve">"I did. "</w:t>
+      </w:r>
+    </w:p>
+    <w:p>
+      <w:r>
+        <w:t xml:space="preserve">Everyone looked at her.</w:t>
+      </w:r>
+    </w:p>
+    <w:p>
+      <w:r>
+        <w:t xml:space="preserve">She held Rian's marker.</w:t>
+      </w:r>
+    </w:p>
+    <w:p>
+      <w:r>
+        <w:t xml:space="preserve">He checked his coat pocket.</w:t>
+      </w:r>
+    </w:p>
+    <w:p>
+      <w:r>
+        <w:t xml:space="preserve">"I respect the theft. "</w:t>
+      </w:r>
+    </w:p>
+    <w:p>
+      <w:r>
+        <w:t xml:space="preserve">The third option brightened.</w:t>
+      </w:r>
+    </w:p>
+    <w:p>
+      <w:r>
+        <w:t xml:space="preserve">The system tried to remove it.</w:t>
+      </w:r>
+    </w:p>
+    <w:p>
+      <w:r>
+        <w:t xml:space="preserve">Hundreds of witnesses spoke.</w:t>
+      </w:r>
+    </w:p>
+    <w:p>
+      <w:r>
+        <w:t xml:space="preserve">"Recognized. "</w:t>
+      </w:r>
+    </w:p>
+    <w:p>
+      <w:r>
+        <w:t xml:space="preserve">The road carried the word.</w:t>
+      </w:r>
+    </w:p>
+    <w:p>
+      <w:r>
+        <w:t xml:space="preserve">West Haneul answered through the panel.</w:t>
+      </w:r>
+    </w:p>
+    <w:p>
+      <w:r>
+        <w:t xml:space="preserve">"Recognized. "</w:t>
+      </w:r>
+    </w:p>
+    <w:p>
+      <w:r>
+        <w:t xml:space="preserve">Elder Qiao raised one bloodied hand at Azure Sky Sect.</w:t>
+      </w:r>
+    </w:p>
+    <w:p>
+      <w:r>
+        <w:t xml:space="preserve">"Recognized. "</w:t>
+      </w:r>
+    </w:p>
+    <w:p>
+      <w:r>
+        <w:t xml:space="preserve">The third option stabilized.</w:t>
+      </w:r>
+    </w:p>
+    <w:p>
+      <w:r>
+        <w:t xml:space="preserve">Unauthorized objective acknowledged.</w:t>
+      </w:r>
+    </w:p>
+    <w:p>
+      <w:r>
+        <w:t xml:space="preserve">Requirement: Activate all twelve recognition network nodes before convergence.</w:t>
+      </w:r>
+    </w:p>
+    <w:p>
+      <w:r>
+        <w:t xml:space="preserve">Active nodes: 3.</w:t>
+      </w:r>
+    </w:p>
+    <w:p>
+      <w:r>
+        <w:t xml:space="preserve">Accessible nodes: 4.</w:t>
+      </w:r>
+    </w:p>
+    <w:p>
+      <w:r>
+        <w:t xml:space="preserve">Unknown nodes: 5.</w:t>
+      </w:r>
+    </w:p>
+    <w:p>
+      <w:r>
+        <w:t xml:space="preserve">Destroyed nodes: 0.</w:t>
+      </w:r>
+    </w:p>
+    <w:p>
+      <w:r>
+        <w:t xml:space="preserve">Kai read the numbers.</w:t>
+      </w:r>
+    </w:p>
+    <w:p>
+      <w:r>
+        <w:t xml:space="preserve">"That only accounts for twelve if the accessible nodes include the active ones. "</w:t>
+      </w:r>
+    </w:p>
+    <w:p>
+      <w:r>
+        <w:t xml:space="preserve">Dr. Venn shook her head.</w:t>
+      </w:r>
+    </w:p>
+    <w:p>
+      <w:r>
+        <w:t xml:space="preserve">"No. Three active, four accessible, five unknown. Twelve total. "</w:t>
+      </w:r>
+    </w:p>
+    <w:p>
+      <w:r>
+        <w:t xml:space="preserve">The Radiant Abyss was accessible.</w:t>
+      </w:r>
+    </w:p>
+    <w:p>
+      <w:r>
+        <w:t xml:space="preserve">West Haneul active.</w:t>
+      </w:r>
+    </w:p>
+    <w:p>
+      <w:r>
+        <w:t xml:space="preserve">The transit platform active.</w:t>
+      </w:r>
+    </w:p>
+    <w:p>
+      <w:r>
+        <w:t xml:space="preserve">The coastal node active.</w:t>
+      </w:r>
+    </w:p>
+    <w:p>
+      <w:r>
+        <w:t xml:space="preserve">Three more accessible somewhere.</w:t>
+      </w:r>
+    </w:p>
+    <w:p>
+      <w:r>
+        <w:t xml:space="preserve">Five not yet located.</w:t>
+      </w:r>
+    </w:p>
+    <w:p>
+      <w:r>
+        <w:t xml:space="preserve">Seventy-one hours.</w:t>
+      </w:r>
+    </w:p>
+    <w:p>
+      <w:r>
+        <w:t xml:space="preserve">The guardian with the brush raised its stone hand.</w:t>
+      </w:r>
+    </w:p>
+    <w:p>
+      <w:r>
+        <w:t xml:space="preserve">A map appeared above the platform.</w:t>
+      </w:r>
+    </w:p>
+    <w:p>
+      <w:r>
+        <w:t xml:space="preserve">Twelve points spread across both worlds.</w:t>
+      </w:r>
+    </w:p>
+    <w:p>
+      <w:r>
+        <w:t xml:space="preserve">Three burned red.</w:t>
+      </w:r>
+    </w:p>
+    <w:p>
+      <w:r>
+        <w:t xml:space="preserve">Four gold.</w:t>
+      </w:r>
+    </w:p>
+    <w:p>
+      <w:r>
+        <w:t xml:space="preserve">Five dark.</w:t>
+      </w:r>
+    </w:p>
+    <w:p>
+      <w:r>
+        <w:t xml:space="preserve">One gold point stood inside the Celestial Domain near Azure Sky Sect.</w:t>
+      </w:r>
+    </w:p>
+    <w:p>
+      <w:r>
+        <w:t xml:space="preserve">Another appeared beneath a modern city Kai recognized.</w:t>
+      </w:r>
+    </w:p>
+    <w:p>
+      <w:r>
+        <w:t xml:space="preserve">The third floated between worlds.</w:t>
+      </w:r>
+    </w:p>
+    <w:p>
+      <w:r>
+        <w:t xml:space="preserve">The fourth stood at the edge of the map where no location existed.</w:t>
+      </w:r>
+    </w:p>
+    <w:p>
+      <w:r>
+        <w:t xml:space="preserve">Li Yun looked toward Elder Qiao's panel.</w:t>
+      </w:r>
+    </w:p>
+    <w:p>
+      <w:r>
+        <w:t xml:space="preserve">"I can reach the Celestial Domain node. "</w:t>
+      </w:r>
+    </w:p>
+    <w:p>
+      <w:r>
+        <w:t xml:space="preserve">Kai nodded toward the modern city.</w:t>
+      </w:r>
+    </w:p>
+    <w:p>
+      <w:r>
+        <w:t xml:space="preserve">"I can reach that one. "</w:t>
+      </w:r>
+    </w:p>
+    <w:p>
+      <w:r>
+        <w:t xml:space="preserve">The cord between them tightened.</w:t>
+      </w:r>
+    </w:p>
+    <w:p>
+      <w:r>
+        <w:t xml:space="preserve">The system warned them.</w:t>
+      </w:r>
+    </w:p>
+    <w:p>
+      <w:r>
+        <w:t xml:space="preserve">Branches cannot separate while dual continuity remains unsupported.</w:t>
+      </w:r>
+    </w:p>
+    <w:p>
+      <w:r>
+        <w:t xml:space="preserve">Qingchi moved in Li Yun's hand.</w:t>
+      </w:r>
+    </w:p>
+    <w:p>
+      <w:r>
+        <w:t xml:space="preserve">"Then we support it. "</w:t>
+      </w:r>
+    </w:p>
+    <w:p>
+      <w:r>
+        <w:t xml:space="preserve">Dr. Venn looked at the guardian cord.</w:t>
+      </w:r>
+    </w:p>
+    <w:p>
+      <w:r>
+        <w:t xml:space="preserve">"The central stone anchors you both to Witness Road. If the road divides, active witnesses must remain along every branch. "</w:t>
+      </w:r>
+    </w:p>
+    <w:p>
+      <w:r>
+        <w:t xml:space="preserve">Rian opened the ledger.</w:t>
+      </w:r>
+    </w:p>
+    <w:p>
+      <w:r>
+        <w:t xml:space="preserve">"We need teams. "</w:t>
+      </w:r>
+    </w:p>
+    <w:p>
+      <w:r>
+        <w:t xml:space="preserve">Han looked at Kai.</w:t>
+      </w:r>
+    </w:p>
+    <w:p>
+      <w:r>
+        <w:t xml:space="preserve">"No. "</w:t>
+      </w:r>
+    </w:p>
+    <w:p>
+      <w:r>
+        <w:t xml:space="preserve">Kai blinked.</w:t>
+      </w:r>
+    </w:p>
+    <w:p>
+      <w:r>
+        <w:t xml:space="preserve">"I did not say anything. "</w:t>
+      </w:r>
+    </w:p>
+    <w:p>
+      <w:r>
+        <w:t xml:space="preserve">"You were about to assign them. "</w:t>
+      </w:r>
+    </w:p>
+    <w:p>
+      <w:r>
+        <w:t xml:space="preserve">The surrendered seed of authority remained absent.</w:t>
+      </w:r>
+    </w:p>
+    <w:p>
+      <w:r>
+        <w:t xml:space="preserve">The old habit still moved around the empty place.</w:t>
+      </w:r>
+    </w:p>
+    <w:p>
+      <w:r>
+        <w:t xml:space="preserve">Kai looked at the people gathered in the chamber.</w:t>
+      </w:r>
+    </w:p>
+    <w:p>
+      <w:r>
+        <w:t xml:space="preserve">He could not decide who faced which danger.</w:t>
+      </w:r>
+    </w:p>
+    <w:p>
+      <w:r>
+        <w:t xml:space="preserve">"Then people choose. "</w:t>
+      </w:r>
+    </w:p>
+    <w:p>
+      <w:r>
+        <w:t xml:space="preserve">Han nodded once.</w:t>
+      </w:r>
+    </w:p>
+    <w:p>
+      <w:r>
+        <w:t xml:space="preserve">Rian lifted his hand.</w:t>
+      </w:r>
+    </w:p>
+    <w:p>
+      <w:r>
+        <w:t xml:space="preserve">"I choose the modern city. It likely has indoor plumbing. "</w:t>
+      </w:r>
+    </w:p>
+    <w:p>
+      <w:r>
+        <w:t xml:space="preserve">Dr. Venn stared at him.</w:t>
+      </w:r>
+    </w:p>
+    <w:p>
+      <w:r>
+        <w:t xml:space="preserve">"That is your criterion? "</w:t>
+      </w:r>
+    </w:p>
+    <w:p>
+      <w:r>
+        <w:t xml:space="preserve">"It is one. "</w:t>
+      </w:r>
+    </w:p>
+    <w:p>
+      <w:r>
+        <w:t xml:space="preserve">Choi looked toward West Haneul.</w:t>
+      </w:r>
+    </w:p>
+    <w:p>
+      <w:r>
+        <w:t xml:space="preserve">"I choose to return. The local node remains unstable, and the residents need current records. "</w:t>
+      </w:r>
+    </w:p>
+    <w:p>
+      <w:r>
+        <w:t xml:space="preserve">Seo Jun held the ledger.</w:t>
+      </w:r>
+    </w:p>
+    <w:p>
+      <w:r>
+        <w:t xml:space="preserve">"I will go with her. "</w:t>
+      </w:r>
+    </w:p>
+    <w:p>
+      <w:r>
+        <w:t xml:space="preserve">The young girl tightened her grip on his sleeve.</w:t>
+      </w:r>
+    </w:p>
+    <w:p>
+      <w:r>
+        <w:t xml:space="preserve">"So will I. "</w:t>
+      </w:r>
+    </w:p>
+    <w:p>
+      <w:r>
+        <w:t xml:space="preserve">Seo Jun looked down.</w:t>
+      </w:r>
+    </w:p>
+    <w:p>
+      <w:r>
+        <w:t xml:space="preserve">"You do not have to. "</w:t>
+      </w:r>
+    </w:p>
+    <w:p>
+      <w:r>
+        <w:t xml:space="preserve">"I know. "</w:t>
+      </w:r>
+    </w:p>
+    <w:p>
+      <w:r>
+        <w:t xml:space="preserve">The words changed something in him.</w:t>
+      </w:r>
+    </w:p>
+    <w:p>
+      <w:r>
+        <w:t xml:space="preserve">Han stood beside Kai.</w:t>
+      </w:r>
+    </w:p>
+    <w:p>
+      <w:r>
+        <w:t xml:space="preserve">"I choose the modern node. "</w:t>
+      </w:r>
+    </w:p>
+    <w:p>
+      <w:r>
+        <w:t xml:space="preserve">Dr. Venn looked at the map.</w:t>
+      </w:r>
+    </w:p>
+    <w:p>
+      <w:r>
+        <w:t xml:space="preserve">"I need access to both branches. "</w:t>
+      </w:r>
+    </w:p>
+    <w:p>
+      <w:r>
+        <w:t xml:space="preserve">The mendicant lifted the broken bowl.</w:t>
+      </w:r>
+    </w:p>
+    <w:p>
+      <w:r>
+        <w:t xml:space="preserve">"I will remain at the central road and witness both. "</w:t>
+      </w:r>
+    </w:p>
+    <w:p>
+      <w:r>
+        <w:t xml:space="preserve">Rian looked at him.</w:t>
+      </w:r>
+    </w:p>
+    <w:p>
+      <w:r>
+        <w:t xml:space="preserve">"You could come with us. "</w:t>
+      </w:r>
+    </w:p>
+    <w:p>
+      <w:r>
+        <w:t xml:space="preserve">The mendicant gazed at the false sun.</w:t>
+      </w:r>
+    </w:p>
+    <w:p>
+      <w:r>
+        <w:t xml:space="preserve">"I have only just left my roadside. Allow me one impossible place at a time. "</w:t>
+      </w:r>
+    </w:p>
+    <w:p>
+      <w:r>
+        <w:t xml:space="preserve">Li Yun looked toward the rescued identities.</w:t>
+      </w:r>
+    </w:p>
+    <w:p>
+      <w:r>
+        <w:t xml:space="preserve">"Who comes to the Celestial Domain? "</w:t>
+      </w:r>
+    </w:p>
+    <w:p>
+      <w:r>
+        <w:t xml:space="preserve">A dozen raised their hands.</w:t>
+      </w:r>
+    </w:p>
+    <w:p>
+      <w:r>
+        <w:t xml:space="preserve">Some wore clothing from the mountain gate vision. Others carried cultivation traces that had been dormant within the bowl.</w:t>
+      </w:r>
+    </w:p>
+    <w:p>
+      <w:r>
+        <w:t xml:space="preserve">Qingchi hummed.</w:t>
+      </w:r>
+    </w:p>
+    <w:p>
+      <w:r>
+        <w:t xml:space="preserve">"None of you appear well trained. "</w:t>
+      </w:r>
+    </w:p>
+    <w:p>
+      <w:r>
+        <w:t xml:space="preserve">A burned man crossed his arms.</w:t>
+      </w:r>
+    </w:p>
+    <w:p>
+      <w:r>
+        <w:t xml:space="preserve">"Neither did you when you first held a sword. "</w:t>
+      </w:r>
+    </w:p>
+    <w:p>
+      <w:r>
+        <w:t xml:space="preserve">"I was magnificent. "</w:t>
+      </w:r>
+    </w:p>
+    <w:p>
+      <w:r>
+        <w:t xml:space="preserve">Li Yun almost smiled.</w:t>
+      </w:r>
+    </w:p>
+    <w:p>
+      <w:r>
+        <w:t xml:space="preserve">The system countdown changed.</w:t>
+      </w:r>
+    </w:p>
+    <w:p>
+      <w:r>
+        <w:t xml:space="preserve">70 hours, 43 minutes.</w:t>
+      </w:r>
+    </w:p>
+    <w:p>
+      <w:r>
+        <w:t xml:space="preserve">The map expanded.</w:t>
+      </w:r>
+    </w:p>
+    <w:p>
+      <w:r>
+        <w:t xml:space="preserve">The modern node resolved beneath a city hospital.</w:t>
+      </w:r>
+    </w:p>
+    <w:p>
+      <w:r>
+        <w:t xml:space="preserve">Kai recognized the building.</w:t>
+      </w:r>
+    </w:p>
+    <w:p>
+      <w:r>
+        <w:t xml:space="preserve">The room from the memory cord.</w:t>
+      </w:r>
+    </w:p>
+    <w:p>
+      <w:r>
+        <w:t xml:space="preserve">The hospital where he had awakened.</w:t>
+      </w:r>
+    </w:p>
+    <w:p>
+      <w:r>
+        <w:t xml:space="preserve">The Celestial Domain node appeared beneath Azure Sky Sect's oldest cultivation hall.</w:t>
+      </w:r>
+    </w:p>
+    <w:p>
+      <w:r>
+        <w:t xml:space="preserve">Li Yun recognized it too.</w:t>
+      </w:r>
+    </w:p>
+    <w:p>
+      <w:r>
+        <w:t xml:space="preserve">"We began above the nodes," Kai said.</w:t>
+      </w:r>
+    </w:p>
+    <w:p>
+      <w:r>
+        <w:t xml:space="preserve">Dr. Venn looked at both locations.</w:t>
+      </w:r>
+    </w:p>
+    <w:p>
+      <w:r>
+        <w:t xml:space="preserve">"Your awakenings were not random. "</w:t>
+      </w:r>
+    </w:p>
+    <w:p>
+      <w:r>
+        <w:t xml:space="preserve">The system had divided one continuity and delivered each branch directly above a separate part of the network.</w:t>
+      </w:r>
+    </w:p>
+    <w:p>
+      <w:r>
+        <w:t xml:space="preserve">Testing both worlds.</w:t>
+      </w:r>
+    </w:p>
+    <w:p>
+      <w:r>
+        <w:t xml:space="preserve">Preparing to choose.</w:t>
+      </w:r>
+    </w:p>
+    <w:p>
+      <w:r>
+        <w:t xml:space="preserve">The central white stone cracked.</w:t>
+      </w:r>
+    </w:p>
+    <w:p>
+      <w:r>
+        <w:t xml:space="preserve">Witness Road divided.</w:t>
+      </w:r>
+    </w:p>
+    <w:p>
+      <w:r>
+        <w:t xml:space="preserve">One branch led toward the hospital.</w:t>
+      </w:r>
+    </w:p>
+    <w:p>
+      <w:r>
+        <w:t xml:space="preserve">Another toward Azure Sky Sect.</w:t>
+      </w:r>
+    </w:p>
+    <w:p>
+      <w:r>
+        <w:t xml:space="preserve">A third returned toward West Haneul.</w:t>
+      </w:r>
+    </w:p>
+    <w:p>
+      <w:r>
+        <w:t xml:space="preserve">The fourth remained beneath the mendicant and the rescued identities.</w:t>
+      </w:r>
+    </w:p>
+    <w:p>
+      <w:r>
+        <w:t xml:space="preserve">The cord guardian extended its rope through every path.</w:t>
+      </w:r>
+    </w:p>
+    <w:p>
+      <w:r>
+        <w:t xml:space="preserve">The brush wrote names.</w:t>
+      </w:r>
+    </w:p>
+    <w:p>
+      <w:r>
+        <w:t xml:space="preserve">The chisel cut separation without severing connection.</w:t>
+      </w:r>
+    </w:p>
+    <w:p>
+      <w:r>
+        <w:t xml:space="preserve">For a moment, the architecture held.</w:t>
+      </w:r>
+    </w:p>
+    <w:p>
+      <w:r>
+        <w:t xml:space="preserve">Then the dark point between worlds moved.</w:t>
+      </w:r>
+    </w:p>
+    <w:p>
+      <w:r>
+        <w:t xml:space="preserve">One of the five unknown nodes awakened.</w:t>
+      </w:r>
+    </w:p>
+    <w:p>
+      <w:r>
+        <w:t xml:space="preserve">Not red.</w:t>
+      </w:r>
+    </w:p>
+    <w:p>
+      <w:r>
+        <w:t xml:space="preserve">Black.</w:t>
+      </w:r>
+    </w:p>
+    <w:p>
+      <w:r>
+        <w:t xml:space="preserve">The system map distorted around it.</w:t>
+      </w:r>
+    </w:p>
+    <w:p>
+      <w:r>
+        <w:t xml:space="preserve">Unknown node activation detected.</w:t>
+      </w:r>
+    </w:p>
+    <w:p>
+      <w:r>
+        <w:t xml:space="preserve">Function: Identity Consumption.</w:t>
+      </w:r>
+    </w:p>
+    <w:p>
+      <w:r>
+        <w:t xml:space="preserve">Network designation: Null Archive.</w:t>
+      </w:r>
+    </w:p>
+    <w:p>
+      <w:r>
+        <w:t xml:space="preserve">Location: Convergence boundary.</w:t>
+      </w:r>
+    </w:p>
+    <w:p>
+      <w:r>
+        <w:t xml:space="preserve">The overlapping worlds trembled.</w:t>
+      </w:r>
+    </w:p>
+    <w:p>
+      <w:r>
+        <w:t xml:space="preserve">Names vanished from the map.</w:t>
+      </w:r>
+    </w:p>
+    <w:p>
+      <w:r>
+        <w:t xml:space="preserve">Not people.</w:t>
+      </w:r>
+    </w:p>
+    <w:p>
+      <w:r>
+        <w:t xml:space="preserve">Nodes.</w:t>
+      </w:r>
+    </w:p>
+    <w:p>
+      <w:r>
+        <w:t xml:space="preserve">One dark point disappeared.</w:t>
+      </w:r>
+    </w:p>
+    <w:p>
+      <w:r>
+        <w:t xml:space="preserve">Then another.</w:t>
+      </w:r>
+    </w:p>
+    <w:p>
+      <w:r>
+        <w:t xml:space="preserve">The Null Archive was consuming the unknown sites before they could be reached.</w:t>
+      </w:r>
+    </w:p>
+    <w:p>
+      <w:r>
+        <w:t xml:space="preserve">The countdown dropped.</w:t>
+      </w:r>
+    </w:p>
+    <w:p>
+      <w:r>
+        <w:t xml:space="preserve">Estimated full contact revised: 48 hours.</w:t>
+      </w:r>
+    </w:p>
+    <w:p>
+      <w:r>
+        <w:t xml:space="preserve">Rian's humor vanished.</w:t>
+      </w:r>
+    </w:p>
+    <w:p>
+      <w:r>
+        <w:t xml:space="preserve">"It just removed almost a day. "</w:t>
+      </w:r>
+    </w:p>
+    <w:p>
+      <w:r>
+        <w:t xml:space="preserve">The Sunlit Mendicant looked toward the false sun.</w:t>
+      </w:r>
+    </w:p>
+    <w:p>
+      <w:r>
+        <w:t xml:space="preserve">"No. "</w:t>
+      </w:r>
+    </w:p>
+    <w:p>
+      <w:r>
+        <w:t xml:space="preserve">His voice carried old fear.</w:t>
+      </w:r>
+    </w:p>
+    <w:p>
+      <w:r>
+        <w:t xml:space="preserve">"It removed places where time could wait. "</w:t>
+      </w:r>
+    </w:p>
+    <w:p>
+      <w:r>
+        <w:t xml:space="preserve">The black point expanded.</w:t>
+      </w:r>
+    </w:p>
+    <w:p>
+      <w:r>
+        <w:t xml:space="preserve">A doorway appeared above the platform.</w:t>
+      </w:r>
+    </w:p>
+    <w:p>
+      <w:r>
+        <w:t xml:space="preserve">Beyond it stood shelves stretching through a lightless hall.</w:t>
+      </w:r>
+    </w:p>
+    <w:p>
+      <w:r>
+        <w:t xml:space="preserve">Wooden tablets filled them.</w:t>
+      </w:r>
+    </w:p>
+    <w:p>
+      <w:r>
+        <w:t xml:space="preserve">Every tablet was blank.</w:t>
+      </w:r>
+    </w:p>
+    <w:p>
+      <w:r>
+        <w:t xml:space="preserve">A figure walked between the shelves.</w:t>
+      </w:r>
+    </w:p>
+    <w:p>
+      <w:r>
+        <w:t xml:space="preserve">Tall.</w:t>
+      </w:r>
+    </w:p>
+    <w:p>
+      <w:r>
+        <w:t xml:space="preserve">Thin.</w:t>
+      </w:r>
+    </w:p>
+    <w:p>
+      <w:r>
+        <w:t xml:space="preserve">Wearing white robes.</w:t>
+      </w:r>
+    </w:p>
+    <w:p>
+      <w:r>
+        <w:t xml:space="preserve">A red cord held a blank tablet over its face.</w:t>
+      </w:r>
+    </w:p>
+    <w:p>
+      <w:r>
+        <w:t xml:space="preserve">The Registrar.</w:t>
+      </w:r>
+    </w:p>
+    <w:p>
+      <w:r>
+        <w:t xml:space="preserve">Not the one from West Haneul.</w:t>
+      </w:r>
+    </w:p>
+    <w:p>
+      <w:r>
+        <w:t xml:space="preserve">Another.</w:t>
+      </w:r>
+    </w:p>
+    <w:p>
+      <w:r>
+        <w:t xml:space="preserve">Or the same office wearing another body.</w:t>
+      </w:r>
+    </w:p>
+    <w:p>
+      <w:r>
+        <w:t xml:space="preserve">She carried two extinguished bells.</w:t>
+      </w:r>
+    </w:p>
+    <w:p>
+      <w:r>
+        <w:t xml:space="preserve">The unknown nodes.</w:t>
+      </w:r>
+    </w:p>
+    <w:p>
+      <w:r>
+        <w:t xml:space="preserve">Behind her, more blank tablets turned toward the open door.</w:t>
+      </w:r>
+    </w:p>
+    <w:p>
+      <w:r>
+        <w:t xml:space="preserve">The Registrar lifted one hand.</w:t>
+      </w:r>
+    </w:p>
+    <w:p>
+      <w:r>
+        <w:t xml:space="preserve">Kai's and Li Yun's names appeared on separate slips.</w:t>
+      </w:r>
+    </w:p>
+    <w:p>
+      <w:r>
+        <w:t xml:space="preserve">She placed both inside the same empty box.</w:t>
+      </w:r>
+    </w:p>
+    <w:p>
+      <w:r>
+        <w:t xml:space="preserve">The system screamed.</w:t>
+      </w:r>
+    </w:p>
+    <w:p>
+      <w:r>
+        <w:t xml:space="preserve">Dual continuity compromised.</w:t>
+      </w:r>
+    </w:p>
+    <w:p>
+      <w:r>
+        <w:t xml:space="preserve">Witness Road anchor under attack.</w:t>
+      </w:r>
+    </w:p>
+    <w:p>
+      <w:r>
+        <w:t xml:space="preserve">The white cord between Kai and Li Yun turned black.</w:t>
+      </w:r>
+    </w:p>
+    <w:p>
+      <w:r>
+        <w:t xml:space="preserve">Memories began draining from both.</w:t>
+      </w:r>
+    </w:p>
+    <w:p>
+      <w:r>
+        <w:t xml:space="preserve">Kai forgot the hospital room.</w:t>
+      </w:r>
+    </w:p>
+    <w:p>
+      <w:r>
+        <w:t xml:space="preserve">Li Yun forgot Elder Qiao's face.</w:t>
+      </w:r>
+    </w:p>
+    <w:p>
+      <w:r>
+        <w:t xml:space="preserve">The box in the Null Archive filled with color.</w:t>
+      </w:r>
+    </w:p>
+    <w:p>
+      <w:r>
+        <w:t xml:space="preserve">The Registrar closed its lid.</w:t>
+      </w:r>
+    </w:p>
+    <w:p>
+      <w:r>
+        <w:t xml:space="preserve">On the front, she wrote one word.</w:t>
+      </w:r>
+    </w:p>
+    <w:p>
+      <w:r>
+        <w:t xml:space="preserve">UNCLAIMED.</w:t>
+      </w:r>
+    </w:p>
+    <w:p>
+      <w:r>
+        <w:t xml:space="preserve">The doorway began to shut.</w:t>
+      </w:r>
+    </w:p>
+    <w:p>
+      <w:r>
+        <w:t xml:space="preserve">Kai seized the blackened cord.</w:t>
+      </w:r>
+    </w:p>
+    <w:p>
+      <w:r>
+        <w:t xml:space="preserve">Li Yun grabbed it from the other side.</w:t>
+      </w:r>
+    </w:p>
+    <w:p>
+      <w:r>
+        <w:t xml:space="preserve">The system offered the original choice again.</w:t>
+      </w:r>
+    </w:p>
+    <w:p>
+      <w:r>
+        <w:t xml:space="preserve">One identity must be surrendered to preserve the other.</w:t>
+      </w:r>
+    </w:p>
+    <w:p>
+      <w:r>
+        <w:t xml:space="preserve">Kai looked at Li Yun.</w:t>
+      </w:r>
+    </w:p>
+    <w:p>
+      <w:r>
+        <w:t xml:space="preserve">This time, the threat was real.</w:t>
+      </w:r>
+    </w:p>
+    <w:p>
+      <w:r>
+        <w:t xml:space="preserve">One could release the cord and preserve the other branch.</w:t>
+      </w:r>
+    </w:p>
+    <w:p>
+      <w:r>
+        <w:t xml:space="preserve">Li Yun's grip tightened.</w:t>
+      </w:r>
+    </w:p>
+    <w:p>
+      <w:r>
+        <w:t xml:space="preserve">"Do not. "</w:t>
+      </w:r>
+    </w:p>
+    <w:p>
+      <w:r>
+        <w:t xml:space="preserve">"I was going to say the same. "</w:t>
+      </w:r>
+    </w:p>
+    <w:p>
+      <w:r>
+        <w:t xml:space="preserve">The door narrowed.</w:t>
+      </w:r>
+    </w:p>
+    <w:p>
+      <w:r>
+        <w:t xml:space="preserve">The box moved deeper into the archive.</w:t>
+      </w:r>
+    </w:p>
+    <w:p>
+      <w:r>
+        <w:t xml:space="preserve">Qingchi flew from Li Yun's hand.</w:t>
+      </w:r>
+    </w:p>
+    <w:p>
+      <w:r>
+        <w:t xml:space="preserve">The sword crossed the threshold before it closed.</w:t>
+      </w:r>
+    </w:p>
+    <w:p>
+      <w:r>
+        <w:t xml:space="preserve">Her voice echoed among the blank shelves.</w:t>
+      </w:r>
+    </w:p>
+    <w:p>
+      <w:r>
+        <w:t xml:space="preserve">"I recognize both of them. "</w:t>
+      </w:r>
+    </w:p>
+    <w:p>
+      <w:r>
+        <w:t xml:space="preserve">The door slammed shut.</w:t>
+      </w:r>
+    </w:p>
+    <w:p>
+      <w:r>
+        <w:t xml:space="preserve">The cord stopped darkening.</w:t>
+      </w:r>
+    </w:p>
+    <w:p>
+      <w:r>
+        <w:t xml:space="preserve">But Qingchi was gone.</w:t>
+      </w:r>
+    </w:p>
+    <w:p>
+      <w:r>
+        <w:t xml:space="preserve">Li Yun stared at his empty hand.</w:t>
+      </w:r>
+    </w:p>
+    <w:p>
+      <w:r>
+        <w:t xml:space="preserve">The system map showed the Null Archive moving beyond all known routes.</w:t>
+      </w:r>
+    </w:p>
+    <w:p>
+      <w:r>
+        <w:t xml:space="preserve">A single silver line remained connected to it.</w:t>
+      </w:r>
+    </w:p>
+    <w:p>
+      <w:r>
+        <w:t xml:space="preserve">Qingchi.</w:t>
+      </w:r>
+    </w:p>
+    <w:p>
+      <w:r>
+        <w:t xml:space="preserve">Her voice came faintly through the cord.</w:t>
+      </w:r>
+    </w:p>
+    <w:p>
+      <w:r>
+        <w:t xml:space="preserve">"I found the missing nodes. "</w:t>
+      </w:r>
+    </w:p>
+    <w:p>
+      <w:r>
+        <w:t xml:space="preserve">Li Yun stepped toward the vanished doorway.</w:t>
+      </w:r>
+    </w:p>
+    <w:p>
+      <w:r>
+        <w:t xml:space="preserve">"Where? "</w:t>
+      </w:r>
+    </w:p>
+    <w:p>
+      <w:r>
+        <w:t xml:space="preserve">Silence.</w:t>
+      </w:r>
+    </w:p>
+    <w:p>
+      <w:r>
+        <w:t xml:space="preserve">Then steel struck wood.</w:t>
+      </w:r>
+    </w:p>
+    <w:p>
+      <w:r>
+        <w:t xml:space="preserve">Once.</w:t>
+      </w:r>
+    </w:p>
+    <w:p>
+      <w:r>
+        <w:t xml:space="preserve">Twice.</w:t>
+      </w:r>
+    </w:p>
+    <w:p>
+      <w:r>
+        <w:t xml:space="preserve">A third time.</w:t>
+      </w:r>
+    </w:p>
+    <w:p>
+      <w:r>
+        <w:t xml:space="preserve">Qingchi's voice returned, weaker.</w:t>
+      </w:r>
+    </w:p>
+    <w:p>
+      <w:r>
+        <w:t xml:space="preserve">"They are not places. "</w:t>
+      </w:r>
+    </w:p>
+    <w:p>
+      <w:r>
+        <w:t xml:space="preserve">The black map opened.</w:t>
+      </w:r>
+    </w:p>
+    <w:p>
+      <w:r>
+        <w:t xml:space="preserve">Five unknown nodes appeared inside the Registrar's body.</w:t>
+      </w:r>
+    </w:p>
+    <w:p>
+      <w:r>
+        <w:t xml:space="preserve">One in each hand.</w:t>
+      </w:r>
+    </w:p>
+    <w:p>
+      <w:r>
+        <w:t xml:space="preserve">One behind the blank tablet.</w:t>
+      </w:r>
+    </w:p>
+    <w:p>
+      <w:r>
+        <w:t xml:space="preserve">One inside her chest.</w:t>
+      </w:r>
+    </w:p>
+    <w:p>
+      <w:r>
+        <w:t xml:space="preserve">One where her shadow should have been.</w:t>
+      </w:r>
+    </w:p>
+    <w:p>
+      <w:r>
+        <w:t xml:space="preserve">The Registrar turned.</w:t>
+      </w:r>
+    </w:p>
+    <w:p>
+      <w:r>
+        <w:t xml:space="preserve">Though her face remained covered, Kai felt her looking through the cord.</w:t>
+      </w:r>
+    </w:p>
+    <w:p>
+      <w:r>
+        <w:t xml:space="preserve">Qingchi whispered the rest.</w:t>
+      </w:r>
+    </w:p>
+    <w:p>
+      <w:r>
+        <w:t xml:space="preserve">"They are people. "</w:t>
+      </w:r>
+    </w:p>
+    <w:p>
+      <w:r>
+        <w:t xml:space="preserve">The Null Archive extinguished its light.</w:t>
+      </w:r>
+    </w:p>
+    <w:p>
+      <w:r>
+        <w:t xml:space="preserve">And all five missing nodes opened their eyes.</w:t>
       </w:r>
     </w:p>
     <w:sectPr>

</xml_diff>

<commit_message>
Add Heavenly Ascension System Chapter 66
</commit_message>
<xml_diff>
--- a/Heavenly Ascension System.docx
+++ b/Heavenly Ascension System.docx
@@ -60831,6 +60831,2739 @@
     <w:p>
       <w:r>
         <w:t xml:space="preserve">The Null Archive extinguished its light.</w:t>
+      </w:r>
+    </w:p>
+    <w:p>
+      <w:r>
+        <w:t xml:space="preserve">And all five missing nodes opened their eyes.</w:t>
+      </w:r>
+    </w:p>
+    <w:p>
+      <w:pPr>
+        <w:pStyle w:val="Heading1"/>
+      </w:pPr>
+      <w:r>
+        <w:t xml:space="preserve">Chapter 66</w:t>
+      </w:r>
+    </w:p>
+    <w:p>
+      <w:r>
+        <w:t xml:space="preserve">Edit</w:t>
+      </w:r>
+    </w:p>
+    <w:p>
+      <w:r>
+        <w:t xml:space="preserve">Chapter 66: The Name Beneath the Name</w:t>
+      </w:r>
+    </w:p>
+    <w:p>
+      <w:r>
+        <w:t xml:space="preserve">One identity must be surrendered.</w:t>
+      </w:r>
+    </w:p>
+    <w:p>
+      <w:r>
+        <w:t xml:space="preserve">The golden words remained above the Radiant Abyss platform, steady and absolute.</w:t>
+      </w:r>
+    </w:p>
+    <w:p>
+      <w:r>
+        <w:t xml:space="preserve">Kai stared at them until their light burned into his vision.</w:t>
+      </w:r>
+    </w:p>
+    <w:p>
+      <w:r>
+        <w:t xml:space="preserve">Across the chamber, Li Yun held the sheathed sword at his side. His grip had tightened enough to whiten his knuckles, but he had not drawn the blade. That restraint told Kai more than anger would have.</w:t>
+      </w:r>
+    </w:p>
+    <w:p>
+      <w:r>
+        <w:t xml:space="preserve">Li Yun wanted answers.</w:t>
+      </w:r>
+    </w:p>
+    <w:p>
+      <w:r>
+        <w:t xml:space="preserve">He was also afraid of what those answers might cost.</w:t>
+      </w:r>
+    </w:p>
+    <w:p>
+      <w:r>
+        <w:t xml:space="preserve">Qingchi hovered near his shoulder, her translucent form pale against the darkness beyond the platform. The sword spirit's eyes moved between them with growing unease.</w:t>
+      </w:r>
+    </w:p>
+    <w:p>
+      <w:r>
+        <w:t xml:space="preserve">"This trial is flawed," she said.</w:t>
+      </w:r>
+    </w:p>
+    <w:p>
+      <w:r>
+        <w:t xml:space="preserve">The words vanished.</w:t>
+      </w:r>
+    </w:p>
+    <w:p>
+      <w:r>
+        <w:t xml:space="preserve">For half a breath, Kai thought the platform had accepted her objection.</w:t>
+      </w:r>
+    </w:p>
+    <w:p>
+      <w:r>
+        <w:t xml:space="preserve">Then a second line appeared.</w:t>
+      </w:r>
+    </w:p>
+    <w:p>
+      <w:r>
+        <w:t xml:space="preserve">The trial reflects the condition of the participant.</w:t>
+      </w:r>
+    </w:p>
+    <w:p>
+      <w:r>
+        <w:t xml:space="preserve">Li Yun's jaw hardened.</w:t>
+      </w:r>
+    </w:p>
+    <w:p>
+      <w:r>
+        <w:t xml:space="preserve">"Which participant? "</w:t>
+      </w:r>
+    </w:p>
+    <w:p>
+      <w:r>
+        <w:t xml:space="preserve">The System answered immediately.</w:t>
+      </w:r>
+    </w:p>
+    <w:p>
+      <w:r>
+        <w:t xml:space="preserve">Yes.</w:t>
+      </w:r>
+    </w:p>
+    <w:p>
+      <w:r>
+        <w:t xml:space="preserve">Silence followed.</w:t>
+      </w:r>
+    </w:p>
+    <w:p>
+      <w:r>
+        <w:t xml:space="preserve">It was the kind of answer the Radiant Abyss favored. Accurate enough to be useless. Simple enough to conceal a blade.</w:t>
+      </w:r>
+    </w:p>
+    <w:p>
+      <w:r>
+        <w:t xml:space="preserve">Kai looked down at the platform beneath his feet.</w:t>
+      </w:r>
+    </w:p>
+    <w:p>
+      <w:r>
+        <w:t xml:space="preserve">Five circles had been carved into the white stone. Four were dark. One held a faint thread of gold that connected his position to Li Yun's. That thread pulsed in rhythm with neither of their hearts.</w:t>
+      </w:r>
+    </w:p>
+    <w:p>
+      <w:r>
+        <w:t xml:space="preserve">It had appeared when they entered the chamber.</w:t>
+      </w:r>
+    </w:p>
+    <w:p>
+      <w:r>
+        <w:t xml:space="preserve">It had strengthened when Li Yun spoke Kai's name.</w:t>
+      </w:r>
+    </w:p>
+    <w:p>
+      <w:r>
+        <w:t xml:space="preserve">Kai had not told him that.</w:t>
+      </w:r>
+    </w:p>
+    <w:p>
+      <w:r>
+        <w:t xml:space="preserve">There were too many things he had not told him.</w:t>
+      </w:r>
+    </w:p>
+    <w:p>
+      <w:r>
+        <w:t xml:space="preserve">Li Yun took one step forward.</w:t>
+      </w:r>
+    </w:p>
+    <w:p>
+      <w:r>
+        <w:t xml:space="preserve">The golden thread brightened.</w:t>
+      </w:r>
+    </w:p>
+    <w:p>
+      <w:r>
+        <w:t xml:space="preserve">A pressure passed through Kai's chest.</w:t>
+      </w:r>
+    </w:p>
+    <w:p>
+      <w:r>
+        <w:t xml:space="preserve">Not pain. Recognition.</w:t>
+      </w:r>
+    </w:p>
+    <w:p>
+      <w:r>
+        <w:t xml:space="preserve">Memory shifted behind his eyes.</w:t>
+      </w:r>
+    </w:p>
+    <w:p>
+      <w:r>
+        <w:t xml:space="preserve">A mountain path beneath rain.</w:t>
+      </w:r>
+    </w:p>
+    <w:p>
+      <w:r>
+        <w:t xml:space="preserve">A wooden bowl filled with bitter medicine.</w:t>
+      </w:r>
+    </w:p>
+    <w:p>
+      <w:r>
+        <w:t xml:space="preserve">A sword too heavy for a child's hands.</w:t>
+      </w:r>
+    </w:p>
+    <w:p>
+      <w:r>
+        <w:t xml:space="preserve">Elder Qiao standing beneath a dead plum tree, telling someone to try again.</w:t>
+      </w:r>
+    </w:p>
+    <w:p>
+      <w:r>
+        <w:t xml:space="preserve">Kai staggered.</w:t>
+      </w:r>
+    </w:p>
+    <w:p>
+      <w:r>
+        <w:t xml:space="preserve">Li Yun flinched at the same moment.</w:t>
+      </w:r>
+    </w:p>
+    <w:p>
+      <w:r>
+        <w:t xml:space="preserve">Qingchi moved between them. "What happened? "</w:t>
+      </w:r>
+    </w:p>
+    <w:p>
+      <w:r>
+        <w:t xml:space="preserve">Neither answered.</w:t>
+      </w:r>
+    </w:p>
+    <w:p>
+      <w:r>
+        <w:t xml:space="preserve">Kai could still smell the rain.</w:t>
+      </w:r>
+    </w:p>
+    <w:p>
+      <w:r>
+        <w:t xml:space="preserve">It was impossible.</w:t>
+      </w:r>
+    </w:p>
+    <w:p>
+      <w:r>
+        <w:t xml:space="preserve">He had never walked that mountain path.</w:t>
+      </w:r>
+    </w:p>
+    <w:p>
+      <w:r>
+        <w:t xml:space="preserve">He had never trained beneath Elder Qiao.</w:t>
+      </w:r>
+    </w:p>
+    <w:p>
+      <w:r>
+        <w:t xml:space="preserve">He had never been a child holding a sword with bleeding palms while an old man pretended not to notice.</w:t>
+      </w:r>
+    </w:p>
+    <w:p>
+      <w:r>
+        <w:t xml:space="preserve">And yet the memory fit inside him too well to be false.</w:t>
+      </w:r>
+    </w:p>
+    <w:p>
+      <w:r>
+        <w:t xml:space="preserve">Li Yun's face had gone pale.</w:t>
+      </w:r>
+    </w:p>
+    <w:p>
+      <w:r>
+        <w:t xml:space="preserve">"You saw it," Kai said.</w:t>
+      </w:r>
+    </w:p>
+    <w:p>
+      <w:r>
+        <w:t xml:space="preserve">Li Yun's eyes sharpened. "What did you see? "</w:t>
+      </w:r>
+    </w:p>
+    <w:p>
+      <w:r>
+        <w:t xml:space="preserve">"The eastern training slope. Rain. Elder Qiao told you your stance was an insult to the mountain. "</w:t>
+      </w:r>
+    </w:p>
+    <w:p>
+      <w:r>
+        <w:t xml:space="preserve">"He said that when I was nine. "</w:t>
+      </w:r>
+    </w:p>
+    <w:p>
+      <w:r>
+        <w:t xml:space="preserve">Kai swallowed.</w:t>
+      </w:r>
+    </w:p>
+    <w:p>
+      <w:r>
+        <w:t xml:space="preserve">"He gave you medicine afterward. You poured half of it behind the kitchen because you hated the taste. "</w:t>
+      </w:r>
+    </w:p>
+    <w:p>
+      <w:r>
+        <w:t xml:space="preserve">Qingchi turned toward Li Yun.</w:t>
+      </w:r>
+    </w:p>
+    <w:p>
+      <w:r>
+        <w:t xml:space="preserve">Li Yun did not move.</w:t>
+      </w:r>
+    </w:p>
+    <w:p>
+      <w:r>
+        <w:t xml:space="preserve">Only his grip changed.</w:t>
+      </w:r>
+    </w:p>
+    <w:p>
+      <w:r>
+        <w:t xml:space="preserve">His hand left the sword.</w:t>
+      </w:r>
+    </w:p>
+    <w:p>
+      <w:r>
+        <w:t xml:space="preserve">That frightened Kai more than if he had drawn it.</w:t>
+      </w:r>
+    </w:p>
+    <w:p>
+      <w:r>
+        <w:t xml:space="preserve">"No one knew that," Li Yun said.</w:t>
+      </w:r>
+    </w:p>
+    <w:p>
+      <w:r>
+        <w:t xml:space="preserve">"Elder Qiao knew. "</w:t>
+      </w:r>
+    </w:p>
+    <w:p>
+      <w:r>
+        <w:t xml:space="preserve">"He believed I drank it. "</w:t>
+      </w:r>
+    </w:p>
+    <w:p>
+      <w:r>
+        <w:t xml:space="preserve">Kai almost laughed.</w:t>
+      </w:r>
+    </w:p>
+    <w:p>
+      <w:r>
+        <w:t xml:space="preserve">The sound died before it reached his throat.</w:t>
+      </w:r>
+    </w:p>
+    <w:p>
+      <w:r>
+        <w:t xml:space="preserve">Above them, the message changed.</w:t>
+      </w:r>
+    </w:p>
+    <w:p>
+      <w:r>
+        <w:t xml:space="preserve">Identity overlap confirmed.</w:t>
+      </w:r>
+    </w:p>
+    <w:p>
+      <w:r>
+        <w:t xml:space="preserve">Division stability: 31 percent.</w:t>
+      </w:r>
+    </w:p>
+    <w:p>
+      <w:r>
+        <w:t xml:space="preserve">One identity must be surrendered.</w:t>
+      </w:r>
+    </w:p>
+    <w:p>
+      <w:r>
+        <w:t xml:space="preserve">Li Yun looked up sharply. "Division. "</w:t>
+      </w:r>
+    </w:p>
+    <w:p>
+      <w:r>
+        <w:t xml:space="preserve">Kai had already understood.</w:t>
+      </w:r>
+    </w:p>
+    <w:p>
+      <w:r>
+        <w:t xml:space="preserve">He wished he had not.</w:t>
+      </w:r>
+    </w:p>
+    <w:p>
+      <w:r>
+        <w:t xml:space="preserve">The System had not mistaken them for two participants.</w:t>
+      </w:r>
+    </w:p>
+    <w:p>
+      <w:r>
+        <w:t xml:space="preserve">It regarded them as one thing separated into unstable parts.</w:t>
+      </w:r>
+    </w:p>
+    <w:p>
+      <w:r>
+        <w:t xml:space="preserve">Kai moved toward the nearest dark circle. The platform resisted him. Invisible pressure gathered around his legs, urging him back toward the golden thread.</w:t>
+      </w:r>
+    </w:p>
+    <w:p>
+      <w:r>
+        <w:t xml:space="preserve">He forced another step.</w:t>
+      </w:r>
+    </w:p>
+    <w:p>
+      <w:r>
+        <w:t xml:space="preserve">The pressure doubled.</w:t>
+      </w:r>
+    </w:p>
+    <w:p>
+      <w:r>
+        <w:t xml:space="preserve">"Stop," Qingchi warned.</w:t>
+      </w:r>
+    </w:p>
+    <w:p>
+      <w:r>
+        <w:t xml:space="preserve">Kai pushed harder.</w:t>
+      </w:r>
+    </w:p>
+    <w:p>
+      <w:r>
+        <w:t xml:space="preserve">A crack sounded through the chamber.</w:t>
+      </w:r>
+    </w:p>
+    <w:p>
+      <w:r>
+        <w:t xml:space="preserve">Not from the platform.</w:t>
+      </w:r>
+    </w:p>
+    <w:p>
+      <w:r>
+        <w:t xml:space="preserve">From inside his skull.</w:t>
+      </w:r>
+    </w:p>
+    <w:p>
+      <w:r>
+        <w:t xml:space="preserve">Light split across his vision.</w:t>
+      </w:r>
+    </w:p>
+    <w:p>
+      <w:r>
+        <w:t xml:space="preserve">For an instant, the Radiant Abyss disappeared.</w:t>
+      </w:r>
+    </w:p>
+    <w:p>
+      <w:r>
+        <w:t xml:space="preserve">He stood in a place without walls.</w:t>
+      </w:r>
+    </w:p>
+    <w:p>
+      <w:r>
+        <w:t xml:space="preserve">Five stars hung in darkness.</w:t>
+      </w:r>
+    </w:p>
+    <w:p>
+      <w:r>
+        <w:t xml:space="preserve">Each star had an eye.</w:t>
+      </w:r>
+    </w:p>
+    <w:p>
+      <w:r>
+        <w:t xml:space="preserve">All five were closed.</w:t>
+      </w:r>
+    </w:p>
+    <w:p>
+      <w:r>
+        <w:t xml:space="preserve">Between them floated a human shape divided by a vertical line of gold. One side wore Li Yun's face. The other wore Kai's.</w:t>
+      </w:r>
+    </w:p>
+    <w:p>
+      <w:r>
+        <w:t xml:space="preserve">Neither side had a shadow.</w:t>
+      </w:r>
+    </w:p>
+    <w:p>
+      <w:r>
+        <w:t xml:space="preserve">Then the vision broke.</w:t>
+      </w:r>
+    </w:p>
+    <w:p>
+      <w:r>
+        <w:t xml:space="preserve">Kai dropped to one knee.</w:t>
+      </w:r>
+    </w:p>
+    <w:p>
+      <w:r>
+        <w:t xml:space="preserve">Li Yun caught his shoulder before he struck the stone.</w:t>
+      </w:r>
+    </w:p>
+    <w:p>
+      <w:r>
+        <w:t xml:space="preserve">The contact triggered another memory.</w:t>
+      </w:r>
+    </w:p>
+    <w:p>
+      <w:r>
+        <w:t xml:space="preserve">A cave flooded with silver light.</w:t>
+      </w:r>
+    </w:p>
+    <w:p>
+      <w:r>
+        <w:t xml:space="preserve">A blade buried in black earth.</w:t>
+      </w:r>
+    </w:p>
+    <w:p>
+      <w:r>
+        <w:t xml:space="preserve">Qingchi's voice, weaker and younger, whispering from within rusted metal.</w:t>
+      </w:r>
+    </w:p>
+    <w:p>
+      <w:r>
+        <w:t xml:space="preserve">Li Yun pulling the sword free.</w:t>
+      </w:r>
+    </w:p>
+    <w:p>
+      <w:r>
+        <w:t xml:space="preserve">But the hand wrapped around the hilt was not Li Yun's.</w:t>
+      </w:r>
+    </w:p>
+    <w:p>
+      <w:r>
+        <w:t xml:space="preserve">It was Kai's.</w:t>
+      </w:r>
+    </w:p>
+    <w:p>
+      <w:r>
+        <w:t xml:space="preserve">Both men recoiled.</w:t>
+      </w:r>
+    </w:p>
+    <w:p>
+      <w:r>
+        <w:t xml:space="preserve">Qingchi gasped.</w:t>
+      </w:r>
+    </w:p>
+    <w:p>
+      <w:r>
+        <w:t xml:space="preserve">For the first time since Kai had met her, the sword spirit looked truly afraid.</w:t>
+      </w:r>
+    </w:p>
+    <w:p>
+      <w:r>
+        <w:t xml:space="preserve">"I felt that," she whispered.</w:t>
+      </w:r>
+    </w:p>
+    <w:p>
+      <w:r>
+        <w:t xml:space="preserve">Li Yun stared at his hand.</w:t>
+      </w:r>
+    </w:p>
+    <w:p>
+      <w:r>
+        <w:t xml:space="preserve">Kai stared at his own.</w:t>
+      </w:r>
+    </w:p>
+    <w:p>
+      <w:r>
+        <w:t xml:space="preserve">The System's words shifted again.</w:t>
+      </w:r>
+    </w:p>
+    <w:p>
+      <w:r>
+        <w:t xml:space="preserve">Shared origin resonance increasing.</w:t>
+      </w:r>
+    </w:p>
+    <w:p>
+      <w:r>
+        <w:t xml:space="preserve">Warning: involuntary reunification may occur.</w:t>
+      </w:r>
+    </w:p>
+    <w:p>
+      <w:r>
+        <w:t xml:space="preserve">Qingchi turned toward the golden letters. "Reunification into what? "</w:t>
+      </w:r>
+    </w:p>
+    <w:p>
+      <w:r>
+        <w:t xml:space="preserve">No answer came.</w:t>
+      </w:r>
+    </w:p>
+    <w:p>
+      <w:r>
+        <w:t xml:space="preserve">Li Yun looked at Kai.</w:t>
+      </w:r>
+    </w:p>
+    <w:p>
+      <w:r>
+        <w:t xml:space="preserve">"Tell me everything. "</w:t>
+      </w:r>
+    </w:p>
+    <w:p>
+      <w:r>
+        <w:t xml:space="preserve">Kai almost refused from instinct.</w:t>
+      </w:r>
+    </w:p>
+    <w:p>
+      <w:r>
+        <w:t xml:space="preserve">Secrets had kept him alive.</w:t>
+      </w:r>
+    </w:p>
+    <w:p>
+      <w:r>
+        <w:t xml:space="preserve">Secrets had also led them here.</w:t>
+      </w:r>
+    </w:p>
+    <w:p>
+      <w:r>
+        <w:t xml:space="preserve">He rose slowly.</w:t>
+      </w:r>
+    </w:p>
+    <w:p>
+      <w:r>
+        <w:t xml:space="preserve">"My first memory is not of being born," he said. "It is of waking inside the Sunlit Mendicant node. "</w:t>
+      </w:r>
+    </w:p>
+    <w:p>
+      <w:r>
+        <w:t xml:space="preserve">Li Yun's expression tightened.</w:t>
+      </w:r>
+    </w:p>
+    <w:p>
+      <w:r>
+        <w:t xml:space="preserve">Kai continued before courage could fail him.</w:t>
+      </w:r>
+    </w:p>
+    <w:p>
+      <w:r>
+        <w:t xml:space="preserve">"I had a body. I had a name. I had knowledge of the System. I knew how to move, speak, read formations, and survive inside a damaged node. But I had no childhood. No parents. No sect. Nothing before the moment my eyes opened. "</w:t>
+      </w:r>
+    </w:p>
+    <w:p>
+      <w:r>
+        <w:t xml:space="preserve">Qingchi's gaze moved to the gold thread between them.</w:t>
+      </w:r>
+    </w:p>
+    <w:p>
+      <w:r>
+        <w:t xml:space="preserve">Li Yun's voice was quiet. "You told me you were a node guide. "</w:t>
+      </w:r>
+    </w:p>
+    <w:p>
+      <w:r>
+        <w:t xml:space="preserve">"I was. "</w:t>
+      </w:r>
+    </w:p>
+    <w:p>
+      <w:r>
+        <w:t xml:space="preserve">"That was not the whole truth. "</w:t>
+      </w:r>
+    </w:p>
+    <w:p>
+      <w:r>
+        <w:t xml:space="preserve">"No. "</w:t>
+      </w:r>
+    </w:p>
+    <w:p>
+      <w:r>
+        <w:t xml:space="preserve">Anger flashed across Li Yun's face.</w:t>
+      </w:r>
+    </w:p>
+    <w:p>
+      <w:r>
+        <w:t xml:space="preserve">Kai accepted it.</w:t>
+      </w:r>
+    </w:p>
+    <w:p>
+      <w:r>
+        <w:t xml:space="preserve">"I thought I had been created to maintain the node. Later, I found records suggesting I had been transferred into it. After that, I found records suggesting the transfer had failed. "</w:t>
+      </w:r>
+    </w:p>
+    <w:p>
+      <w:r>
+        <w:t xml:space="preserve">"What does that mean? "</w:t>
+      </w:r>
+    </w:p>
+    <w:p>
+      <w:r>
+        <w:t xml:space="preserve">"It means the person who entered the node may not have been the person who woke inside it. "</w:t>
+      </w:r>
+    </w:p>
+    <w:p>
+      <w:r>
+        <w:t xml:space="preserve">The golden thread pulsed.</w:t>
+      </w:r>
+    </w:p>
+    <w:p>
+      <w:r>
+        <w:t xml:space="preserve">Memory pressed against Kai's mind again.</w:t>
+      </w:r>
+    </w:p>
+    <w:p>
+      <w:r>
+        <w:t xml:space="preserve">He did not resist.</w:t>
+      </w:r>
+    </w:p>
+    <w:p>
+      <w:r>
+        <w:t xml:space="preserve">A ritual hall.</w:t>
+      </w:r>
+    </w:p>
+    <w:p>
+      <w:r>
+        <w:t xml:space="preserve">Five figures kneeling around a child.</w:t>
+      </w:r>
+    </w:p>
+    <w:p>
+      <w:r>
+        <w:t xml:space="preserve">The child's face hidden beneath strips of white cloth.</w:t>
+      </w:r>
+    </w:p>
+    <w:p>
+      <w:r>
+        <w:t xml:space="preserve">A circle of symbols drawn in blood and sunlight.</w:t>
+      </w:r>
+    </w:p>
+    <w:p>
+      <w:r>
+        <w:t xml:space="preserve">A voice saying, The vessel cannot survive the whole inheritance.</w:t>
+      </w:r>
+    </w:p>
+    <w:p>
+      <w:r>
+        <w:t xml:space="preserve">Another voice answering, Then divide the name.</w:t>
+      </w:r>
+    </w:p>
+    <w:p>
+      <w:r>
+        <w:t xml:space="preserve">Kai's breath stopped.</w:t>
+      </w:r>
+    </w:p>
+    <w:p>
+      <w:r>
+        <w:t xml:space="preserve">Li Yun swayed.</w:t>
+      </w:r>
+    </w:p>
+    <w:p>
+      <w:r>
+        <w:t xml:space="preserve">They had both seen it.</w:t>
+      </w:r>
+    </w:p>
+    <w:p>
+      <w:r>
+        <w:t xml:space="preserve">Qingchi had not.</w:t>
+      </w:r>
+    </w:p>
+    <w:p>
+      <w:r>
+        <w:t xml:space="preserve">"What was it? " she demanded.</w:t>
+      </w:r>
+    </w:p>
+    <w:p>
+      <w:r>
+        <w:t xml:space="preserve">Li Yun's face had emptied of color.</w:t>
+      </w:r>
+    </w:p>
+    <w:p>
+      <w:r>
+        <w:t xml:space="preserve">"A ritual. "</w:t>
+      </w:r>
+    </w:p>
+    <w:p>
+      <w:r>
+        <w:t xml:space="preserve">Kai nodded.</w:t>
+      </w:r>
+    </w:p>
+    <w:p>
+      <w:r>
+        <w:t xml:space="preserve">"A child," Li Yun said. "They were doing something to a child. "</w:t>
+      </w:r>
+    </w:p>
+    <w:p>
+      <w:r>
+        <w:t xml:space="preserve">"Dividing him. "</w:t>
+      </w:r>
+    </w:p>
+    <w:p>
+      <w:r>
+        <w:t xml:space="preserve">The System responded.</w:t>
+      </w:r>
+    </w:p>
+    <w:p>
+      <w:r>
+        <w:t xml:space="preserve">Historical interpretation accepted.</w:t>
+      </w:r>
+    </w:p>
+    <w:p>
+      <w:r>
+        <w:t xml:space="preserve">Identity architecture: partitioned.</w:t>
+      </w:r>
+    </w:p>
+    <w:p>
+      <w:r>
+        <w:t xml:space="preserve">Qingchi lifted her chin toward the message. "Partitioned into how many? "</w:t>
+      </w:r>
+    </w:p>
+    <w:p>
+      <w:r>
+        <w:t xml:space="preserve">Five dark circles lit beneath their feet.</w:t>
+      </w:r>
+    </w:p>
+    <w:p>
+      <w:r>
+        <w:t xml:space="preserve">A sixth circle appeared between Kai and Li Yun.</w:t>
+      </w:r>
+    </w:p>
+    <w:p>
+      <w:r>
+        <w:t xml:space="preserve">Unlike the others, it was already cracked.</w:t>
+      </w:r>
+    </w:p>
+    <w:p>
+      <w:r>
+        <w:t xml:space="preserve">Primary identity divided into six functional vessels.</w:t>
+      </w:r>
+    </w:p>
+    <w:p>
+      <w:r>
+        <w:t xml:space="preserve">Kai stared at the circles.</w:t>
+      </w:r>
+    </w:p>
+    <w:p>
+      <w:r>
+        <w:t xml:space="preserve">Six.</w:t>
+      </w:r>
+    </w:p>
+    <w:p>
+      <w:r>
+        <w:t xml:space="preserve">The number settled into place with horrible precision.</w:t>
+      </w:r>
+    </w:p>
+    <w:p>
+      <w:r>
+        <w:t xml:space="preserve">Five missing nodes.</w:t>
+      </w:r>
+    </w:p>
+    <w:p>
+      <w:r>
+        <w:t xml:space="preserve">One surviving cultivator.</w:t>
+      </w:r>
+    </w:p>
+    <w:p>
+      <w:r>
+        <w:t xml:space="preserve">"No," Li Yun said.</w:t>
+      </w:r>
+    </w:p>
+    <w:p>
+      <w:r>
+        <w:t xml:space="preserve">Kai looked at him.</w:t>
+      </w:r>
+    </w:p>
+    <w:p>
+      <w:r>
+        <w:t xml:space="preserve">Li Yun shook his head once, hard enough to reject the thought before it fully formed.</w:t>
+      </w:r>
+    </w:p>
+    <w:p>
+      <w:r>
+        <w:t xml:space="preserve">"The nodes are locations. Structures. Pieces of the Radiant Abyss. "</w:t>
+      </w:r>
+    </w:p>
+    <w:p>
+      <w:r>
+        <w:t xml:space="preserve">"That is what we believed. "</w:t>
+      </w:r>
+    </w:p>
+    <w:p>
+      <w:r>
+        <w:t xml:space="preserve">"They cannot be people. "</w:t>
+      </w:r>
+    </w:p>
+    <w:p>
+      <w:r>
+        <w:t xml:space="preserve">"Maybe they are both. "</w:t>
+      </w:r>
+    </w:p>
+    <w:p>
+      <w:r>
+        <w:t xml:space="preserve">The chamber trembled.</w:t>
+      </w:r>
+    </w:p>
+    <w:p>
+      <w:r>
+        <w:t xml:space="preserve">Far below the platform, something enormous shifted in the dark.</w:t>
+      </w:r>
+    </w:p>
+    <w:p>
+      <w:r>
+        <w:t xml:space="preserve">Qingchi descended until her feet touched the stone. "The Source Lumen shard reacted to Li Yun as though he belonged to the node network. The guardians called him incomplete. The System has repeatedly granted him authority that should require an administrator. "</w:t>
+      </w:r>
+    </w:p>
+    <w:p>
+      <w:r>
+        <w:t xml:space="preserve">Li Yun turned toward her.</w:t>
+      </w:r>
+    </w:p>
+    <w:p>
+      <w:r>
+        <w:t xml:space="preserve">She did not soften the conclusion.</w:t>
+      </w:r>
+    </w:p>
+    <w:p>
+      <w:r>
+        <w:t xml:space="preserve">"And Kai can access functions that no ordinary guide should possess. "</w:t>
+      </w:r>
+    </w:p>
+    <w:p>
+      <w:r>
+        <w:t xml:space="preserve">Kai looked at the six circles.</w:t>
+      </w:r>
+    </w:p>
+    <w:p>
+      <w:r>
+        <w:t xml:space="preserve">One identity divided into six functional vessels.</w:t>
+      </w:r>
+    </w:p>
+    <w:p>
+      <w:r>
+        <w:t xml:space="preserve">Five nodes.</w:t>
+      </w:r>
+    </w:p>
+    <w:p>
+      <w:r>
+        <w:t xml:space="preserve">One cultivator.</w:t>
+      </w:r>
+    </w:p>
+    <w:p>
+      <w:r>
+        <w:t xml:space="preserve">But he stood here too.</w:t>
+      </w:r>
+    </w:p>
+    <w:p>
+      <w:r>
+        <w:t xml:space="preserve">Which vessel was he?</w:t>
+      </w:r>
+    </w:p>
+    <w:p>
+      <w:r>
+        <w:t xml:space="preserve">The cracked circle between them pulsed.</w:t>
+      </w:r>
+    </w:p>
+    <w:p>
+      <w:r>
+        <w:t xml:space="preserve">The answer came before he could ask.</w:t>
+      </w:r>
+    </w:p>
+    <w:p>
+      <w:r>
+        <w:t xml:space="preserve">Redundant identity fragment detected.</w:t>
+      </w:r>
+    </w:p>
+    <w:p>
+      <w:r>
+        <w:t xml:space="preserve">Kai: provisional continuity vessel.</w:t>
+      </w:r>
+    </w:p>
+    <w:p>
+      <w:r>
+        <w:t xml:space="preserve">Li Yun: primary incarnate vessel.</w:t>
+      </w:r>
+    </w:p>
+    <w:p>
+      <w:r>
+        <w:t xml:space="preserve">The words struck harder than any blade.</w:t>
+      </w:r>
+    </w:p>
+    <w:p>
+      <w:r>
+        <w:t xml:space="preserve">Kai read them again.</w:t>
+      </w:r>
+    </w:p>
+    <w:p>
+      <w:r>
+        <w:t xml:space="preserve">Provisional.</w:t>
+      </w:r>
+    </w:p>
+    <w:p>
+      <w:r>
+        <w:t xml:space="preserve">Continuity vessel.</w:t>
+      </w:r>
+    </w:p>
+    <w:p>
+      <w:r>
+        <w:t xml:space="preserve">Not a person.</w:t>
+      </w:r>
+    </w:p>
+    <w:p>
+      <w:r>
+        <w:t xml:space="preserve">Not even a proper fragment.</w:t>
+      </w:r>
+    </w:p>
+    <w:p>
+      <w:r>
+        <w:t xml:space="preserve">A container meant to preserve something until the real vessel arrived.</w:t>
+      </w:r>
+    </w:p>
+    <w:p>
+      <w:r>
+        <w:t xml:space="preserve">Li Yun stepped toward him. "Kai. "</w:t>
+      </w:r>
+    </w:p>
+    <w:p>
+      <w:r>
+        <w:t xml:space="preserve">Kai raised a hand.</w:t>
+      </w:r>
+    </w:p>
+    <w:p>
+      <w:r>
+        <w:t xml:space="preserve">He did not want comfort.</w:t>
+      </w:r>
+    </w:p>
+    <w:p>
+      <w:r>
+        <w:t xml:space="preserve">Not yet.</w:t>
+      </w:r>
+    </w:p>
+    <w:p>
+      <w:r>
+        <w:t xml:space="preserve">"What am I preserving? " he asked the System.</w:t>
+      </w:r>
+    </w:p>
+    <w:p>
+      <w:r>
+        <w:t xml:space="preserve">Memory.</w:t>
+      </w:r>
+    </w:p>
+    <w:p>
+      <w:r>
+        <w:t xml:space="preserve">A second word appeared.</w:t>
+      </w:r>
+    </w:p>
+    <w:p>
+      <w:r>
+        <w:t xml:space="preserve">Failure.</w:t>
+      </w:r>
+    </w:p>
+    <w:p>
+      <w:r>
+        <w:t xml:space="preserve">Then a third.</w:t>
+      </w:r>
+    </w:p>
+    <w:p>
+      <w:r>
+        <w:t xml:space="preserve">Choice.</w:t>
+      </w:r>
+    </w:p>
+    <w:p>
+      <w:r>
+        <w:t xml:space="preserve">Kai laughed once.</w:t>
+      </w:r>
+    </w:p>
+    <w:p>
+      <w:r>
+        <w:t xml:space="preserve">It sounded wrong in the chamber.</w:t>
+      </w:r>
+    </w:p>
+    <w:p>
+      <w:r>
+        <w:t xml:space="preserve">"At least I contain a varied collection. "</w:t>
+      </w:r>
+    </w:p>
+    <w:p>
+      <w:r>
+        <w:t xml:space="preserve">Li Yun's expression did not change. "You are not a container. "</w:t>
+      </w:r>
+    </w:p>
+    <w:p>
+      <w:r>
+        <w:t xml:space="preserve">"The System seems confident. "</w:t>
+      </w:r>
+    </w:p>
+    <w:p>
+      <w:r>
+        <w:t xml:space="preserve">"The System has called me an unauthorized inheritor, a damaged administrator, a node claimant, and a contamination risk. Its labels are not truth. "</w:t>
+      </w:r>
+    </w:p>
+    <w:p>
+      <w:r>
+        <w:t xml:space="preserve">"They are closer to truth than my memories. "</w:t>
+      </w:r>
+    </w:p>
+    <w:p>
+      <w:r>
+        <w:t xml:space="preserve">"Are they? "</w:t>
+      </w:r>
+    </w:p>
+    <w:p>
+      <w:r>
+        <w:t xml:space="preserve">Kai met his eyes.</w:t>
+      </w:r>
+    </w:p>
+    <w:p>
+      <w:r>
+        <w:t xml:space="preserve">Li Yun stepped closer.</w:t>
+      </w:r>
+    </w:p>
+    <w:p>
+      <w:r>
+        <w:t xml:space="preserve">"You were angry when Elder Qiao was injured. "</w:t>
+      </w:r>
+    </w:p>
+    <w:p>
+      <w:r>
+        <w:t xml:space="preserve">"Anyone would be. "</w:t>
+      </w:r>
+    </w:p>
+    <w:p>
+      <w:r>
+        <w:t xml:space="preserve">"You argued with the guardian in the Quiet Gate when it tried to erase the village records. "</w:t>
+      </w:r>
+    </w:p>
+    <w:p>
+      <w:r>
+        <w:t xml:space="preserve">"It was inefficient. "</w:t>
+      </w:r>
+    </w:p>
+    <w:p>
+      <w:r>
+        <w:t xml:space="preserve">"You stayed behind in the Radiant Corridor to keep the formation open when you could have escaped. "</w:t>
+      </w:r>
+    </w:p>
+    <w:p>
+      <w:r>
+        <w:t xml:space="preserve">"I calculated the risk. "</w:t>
+      </w:r>
+    </w:p>
+    <w:p>
+      <w:r>
+        <w:t xml:space="preserve">"You lied about the calculation. "</w:t>
+      </w:r>
+    </w:p>
+    <w:p>
+      <w:r>
+        <w:t xml:space="preserve">Kai said nothing.</w:t>
+      </w:r>
+    </w:p>
+    <w:p>
+      <w:r>
+        <w:t xml:space="preserve">Li Yun's voice sharpened.</w:t>
+      </w:r>
+    </w:p>
+    <w:p>
+      <w:r>
+        <w:t xml:space="preserve">"You were afraid. You stayed anyway. "</w:t>
+      </w:r>
+    </w:p>
+    <w:p>
+      <w:r>
+        <w:t xml:space="preserve">The golden thread brightened.</w:t>
+      </w:r>
+    </w:p>
+    <w:p>
+      <w:r>
+        <w:t xml:space="preserve">The System reacted.</w:t>
+      </w:r>
+    </w:p>
+    <w:p>
+      <w:r>
+        <w:t xml:space="preserve">Identity divergence increasing.</w:t>
+      </w:r>
+    </w:p>
+    <w:p>
+      <w:r>
+        <w:t xml:space="preserve">Division stability: 38 percent.</w:t>
+      </w:r>
+    </w:p>
+    <w:p>
+      <w:r>
+        <w:t xml:space="preserve">Qingchi stared upward. "It became more stable. "</w:t>
+      </w:r>
+    </w:p>
+    <w:p>
+      <w:r>
+        <w:t xml:space="preserve">Kai understood why.</w:t>
+      </w:r>
+    </w:p>
+    <w:p>
+      <w:r>
+        <w:t xml:space="preserve">Li Yun had not argued that Kai possessed a soul.</w:t>
+      </w:r>
+    </w:p>
+    <w:p>
+      <w:r>
+        <w:t xml:space="preserve">He had named choices.</w:t>
+      </w:r>
+    </w:p>
+    <w:p>
+      <w:r>
+        <w:t xml:space="preserve">Specific choices. Irrational ones. Human ones.</w:t>
+      </w:r>
+    </w:p>
+    <w:p>
+      <w:r>
+        <w:t xml:space="preserve">The System had recognized them as divergence.</w:t>
+      </w:r>
+    </w:p>
+    <w:p>
+      <w:r>
+        <w:t xml:space="preserve">Difference created stability.</w:t>
+      </w:r>
+    </w:p>
+    <w:p>
+      <w:r>
+        <w:t xml:space="preserve">Sameness pulled them toward reunification.</w:t>
+      </w:r>
+    </w:p>
+    <w:p>
+      <w:r>
+        <w:t xml:space="preserve">Kai looked at the six circles again.</w:t>
+      </w:r>
+    </w:p>
+    <w:p>
+      <w:r>
+        <w:t xml:space="preserve">"One identity must be surrendered," he said. "It may not be demanding a death. "</w:t>
+      </w:r>
+    </w:p>
+    <w:p>
+      <w:r>
+        <w:t xml:space="preserve">Li Yun followed his gaze. "You think it wants a claim. "</w:t>
+      </w:r>
+    </w:p>
+    <w:p>
+      <w:r>
+        <w:t xml:space="preserve">"I think this chamber cannot proceed while both of us claim the same origin. "</w:t>
+      </w:r>
+    </w:p>
+    <w:p>
+      <w:r>
+        <w:t xml:space="preserve">"I never claimed your origin. "</w:t>
+      </w:r>
+    </w:p>
+    <w:p>
+      <w:r>
+        <w:t xml:space="preserve">"No. But the System did. "</w:t>
+      </w:r>
+    </w:p>
+    <w:p>
+      <w:r>
+        <w:t xml:space="preserve">Kai stepped onto the cracked circle.</w:t>
+      </w:r>
+    </w:p>
+    <w:p>
+      <w:r>
+        <w:t xml:space="preserve">Pain surged through his legs.</w:t>
+      </w:r>
+    </w:p>
+    <w:p>
+      <w:r>
+        <w:t xml:space="preserve">The golden thread rose from the floor and wrapped around his wrist.</w:t>
+      </w:r>
+    </w:p>
+    <w:p>
+      <w:r>
+        <w:t xml:space="preserve">Li Yun moved forward.</w:t>
+      </w:r>
+    </w:p>
+    <w:p>
+      <w:r>
+        <w:t xml:space="preserve">Kai shook his head.</w:t>
+      </w:r>
+    </w:p>
+    <w:p>
+      <w:r>
+        <w:t xml:space="preserve">"Let me test it. "</w:t>
+      </w:r>
+    </w:p>
+    <w:p>
+      <w:r>
+        <w:t xml:space="preserve">"You have a poor history with that phrase. "</w:t>
+      </w:r>
+    </w:p>
+    <w:p>
+      <w:r>
+        <w:t xml:space="preserve">"So do you. "</w:t>
+      </w:r>
+    </w:p>
+    <w:p>
+      <w:r>
+        <w:t xml:space="preserve">That earned the smallest flicker of irritation.</w:t>
+      </w:r>
+    </w:p>
+    <w:p>
+      <w:r>
+        <w:t xml:space="preserve">Good.</w:t>
+      </w:r>
+    </w:p>
+    <w:p>
+      <w:r>
+        <w:t xml:space="preserve">Irritation was better than fear.</w:t>
+      </w:r>
+    </w:p>
+    <w:p>
+      <w:r>
+        <w:t xml:space="preserve">Kai looked up.</w:t>
+      </w:r>
+    </w:p>
+    <w:p>
+      <w:r>
+        <w:t xml:space="preserve">"I surrender my identity as Li Yun. "</w:t>
+      </w:r>
+    </w:p>
+    <w:p>
+      <w:r>
+        <w:t xml:space="preserve">The chamber went still.</w:t>
+      </w:r>
+    </w:p>
+    <w:p>
+      <w:r>
+        <w:t xml:space="preserve">For one heartbeat, nothing happened.</w:t>
+      </w:r>
+    </w:p>
+    <w:p>
+      <w:r>
+        <w:t xml:space="preserve">Then the golden thread tightened.</w:t>
+      </w:r>
+    </w:p>
+    <w:p>
+      <w:r>
+        <w:t xml:space="preserve">Fire raced through Kai's arm.</w:t>
+      </w:r>
+    </w:p>
+    <w:p>
+      <w:r>
+        <w:t xml:space="preserve">His knees nearly buckled, but he remained standing.</w:t>
+      </w:r>
+    </w:p>
+    <w:p>
+      <w:r>
+        <w:t xml:space="preserve">Words appeared above him.</w:t>
+      </w:r>
+    </w:p>
+    <w:p>
+      <w:r>
+        <w:t xml:space="preserve">Invalid surrender.</w:t>
+      </w:r>
+    </w:p>
+    <w:p>
+      <w:r>
+        <w:t xml:space="preserve">Kai does not possess the identity designation Li Yun.</w:t>
+      </w:r>
+    </w:p>
+    <w:p>
+      <w:r>
+        <w:t xml:space="preserve">Kai bared his teeth.</w:t>
+      </w:r>
+    </w:p>
+    <w:p>
+      <w:r>
+        <w:t xml:space="preserve">"Useful. "</w:t>
+      </w:r>
+    </w:p>
+    <w:p>
+      <w:r>
+        <w:t xml:space="preserve">Li Yun stepped onto the edge of the cracked circle.</w:t>
+      </w:r>
+    </w:p>
+    <w:p>
+      <w:r>
+        <w:t xml:space="preserve">"I surrender my identity as Kai. "</w:t>
+      </w:r>
+    </w:p>
+    <w:p>
+      <w:r>
+        <w:t xml:space="preserve">The thread lashed toward him.</w:t>
+      </w:r>
+    </w:p>
+    <w:p>
+      <w:r>
+        <w:t xml:space="preserve">Qingchi shouted.</w:t>
+      </w:r>
+    </w:p>
+    <w:p>
+      <w:r>
+        <w:t xml:space="preserve">Gold struck Li Yun's chest and burst apart.</w:t>
+      </w:r>
+    </w:p>
+    <w:p>
+      <w:r>
+        <w:t xml:space="preserve">Invalid surrender.</w:t>
+      </w:r>
+    </w:p>
+    <w:p>
+      <w:r>
+        <w:t xml:space="preserve">Li Yun does not possess the identity designation Kai.</w:t>
+      </w:r>
+    </w:p>
+    <w:p>
+      <w:r>
+        <w:t xml:space="preserve">Kai glanced at him. "You did not have to test that. "</w:t>
+      </w:r>
+    </w:p>
+    <w:p>
+      <w:r>
+        <w:t xml:space="preserve">"You did. "</w:t>
+      </w:r>
+    </w:p>
+    <w:p>
+      <w:r>
+        <w:t xml:space="preserve">"I am the expendable one. "</w:t>
+      </w:r>
+    </w:p>
+    <w:p>
+      <w:r>
+        <w:t xml:space="preserve">Li Yun's eyes hardened.</w:t>
+      </w:r>
+    </w:p>
+    <w:p>
+      <w:r>
+        <w:t xml:space="preserve">"Say that again and I will throw you off the platform. "</w:t>
+      </w:r>
+    </w:p>
+    <w:p>
+      <w:r>
+        <w:t xml:space="preserve">The System flickered.</w:t>
+      </w:r>
+    </w:p>
+    <w:p>
+      <w:r>
+        <w:t xml:space="preserve">For the briefest instant, a new line appeared.</w:t>
+      </w:r>
+    </w:p>
+    <w:p>
+      <w:r>
+        <w:t xml:space="preserve">Emotional divergence confirmed.</w:t>
+      </w:r>
+    </w:p>
+    <w:p>
+      <w:r>
+        <w:t xml:space="preserve">Then it vanished.</w:t>
+      </w:r>
+    </w:p>
+    <w:p>
+      <w:r>
+        <w:t xml:space="preserve">Kai stared at the empty space.</w:t>
+      </w:r>
+    </w:p>
+    <w:p>
+      <w:r>
+        <w:t xml:space="preserve">The trial was measuring them.</w:t>
+      </w:r>
+    </w:p>
+    <w:p>
+      <w:r>
+        <w:t xml:space="preserve">Not only their memories.</w:t>
+      </w:r>
+    </w:p>
+    <w:p>
+      <w:r>
+        <w:t xml:space="preserve">Their attachment.</w:t>
+      </w:r>
+    </w:p>
+    <w:p>
+      <w:r>
+        <w:t xml:space="preserve">Their resistance.</w:t>
+      </w:r>
+    </w:p>
+    <w:p>
+      <w:r>
+        <w:t xml:space="preserve">Perhaps even their willingness to sacrifice each other.</w:t>
+      </w:r>
+    </w:p>
+    <w:p>
+      <w:r>
+        <w:t xml:space="preserve">The words at the beginning had been precise.</w:t>
+      </w:r>
+    </w:p>
+    <w:p>
+      <w:r>
+        <w:t xml:space="preserve">One identity must be surrendered.</w:t>
+      </w:r>
+    </w:p>
+    <w:p>
+      <w:r>
+        <w:t xml:space="preserve">Not one person.</w:t>
+      </w:r>
+    </w:p>
+    <w:p>
+      <w:r>
+        <w:t xml:space="preserve">Not one life.</w:t>
+      </w:r>
+    </w:p>
+    <w:p>
+      <w:r>
+        <w:t xml:space="preserve">Identity was a relationship between memory, name, choice, and recognition.</w:t>
+      </w:r>
+    </w:p>
+    <w:p>
+      <w:r>
+        <w:t xml:space="preserve">Kai closed his eyes.</w:t>
+      </w:r>
+    </w:p>
+    <w:p>
+      <w:r>
+        <w:t xml:space="preserve">The ritual memory returned.</w:t>
+      </w:r>
+    </w:p>
+    <w:p>
+      <w:r>
+        <w:t xml:space="preserve">A child bound beneath white cloth.</w:t>
+      </w:r>
+    </w:p>
+    <w:p>
+      <w:r>
+        <w:t xml:space="preserve">Five figures around him.</w:t>
+      </w:r>
+    </w:p>
+    <w:p>
+      <w:r>
+        <w:t xml:space="preserve">Six vessels prepared.</w:t>
+      </w:r>
+    </w:p>
+    <w:p>
+      <w:r>
+        <w:t xml:space="preserve">The vessel cannot survive the whole inheritance.</w:t>
+      </w:r>
+    </w:p>
+    <w:p>
+      <w:r>
+        <w:t xml:space="preserve">Then divide the name.</w:t>
+      </w:r>
+    </w:p>
+    <w:p>
+      <w:r>
+        <w:t xml:space="preserve">But why six?</w:t>
+      </w:r>
+    </w:p>
+    <w:p>
+      <w:r>
+        <w:t xml:space="preserve">Five nodes could each hold a function.</w:t>
+      </w:r>
+    </w:p>
+    <w:p>
+      <w:r>
+        <w:t xml:space="preserve">The incarnate vessel could move between them.</w:t>
+      </w:r>
+    </w:p>
+    <w:p>
+      <w:r>
+        <w:t xml:space="preserve">Kai had been called redundant.</w:t>
+      </w:r>
+    </w:p>
+    <w:p>
+      <w:r>
+        <w:t xml:space="preserve">A continuity vessel.</w:t>
+      </w:r>
+    </w:p>
+    <w:p>
+      <w:r>
+        <w:t xml:space="preserve">A safeguard created when something had gone wrong.</w:t>
+      </w:r>
+    </w:p>
+    <w:p>
+      <w:r>
+        <w:t xml:space="preserve">He searched the memory more carefully.</w:t>
+      </w:r>
+    </w:p>
+    <w:p>
+      <w:r>
+        <w:t xml:space="preserve">The five ritualists were not chanting.</w:t>
+      </w:r>
+    </w:p>
+    <w:p>
+      <w:r>
+        <w:t xml:space="preserve">They were arguing.</w:t>
+      </w:r>
+    </w:p>
+    <w:p>
+      <w:r>
+        <w:t xml:space="preserve">One wanted obedience.</w:t>
+      </w:r>
+    </w:p>
+    <w:p>
+      <w:r>
+        <w:t xml:space="preserve">One wanted preservation.</w:t>
+      </w:r>
+    </w:p>
+    <w:p>
+      <w:r>
+        <w:t xml:space="preserve">One wanted power.</w:t>
+      </w:r>
+    </w:p>
+    <w:p>
+      <w:r>
+        <w:t xml:space="preserve">One wanted survival.</w:t>
+      </w:r>
+    </w:p>
+    <w:p>
+      <w:r>
+        <w:t xml:space="preserve">The fifth had stood apart, hands shaking.</w:t>
+      </w:r>
+    </w:p>
+    <w:p>
+      <w:r>
+        <w:t xml:space="preserve">The fifth voice said, And what happens if the child refuses us?</w:t>
+      </w:r>
+    </w:p>
+    <w:p>
+      <w:r>
+        <w:t xml:space="preserve">No one answered.</w:t>
+      </w:r>
+    </w:p>
+    <w:p>
+      <w:r>
+        <w:t xml:space="preserve">The figure stepped into the circle.</w:t>
+      </w:r>
+    </w:p>
+    <w:p>
+      <w:r>
+        <w:t xml:space="preserve">Then he said, Give the choice somewhere to live.</w:t>
+      </w:r>
+    </w:p>
+    <w:p>
+      <w:r>
+        <w:t xml:space="preserve">Kai opened his eyes.</w:t>
+      </w:r>
+    </w:p>
+    <w:p>
+      <w:r>
+        <w:t xml:space="preserve">Choice.</w:t>
+      </w:r>
+    </w:p>
+    <w:p>
+      <w:r>
+        <w:t xml:space="preserve">Memory.</w:t>
+      </w:r>
+    </w:p>
+    <w:p>
+      <w:r>
+        <w:t xml:space="preserve">Failure.</w:t>
+      </w:r>
+    </w:p>
+    <w:p>
+      <w:r>
+        <w:t xml:space="preserve">He was not an accidental copy.</w:t>
+      </w:r>
+    </w:p>
+    <w:p>
+      <w:r>
+        <w:t xml:space="preserve">He was the piece designed to refuse.</w:t>
+      </w:r>
+    </w:p>
+    <w:p>
+      <w:r>
+        <w:t xml:space="preserve">The System called him provisional because choice could not be permanently contained.</w:t>
+      </w:r>
+    </w:p>
+    <w:p>
+      <w:r>
+        <w:t xml:space="preserve">It existed only until it was made.</w:t>
+      </w:r>
+    </w:p>
+    <w:p>
+      <w:r>
+        <w:t xml:space="preserve">"Kai? " Qingchi asked.</w:t>
+      </w:r>
+    </w:p>
+    <w:p>
+      <w:r>
+        <w:t xml:space="preserve">He looked at Li Yun.</w:t>
+      </w:r>
+    </w:p>
+    <w:p>
+      <w:r>
+        <w:t xml:space="preserve">"I know what I am. "</w:t>
+      </w:r>
+    </w:p>
+    <w:p>
+      <w:r>
+        <w:t xml:space="preserve">Li Yun's posture tightened. "What? "</w:t>
+      </w:r>
+    </w:p>
+    <w:p>
+      <w:r>
+        <w:t xml:space="preserve">"The part of you they could not control. "</w:t>
+      </w:r>
+    </w:p>
+    <w:p>
+      <w:r>
+        <w:t xml:space="preserve">The chamber reacted.</w:t>
+      </w:r>
+    </w:p>
+    <w:p>
+      <w:r>
+        <w:t xml:space="preserve">Every symbol on the platform ignited.</w:t>
+      </w:r>
+    </w:p>
+    <w:p>
+      <w:r>
+        <w:t xml:space="preserve">A flood of memories tore through both of them.</w:t>
+      </w:r>
+    </w:p>
+    <w:p>
+      <w:r>
+        <w:t xml:space="preserve">Li Yun screamed.</w:t>
+      </w:r>
+    </w:p>
+    <w:p>
+      <w:r>
+        <w:t xml:space="preserve">Kai could not.</w:t>
+      </w:r>
+    </w:p>
+    <w:p>
+      <w:r>
+        <w:t xml:space="preserve">His body locked as a thousand lives unfolded behind his eyes.</w:t>
+      </w:r>
+    </w:p>
+    <w:p>
+      <w:r>
+        <w:t xml:space="preserve">The child beneath the cloth.</w:t>
+      </w:r>
+    </w:p>
+    <w:p>
+      <w:r>
+        <w:t xml:space="preserve">The division ritual.</w:t>
+      </w:r>
+    </w:p>
+    <w:p>
+      <w:r>
+        <w:t xml:space="preserve">Five streams of light ripped from his chest.</w:t>
+      </w:r>
+    </w:p>
+    <w:p>
+      <w:r>
+        <w:t xml:space="preserve">One entered a chisel.</w:t>
+      </w:r>
+    </w:p>
+    <w:p>
+      <w:r>
+        <w:t xml:space="preserve">One entered a brush.</w:t>
+      </w:r>
+    </w:p>
+    <w:p>
+      <w:r>
+        <w:t xml:space="preserve">One entered a cord.</w:t>
+      </w:r>
+    </w:p>
+    <w:p>
+      <w:r>
+        <w:t xml:space="preserve">One entered a shard of living sunlight.</w:t>
+      </w:r>
+    </w:p>
+    <w:p>
+      <w:r>
+        <w:t xml:space="preserve">One entered a black seed surrounded by empty space.</w:t>
+      </w:r>
+    </w:p>
+    <w:p>
+      <w:r>
+        <w:t xml:space="preserve">The sixth remained in the child's body.</w:t>
+      </w:r>
+    </w:p>
+    <w:p>
+      <w:r>
+        <w:t xml:space="preserve">Then the ritual failed.</w:t>
+      </w:r>
+    </w:p>
+    <w:p>
+      <w:r>
+        <w:t xml:space="preserve">The black seed opened.</w:t>
+      </w:r>
+    </w:p>
+    <w:p>
+      <w:r>
+        <w:t xml:space="preserve">Something on the other side looked back.</w:t>
+      </w:r>
+    </w:p>
+    <w:p>
+      <w:r>
+        <w:t xml:space="preserve">The five streams vanished into separate nodes.</w:t>
+      </w:r>
+    </w:p>
+    <w:p>
+      <w:r>
+        <w:t xml:space="preserve">The child's body survived, but his name broke.</w:t>
+      </w:r>
+    </w:p>
+    <w:p>
+      <w:r>
+        <w:t xml:space="preserve">Memory collapsed.</w:t>
+      </w:r>
+    </w:p>
+    <w:p>
+      <w:r>
+        <w:t xml:space="preserve">The ritualists panicked.</w:t>
+      </w:r>
+    </w:p>
+    <w:p>
+      <w:r>
+        <w:t xml:space="preserve">One seized the loose fragments of thought and sealed them inside the Sunlit Mendicant node.</w:t>
+      </w:r>
+    </w:p>
+    <w:p>
+      <w:r>
+        <w:t xml:space="preserve">A continuity vessel.</w:t>
+      </w:r>
+    </w:p>
+    <w:p>
+      <w:r>
+        <w:t xml:space="preserve">A witness.</w:t>
+      </w:r>
+    </w:p>
+    <w:p>
+      <w:r>
+        <w:t xml:space="preserve">A place for the lost choices to remain until the incarnate vessel could reclaim them.</w:t>
+      </w:r>
+    </w:p>
+    <w:p>
+      <w:r>
+        <w:t xml:space="preserve">Kai saw himself open his eyes inside the node.</w:t>
+      </w:r>
+    </w:p>
+    <w:p>
+      <w:r>
+        <w:t xml:space="preserve">He saw Li Yun wake years later beneath a mountain sky with no memory of the ritual.</w:t>
+      </w:r>
+    </w:p>
+    <w:p>
+      <w:r>
+        <w:t xml:space="preserve">He saw the System detect them both.</w:t>
+      </w:r>
+    </w:p>
+    <w:p>
+      <w:r>
+        <w:t xml:space="preserve">He saw it hesitate.</w:t>
+      </w:r>
+    </w:p>
+    <w:p>
+      <w:r>
+        <w:t xml:space="preserve">Then the visions ended.</w:t>
+      </w:r>
+    </w:p>
+    <w:p>
+      <w:r>
+        <w:t xml:space="preserve">Kai struck the platform on both hands.</w:t>
+      </w:r>
+    </w:p>
+    <w:p>
+      <w:r>
+        <w:t xml:space="preserve">Blood ran from his nose.</w:t>
+      </w:r>
+    </w:p>
+    <w:p>
+      <w:r>
+        <w:t xml:space="preserve">Li Yun lay several steps away, Qingchi kneeling beside him.</w:t>
+      </w:r>
+    </w:p>
+    <w:p>
+      <w:r>
+        <w:t xml:space="preserve">The sword spirit looked between them.</w:t>
+      </w:r>
+    </w:p>
+    <w:p>
+      <w:r>
+        <w:t xml:space="preserve">"You saw everything. "</w:t>
+      </w:r>
+    </w:p>
+    <w:p>
+      <w:r>
+        <w:t xml:space="preserve">Li Yun pushed himself upright.</w:t>
+      </w:r>
+    </w:p>
+    <w:p>
+      <w:r>
+        <w:t xml:space="preserve">His eyes were wet, though his expression remained fierce.</w:t>
+      </w:r>
+    </w:p>
+    <w:p>
+      <w:r>
+        <w:t xml:space="preserve">"They made us. "</w:t>
+      </w:r>
+    </w:p>
+    <w:p>
+      <w:r>
+        <w:t xml:space="preserve">Kai wiped the blood from his mouth.</w:t>
+      </w:r>
+    </w:p>
+    <w:p>
+      <w:r>
+        <w:t xml:space="preserve">"They divided us. "</w:t>
+      </w:r>
+    </w:p>
+    <w:p>
+      <w:r>
+        <w:t xml:space="preserve">"They used me. "</w:t>
+      </w:r>
+    </w:p>
+    <w:p>
+      <w:r>
+        <w:t xml:space="preserve">"They intended to. "</w:t>
+      </w:r>
+    </w:p>
+    <w:p>
+      <w:r>
+        <w:t xml:space="preserve">Li Yun looked at him.</w:t>
+      </w:r>
+    </w:p>
+    <w:p>
+      <w:r>
+        <w:t xml:space="preserve">"But they were afraid of you. "</w:t>
+      </w:r>
+    </w:p>
+    <w:p>
+      <w:r>
+        <w:t xml:space="preserve">Kai almost denied it.</w:t>
+      </w:r>
+    </w:p>
+    <w:p>
+      <w:r>
+        <w:t xml:space="preserve">The words would not come.</w:t>
+      </w:r>
+    </w:p>
+    <w:p>
+      <w:r>
+        <w:t xml:space="preserve">The fifth ritualist had created him as a refuge for choice.</w:t>
+      </w:r>
+    </w:p>
+    <w:p>
+      <w:r>
+        <w:t xml:space="preserve">Not freedom.</w:t>
+      </w:r>
+    </w:p>
+    <w:p>
+      <w:r>
+        <w:t xml:space="preserve">Not a soul.</w:t>
+      </w:r>
+    </w:p>
+    <w:p>
+      <w:r>
+        <w:t xml:space="preserve">A possibility.</w:t>
+      </w:r>
+    </w:p>
+    <w:p>
+      <w:r>
+        <w:t xml:space="preserve">Perhaps that was how every soul began.</w:t>
+      </w:r>
+    </w:p>
+    <w:p>
+      <w:r>
+        <w:t xml:space="preserve">The golden message returned.</w:t>
+      </w:r>
+    </w:p>
+    <w:p>
+      <w:r>
+        <w:t xml:space="preserve">One identity must be surrendered.</w:t>
+      </w:r>
+    </w:p>
+    <w:p>
+      <w:r>
+        <w:t xml:space="preserve">Beneath it, new words formed.</w:t>
+      </w:r>
+    </w:p>
+    <w:p>
+      <w:r>
+        <w:t xml:space="preserve">Available identity claims:</w:t>
+      </w:r>
+    </w:p>
+    <w:p>
+      <w:r>
+        <w:t xml:space="preserve">Li Yun, inheritor of the Radiant Abyss</w:t>
+      </w:r>
+    </w:p>
+    <w:p>
+      <w:r>
+        <w:t xml:space="preserve">Kai, continuity of the divided name</w:t>
+      </w:r>
+    </w:p>
+    <w:p>
+      <w:r>
+        <w:t xml:space="preserve">The Nameless Administrator</w:t>
+      </w:r>
+    </w:p>
+    <w:p>
+      <w:r>
+        <w:t xml:space="preserve">The third title pulsed.</w:t>
+      </w:r>
+    </w:p>
+    <w:p>
+      <w:r>
+        <w:t xml:space="preserve">Li Yun rose unsteadily.</w:t>
+      </w:r>
+    </w:p>
+    <w:p>
+      <w:r>
+        <w:t xml:space="preserve">"The Nameless Administrator was the child. "</w:t>
+      </w:r>
+    </w:p>
+    <w:p>
+      <w:r>
+        <w:t xml:space="preserve">Kai nodded.</w:t>
+      </w:r>
+    </w:p>
+    <w:p>
+      <w:r>
+        <w:t xml:space="preserve">"The identity before division. "</w:t>
+      </w:r>
+    </w:p>
+    <w:p>
+      <w:r>
+        <w:t xml:space="preserve">Qingchi studied the options. "The trial wants one of the three claims abandoned. "</w:t>
+      </w:r>
+    </w:p>
+    <w:p>
+      <w:r>
+        <w:t xml:space="preserve">"If Li Yun surrenders his current identity, the original may consume him," Kai said.</w:t>
+      </w:r>
+    </w:p>
+    <w:p>
+      <w:r>
+        <w:t xml:space="preserve">"If you surrender yours, you may cease to exist," Qingchi replied.</w:t>
+      </w:r>
+    </w:p>
+    <w:p>
+      <w:r>
+        <w:t xml:space="preserve">Kai did not answer.</w:t>
+      </w:r>
+    </w:p>
+    <w:p>
+      <w:r>
+        <w:t xml:space="preserve">Li Yun looked at the third option.</w:t>
+      </w:r>
+    </w:p>
+    <w:p>
+      <w:r>
+        <w:t xml:space="preserve">"And if we surrender the original? "</w:t>
+      </w:r>
+    </w:p>
+    <w:p>
+      <w:r>
+        <w:t xml:space="preserve">Kai felt the System watching.</w:t>
+      </w:r>
+    </w:p>
+    <w:p>
+      <w:r>
+        <w:t xml:space="preserve">"Then the divided name can never be restored. "</w:t>
+      </w:r>
+    </w:p>
+    <w:p>
+      <w:r>
+        <w:t xml:space="preserve">The chamber darkened around them.</w:t>
+      </w:r>
+    </w:p>
+    <w:p>
+      <w:r>
+        <w:t xml:space="preserve">The consequences unfolded without words.</w:t>
+      </w:r>
+    </w:p>
+    <w:p>
+      <w:r>
+        <w:t xml:space="preserve">The Nameless Administrator possessed authority over all five nodes. Reclaiming that identity might grant them control of the Radiant Abyss.</w:t>
+      </w:r>
+    </w:p>
+    <w:p>
+      <w:r>
+        <w:t xml:space="preserve">It might repair the broken System.</w:t>
+      </w:r>
+    </w:p>
+    <w:p>
+      <w:r>
+        <w:t xml:space="preserve">It might reveal the truth behind the guardians, the missing nodes, and the force that had looked through the black seed.</w:t>
+      </w:r>
+    </w:p>
+    <w:p>
+      <w:r>
+        <w:t xml:space="preserve">It might also erase Li Yun and Kai by replacing them with the person they had once been.</w:t>
+      </w:r>
+    </w:p>
+    <w:p>
+      <w:r>
+        <w:t xml:space="preserve">Li Yun's face grew still.</w:t>
+      </w:r>
+    </w:p>
+    <w:p>
+      <w:r>
+        <w:t xml:space="preserve">Kai knew that expression.</w:t>
+      </w:r>
+    </w:p>
+    <w:p>
+      <w:r>
+        <w:t xml:space="preserve">He was weighing duty against self.</w:t>
+      </w:r>
+    </w:p>
+    <w:p>
+      <w:r>
+        <w:t xml:space="preserve">The sect needed power.</w:t>
+      </w:r>
+    </w:p>
+    <w:p>
+      <w:r>
+        <w:t xml:space="preserve">Elder Qiao needed answers.</w:t>
+      </w:r>
+    </w:p>
+    <w:p>
+      <w:r>
+        <w:t xml:space="preserve">The damaged lands beyond the Radiant Abyss needed someone capable of repairing what had been broken.</w:t>
+      </w:r>
+    </w:p>
+    <w:p>
+      <w:r>
+        <w:t xml:space="preserve">Li Yun would sacrifice himself if he believed the gain was worth it.</w:t>
+      </w:r>
+    </w:p>
+    <w:p>
+      <w:r>
+        <w:t xml:space="preserve">Kai had inherited enough of him to know that.</w:t>
+      </w:r>
+    </w:p>
+    <w:p>
+      <w:r>
+        <w:t xml:space="preserve">"No," Kai said.</w:t>
+      </w:r>
+    </w:p>
+    <w:p>
+      <w:r>
+        <w:t xml:space="preserve">Li Yun glanced at him. "I have not spoken. "</w:t>
+      </w:r>
+    </w:p>
+    <w:p>
+      <w:r>
+        <w:t xml:space="preserve">"You were preparing to say something foolish. "</w:t>
+      </w:r>
+    </w:p>
+    <w:p>
+      <w:r>
+        <w:t xml:space="preserve">"I was considering the options. "</w:t>
+      </w:r>
+    </w:p>
+    <w:p>
+      <w:r>
+        <w:t xml:space="preserve">"You were preparing to offer yourself to an ancient identity because it may possess greater authority. "</w:t>
+      </w:r>
+    </w:p>
+    <w:p>
+      <w:r>
+        <w:t xml:space="preserve">Li Yun's silence confirmed it.</w:t>
+      </w:r>
+    </w:p>
+    <w:p>
+      <w:r>
+        <w:t xml:space="preserve">Qingchi stepped between them.</w:t>
+      </w:r>
+    </w:p>
+    <w:p>
+      <w:r>
+        <w:t xml:space="preserve">"Kai is right. "</w:t>
+      </w:r>
+    </w:p>
+    <w:p>
+      <w:r>
+        <w:t xml:space="preserve">Li Yun frowned.</w:t>
+      </w:r>
+    </w:p>
+    <w:p>
+      <w:r>
+        <w:t xml:space="preserve">She faced him fully. "The person created by that ritual may have been innocent, but he is gone. You are not a shell waiting for him to return. "</w:t>
+      </w:r>
+    </w:p>
+    <w:p>
+      <w:r>
+        <w:t xml:space="preserve">"The nodes are failing. "</w:t>
+      </w:r>
+    </w:p>
+    <w:p>
+      <w:r>
+        <w:t xml:space="preserve">"Then we repair them as ourselves. "</w:t>
+      </w:r>
+    </w:p>
+    <w:p>
+      <w:r>
+        <w:t xml:space="preserve">"We may not be able to. "</w:t>
+      </w:r>
+    </w:p>
+    <w:p>
+      <w:r>
+        <w:t xml:space="preserve">"Then we fail as ourselves. "</w:t>
+      </w:r>
+    </w:p>
+    <w:p>
+      <w:r>
+        <w:t xml:space="preserve">The words struck the chamber like a bell.</w:t>
+      </w:r>
+    </w:p>
+    <w:p>
+      <w:r>
+        <w:t xml:space="preserve">The golden thread loosened.</w:t>
+      </w:r>
+    </w:p>
+    <w:p>
+      <w:r>
+        <w:t xml:space="preserve">Kai looked at Qingchi.</w:t>
+      </w:r>
+    </w:p>
+    <w:p>
+      <w:r>
+        <w:t xml:space="preserve">She had made the choice sound simple.</w:t>
+      </w:r>
+    </w:p>
+    <w:p>
+      <w:r>
+        <w:t xml:space="preserve">It was not.</w:t>
+      </w:r>
+    </w:p>
+    <w:p>
+      <w:r>
+        <w:t xml:space="preserve">But simplicity did not make it wrong.</w:t>
+      </w:r>
+    </w:p>
+    <w:p>
+      <w:r>
+        <w:t xml:space="preserve">Li Yun looked toward the darkness surrounding the platform.</w:t>
+      </w:r>
+    </w:p>
+    <w:p>
+      <w:r>
+        <w:t xml:space="preserve">"What if surrendering the original identity destroys our connection to the nodes? "</w:t>
+      </w:r>
+    </w:p>
+    <w:p>
+      <w:r>
+        <w:t xml:space="preserve">Kai considered the question.</w:t>
+      </w:r>
+    </w:p>
+    <w:p>
+      <w:r>
+        <w:t xml:space="preserve">"It may. "</w:t>
+      </w:r>
+    </w:p>
+    <w:p>
+      <w:r>
+        <w:t xml:space="preserve">"What if it seals the five missing nodes forever? "</w:t>
+      </w:r>
+    </w:p>
+    <w:p>
+      <w:r>
+        <w:t xml:space="preserve">"It may. "</w:t>
+      </w:r>
+    </w:p>
+    <w:p>
+      <w:r>
+        <w:t xml:space="preserve">"What if the Nameless Administrator is the only one who can stop what is coming? "</w:t>
+      </w:r>
+    </w:p>
+    <w:p>
+      <w:r>
+        <w:t xml:space="preserve">Kai stepped closer.</w:t>
+      </w:r>
+    </w:p>
+    <w:p>
+      <w:r>
+        <w:t xml:space="preserve">"Then we will have to become something he could not. "</w:t>
+      </w:r>
+    </w:p>
+    <w:p>
+      <w:r>
+        <w:t xml:space="preserve">Li Yun met his gaze.</w:t>
+      </w:r>
+    </w:p>
+    <w:p>
+      <w:r>
+        <w:t xml:space="preserve">Kai continued.</w:t>
+      </w:r>
+    </w:p>
+    <w:p>
+      <w:r>
+        <w:t xml:space="preserve">"They created a single administrator and divided him because one vessel could not contain the inheritance. Their design failed before either of us had a chance to choose. Rebuilding that design is not salvation. "</w:t>
+      </w:r>
+    </w:p>
+    <w:p>
+      <w:r>
+        <w:t xml:space="preserve">The System flashed.</w:t>
+      </w:r>
+    </w:p>
+    <w:p>
+      <w:r>
+        <w:t xml:space="preserve">Warning: surrender of root identity is irreversible.</w:t>
+      </w:r>
+    </w:p>
+    <w:p>
+      <w:r>
+        <w:t xml:space="preserve">All restoration pathways will be terminated.</w:t>
+      </w:r>
+    </w:p>
+    <w:p>
+      <w:r>
+        <w:t xml:space="preserve">Original authority may become inaccessible.</w:t>
+      </w:r>
+    </w:p>
+    <w:p>
+      <w:r>
+        <w:t xml:space="preserve">Li Yun read each line.</w:t>
+      </w:r>
+    </w:p>
+    <w:p>
+      <w:r>
+        <w:t xml:space="preserve">Kai waited.</w:t>
+      </w:r>
+    </w:p>
+    <w:p>
+      <w:r>
+        <w:t xml:space="preserve">He would not choose for him.</w:t>
+      </w:r>
+    </w:p>
+    <w:p>
+      <w:r>
+        <w:t xml:space="preserve">That was the entire reason he existed.</w:t>
+      </w:r>
+    </w:p>
+    <w:p>
+      <w:r>
+        <w:t xml:space="preserve">At last, Li Yun placed the sheathed sword on the platform.</w:t>
+      </w:r>
+    </w:p>
+    <w:p>
+      <w:r>
+        <w:t xml:space="preserve">Qingchi's spirit form flickered, but she did not object.</w:t>
+      </w:r>
+    </w:p>
+    <w:p>
+      <w:r>
+        <w:t xml:space="preserve">Li Yun touched two fingers to the cracked circle.</w:t>
+      </w:r>
+    </w:p>
+    <w:p>
+      <w:r>
+        <w:t xml:space="preserve">"My name is Li Yun," he said. "Whatever life came before mine, it does not own the one I have lived. "</w:t>
+      </w:r>
+    </w:p>
+    <w:p>
+      <w:r>
+        <w:t xml:space="preserve">The platform trembled.</w:t>
+      </w:r>
+    </w:p>
+    <w:p>
+      <w:r>
+        <w:t xml:space="preserve">Kai stepped beside him.</w:t>
+      </w:r>
+    </w:p>
+    <w:p>
+      <w:r>
+        <w:t xml:space="preserve">"My name is Kai. It was given to a provisional vessel, but I have carried it through every choice that followed. That is enough. "</w:t>
+      </w:r>
+    </w:p>
+    <w:p>
+      <w:r>
+        <w:t xml:space="preserve">The third title blazed.</w:t>
+      </w:r>
+    </w:p>
+    <w:p>
+      <w:r>
+        <w:t xml:space="preserve">The Nameless Administrator</w:t>
+      </w:r>
+    </w:p>
+    <w:p>
+      <w:r>
+        <w:t xml:space="preserve">Kai and Li Yun spoke together.</w:t>
+      </w:r>
+    </w:p>
+    <w:p>
+      <w:r>
+        <w:t xml:space="preserve">"We surrender this identity. "</w:t>
+      </w:r>
+    </w:p>
+    <w:p>
+      <w:r>
+        <w:t xml:space="preserve">The golden words shattered.</w:t>
+      </w:r>
+    </w:p>
+    <w:p>
+      <w:r>
+        <w:t xml:space="preserve">The chamber roared.</w:t>
+      </w:r>
+    </w:p>
+    <w:p>
+      <w:r>
+        <w:t xml:space="preserve">Light erupted from the six circles.</w:t>
+      </w:r>
+    </w:p>
+    <w:p>
+      <w:r>
+        <w:t xml:space="preserve">The cracked circle beneath them split completely, but instead of collapsing, its halves moved apart. One settled beneath Li Yun. The other settled beneath Kai.</w:t>
+      </w:r>
+    </w:p>
+    <w:p>
+      <w:r>
+        <w:t xml:space="preserve">The thread between their wrists snapped.</w:t>
+      </w:r>
+    </w:p>
+    <w:p>
+      <w:r>
+        <w:t xml:space="preserve">Kai felt something tear free inside him.</w:t>
+      </w:r>
+    </w:p>
+    <w:p>
+      <w:r>
+        <w:t xml:space="preserve">A name he had never known.</w:t>
+      </w:r>
+    </w:p>
+    <w:p>
+      <w:r>
+        <w:t xml:space="preserve">A face he had never worn.</w:t>
+      </w:r>
+    </w:p>
+    <w:p>
+      <w:r>
+        <w:t xml:space="preserve">A grief older than either of them.</w:t>
+      </w:r>
+    </w:p>
+    <w:p>
+      <w:r>
+        <w:t xml:space="preserve">It rose as a human silhouette formed from gold.</w:t>
+      </w:r>
+    </w:p>
+    <w:p>
+      <w:r>
+        <w:t xml:space="preserve">A child stood between them.</w:t>
+      </w:r>
+    </w:p>
+    <w:p>
+      <w:r>
+        <w:t xml:space="preserve">White cloth covered his eyes.</w:t>
+      </w:r>
+    </w:p>
+    <w:p>
+      <w:r>
+        <w:t xml:space="preserve">Five wounds of light marked his chest.</w:t>
+      </w:r>
+    </w:p>
+    <w:p>
+      <w:r>
+        <w:t xml:space="preserve">He turned first toward Li Yun.</w:t>
+      </w:r>
+    </w:p>
+    <w:p>
+      <w:r>
+        <w:t xml:space="preserve">Then toward Kai.</w:t>
+      </w:r>
+    </w:p>
+    <w:p>
+      <w:r>
+        <w:t xml:space="preserve">Though his eyes were hidden, Kai felt his attention.</w:t>
+      </w:r>
+    </w:p>
+    <w:p>
+      <w:r>
+        <w:t xml:space="preserve">Not anger.</w:t>
+      </w:r>
+    </w:p>
+    <w:p>
+      <w:r>
+        <w:t xml:space="preserve">Not sorrow.</w:t>
+      </w:r>
+    </w:p>
+    <w:p>
+      <w:r>
+        <w:t xml:space="preserve">Relief.</w:t>
+      </w:r>
+    </w:p>
+    <w:p>
+      <w:r>
+        <w:t xml:space="preserve">The child lifted one hand.</w:t>
+      </w:r>
+    </w:p>
+    <w:p>
+      <w:r>
+        <w:t xml:space="preserve">The System screamed.</w:t>
+      </w:r>
+    </w:p>
+    <w:p>
+      <w:r>
+        <w:t xml:space="preserve">Every golden symbol in the chamber distorted.</w:t>
+      </w:r>
+    </w:p>
+    <w:p>
+      <w:r>
+        <w:t xml:space="preserve">Root identity surrender detected.</w:t>
+      </w:r>
+    </w:p>
+    <w:p>
+      <w:r>
+        <w:t xml:space="preserve">Restoration protocol terminated.</w:t>
+      </w:r>
+    </w:p>
+    <w:p>
+      <w:r>
+        <w:t xml:space="preserve">Authority succession unresolved.</w:t>
+      </w:r>
+    </w:p>
+    <w:p>
+      <w:r>
+        <w:t xml:space="preserve">Five node vessels remain unawakened.</w:t>
+      </w:r>
+    </w:p>
+    <w:p>
+      <w:r>
+        <w:t xml:space="preserve">The child closed his raised hand.</w:t>
+      </w:r>
+    </w:p>
+    <w:p>
+      <w:r>
+        <w:t xml:space="preserve">The title above him collapsed into sparks.</w:t>
+      </w:r>
+    </w:p>
+    <w:p>
+      <w:r>
+        <w:t xml:space="preserve">His body began to dissolve.</w:t>
+      </w:r>
+    </w:p>
+    <w:p>
+      <w:r>
+        <w:t xml:space="preserve">Li Yun stepped forward. "Wait. "</w:t>
+      </w:r>
+    </w:p>
+    <w:p>
+      <w:r>
+        <w:t xml:space="preserve">The child tilted his head.</w:t>
+      </w:r>
+    </w:p>
+    <w:p>
+      <w:r>
+        <w:t xml:space="preserve">For a moment, Kai thought he would speak.</w:t>
+      </w:r>
+    </w:p>
+    <w:p>
+      <w:r>
+        <w:t xml:space="preserve">Instead, a memory passed into them both.</w:t>
+      </w:r>
+    </w:p>
+    <w:p>
+      <w:r>
+        <w:t xml:space="preserve">Not a ritual.</w:t>
+      </w:r>
+    </w:p>
+    <w:p>
+      <w:r>
+        <w:t xml:space="preserve">Not a command.</w:t>
+      </w:r>
+    </w:p>
+    <w:p>
+      <w:r>
+        <w:t xml:space="preserve">A single wish made by a terrified child beneath white cloth.</w:t>
+      </w:r>
+    </w:p>
+    <w:p>
+      <w:r>
+        <w:t xml:space="preserve">I do not want to become what they need.</w:t>
+      </w:r>
+    </w:p>
+    <w:p>
+      <w:r>
+        <w:t xml:space="preserve">The memory faded.</w:t>
+      </w:r>
+    </w:p>
+    <w:p>
+      <w:r>
+        <w:t xml:space="preserve">So did he.</w:t>
+      </w:r>
+    </w:p>
+    <w:p>
+      <w:r>
+        <w:t xml:space="preserve">The platform fell silent.</w:t>
+      </w:r>
+    </w:p>
+    <w:p>
+      <w:r>
+        <w:t xml:space="preserve">Kai remained still long after the last spark vanished.</w:t>
+      </w:r>
+    </w:p>
+    <w:p>
+      <w:r>
+        <w:t xml:space="preserve">Li Yun retrieved his sword.</w:t>
+      </w:r>
+    </w:p>
+    <w:p>
+      <w:r>
+        <w:t xml:space="preserve">Qingchi returned to hover beside him, one hand pressed over her heart.</w:t>
+      </w:r>
+    </w:p>
+    <w:p>
+      <w:r>
+        <w:t xml:space="preserve">"Is it over? " she asked.</w:t>
+      </w:r>
+    </w:p>
+    <w:p>
+      <w:r>
+        <w:t xml:space="preserve">The darkness below them answered.</w:t>
+      </w:r>
+    </w:p>
+    <w:p>
+      <w:r>
+        <w:t xml:space="preserve">A deep pulse shook the chamber.</w:t>
+      </w:r>
+    </w:p>
+    <w:p>
+      <w:r>
+        <w:t xml:space="preserve">Then another.</w:t>
+      </w:r>
+    </w:p>
+    <w:p>
+      <w:r>
+        <w:t xml:space="preserve">The five circles surrounding Kai and Li Yun ignited one by one.</w:t>
+      </w:r>
+    </w:p>
+    <w:p>
+      <w:r>
+        <w:t xml:space="preserve">Chisel.</w:t>
+      </w:r>
+    </w:p>
+    <w:p>
+      <w:r>
+        <w:t xml:space="preserve">Brush.</w:t>
+      </w:r>
+    </w:p>
+    <w:p>
+      <w:r>
+        <w:t xml:space="preserve">Cord.</w:t>
+      </w:r>
+    </w:p>
+    <w:p>
+      <w:r>
+        <w:t xml:space="preserve">Lumen.</w:t>
+      </w:r>
+    </w:p>
+    <w:p>
+      <w:r>
+        <w:t xml:space="preserve">Void.</w:t>
+      </w:r>
+    </w:p>
+    <w:p>
+      <w:r>
+        <w:t xml:space="preserve">The symbols did not resemble names, yet Kai understood them.</w:t>
+      </w:r>
+    </w:p>
+    <w:p>
+      <w:r>
+        <w:t xml:space="preserve">The guardians had never merely protected the nodes.</w:t>
+      </w:r>
+    </w:p>
+    <w:p>
+      <w:r>
+        <w:t xml:space="preserve">They were echoes of the functions sealed within them.</w:t>
+      </w:r>
+    </w:p>
+    <w:p>
+      <w:r>
+        <w:t xml:space="preserve">Craft.</w:t>
+      </w:r>
+    </w:p>
+    <w:p>
+      <w:r>
+        <w:t xml:space="preserve">Record.</w:t>
+      </w:r>
+    </w:p>
+    <w:p>
+      <w:r>
+        <w:t xml:space="preserve">Bond.</w:t>
+      </w:r>
+    </w:p>
+    <w:p>
+      <w:r>
+        <w:t xml:space="preserve">Life.</w:t>
+      </w:r>
+    </w:p>
+    <w:p>
+      <w:r>
+        <w:t xml:space="preserve">Absence.</w:t>
+      </w:r>
+    </w:p>
+    <w:p>
+      <w:r>
+        <w:t xml:space="preserve">The System's voice returned, no longer calm.</w:t>
+      </w:r>
+    </w:p>
+    <w:p>
+      <w:r>
+        <w:t xml:space="preserve">Root identity unavailable.</w:t>
+      </w:r>
+    </w:p>
+    <w:p>
+      <w:r>
+        <w:t xml:space="preserve">Node network initiating emergency succession.</w:t>
+      </w:r>
+    </w:p>
+    <w:p>
+      <w:r>
+        <w:t xml:space="preserve">Li Yun drew his sword.</w:t>
+      </w:r>
+    </w:p>
+    <w:p>
+      <w:r>
+        <w:t xml:space="preserve">Qingchi vanished into the blade, filling its edge with pale radiance.</w:t>
+      </w:r>
+    </w:p>
+    <w:p>
+      <w:r>
+        <w:t xml:space="preserve">Kai felt the five distant connections pull taut.</w:t>
+      </w:r>
+    </w:p>
+    <w:p>
+      <w:r>
+        <w:t xml:space="preserve">Not toward one administrator.</w:t>
+      </w:r>
+    </w:p>
+    <w:p>
+      <w:r>
+        <w:t xml:space="preserve">Toward both of them.</w:t>
+      </w:r>
+    </w:p>
+    <w:p>
+      <w:r>
+        <w:t xml:space="preserve">The chamber walls cracked.</w:t>
+      </w:r>
+    </w:p>
+    <w:p>
+      <w:r>
+        <w:t xml:space="preserve">Beyond them, five places opened across the world.</w:t>
+      </w:r>
+    </w:p>
+    <w:p>
+      <w:r>
+        <w:t xml:space="preserve">A buried hall filled with stone figures.</w:t>
+      </w:r>
+    </w:p>
+    <w:p>
+      <w:r>
+        <w:t xml:space="preserve">A library where every blank page began to bleed.</w:t>
+      </w:r>
+    </w:p>
+    <w:p>
+      <w:r>
+        <w:t xml:space="preserve">A bridge stretched between two dead mountains.</w:t>
+      </w:r>
+    </w:p>
+    <w:p>
+      <w:r>
+        <w:t xml:space="preserve">A golden forest breathing beneath the earth.</w:t>
+      </w:r>
+    </w:p>
+    <w:p>
+      <w:r>
+        <w:t xml:space="preserve">A black tower standing in a sky without stars.</w:t>
+      </w:r>
+    </w:p>
+    <w:p>
+      <w:r>
+        <w:t xml:space="preserve">In each place, something stirred.</w:t>
+      </w:r>
+    </w:p>
+    <w:p>
+      <w:r>
+        <w:t xml:space="preserve">Kai heard five breaths enter five ancient bodies.</w:t>
+      </w:r>
+    </w:p>
+    <w:p>
+      <w:r>
+        <w:t xml:space="preserve">Li Yun raised his sword as the final System warning appeared.</w:t>
+      </w:r>
+    </w:p>
+    <w:p>
+      <w:r>
+        <w:t xml:space="preserve">The vessels remember being abandoned.</w:t>
       </w:r>
     </w:p>
     <w:p>

</xml_diff>